<commit_message>
ManyChat: ejemplos de respuestas automáticas
Co-Authored-By: Claude Opus 5.5 <noreply@anthropic.com>
Claude-Session: https://claude.ai/code/session_01GFkSYVqa8d2zDX8Qy6Lwpz
</commit_message>
<xml_diff>
--- a/Presupuesto_2027_Comunicacion_RRPP_Poliforum_Leon.docx
+++ b/Presupuesto_2027_Comunicacion_RRPP_Poliforum_Leon.docx
@@ -843,7 +843,7 @@
             </w:tcMar>
           </w:tcPr>
           <w:p>
-            <w:hyperlink w:history="1" r:id="rIdt5nsx_k84pzpebky3fo1k">
+            <w:hyperlink w:history="1" r:id="rIdvhs-9tq0k94ittaclge2u">
               <w:r>
                 <w:rPr>
                   <w:rFonts w:ascii="Arial" w:cs="Arial" w:eastAsia="Arial" w:hAnsi="Arial"/>
@@ -986,7 +986,7 @@
             </w:tcMar>
           </w:tcPr>
           <w:p>
-            <w:hyperlink w:history="1" r:id="rIdee3ydwv64nuf52uk64xtr">
+            <w:hyperlink w:history="1" r:id="rIdipnonfxse7fvcvr8j3t0-">
               <w:r>
                 <w:rPr>
                   <w:rFonts w:ascii="Arial" w:cs="Arial" w:eastAsia="Arial" w:hAnsi="Arial"/>
@@ -1129,7 +1129,7 @@
             </w:tcMar>
           </w:tcPr>
           <w:p>
-            <w:hyperlink w:history="1" r:id="rId0nu1vm_gpcj91ylpkfu9m">
+            <w:hyperlink w:history="1" r:id="rIdp1d04r9sbey74s59wt6q8">
               <w:r>
                 <w:rPr>
                   <w:rFonts w:ascii="Arial" w:cs="Arial" w:eastAsia="Arial" w:hAnsi="Arial"/>
@@ -1432,7 +1432,7 @@
           <w:sz w:val="22"/>
           <w:szCs w:val="22"/>
         </w:rPr>
-        <w:t xml:space="preserve">Convierte comentarios en leads. Cada persona que comenta una palabra clave recibe al instante un mensaje privado con el link o la información, y además contesta solos los mensajes frecuentes de Instagram y Facebook, de día y de noche.</w:t>
+        <w:t xml:space="preserve">Hace dos cosas. 1) Contesta solo los mensajes privados de Instagram, Facebook y Messenger, de día y de noche: si alguien escribe "¿dónde compro boletos para…?" o "estoy buscando trabajo", le llega la respuesta correcta al momento. 2) Convierte comentarios en leads: quien comenta una palabra clave recibe por mensaje privado el link o la información.</w:t>
       </w:r>
     </w:p>
     <w:p>
@@ -1592,6 +1592,483 @@
           <w:szCs w:val="22"/>
         </w:rPr>
         <w:t xml:space="preserve">En un evento masivo, los avisos de accesos, estacionamiento y horarios se reconocen como oficiales al instante.</w:t>
+      </w:r>
+    </w:p>
+    <w:p>
+      <w:pPr>
+        <w:pStyle w:val="Heading2"/>
+        <w:spacing w:after="80" w:before="200"/>
+      </w:pPr>
+      <w:r>
+        <w:rPr>
+          <w:rFonts w:ascii="Arial" w:cs="Arial" w:eastAsia="Arial" w:hAnsi="Arial"/>
+          <w:b/>
+          <w:bCs/>
+          <w:color w:val="175772"/>
+          <w:sz w:val="26"/>
+          <w:szCs w:val="26"/>
+        </w:rPr>
+        <w:t xml:space="preserve">Qué contesta ManyChat en automático</w:t>
+      </w:r>
+    </w:p>
+    <w:tbl>
+      <w:tblPr>
+        <w:tblW w:type="dxa" w:w="9360"/>
+        <w:tblBorders>
+          <w:top w:val="single" w:color="auto" w:sz="4"/>
+          <w:left w:val="single" w:color="auto" w:sz="4"/>
+          <w:bottom w:val="single" w:color="auto" w:sz="4"/>
+          <w:right w:val="single" w:color="auto" w:sz="4"/>
+          <w:insideH w:val="single" w:color="auto" w:sz="4"/>
+          <w:insideV w:val="single" w:color="auto" w:sz="4"/>
+        </w:tblBorders>
+      </w:tblPr>
+      <w:tblGrid>
+        <w:gridCol w:w="4200"/>
+        <w:gridCol w:w="5160"/>
+      </w:tblGrid>
+      <w:tr>
+        <w:trPr>
+          <w:tblHeader/>
+        </w:trPr>
+        <w:tc>
+          <w:tcPr>
+            <w:tcW w:type="dxa" w:w="4200"/>
+            <w:shd w:fill="DCE6EB" w:color="auto" w:val="clear"/>
+            <w:tcMar>
+              <w:top w:type="dxa" w:w="70"/>
+              <w:left w:type="dxa" w:w="100"/>
+              <w:bottom w:type="dxa" w:w="70"/>
+              <w:right w:type="dxa" w:w="100"/>
+            </w:tcMar>
+          </w:tcPr>
+          <w:p>
+            <w:pPr>
+              <w:jc w:val="left"/>
+            </w:pPr>
+            <w:r>
+              <w:rPr>
+                <w:rFonts w:ascii="Arial" w:cs="Arial" w:eastAsia="Arial" w:hAnsi="Arial"/>
+                <w:b/>
+                <w:bCs/>
+                <w:color w:val="0E3A4E"/>
+                <w:sz w:val="19"/>
+                <w:szCs w:val="19"/>
+              </w:rPr>
+              <w:t xml:space="preserve">Si alguien escribe…</w:t>
+            </w:r>
+          </w:p>
+        </w:tc>
+        <w:tc>
+          <w:tcPr>
+            <w:tcW w:type="dxa" w:w="5160"/>
+            <w:shd w:fill="DCE6EB" w:color="auto" w:val="clear"/>
+            <w:tcMar>
+              <w:top w:type="dxa" w:w="70"/>
+              <w:left w:type="dxa" w:w="100"/>
+              <w:bottom w:type="dxa" w:w="70"/>
+              <w:right w:type="dxa" w:w="100"/>
+            </w:tcMar>
+          </w:tcPr>
+          <w:p>
+            <w:pPr>
+              <w:jc w:val="left"/>
+            </w:pPr>
+            <w:r>
+              <w:rPr>
+                <w:rFonts w:ascii="Arial" w:cs="Arial" w:eastAsia="Arial" w:hAnsi="Arial"/>
+                <w:b/>
+                <w:bCs/>
+                <w:color w:val="0E3A4E"/>
+                <w:sz w:val="19"/>
+                <w:szCs w:val="19"/>
+              </w:rPr>
+              <w:t xml:space="preserve">ManyChat responde al instante con…</w:t>
+            </w:r>
+          </w:p>
+        </w:tc>
+      </w:tr>
+      <w:tr>
+        <w:trPr>
+          <w:tblHeader w:val="false"/>
+        </w:trPr>
+        <w:tc>
+          <w:tcPr>
+            <w:tcW w:type="dxa" w:w="4200"/>
+            <w:shd w:fill="F6F9FA" w:color="auto" w:val="clear"/>
+            <w:tcMar>
+              <w:top w:type="dxa" w:w="70"/>
+              <w:left w:type="dxa" w:w="100"/>
+              <w:bottom w:type="dxa" w:w="70"/>
+              <w:right w:type="dxa" w:w="100"/>
+            </w:tcMar>
+          </w:tcPr>
+          <w:p>
+            <w:pPr>
+              <w:jc w:val="left"/>
+            </w:pPr>
+            <w:r>
+              <w:rPr>
+                <w:rFonts w:ascii="Arial" w:cs="Arial" w:eastAsia="Arial" w:hAnsi="Arial"/>
+                <w:b w:val="false"/>
+                <w:bCs w:val="false"/>
+                <w:color w:val="0E3A4E"/>
+                <w:sz w:val="19"/>
+                <w:szCs w:val="19"/>
+              </w:rPr>
+              <w:t xml:space="preserve">"¿Dónde puedo comprar boletos para…?"</w:t>
+            </w:r>
+          </w:p>
+        </w:tc>
+        <w:tc>
+          <w:tcPr>
+            <w:tcW w:type="dxa" w:w="5160"/>
+            <w:shd w:fill="F6F9FA" w:color="auto" w:val="clear"/>
+            <w:tcMar>
+              <w:top w:type="dxa" w:w="70"/>
+              <w:left w:type="dxa" w:w="100"/>
+              <w:bottom w:type="dxa" w:w="70"/>
+              <w:right w:type="dxa" w:w="100"/>
+            </w:tcMar>
+          </w:tcPr>
+          <w:p>
+            <w:pPr>
+              <w:jc w:val="left"/>
+            </w:pPr>
+            <w:r>
+              <w:rPr>
+                <w:rFonts w:ascii="Arial" w:cs="Arial" w:eastAsia="Arial" w:hAnsi="Arial"/>
+                <w:b w:val="false"/>
+                <w:bCs w:val="false"/>
+                <w:color w:val="0E3A4E"/>
+                <w:sz w:val="19"/>
+                <w:szCs w:val="19"/>
+              </w:rPr>
+              <w:t xml:space="preserve">El link oficial de boletos del evento, fecha y horario</w:t>
+            </w:r>
+          </w:p>
+        </w:tc>
+      </w:tr>
+      <w:tr>
+        <w:trPr>
+          <w:tblHeader w:val="false"/>
+        </w:trPr>
+        <w:tc>
+          <w:tcPr>
+            <w:tcW w:type="dxa" w:w="4200"/>
+            <w:shd w:fill="FFFFFF" w:color="auto" w:val="clear"/>
+            <w:tcMar>
+              <w:top w:type="dxa" w:w="70"/>
+              <w:left w:type="dxa" w:w="100"/>
+              <w:bottom w:type="dxa" w:w="70"/>
+              <w:right w:type="dxa" w:w="100"/>
+            </w:tcMar>
+          </w:tcPr>
+          <w:p>
+            <w:pPr>
+              <w:jc w:val="left"/>
+            </w:pPr>
+            <w:r>
+              <w:rPr>
+                <w:rFonts w:ascii="Arial" w:cs="Arial" w:eastAsia="Arial" w:hAnsi="Arial"/>
+                <w:b w:val="false"/>
+                <w:bCs w:val="false"/>
+                <w:color w:val="0E3A4E"/>
+                <w:sz w:val="19"/>
+                <w:szCs w:val="19"/>
+              </w:rPr>
+              <w:t xml:space="preserve">"Estoy buscando trabajo" / "¿tienen vacantes?"</w:t>
+            </w:r>
+          </w:p>
+        </w:tc>
+        <w:tc>
+          <w:tcPr>
+            <w:tcW w:type="dxa" w:w="5160"/>
+            <w:shd w:fill="FFFFFF" w:color="auto" w:val="clear"/>
+            <w:tcMar>
+              <w:top w:type="dxa" w:w="70"/>
+              <w:left w:type="dxa" w:w="100"/>
+              <w:bottom w:type="dxa" w:w="70"/>
+              <w:right w:type="dxa" w:w="100"/>
+            </w:tcMar>
+          </w:tcPr>
+          <w:p>
+            <w:pPr>
+              <w:jc w:val="left"/>
+            </w:pPr>
+            <w:r>
+              <w:rPr>
+                <w:rFonts w:ascii="Arial" w:cs="Arial" w:eastAsia="Arial" w:hAnsi="Arial"/>
+                <w:b w:val="false"/>
+                <w:bCs w:val="false"/>
+                <w:color w:val="0E3A4E"/>
+                <w:sz w:val="19"/>
+                <w:szCs w:val="19"/>
+              </w:rPr>
+              <w:t xml:space="preserve">El correo o link de Recursos Humanos para enviar su CV</w:t>
+            </w:r>
+          </w:p>
+        </w:tc>
+      </w:tr>
+      <w:tr>
+        <w:trPr>
+          <w:tblHeader w:val="false"/>
+        </w:trPr>
+        <w:tc>
+          <w:tcPr>
+            <w:tcW w:type="dxa" w:w="4200"/>
+            <w:shd w:fill="F6F9FA" w:color="auto" w:val="clear"/>
+            <w:tcMar>
+              <w:top w:type="dxa" w:w="70"/>
+              <w:left w:type="dxa" w:w="100"/>
+              <w:bottom w:type="dxa" w:w="70"/>
+              <w:right w:type="dxa" w:w="100"/>
+            </w:tcMar>
+          </w:tcPr>
+          <w:p>
+            <w:pPr>
+              <w:jc w:val="left"/>
+            </w:pPr>
+            <w:r>
+              <w:rPr>
+                <w:rFonts w:ascii="Arial" w:cs="Arial" w:eastAsia="Arial" w:hAnsi="Arial"/>
+                <w:b w:val="false"/>
+                <w:bCs w:val="false"/>
+                <w:color w:val="0E3A4E"/>
+                <w:sz w:val="19"/>
+                <w:szCs w:val="19"/>
+              </w:rPr>
+              <w:t xml:space="preserve">"¿Cómo llego?" / "¿dónde me estaciono?"</w:t>
+            </w:r>
+          </w:p>
+        </w:tc>
+        <w:tc>
+          <w:tcPr>
+            <w:tcW w:type="dxa" w:w="5160"/>
+            <w:shd w:fill="F6F9FA" w:color="auto" w:val="clear"/>
+            <w:tcMar>
+              <w:top w:type="dxa" w:w="70"/>
+              <w:left w:type="dxa" w:w="100"/>
+              <w:bottom w:type="dxa" w:w="70"/>
+              <w:right w:type="dxa" w:w="100"/>
+            </w:tcMar>
+          </w:tcPr>
+          <w:p>
+            <w:pPr>
+              <w:jc w:val="left"/>
+            </w:pPr>
+            <w:r>
+              <w:rPr>
+                <w:rFonts w:ascii="Arial" w:cs="Arial" w:eastAsia="Arial" w:hAnsi="Arial"/>
+                <w:b w:val="false"/>
+                <w:bCs w:val="false"/>
+                <w:color w:val="0E3A4E"/>
+                <w:sz w:val="19"/>
+                <w:szCs w:val="19"/>
+              </w:rPr>
+              <w:t xml:space="preserve">Ubicación en Google Maps, accesos y estacionamiento</w:t>
+            </w:r>
+          </w:p>
+        </w:tc>
+      </w:tr>
+      <w:tr>
+        <w:trPr>
+          <w:tblHeader w:val="false"/>
+        </w:trPr>
+        <w:tc>
+          <w:tcPr>
+            <w:tcW w:type="dxa" w:w="4200"/>
+            <w:shd w:fill="FFFFFF" w:color="auto" w:val="clear"/>
+            <w:tcMar>
+              <w:top w:type="dxa" w:w="70"/>
+              <w:left w:type="dxa" w:w="100"/>
+              <w:bottom w:type="dxa" w:w="70"/>
+              <w:right w:type="dxa" w:w="100"/>
+            </w:tcMar>
+          </w:tcPr>
+          <w:p>
+            <w:pPr>
+              <w:jc w:val="left"/>
+            </w:pPr>
+            <w:r>
+              <w:rPr>
+                <w:rFonts w:ascii="Arial" w:cs="Arial" w:eastAsia="Arial" w:hAnsi="Arial"/>
+                <w:b w:val="false"/>
+                <w:bCs w:val="false"/>
+                <w:color w:val="0E3A4E"/>
+                <w:sz w:val="19"/>
+                <w:szCs w:val="19"/>
+              </w:rPr>
+              <w:t xml:space="preserve">"Quiero rentar un salón" / "cotizar un evento"</w:t>
+            </w:r>
+          </w:p>
+        </w:tc>
+        <w:tc>
+          <w:tcPr>
+            <w:tcW w:type="dxa" w:w="5160"/>
+            <w:shd w:fill="FFFFFF" w:color="auto" w:val="clear"/>
+            <w:tcMar>
+              <w:top w:type="dxa" w:w="70"/>
+              <w:left w:type="dxa" w:w="100"/>
+              <w:bottom w:type="dxa" w:w="70"/>
+              <w:right w:type="dxa" w:w="100"/>
+            </w:tcMar>
+          </w:tcPr>
+          <w:p>
+            <w:pPr>
+              <w:jc w:val="left"/>
+            </w:pPr>
+            <w:r>
+              <w:rPr>
+                <w:rFonts w:ascii="Arial" w:cs="Arial" w:eastAsia="Arial" w:hAnsi="Arial"/>
+                <w:b w:val="false"/>
+                <w:bCs w:val="false"/>
+                <w:color w:val="0E3A4E"/>
+                <w:sz w:val="19"/>
+                <w:szCs w:val="19"/>
+              </w:rPr>
+              <w:t xml:space="preserve">Pide nombre, fecha y número de personas, y avisa al ejecutivo comercial</w:t>
+            </w:r>
+          </w:p>
+        </w:tc>
+      </w:tr>
+      <w:tr>
+        <w:trPr>
+          <w:tblHeader w:val="false"/>
+        </w:trPr>
+        <w:tc>
+          <w:tcPr>
+            <w:tcW w:type="dxa" w:w="4200"/>
+            <w:shd w:fill="F6F9FA" w:color="auto" w:val="clear"/>
+            <w:tcMar>
+              <w:top w:type="dxa" w:w="70"/>
+              <w:left w:type="dxa" w:w="100"/>
+              <w:bottom w:type="dxa" w:w="70"/>
+              <w:right w:type="dxa" w:w="100"/>
+            </w:tcMar>
+          </w:tcPr>
+          <w:p>
+            <w:pPr>
+              <w:jc w:val="left"/>
+            </w:pPr>
+            <w:r>
+              <w:rPr>
+                <w:rFonts w:ascii="Arial" w:cs="Arial" w:eastAsia="Arial" w:hAnsi="Arial"/>
+                <w:b w:val="false"/>
+                <w:bCs w:val="false"/>
+                <w:color w:val="0E3A4E"/>
+                <w:sz w:val="19"/>
+                <w:szCs w:val="19"/>
+              </w:rPr>
+              <w:t xml:space="preserve">"¿A qué hora abren?"</w:t>
+            </w:r>
+          </w:p>
+        </w:tc>
+        <w:tc>
+          <w:tcPr>
+            <w:tcW w:type="dxa" w:w="5160"/>
+            <w:shd w:fill="F6F9FA" w:color="auto" w:val="clear"/>
+            <w:tcMar>
+              <w:top w:type="dxa" w:w="70"/>
+              <w:left w:type="dxa" w:w="100"/>
+              <w:bottom w:type="dxa" w:w="70"/>
+              <w:right w:type="dxa" w:w="100"/>
+            </w:tcMar>
+          </w:tcPr>
+          <w:p>
+            <w:pPr>
+              <w:jc w:val="left"/>
+            </w:pPr>
+            <w:r>
+              <w:rPr>
+                <w:rFonts w:ascii="Arial" w:cs="Arial" w:eastAsia="Arial" w:hAnsi="Arial"/>
+                <w:b w:val="false"/>
+                <w:bCs w:val="false"/>
+                <w:color w:val="0E3A4E"/>
+                <w:sz w:val="19"/>
+                <w:szCs w:val="19"/>
+              </w:rPr>
+              <w:t xml:space="preserve">Horarios del evento o del recinto</w:t>
+            </w:r>
+          </w:p>
+        </w:tc>
+      </w:tr>
+      <w:tr>
+        <w:trPr>
+          <w:tblHeader w:val="false"/>
+        </w:trPr>
+        <w:tc>
+          <w:tcPr>
+            <w:tcW w:type="dxa" w:w="4200"/>
+            <w:shd w:fill="FFFFFF" w:color="auto" w:val="clear"/>
+            <w:tcMar>
+              <w:top w:type="dxa" w:w="70"/>
+              <w:left w:type="dxa" w:w="100"/>
+              <w:bottom w:type="dxa" w:w="70"/>
+              <w:right w:type="dxa" w:w="100"/>
+            </w:tcMar>
+          </w:tcPr>
+          <w:p>
+            <w:pPr>
+              <w:jc w:val="left"/>
+            </w:pPr>
+            <w:r>
+              <w:rPr>
+                <w:rFonts w:ascii="Arial" w:cs="Arial" w:eastAsia="Arial" w:hAnsi="Arial"/>
+                <w:b w:val="false"/>
+                <w:bCs w:val="false"/>
+                <w:color w:val="0E3A4E"/>
+                <w:sz w:val="19"/>
+                <w:szCs w:val="19"/>
+              </w:rPr>
+              <w:t xml:space="preserve">Comentario con palabra clave (ej. "BOLETOS")</w:t>
+            </w:r>
+          </w:p>
+        </w:tc>
+        <w:tc>
+          <w:tcPr>
+            <w:tcW w:type="dxa" w:w="5160"/>
+            <w:shd w:fill="FFFFFF" w:color="auto" w:val="clear"/>
+            <w:tcMar>
+              <w:top w:type="dxa" w:w="70"/>
+              <w:left w:type="dxa" w:w="100"/>
+              <w:bottom w:type="dxa" w:w="70"/>
+              <w:right w:type="dxa" w:w="100"/>
+            </w:tcMar>
+          </w:tcPr>
+          <w:p>
+            <w:pPr>
+              <w:jc w:val="left"/>
+            </w:pPr>
+            <w:r>
+              <w:rPr>
+                <w:rFonts w:ascii="Arial" w:cs="Arial" w:eastAsia="Arial" w:hAnsi="Arial"/>
+                <w:b w:val="false"/>
+                <w:bCs w:val="false"/>
+                <w:color w:val="0E3A4E"/>
+                <w:sz w:val="19"/>
+                <w:szCs w:val="19"/>
+              </w:rPr>
+              <w:t xml:space="preserve">Mensaje privado con el link: así llegaron los 3 leads de la campaña de Maricela Cordero</w:t>
+            </w:r>
+          </w:p>
+        </w:tc>
+      </w:tr>
+    </w:tbl>
+    <w:p>
+      <w:pPr>
+        <w:spacing w:after="120" w:before="80"/>
+      </w:pPr>
+      <w:r>
+        <w:rPr>
+          <w:rFonts w:ascii="Arial" w:cs="Arial" w:eastAsia="Arial" w:hAnsi="Arial"/>
+          <w:i/>
+          <w:iCs/>
+          <w:color w:val="3D5866"/>
+          <w:sz w:val="19"/>
+          <w:szCs w:val="19"/>
+        </w:rPr>
+        <w:t xml:space="preserve">Las respuestas las escribe y aprueba el equipo; ManyChat detecta la pregunta y manda la respuesta. Lo que no reconoce, lo pasa a una persona.</w:t>
       </w:r>
     </w:p>
     <w:p>
@@ -4001,7 +4478,7 @@
         </w:numPr>
         <w:spacing w:after="60"/>
       </w:pPr>
-      <w:hyperlink w:history="1" r:id="rIdvxkycsh0yda0q8efnntpi">
+      <w:hyperlink w:history="1" r:id="rIdeisjsnt5_lmgu8c_fmbxl">
         <w:r>
           <w:rPr>
             <w:rFonts w:ascii="Arial" w:cs="Arial" w:eastAsia="Arial" w:hAnsi="Arial"/>
@@ -4023,7 +4500,7 @@
         </w:numPr>
         <w:spacing w:after="60"/>
       </w:pPr>
-      <w:hyperlink w:history="1" r:id="rIdixg5ynmhw7_guqosmlzhq">
+      <w:hyperlink w:history="1" r:id="rIdpkn6l1ol9k1e4ic5cvgjg">
         <w:r>
           <w:rPr>
             <w:rFonts w:ascii="Arial" w:cs="Arial" w:eastAsia="Arial" w:hAnsi="Arial"/>
@@ -4045,7 +4522,7 @@
         </w:numPr>
         <w:spacing w:after="60"/>
       </w:pPr>
-      <w:hyperlink w:history="1" r:id="rIdllo0pubbvptmxagxdel12">
+      <w:hyperlink w:history="1" r:id="rIdmeaxktjjy8taw67sfp9gj">
         <w:r>
           <w:rPr>
             <w:rFonts w:ascii="Arial" w:cs="Arial" w:eastAsia="Arial" w:hAnsi="Arial"/>
@@ -4067,7 +4544,7 @@
         </w:numPr>
         <w:spacing w:after="60"/>
       </w:pPr>
-      <w:hyperlink w:history="1" r:id="rId1t0bxfueohjgx94nfrp31">
+      <w:hyperlink w:history="1" r:id="rIdf_bsojgalberp0oxx4d_i">
         <w:r>
           <w:rPr>
             <w:rFonts w:ascii="Arial" w:cs="Arial" w:eastAsia="Arial" w:hAnsi="Arial"/>
@@ -4089,7 +4566,7 @@
         </w:numPr>
         <w:spacing w:after="60"/>
       </w:pPr>
-      <w:hyperlink w:history="1" r:id="rIdjhigjx04crp_l3suykecl">
+      <w:hyperlink w:history="1" r:id="rIdusyvbgah1dhws_3aod_2p">
         <w:r>
           <w:rPr>
             <w:rFonts w:ascii="Arial" w:cs="Arial" w:eastAsia="Arial" w:hAnsi="Arial"/>
@@ -4111,7 +4588,7 @@
         </w:numPr>
         <w:spacing w:after="60"/>
       </w:pPr>
-      <w:hyperlink w:history="1" r:id="rIduccrwcophzsyezsldxza_">
+      <w:hyperlink w:history="1" r:id="rIdkav_-dbfs9p2sld0suu79">
         <w:r>
           <w:rPr>
             <w:rFonts w:ascii="Arial" w:cs="Arial" w:eastAsia="Arial" w:hAnsi="Arial"/>
@@ -4133,7 +4610,7 @@
         </w:numPr>
         <w:spacing w:after="60"/>
       </w:pPr>
-      <w:hyperlink w:history="1" r:id="rIdgbsyt426no9cdmwtiq0p3">
+      <w:hyperlink w:history="1" r:id="rIdplqofft4_6ce-zlh7ovep">
         <w:r>
           <w:rPr>
             <w:rFonts w:ascii="Arial" w:cs="Arial" w:eastAsia="Arial" w:hAnsi="Arial"/>

</xml_diff>

<commit_message>
Web: esencial vs diseño, chatbot mensual, Claude Pro; Comunicación: mínimo/medio/ideal
Co-Authored-By: Claude Opus 5.5 <noreply@anthropic.com>
Claude-Session: https://claude.ai/code/session_01GFkSYVqa8d2zDX8Qy6Lwpz
</commit_message>
<xml_diff>
--- a/Presupuesto_2027_Comunicacion_RRPP_Poliforum_Leon.docx
+++ b/Presupuesto_2027_Comunicacion_RRPP_Poliforum_Leon.docx
@@ -138,7 +138,7 @@
           <w:sz w:val="22"/>
           <w:szCs w:val="22"/>
         </w:rPr>
-        <w:t xml:space="preserve">Todo en pago anual. Cuánto cuesta el primer año (2027) y cada año siguiente, según el plan de cámara.</w:t>
+        <w:t xml:space="preserve">Todo en pago anual. Tres escenarios según la cámara: mínimo, medio e ideal. Cuánto cuesta el primer año (2027) y cada año siguiente.</w:t>
       </w:r>
     </w:p>
     <w:tbl>
@@ -186,7 +186,7 @@
                 <w:sz w:val="19"/>
                 <w:szCs w:val="19"/>
               </w:rPr>
-              <w:t xml:space="preserve">Plan</w:t>
+              <w:t xml:space="preserve">Escenario</w:t>
             </w:r>
           </w:p>
         </w:tc>
@@ -275,7 +275,7 @@
                 <w:sz w:val="19"/>
                 <w:szCs w:val="19"/>
               </w:rPr>
-              <w:t xml:space="preserve">Plan A · DJI Osmo Pocket 4P</w:t>
+              <w:t xml:space="preserve">Mínimo · DJI Osmo Pocket 4P</w:t>
             </w:r>
           </w:p>
         </w:tc>
@@ -364,7 +364,7 @@
                 <w:sz w:val="19"/>
                 <w:szCs w:val="19"/>
               </w:rPr>
-              <w:t xml:space="preserve">Plan B · Sony ZV-E10 + estabilizador</w:t>
+              <w:t xml:space="preserve">Medio · Sony ZV-E10 + estabilizador</w:t>
             </w:r>
           </w:p>
         </w:tc>
@@ -453,7 +453,7 @@
                 <w:sz w:val="19"/>
                 <w:szCs w:val="19"/>
               </w:rPr>
-              <w:t xml:space="preserve">Plan C · Sony ZV-E10 II + estabilizador</w:t>
+              <w:t xml:space="preserve">Ideal · Sony ZV-E10 II + estabilizador</w:t>
             </w:r>
           </w:p>
         </w:tc>
@@ -843,7 +843,7 @@
             </w:tcMar>
           </w:tcPr>
           <w:p>
-            <w:hyperlink w:history="1" r:id="rIdvhs-9tq0k94ittaclge2u">
+            <w:hyperlink w:history="1" r:id="rIdq2xxaeoctnmude8jwwfc0">
               <w:r>
                 <w:rPr>
                   <w:rFonts w:ascii="Arial" w:cs="Arial" w:eastAsia="Arial" w:hAnsi="Arial"/>
@@ -986,7 +986,7 @@
             </w:tcMar>
           </w:tcPr>
           <w:p>
-            <w:hyperlink w:history="1" r:id="rIdipnonfxse7fvcvr8j3t0-">
+            <w:hyperlink w:history="1" r:id="rId1di6r0b7yg0-xm-d7ba9j">
               <w:r>
                 <w:rPr>
                   <w:rFonts w:ascii="Arial" w:cs="Arial" w:eastAsia="Arial" w:hAnsi="Arial"/>
@@ -1129,7 +1129,7 @@
             </w:tcMar>
           </w:tcPr>
           <w:p>
-            <w:hyperlink w:history="1" r:id="rIdp1d04r9sbey74s59wt6q8">
+            <w:hyperlink w:history="1" r:id="rIde688kthplqlh16sw9b1qp">
               <w:r>
                 <w:rPr>
                   <w:rFonts w:ascii="Arial" w:cs="Arial" w:eastAsia="Arial" w:hAnsi="Arial"/>
@@ -2590,7 +2590,7 @@
           <w:sz w:val="32"/>
           <w:szCs w:val="32"/>
         </w:rPr>
-        <w:t xml:space="preserve">4. Cámara de video: tres planes</w:t>
+        <w:t xml:space="preserve">4. Cámara de video: mínimo, medio e ideal</w:t>
       </w:r>
     </w:p>
     <w:p>
@@ -2605,6 +2605,71 @@
           <w:szCs w:val="22"/>
         </w:rPr>
         <w:t xml:space="preserve">De menor a mayor precio. Solo cámara y estabilizador: los micrófonos ya los tenemos y ninguna cámara necesita software de pago (DJI Mimo y las apps de Sony son gratis).</w:t>
+      </w:r>
+    </w:p>
+    <w:p>
+      <w:pPr>
+        <w:spacing w:after="120" w:before="0"/>
+      </w:pPr>
+      <w:r>
+        <w:rPr>
+          <w:rFonts w:ascii="Arial" w:cs="Arial" w:eastAsia="Arial" w:hAnsi="Arial"/>
+          <w:b/>
+          <w:bCs/>
+          <w:color w:val="0E3A4E"/>
+          <w:sz w:val="22"/>
+          <w:szCs w:val="22"/>
+        </w:rPr>
+        <w:t xml:space="preserve">Mínimo: </w:t>
+      </w:r>
+      <w:r>
+        <w:rPr>
+          <w:rFonts w:ascii="Arial" w:cs="Arial" w:eastAsia="Arial" w:hAnsi="Arial"/>
+          <w:color w:val="0E3A4E"/>
+          <w:sz w:val="22"/>
+          <w:szCs w:val="22"/>
+        </w:rPr>
+        <w:t xml:space="preserve">cámara de bolsillo con estabilizador integrado; resuelve redes y coberturas rápidas. </w:t>
+      </w:r>
+      <w:r>
+        <w:rPr>
+          <w:rFonts w:ascii="Arial" w:cs="Arial" w:eastAsia="Arial" w:hAnsi="Arial"/>
+          <w:b/>
+          <w:bCs/>
+          <w:color w:val="0E3A4E"/>
+          <w:sz w:val="22"/>
+          <w:szCs w:val="22"/>
+        </w:rPr>
+        <w:t xml:space="preserve">Medio: </w:t>
+      </w:r>
+      <w:r>
+        <w:rPr>
+          <w:rFonts w:ascii="Arial" w:cs="Arial" w:eastAsia="Arial" w:hAnsi="Arial"/>
+          <w:color w:val="0E3A4E"/>
+          <w:sz w:val="22"/>
+          <w:szCs w:val="22"/>
+        </w:rPr>
+        <w:t xml:space="preserve">cámara de lentes intercambiables, mejor imagen para institucional. </w:t>
+      </w:r>
+      <w:r>
+        <w:rPr>
+          <w:rFonts w:ascii="Arial" w:cs="Arial" w:eastAsia="Arial" w:hAnsi="Arial"/>
+          <w:b/>
+          <w:bCs/>
+          <w:color w:val="0E3A4E"/>
+          <w:sz w:val="22"/>
+          <w:szCs w:val="22"/>
+        </w:rPr>
+        <w:t xml:space="preserve">Ideal: </w:t>
+      </w:r>
+      <w:r>
+        <w:rPr>
+          <w:rFonts w:ascii="Arial" w:cs="Arial" w:eastAsia="Arial" w:hAnsi="Arial"/>
+          <w:color w:val="0E3A4E"/>
+          <w:sz w:val="22"/>
+          <w:szCs w:val="22"/>
+        </w:rPr>
+        <w:t xml:space="preserve">la versión nueva, con video 4K en 10 bits para el mejor acabado.</w:t>
       </w:r>
     </w:p>
     <w:tbl>
@@ -2681,7 +2746,7 @@
                 <w:sz w:val="19"/>
                 <w:szCs w:val="19"/>
               </w:rPr>
-              <w:t xml:space="preserve">A · DJI Osmo Pocket 4P</w:t>
+              <w:t xml:space="preserve">Mínimo · DJI Osmo Pocket 4P</w:t>
             </w:r>
           </w:p>
         </w:tc>
@@ -2709,7 +2774,7 @@
                 <w:sz w:val="19"/>
                 <w:szCs w:val="19"/>
               </w:rPr>
-              <w:t xml:space="preserve">B · Sony ZV-E10</w:t>
+              <w:t xml:space="preserve">Medio · Sony ZV-E10</w:t>
             </w:r>
           </w:p>
         </w:tc>
@@ -2737,7 +2802,7 @@
                 <w:sz w:val="19"/>
                 <w:szCs w:val="19"/>
               </w:rPr>
-              <w:t xml:space="preserve">C · Sony ZV-E10 II</w:t>
+              <w:t xml:space="preserve">Ideal · Sony ZV-E10 II</w:t>
             </w:r>
           </w:p>
         </w:tc>
@@ -3746,7 +3811,7 @@
           <w:sz w:val="32"/>
           <w:szCs w:val="32"/>
         </w:rPr>
-        <w:t xml:space="preserve">5. Total por plan</w:t>
+        <w:t xml:space="preserve">5. Total por escenario</w:t>
       </w:r>
     </w:p>
     <w:tbl>
@@ -3823,7 +3888,7 @@
                 <w:sz w:val="19"/>
                 <w:szCs w:val="19"/>
               </w:rPr>
-              <w:t xml:space="preserve">Plan A · Osmo Pocket 4P</w:t>
+              <w:t xml:space="preserve">Mínimo · Osmo Pocket 4P</w:t>
             </w:r>
           </w:p>
         </w:tc>
@@ -3851,7 +3916,7 @@
                 <w:sz w:val="19"/>
                 <w:szCs w:val="19"/>
               </w:rPr>
-              <w:t xml:space="preserve">Plan B · Sony ZV-E10</w:t>
+              <w:t xml:space="preserve">Medio · Sony ZV-E10</w:t>
             </w:r>
           </w:p>
         </w:tc>
@@ -3879,7 +3944,7 @@
                 <w:sz w:val="19"/>
                 <w:szCs w:val="19"/>
               </w:rPr>
-              <w:t xml:space="preserve">Plan C · Sony ZV-E10 II</w:t>
+              <w:t xml:space="preserve">Ideal · Sony ZV-E10 II</w:t>
             </w:r>
           </w:p>
         </w:tc>
@@ -4478,7 +4543,7 @@
         </w:numPr>
         <w:spacing w:after="60"/>
       </w:pPr>
-      <w:hyperlink w:history="1" r:id="rIdeisjsnt5_lmgu8c_fmbxl">
+      <w:hyperlink w:history="1" r:id="rId3olp20skysyehbv6gexir">
         <w:r>
           <w:rPr>
             <w:rFonts w:ascii="Arial" w:cs="Arial" w:eastAsia="Arial" w:hAnsi="Arial"/>
@@ -4500,7 +4565,7 @@
         </w:numPr>
         <w:spacing w:after="60"/>
       </w:pPr>
-      <w:hyperlink w:history="1" r:id="rIdpkn6l1ol9k1e4ic5cvgjg">
+      <w:hyperlink w:history="1" r:id="rIda54bja__0x_rzagio_kg6">
         <w:r>
           <w:rPr>
             <w:rFonts w:ascii="Arial" w:cs="Arial" w:eastAsia="Arial" w:hAnsi="Arial"/>
@@ -4522,7 +4587,7 @@
         </w:numPr>
         <w:spacing w:after="60"/>
       </w:pPr>
-      <w:hyperlink w:history="1" r:id="rIdmeaxktjjy8taw67sfp9gj">
+      <w:hyperlink w:history="1" r:id="rIdpxo4a1tczage5mavcjk12">
         <w:r>
           <w:rPr>
             <w:rFonts w:ascii="Arial" w:cs="Arial" w:eastAsia="Arial" w:hAnsi="Arial"/>
@@ -4544,7 +4609,7 @@
         </w:numPr>
         <w:spacing w:after="60"/>
       </w:pPr>
-      <w:hyperlink w:history="1" r:id="rIdf_bsojgalberp0oxx4d_i">
+      <w:hyperlink w:history="1" r:id="rIdqalwcj8tlkvvcyrrdgqbt">
         <w:r>
           <w:rPr>
             <w:rFonts w:ascii="Arial" w:cs="Arial" w:eastAsia="Arial" w:hAnsi="Arial"/>
@@ -4566,7 +4631,7 @@
         </w:numPr>
         <w:spacing w:after="60"/>
       </w:pPr>
-      <w:hyperlink w:history="1" r:id="rIdusyvbgah1dhws_3aod_2p">
+      <w:hyperlink w:history="1" r:id="rIdc5phhkkk_iu3z7v-27gu7">
         <w:r>
           <w:rPr>
             <w:rFonts w:ascii="Arial" w:cs="Arial" w:eastAsia="Arial" w:hAnsi="Arial"/>
@@ -4588,7 +4653,7 @@
         </w:numPr>
         <w:spacing w:after="60"/>
       </w:pPr>
-      <w:hyperlink w:history="1" r:id="rIdkav_-dbfs9p2sld0suu79">
+      <w:hyperlink w:history="1" r:id="rIdnjkax4dt8kvaju2abkmyw">
         <w:r>
           <w:rPr>
             <w:rFonts w:ascii="Arial" w:cs="Arial" w:eastAsia="Arial" w:hAnsi="Arial"/>
@@ -4610,7 +4675,7 @@
         </w:numPr>
         <w:spacing w:after="60"/>
       </w:pPr>
-      <w:hyperlink w:history="1" r:id="rIdplqofft4_6ce-zlh7ovep">
+      <w:hyperlink w:history="1" r:id="rIdgouexwszg3lbqwucpgi5z">
         <w:r>
           <w:rPr>
             <w:rFonts w:ascii="Arial" w:cs="Arial" w:eastAsia="Arial" w:hAnsi="Arial"/>

</xml_diff>

<commit_message>
Cámara: ventas a expositores; Claude: eficiencia del área; sin versión en inglés
Co-Authored-By: Claude Opus 5.5 <noreply@anthropic.com>
Claude-Session: https://claude.ai/code/session_01GFkSYVqa8d2zDX8Qy6Lwpz
</commit_message>
<xml_diff>
--- a/Presupuesto_2027_Comunicacion_RRPP_Poliforum_Leon.docx
+++ b/Presupuesto_2027_Comunicacion_RRPP_Poliforum_Leon.docx
@@ -843,7 +843,7 @@
             </w:tcMar>
           </w:tcPr>
           <w:p>
-            <w:hyperlink w:history="1" r:id="rIdq2xxaeoctnmude8jwwfc0">
+            <w:hyperlink w:history="1" r:id="rIdyswjcpxiqr65mzaqvfldd">
               <w:r>
                 <w:rPr>
                   <w:rFonts w:ascii="Arial" w:cs="Arial" w:eastAsia="Arial" w:hAnsi="Arial"/>
@@ -986,7 +986,7 @@
             </w:tcMar>
           </w:tcPr>
           <w:p>
-            <w:hyperlink w:history="1" r:id="rId1di6r0b7yg0-xm-d7ba9j">
+            <w:hyperlink w:history="1" r:id="rIdrqo4nysmiwgowt0d5j1ay">
               <w:r>
                 <w:rPr>
                   <w:rFonts w:ascii="Arial" w:cs="Arial" w:eastAsia="Arial" w:hAnsi="Arial"/>
@@ -1129,7 +1129,7 @@
             </w:tcMar>
           </w:tcPr>
           <w:p>
-            <w:hyperlink w:history="1" r:id="rIde688kthplqlh16sw9b1qp">
+            <w:hyperlink w:history="1" r:id="rId1posukbmdmgszsa_iivv3">
               <w:r>
                 <w:rPr>
                   <w:rFonts w:ascii="Arial" w:cs="Arial" w:eastAsia="Arial" w:hAnsi="Arial"/>
@@ -1365,7 +1365,7 @@
           <w:sz w:val="22"/>
           <w:szCs w:val="22"/>
         </w:rPr>
-        <w:t xml:space="preserve">Sube el nivel de todo lo que publicamos: imagen estable, 4K y buena respuesta con la poca luz de salones y foros. El contenido institucional y de redes se ve profesional sin contratar producción externa.</w:t>
+        <w:t xml:space="preserve">Hacemos contenido para redes y video institucional todo el año. Una mejor cámara sube la calidad de cada video de redes (imagen estable, 4K y buena respuesta con la poca luz de salones y foros), optimiza los tiempos de producción porque ya no hay que contratar producción externa y, con contenido de mejor nivel, podemos vender más paquetes y servicios de difusión a expositores y organizadores.</w:t>
       </w:r>
     </w:p>
     <w:p>
@@ -1390,7 +1390,7 @@
           <w:sz w:val="22"/>
           <w:szCs w:val="22"/>
         </w:rPr>
-        <w:t xml:space="preserve">El video institucional del recinto, entrevistas a organizadores y el reel del montaje de un evento se graban con calidad de producción y salen el mismo día.</w:t>
+        <w:t xml:space="preserve">El video institucional, los reels de eventos y las cápsulas para expositores se graban en casa con calidad profesional y salen el mismo día. Esa misma calidad se ofrece como paquete de difusión a los expositores.</w:t>
       </w:r>
     </w:p>
     <w:p>
@@ -4543,7 +4543,7 @@
         </w:numPr>
         <w:spacing w:after="60"/>
       </w:pPr>
-      <w:hyperlink w:history="1" r:id="rId3olp20skysyehbv6gexir">
+      <w:hyperlink w:history="1" r:id="rIdkys0gpnzvcn544iy3nacm">
         <w:r>
           <w:rPr>
             <w:rFonts w:ascii="Arial" w:cs="Arial" w:eastAsia="Arial" w:hAnsi="Arial"/>
@@ -4565,7 +4565,7 @@
         </w:numPr>
         <w:spacing w:after="60"/>
       </w:pPr>
-      <w:hyperlink w:history="1" r:id="rIda54bja__0x_rzagio_kg6">
+      <w:hyperlink w:history="1" r:id="rId224vlvgjimx7oa-ahikvr">
         <w:r>
           <w:rPr>
             <w:rFonts w:ascii="Arial" w:cs="Arial" w:eastAsia="Arial" w:hAnsi="Arial"/>
@@ -4587,7 +4587,7 @@
         </w:numPr>
         <w:spacing w:after="60"/>
       </w:pPr>
-      <w:hyperlink w:history="1" r:id="rIdpxo4a1tczage5mavcjk12">
+      <w:hyperlink w:history="1" r:id="rIdi6nlzi2a6dasigimceowp">
         <w:r>
           <w:rPr>
             <w:rFonts w:ascii="Arial" w:cs="Arial" w:eastAsia="Arial" w:hAnsi="Arial"/>
@@ -4609,7 +4609,7 @@
         </w:numPr>
         <w:spacing w:after="60"/>
       </w:pPr>
-      <w:hyperlink w:history="1" r:id="rIdqalwcj8tlkvvcyrrdgqbt">
+      <w:hyperlink w:history="1" r:id="rId5rladzjeybt56yezbb_ff">
         <w:r>
           <w:rPr>
             <w:rFonts w:ascii="Arial" w:cs="Arial" w:eastAsia="Arial" w:hAnsi="Arial"/>
@@ -4631,7 +4631,7 @@
         </w:numPr>
         <w:spacing w:after="60"/>
       </w:pPr>
-      <w:hyperlink w:history="1" r:id="rIdc5phhkkk_iu3z7v-27gu7">
+      <w:hyperlink w:history="1" r:id="rIdvvf1woktkquo43tgb7yne">
         <w:r>
           <w:rPr>
             <w:rFonts w:ascii="Arial" w:cs="Arial" w:eastAsia="Arial" w:hAnsi="Arial"/>
@@ -4653,7 +4653,7 @@
         </w:numPr>
         <w:spacing w:after="60"/>
       </w:pPr>
-      <w:hyperlink w:history="1" r:id="rIdnjkax4dt8kvaju2abkmyw">
+      <w:hyperlink w:history="1" r:id="rId7o2v7zarzvibxo47zrdjh">
         <w:r>
           <w:rPr>
             <w:rFonts w:ascii="Arial" w:cs="Arial" w:eastAsia="Arial" w:hAnsi="Arial"/>
@@ -4675,7 +4675,7 @@
         </w:numPr>
         <w:spacing w:after="60"/>
       </w:pPr>
-      <w:hyperlink w:history="1" r:id="rIdgouexwszg3lbqwucpgi5z">
+      <w:hyperlink w:history="1" r:id="rId23cegwdcxw6gov3dd3pxb">
         <w:r>
           <w:rPr>
             <w:rFonts w:ascii="Arial" w:cs="Arial" w:eastAsia="Arial" w:hAnsi="Arial"/>

</xml_diff>

<commit_message>
Claude y Canva a lo esencial de la web; preguntas difíciles y respuestas
Co-Authored-By: Claude Opus 5.5 <noreply@anthropic.com>
Claude-Session: https://claude.ai/code/session_01GFkSYVqa8d2zDX8Qy6Lwpz
</commit_message>
<xml_diff>
--- a/Presupuesto_2027_Comunicacion_RRPP_Poliforum_Leon.docx
+++ b/Presupuesto_2027_Comunicacion_RRPP_Poliforum_Leon.docx
@@ -843,7 +843,7 @@
             </w:tcMar>
           </w:tcPr>
           <w:p>
-            <w:hyperlink w:history="1" r:id="rIdyswjcpxiqr65mzaqvfldd">
+            <w:hyperlink w:history="1" r:id="rIdokt0rf1rvwvaq2r_s1ru4">
               <w:r>
                 <w:rPr>
                   <w:rFonts w:ascii="Arial" w:cs="Arial" w:eastAsia="Arial" w:hAnsi="Arial"/>
@@ -986,7 +986,7 @@
             </w:tcMar>
           </w:tcPr>
           <w:p>
-            <w:hyperlink w:history="1" r:id="rIdrqo4nysmiwgowt0d5j1ay">
+            <w:hyperlink w:history="1" r:id="rIdzg0s4tcuhyeh3w38y66fm">
               <w:r>
                 <w:rPr>
                   <w:rFonts w:ascii="Arial" w:cs="Arial" w:eastAsia="Arial" w:hAnsi="Arial"/>
@@ -1129,7 +1129,7 @@
             </w:tcMar>
           </w:tcPr>
           <w:p>
-            <w:hyperlink w:history="1" r:id="rId1posukbmdmgszsa_iivv3">
+            <w:hyperlink w:history="1" r:id="rIdwfxqnlktpo3tfqk6dy5pi">
               <w:r>
                 <w:rPr>
                   <w:rFonts w:ascii="Arial" w:cs="Arial" w:eastAsia="Arial" w:hAnsi="Arial"/>
@@ -4515,6 +4515,11 @@
       </w:r>
     </w:p>
     <w:p>
+      <w:r>
+        <w:br w:type="page"/>
+      </w:r>
+    </w:p>
+    <w:p>
       <w:pPr>
         <w:pStyle w:val="Heading1"/>
         <w:pBdr>
@@ -4531,7 +4536,351 @@
           <w:sz w:val="32"/>
           <w:szCs w:val="32"/>
         </w:rPr>
-        <w:t xml:space="preserve">7. Links de compra</w:t>
+        <w:t xml:space="preserve">8. Preguntas difíciles y respuestas</w:t>
+      </w:r>
+    </w:p>
+    <w:p>
+      <w:pPr>
+        <w:spacing w:after="120" w:before="0"/>
+      </w:pPr>
+      <w:r>
+        <w:rPr>
+          <w:rFonts w:ascii="Arial" w:cs="Arial" w:eastAsia="Arial" w:hAnsi="Arial"/>
+          <w:color w:val="0E3A4E"/>
+          <w:sz w:val="22"/>
+          <w:szCs w:val="22"/>
+        </w:rPr>
+        <w:t xml:space="preserve">Lo que puede preguntar Dirección o Finanzas antes de aprobar, y por qué cada cosa sigue en el presupuesto.</w:t>
+      </w:r>
+    </w:p>
+    <w:p>
+      <w:pPr>
+        <w:pStyle w:val="Heading2"/>
+        <w:spacing w:after="80" w:before="200"/>
+      </w:pPr>
+      <w:r>
+        <w:rPr>
+          <w:rFonts w:ascii="Arial" w:cs="Arial" w:eastAsia="Arial" w:hAnsi="Arial"/>
+          <w:b/>
+          <w:bCs/>
+          <w:color w:val="175772"/>
+          <w:sz w:val="26"/>
+          <w:szCs w:val="26"/>
+        </w:rPr>
+        <w:t xml:space="preserve">¿Para qué ManyChat si Meta Business Suite es gratis?</w:t>
+      </w:r>
+    </w:p>
+    <w:p>
+      <w:pPr>
+        <w:spacing w:after="120" w:before="0"/>
+      </w:pPr>
+      <w:r>
+        <w:rPr>
+          <w:rFonts w:ascii="Arial" w:cs="Arial" w:eastAsia="Arial" w:hAnsi="Arial"/>
+          <w:color w:val="0E3A4E"/>
+          <w:sz w:val="22"/>
+          <w:szCs w:val="22"/>
+        </w:rPr>
+        <w:t xml:space="preserve">Meta Business Suite solo funciona desde computadora, no da estadísticas de las dinámicas y sus respuestas son básicas. ManyChat contesta 24/7 en Instagram, Facebook y Messenger, aguanta 2,500 personas al mes y mide cuántos leads llegan. Con un solo evento o expositor que se cierre por un lead, el año queda pagado.</w:t>
+      </w:r>
+    </w:p>
+    <w:p>
+      <w:pPr>
+        <w:pStyle w:val="Heading2"/>
+        <w:spacing w:after="80" w:before="200"/>
+      </w:pPr>
+      <w:r>
+        <w:rPr>
+          <w:rFonts w:ascii="Arial" w:cs="Arial" w:eastAsia="Arial" w:hAnsi="Arial"/>
+          <w:b/>
+          <w:bCs/>
+          <w:color w:val="175772"/>
+          <w:sz w:val="26"/>
+          <w:szCs w:val="26"/>
+        </w:rPr>
+        <w:t xml:space="preserve">¿Ya probaron que funciona?</w:t>
+      </w:r>
+    </w:p>
+    <w:p>
+      <w:pPr>
+        <w:spacing w:after="120" w:before="0"/>
+      </w:pPr>
+      <w:r>
+        <w:rPr>
+          <w:rFonts w:ascii="Arial" w:cs="Arial" w:eastAsia="Arial" w:hAnsi="Arial"/>
+          <w:color w:val="0E3A4E"/>
+          <w:sz w:val="22"/>
+          <w:szCs w:val="22"/>
+        </w:rPr>
+        <w:t xml:space="preserve">Sí. En la campaña de Maricela Cordero llegaron 3 leads sin pagar publicidad, respondiendo a mano. ManyChat hace lo mismo en automático con cada comentario y mensaje.</w:t>
+      </w:r>
+    </w:p>
+    <w:p>
+      <w:pPr>
+        <w:pStyle w:val="Heading2"/>
+        <w:spacing w:after="80" w:before="200"/>
+      </w:pPr>
+      <w:r>
+        <w:rPr>
+          <w:rFonts w:ascii="Arial" w:cs="Arial" w:eastAsia="Arial" w:hAnsi="Arial"/>
+          <w:b/>
+          <w:bCs/>
+          <w:color w:val="175772"/>
+          <w:sz w:val="26"/>
+          <w:szCs w:val="26"/>
+        </w:rPr>
+        <w:t xml:space="preserve">¿Para qué Metricool si Facebook e Instagram se programan gratis?</w:t>
+      </w:r>
+    </w:p>
+    <w:p>
+      <w:pPr>
+        <w:spacing w:after="120" w:before="0"/>
+      </w:pPr>
+      <w:r>
+        <w:rPr>
+          <w:rFonts w:ascii="Arial" w:cs="Arial" w:eastAsia="Arial" w:hAnsi="Arial"/>
+          <w:color w:val="0E3A4E"/>
+          <w:sz w:val="22"/>
+          <w:szCs w:val="22"/>
+        </w:rPr>
+        <w:t xml:space="preserve">Lo gratis solo cubre Facebook e Instagram. Metricool programa también TikTok, YouTube y LinkedIn desde un calendario y saca el reporte mensual para Dirección en un clic. Ahorra horas cada semana.</w:t>
+      </w:r>
+    </w:p>
+    <w:p>
+      <w:pPr>
+        <w:pStyle w:val="Heading2"/>
+        <w:spacing w:after="80" w:before="200"/>
+      </w:pPr>
+      <w:r>
+        <w:rPr>
+          <w:rFonts w:ascii="Arial" w:cs="Arial" w:eastAsia="Arial" w:hAnsi="Arial"/>
+          <w:b/>
+          <w:bCs/>
+          <w:color w:val="175772"/>
+          <w:sz w:val="26"/>
+          <w:szCs w:val="26"/>
+        </w:rPr>
+        <w:t xml:space="preserve">¿Para qué X Premium si casi no usamos X?</w:t>
+      </w:r>
+    </w:p>
+    <w:p>
+      <w:pPr>
+        <w:spacing w:after="120" w:before="0"/>
+      </w:pPr>
+      <w:r>
+        <w:rPr>
+          <w:rFonts w:ascii="Arial" w:cs="Arial" w:eastAsia="Arial" w:hAnsi="Arial"/>
+          <w:color w:val="0E3A4E"/>
+          <w:sz w:val="22"/>
+          <w:szCs w:val="22"/>
+        </w:rPr>
+        <w:t xml:space="preserve">En eventos masivos la gente busca avisos de accesos, estacionamiento y horarios. La palomita evita que una cuenta falsa se haga pasar por el recinto. Son $127 al mes.</w:t>
+      </w:r>
+    </w:p>
+    <w:p>
+      <w:pPr>
+        <w:pStyle w:val="Heading2"/>
+        <w:spacing w:after="80" w:before="200"/>
+      </w:pPr>
+      <w:r>
+        <w:rPr>
+          <w:rFonts w:ascii="Arial" w:cs="Arial" w:eastAsia="Arial" w:hAnsi="Arial"/>
+          <w:b/>
+          <w:bCs/>
+          <w:color w:val="175772"/>
+          <w:sz w:val="26"/>
+          <w:szCs w:val="26"/>
+        </w:rPr>
+        <w:t xml:space="preserve">¿Por qué una cámara si los celulares graban en 4K?</w:t>
+      </w:r>
+    </w:p>
+    <w:p>
+      <w:pPr>
+        <w:spacing w:after="120" w:before="0"/>
+      </w:pPr>
+      <w:r>
+        <w:rPr>
+          <w:rFonts w:ascii="Arial" w:cs="Arial" w:eastAsia="Arial" w:hAnsi="Arial"/>
+          <w:color w:val="0E3A4E"/>
+          <w:sz w:val="22"/>
+          <w:szCs w:val="22"/>
+        </w:rPr>
+        <w:t xml:space="preserve">El celular no tiene estabilizador de cámara, se calienta, se queda sin batería y es personal. La cámara es equipo del recinto: imagen estable, mejor sensor con poca luz y calidad que se puede vender a expositores como paquete de difusión.</w:t>
+      </w:r>
+    </w:p>
+    <w:p>
+      <w:pPr>
+        <w:pStyle w:val="Heading2"/>
+        <w:spacing w:after="80" w:before="200"/>
+      </w:pPr>
+      <w:r>
+        <w:rPr>
+          <w:rFonts w:ascii="Arial" w:cs="Arial" w:eastAsia="Arial" w:hAnsi="Arial"/>
+          <w:b/>
+          <w:bCs/>
+          <w:color w:val="175772"/>
+          <w:sz w:val="26"/>
+          <w:szCs w:val="26"/>
+        </w:rPr>
+        <w:t xml:space="preserve">¿Cómo regresa la inversión?</w:t>
+      </w:r>
+    </w:p>
+    <w:p>
+      <w:pPr>
+        <w:spacing w:after="120" w:before="0"/>
+      </w:pPr>
+      <w:r>
+        <w:rPr>
+          <w:rFonts w:ascii="Arial" w:cs="Arial" w:eastAsia="Arial" w:hAnsi="Arial"/>
+          <w:color w:val="0E3A4E"/>
+          <w:sz w:val="22"/>
+          <w:szCs w:val="22"/>
+        </w:rPr>
+        <w:t xml:space="preserve">Tres vías: paquetes de difusión a expositores con video de mejor calidad, leads de ManyChat sin pagar publicidad y ahorro en producción externa de video institucional.</w:t>
+      </w:r>
+    </w:p>
+    <w:p>
+      <w:pPr>
+        <w:pStyle w:val="Heading2"/>
+        <w:spacing w:after="80" w:before="200"/>
+      </w:pPr>
+      <w:r>
+        <w:rPr>
+          <w:rFonts w:ascii="Arial" w:cs="Arial" w:eastAsia="Arial" w:hAnsi="Arial"/>
+          <w:b/>
+          <w:bCs/>
+          <w:color w:val="175772"/>
+          <w:sz w:val="26"/>
+          <w:szCs w:val="26"/>
+        </w:rPr>
+        <w:t xml:space="preserve">¿Por qué los precios de cámara vienen en rango?</w:t>
+      </w:r>
+    </w:p>
+    <w:p>
+      <w:pPr>
+        <w:spacing w:after="120" w:before="0"/>
+      </w:pPr>
+      <w:r>
+        <w:rPr>
+          <w:rFonts w:ascii="Arial" w:cs="Arial" w:eastAsia="Arial" w:hAnsi="Arial"/>
+          <w:color w:val="0E3A4E"/>
+          <w:sz w:val="22"/>
+          <w:szCs w:val="22"/>
+        </w:rPr>
+        <w:t xml:space="preserve">Cambian según vendedor y promoción. Se compra en tienda oficial (DJI Store, Sony o vendedor verificado) al precio más bajo del rango al momento de aprobar.</w:t>
+      </w:r>
+    </w:p>
+    <w:p>
+      <w:pPr>
+        <w:pStyle w:val="Heading2"/>
+        <w:spacing w:after="80" w:before="200"/>
+      </w:pPr>
+      <w:r>
+        <w:rPr>
+          <w:rFonts w:ascii="Arial" w:cs="Arial" w:eastAsia="Arial" w:hAnsi="Arial"/>
+          <w:b/>
+          <w:bCs/>
+          <w:color w:val="175772"/>
+          <w:sz w:val="26"/>
+          <w:szCs w:val="26"/>
+        </w:rPr>
+        <w:t xml:space="preserve">¿Y si sube el dólar?</w:t>
+      </w:r>
+    </w:p>
+    <w:p>
+      <w:pPr>
+        <w:spacing w:after="120" w:before="0"/>
+      </w:pPr>
+      <w:r>
+        <w:rPr>
+          <w:rFonts w:ascii="Arial" w:cs="Arial" w:eastAsia="Arial" w:hAnsi="Arial"/>
+          <w:color w:val="0E3A4E"/>
+          <w:sz w:val="22"/>
+          <w:szCs w:val="22"/>
+        </w:rPr>
+        <w:t xml:space="preserve">ManyChat y Metricool se calcularon a $19.00 por dólar, arriba del tipo de cambio actual, así que ya traen colchón.</w:t>
+      </w:r>
+    </w:p>
+    <w:p>
+      <w:pPr>
+        <w:pStyle w:val="Heading2"/>
+        <w:spacing w:after="80" w:before="200"/>
+      </w:pPr>
+      <w:r>
+        <w:rPr>
+          <w:rFonts w:ascii="Arial" w:cs="Arial" w:eastAsia="Arial" w:hAnsi="Arial"/>
+          <w:b/>
+          <w:bCs/>
+          <w:color w:val="175772"/>
+          <w:sz w:val="26"/>
+          <w:szCs w:val="26"/>
+        </w:rPr>
+        <w:t xml:space="preserve">¿Por qué pagar anual y no mes a mes?</w:t>
+      </w:r>
+    </w:p>
+    <w:p>
+      <w:pPr>
+        <w:spacing w:after="120" w:before="0"/>
+      </w:pPr>
+      <w:r>
+        <w:rPr>
+          <w:rFonts w:ascii="Arial" w:cs="Arial" w:eastAsia="Arial" w:hAnsi="Arial"/>
+          <w:color w:val="0E3A4E"/>
+          <w:sz w:val="22"/>
+          <w:szCs w:val="22"/>
+        </w:rPr>
+        <w:t xml:space="preserve">Pagar anual ahorra $4,187 al año contra pagar mes a mes.</w:t>
+      </w:r>
+    </w:p>
+    <w:p>
+      <w:pPr>
+        <w:pStyle w:val="Heading2"/>
+        <w:spacing w:after="80" w:before="200"/>
+      </w:pPr>
+      <w:r>
+        <w:rPr>
+          <w:rFonts w:ascii="Arial" w:cs="Arial" w:eastAsia="Arial" w:hAnsi="Arial"/>
+          <w:b/>
+          <w:bCs/>
+          <w:color w:val="175772"/>
+          <w:sz w:val="26"/>
+          <w:szCs w:val="26"/>
+        </w:rPr>
+        <w:t xml:space="preserve">¿Factura?</w:t>
+      </w:r>
+    </w:p>
+    <w:p>
+      <w:pPr>
+        <w:spacing w:after="120" w:before="0"/>
+      </w:pPr>
+      <w:r>
+        <w:rPr>
+          <w:rFonts w:ascii="Arial" w:cs="Arial" w:eastAsia="Arial" w:hAnsi="Arial"/>
+          <w:color w:val="0E3A4E"/>
+          <w:sz w:val="22"/>
+          <w:szCs w:val="22"/>
+        </w:rPr>
+        <w:t xml:space="preserve">Son proveedores del extranjero: entregan comprobante de pago descargable, no CFDI. Confirmar con Contabilidad cómo se registra.</w:t>
+      </w:r>
+    </w:p>
+    <w:p>
+      <w:pPr>
+        <w:pStyle w:val="Heading1"/>
+        <w:pBdr>
+          <w:bottom w:val="single" w:color="A8C243" w:sz="12" w:space="4"/>
+        </w:pBdr>
+        <w:spacing w:after="120" w:before="240"/>
+      </w:pPr>
+      <w:r>
+        <w:rPr>
+          <w:rFonts w:ascii="Arial" w:cs="Arial" w:eastAsia="Arial" w:hAnsi="Arial"/>
+          <w:b/>
+          <w:bCs/>
+          <w:color w:val="175772"/>
+          <w:sz w:val="32"/>
+          <w:szCs w:val="32"/>
+        </w:rPr>
+        <w:t xml:space="preserve">9. Links de compra</w:t>
       </w:r>
     </w:p>
     <w:p>
@@ -4543,7 +4892,7 @@
         </w:numPr>
         <w:spacing w:after="60"/>
       </w:pPr>
-      <w:hyperlink w:history="1" r:id="rIdkys0gpnzvcn544iy3nacm">
+      <w:hyperlink w:history="1" r:id="rIdpcdbvyfsv4taarabgexd3">
         <w:r>
           <w:rPr>
             <w:rFonts w:ascii="Arial" w:cs="Arial" w:eastAsia="Arial" w:hAnsi="Arial"/>
@@ -4565,7 +4914,7 @@
         </w:numPr>
         <w:spacing w:after="60"/>
       </w:pPr>
-      <w:hyperlink w:history="1" r:id="rId224vlvgjimx7oa-ahikvr">
+      <w:hyperlink w:history="1" r:id="rIdtjohssvgl8zomiqocpyon">
         <w:r>
           <w:rPr>
             <w:rFonts w:ascii="Arial" w:cs="Arial" w:eastAsia="Arial" w:hAnsi="Arial"/>
@@ -4587,7 +4936,7 @@
         </w:numPr>
         <w:spacing w:after="60"/>
       </w:pPr>
-      <w:hyperlink w:history="1" r:id="rIdi6nlzi2a6dasigimceowp">
+      <w:hyperlink w:history="1" r:id="rId5mu74hieejclg4ir3v4fq">
         <w:r>
           <w:rPr>
             <w:rFonts w:ascii="Arial" w:cs="Arial" w:eastAsia="Arial" w:hAnsi="Arial"/>
@@ -4609,7 +4958,7 @@
         </w:numPr>
         <w:spacing w:after="60"/>
       </w:pPr>
-      <w:hyperlink w:history="1" r:id="rId5rladzjeybt56yezbb_ff">
+      <w:hyperlink w:history="1" r:id="rId4pwo2z-p3op0vkqu8sa_w">
         <w:r>
           <w:rPr>
             <w:rFonts w:ascii="Arial" w:cs="Arial" w:eastAsia="Arial" w:hAnsi="Arial"/>
@@ -4631,7 +4980,7 @@
         </w:numPr>
         <w:spacing w:after="60"/>
       </w:pPr>
-      <w:hyperlink w:history="1" r:id="rIdvvf1woktkquo43tgb7yne">
+      <w:hyperlink w:history="1" r:id="rIdqono3gie80m2mpjuxf7uu">
         <w:r>
           <w:rPr>
             <w:rFonts w:ascii="Arial" w:cs="Arial" w:eastAsia="Arial" w:hAnsi="Arial"/>
@@ -4653,7 +5002,7 @@
         </w:numPr>
         <w:spacing w:after="60"/>
       </w:pPr>
-      <w:hyperlink w:history="1" r:id="rId7o2v7zarzvibxo47zrdjh">
+      <w:hyperlink w:history="1" r:id="rId5qe9ftkw1tdmy1rg6a6b7">
         <w:r>
           <w:rPr>
             <w:rFonts w:ascii="Arial" w:cs="Arial" w:eastAsia="Arial" w:hAnsi="Arial"/>
@@ -4675,7 +5024,7 @@
         </w:numPr>
         <w:spacing w:after="60"/>
       </w:pPr>
-      <w:hyperlink w:history="1" r:id="rId23cegwdcxw6gov3dd3pxb">
+      <w:hyperlink w:history="1" r:id="rId2om8ja5-kbofb94rsg5vp">
         <w:r>
           <w:rPr>
             <w:rFonts w:ascii="Arial" w:cs="Arial" w:eastAsia="Arial" w:hAnsi="Arial"/>

</xml_diff>

<commit_message>
Quitar preguntas y respuestas; agregar condiciones del presupuesto
Co-Authored-By: Claude Opus 5.5 <noreply@anthropic.com>
Claude-Session: https://claude.ai/code/session_01GFkSYVqa8d2zDX8Qy6Lwpz
</commit_message>
<xml_diff>
--- a/Presupuesto_2027_Comunicacion_RRPP_Poliforum_Leon.docx
+++ b/Presupuesto_2027_Comunicacion_RRPP_Poliforum_Leon.docx
@@ -843,7 +843,7 @@
             </w:tcMar>
           </w:tcPr>
           <w:p>
-            <w:hyperlink w:history="1" r:id="rIdokt0rf1rvwvaq2r_s1ru4">
+            <w:hyperlink w:history="1" r:id="rIderniwxqwewnj0srbl5nnx">
               <w:r>
                 <w:rPr>
                   <w:rFonts w:ascii="Arial" w:cs="Arial" w:eastAsia="Arial" w:hAnsi="Arial"/>
@@ -986,7 +986,7 @@
             </w:tcMar>
           </w:tcPr>
           <w:p>
-            <w:hyperlink w:history="1" r:id="rIdzg0s4tcuhyeh3w38y66fm">
+            <w:hyperlink w:history="1" r:id="rIdfotayinlk66mbnankd1qm">
               <w:r>
                 <w:rPr>
                   <w:rFonts w:ascii="Arial" w:cs="Arial" w:eastAsia="Arial" w:hAnsi="Arial"/>
@@ -1129,7 +1129,7 @@
             </w:tcMar>
           </w:tcPr>
           <w:p>
-            <w:hyperlink w:history="1" r:id="rIdwfxqnlktpo3tfqk6dy5pi">
+            <w:hyperlink w:history="1" r:id="rId2oyiphkeqjwxpn9ypkqwp">
               <w:r>
                 <w:rPr>
                   <w:rFonts w:ascii="Arial" w:cs="Arial" w:eastAsia="Arial" w:hAnsi="Arial"/>
@@ -4515,11 +4515,6 @@
       </w:r>
     </w:p>
     <w:p>
-      <w:r>
-        <w:br w:type="page"/>
-      </w:r>
-    </w:p>
-    <w:p>
       <w:pPr>
         <w:pStyle w:val="Heading1"/>
         <w:pBdr>
@@ -4536,351 +4531,7 @@
           <w:sz w:val="32"/>
           <w:szCs w:val="32"/>
         </w:rPr>
-        <w:t xml:space="preserve">8. Preguntas difíciles y respuestas</w:t>
-      </w:r>
-    </w:p>
-    <w:p>
-      <w:pPr>
-        <w:spacing w:after="120" w:before="0"/>
-      </w:pPr>
-      <w:r>
-        <w:rPr>
-          <w:rFonts w:ascii="Arial" w:cs="Arial" w:eastAsia="Arial" w:hAnsi="Arial"/>
-          <w:color w:val="0E3A4E"/>
-          <w:sz w:val="22"/>
-          <w:szCs w:val="22"/>
-        </w:rPr>
-        <w:t xml:space="preserve">Lo que puede preguntar Dirección o Finanzas antes de aprobar, y por qué cada cosa sigue en el presupuesto.</w:t>
-      </w:r>
-    </w:p>
-    <w:p>
-      <w:pPr>
-        <w:pStyle w:val="Heading2"/>
-        <w:spacing w:after="80" w:before="200"/>
-      </w:pPr>
-      <w:r>
-        <w:rPr>
-          <w:rFonts w:ascii="Arial" w:cs="Arial" w:eastAsia="Arial" w:hAnsi="Arial"/>
-          <w:b/>
-          <w:bCs/>
-          <w:color w:val="175772"/>
-          <w:sz w:val="26"/>
-          <w:szCs w:val="26"/>
-        </w:rPr>
-        <w:t xml:space="preserve">¿Para qué ManyChat si Meta Business Suite es gratis?</w:t>
-      </w:r>
-    </w:p>
-    <w:p>
-      <w:pPr>
-        <w:spacing w:after="120" w:before="0"/>
-      </w:pPr>
-      <w:r>
-        <w:rPr>
-          <w:rFonts w:ascii="Arial" w:cs="Arial" w:eastAsia="Arial" w:hAnsi="Arial"/>
-          <w:color w:val="0E3A4E"/>
-          <w:sz w:val="22"/>
-          <w:szCs w:val="22"/>
-        </w:rPr>
-        <w:t xml:space="preserve">Meta Business Suite solo funciona desde computadora, no da estadísticas de las dinámicas y sus respuestas son básicas. ManyChat contesta 24/7 en Instagram, Facebook y Messenger, aguanta 2,500 personas al mes y mide cuántos leads llegan. Con un solo evento o expositor que se cierre por un lead, el año queda pagado.</w:t>
-      </w:r>
-    </w:p>
-    <w:p>
-      <w:pPr>
-        <w:pStyle w:val="Heading2"/>
-        <w:spacing w:after="80" w:before="200"/>
-      </w:pPr>
-      <w:r>
-        <w:rPr>
-          <w:rFonts w:ascii="Arial" w:cs="Arial" w:eastAsia="Arial" w:hAnsi="Arial"/>
-          <w:b/>
-          <w:bCs/>
-          <w:color w:val="175772"/>
-          <w:sz w:val="26"/>
-          <w:szCs w:val="26"/>
-        </w:rPr>
-        <w:t xml:space="preserve">¿Ya probaron que funciona?</w:t>
-      </w:r>
-    </w:p>
-    <w:p>
-      <w:pPr>
-        <w:spacing w:after="120" w:before="0"/>
-      </w:pPr>
-      <w:r>
-        <w:rPr>
-          <w:rFonts w:ascii="Arial" w:cs="Arial" w:eastAsia="Arial" w:hAnsi="Arial"/>
-          <w:color w:val="0E3A4E"/>
-          <w:sz w:val="22"/>
-          <w:szCs w:val="22"/>
-        </w:rPr>
-        <w:t xml:space="preserve">Sí. En la campaña de Maricela Cordero llegaron 3 leads sin pagar publicidad, respondiendo a mano. ManyChat hace lo mismo en automático con cada comentario y mensaje.</w:t>
-      </w:r>
-    </w:p>
-    <w:p>
-      <w:pPr>
-        <w:pStyle w:val="Heading2"/>
-        <w:spacing w:after="80" w:before="200"/>
-      </w:pPr>
-      <w:r>
-        <w:rPr>
-          <w:rFonts w:ascii="Arial" w:cs="Arial" w:eastAsia="Arial" w:hAnsi="Arial"/>
-          <w:b/>
-          <w:bCs/>
-          <w:color w:val="175772"/>
-          <w:sz w:val="26"/>
-          <w:szCs w:val="26"/>
-        </w:rPr>
-        <w:t xml:space="preserve">¿Para qué Metricool si Facebook e Instagram se programan gratis?</w:t>
-      </w:r>
-    </w:p>
-    <w:p>
-      <w:pPr>
-        <w:spacing w:after="120" w:before="0"/>
-      </w:pPr>
-      <w:r>
-        <w:rPr>
-          <w:rFonts w:ascii="Arial" w:cs="Arial" w:eastAsia="Arial" w:hAnsi="Arial"/>
-          <w:color w:val="0E3A4E"/>
-          <w:sz w:val="22"/>
-          <w:szCs w:val="22"/>
-        </w:rPr>
-        <w:t xml:space="preserve">Lo gratis solo cubre Facebook e Instagram. Metricool programa también TikTok, YouTube y LinkedIn desde un calendario y saca el reporte mensual para Dirección en un clic. Ahorra horas cada semana.</w:t>
-      </w:r>
-    </w:p>
-    <w:p>
-      <w:pPr>
-        <w:pStyle w:val="Heading2"/>
-        <w:spacing w:after="80" w:before="200"/>
-      </w:pPr>
-      <w:r>
-        <w:rPr>
-          <w:rFonts w:ascii="Arial" w:cs="Arial" w:eastAsia="Arial" w:hAnsi="Arial"/>
-          <w:b/>
-          <w:bCs/>
-          <w:color w:val="175772"/>
-          <w:sz w:val="26"/>
-          <w:szCs w:val="26"/>
-        </w:rPr>
-        <w:t xml:space="preserve">¿Para qué X Premium si casi no usamos X?</w:t>
-      </w:r>
-    </w:p>
-    <w:p>
-      <w:pPr>
-        <w:spacing w:after="120" w:before="0"/>
-      </w:pPr>
-      <w:r>
-        <w:rPr>
-          <w:rFonts w:ascii="Arial" w:cs="Arial" w:eastAsia="Arial" w:hAnsi="Arial"/>
-          <w:color w:val="0E3A4E"/>
-          <w:sz w:val="22"/>
-          <w:szCs w:val="22"/>
-        </w:rPr>
-        <w:t xml:space="preserve">En eventos masivos la gente busca avisos de accesos, estacionamiento y horarios. La palomita evita que una cuenta falsa se haga pasar por el recinto. Son $127 al mes.</w:t>
-      </w:r>
-    </w:p>
-    <w:p>
-      <w:pPr>
-        <w:pStyle w:val="Heading2"/>
-        <w:spacing w:after="80" w:before="200"/>
-      </w:pPr>
-      <w:r>
-        <w:rPr>
-          <w:rFonts w:ascii="Arial" w:cs="Arial" w:eastAsia="Arial" w:hAnsi="Arial"/>
-          <w:b/>
-          <w:bCs/>
-          <w:color w:val="175772"/>
-          <w:sz w:val="26"/>
-          <w:szCs w:val="26"/>
-        </w:rPr>
-        <w:t xml:space="preserve">¿Por qué una cámara si los celulares graban en 4K?</w:t>
-      </w:r>
-    </w:p>
-    <w:p>
-      <w:pPr>
-        <w:spacing w:after="120" w:before="0"/>
-      </w:pPr>
-      <w:r>
-        <w:rPr>
-          <w:rFonts w:ascii="Arial" w:cs="Arial" w:eastAsia="Arial" w:hAnsi="Arial"/>
-          <w:color w:val="0E3A4E"/>
-          <w:sz w:val="22"/>
-          <w:szCs w:val="22"/>
-        </w:rPr>
-        <w:t xml:space="preserve">El celular no tiene estabilizador de cámara, se calienta, se queda sin batería y es personal. La cámara es equipo del recinto: imagen estable, mejor sensor con poca luz y calidad que se puede vender a expositores como paquete de difusión.</w:t>
-      </w:r>
-    </w:p>
-    <w:p>
-      <w:pPr>
-        <w:pStyle w:val="Heading2"/>
-        <w:spacing w:after="80" w:before="200"/>
-      </w:pPr>
-      <w:r>
-        <w:rPr>
-          <w:rFonts w:ascii="Arial" w:cs="Arial" w:eastAsia="Arial" w:hAnsi="Arial"/>
-          <w:b/>
-          <w:bCs/>
-          <w:color w:val="175772"/>
-          <w:sz w:val="26"/>
-          <w:szCs w:val="26"/>
-        </w:rPr>
-        <w:t xml:space="preserve">¿Cómo regresa la inversión?</w:t>
-      </w:r>
-    </w:p>
-    <w:p>
-      <w:pPr>
-        <w:spacing w:after="120" w:before="0"/>
-      </w:pPr>
-      <w:r>
-        <w:rPr>
-          <w:rFonts w:ascii="Arial" w:cs="Arial" w:eastAsia="Arial" w:hAnsi="Arial"/>
-          <w:color w:val="0E3A4E"/>
-          <w:sz w:val="22"/>
-          <w:szCs w:val="22"/>
-        </w:rPr>
-        <w:t xml:space="preserve">Tres vías: paquetes de difusión a expositores con video de mejor calidad, leads de ManyChat sin pagar publicidad y ahorro en producción externa de video institucional.</w:t>
-      </w:r>
-    </w:p>
-    <w:p>
-      <w:pPr>
-        <w:pStyle w:val="Heading2"/>
-        <w:spacing w:after="80" w:before="200"/>
-      </w:pPr>
-      <w:r>
-        <w:rPr>
-          <w:rFonts w:ascii="Arial" w:cs="Arial" w:eastAsia="Arial" w:hAnsi="Arial"/>
-          <w:b/>
-          <w:bCs/>
-          <w:color w:val="175772"/>
-          <w:sz w:val="26"/>
-          <w:szCs w:val="26"/>
-        </w:rPr>
-        <w:t xml:space="preserve">¿Por qué los precios de cámara vienen en rango?</w:t>
-      </w:r>
-    </w:p>
-    <w:p>
-      <w:pPr>
-        <w:spacing w:after="120" w:before="0"/>
-      </w:pPr>
-      <w:r>
-        <w:rPr>
-          <w:rFonts w:ascii="Arial" w:cs="Arial" w:eastAsia="Arial" w:hAnsi="Arial"/>
-          <w:color w:val="0E3A4E"/>
-          <w:sz w:val="22"/>
-          <w:szCs w:val="22"/>
-        </w:rPr>
-        <w:t xml:space="preserve">Cambian según vendedor y promoción. Se compra en tienda oficial (DJI Store, Sony o vendedor verificado) al precio más bajo del rango al momento de aprobar.</w:t>
-      </w:r>
-    </w:p>
-    <w:p>
-      <w:pPr>
-        <w:pStyle w:val="Heading2"/>
-        <w:spacing w:after="80" w:before="200"/>
-      </w:pPr>
-      <w:r>
-        <w:rPr>
-          <w:rFonts w:ascii="Arial" w:cs="Arial" w:eastAsia="Arial" w:hAnsi="Arial"/>
-          <w:b/>
-          <w:bCs/>
-          <w:color w:val="175772"/>
-          <w:sz w:val="26"/>
-          <w:szCs w:val="26"/>
-        </w:rPr>
-        <w:t xml:space="preserve">¿Y si sube el dólar?</w:t>
-      </w:r>
-    </w:p>
-    <w:p>
-      <w:pPr>
-        <w:spacing w:after="120" w:before="0"/>
-      </w:pPr>
-      <w:r>
-        <w:rPr>
-          <w:rFonts w:ascii="Arial" w:cs="Arial" w:eastAsia="Arial" w:hAnsi="Arial"/>
-          <w:color w:val="0E3A4E"/>
-          <w:sz w:val="22"/>
-          <w:szCs w:val="22"/>
-        </w:rPr>
-        <w:t xml:space="preserve">ManyChat y Metricool se calcularon a $19.00 por dólar, arriba del tipo de cambio actual, así que ya traen colchón.</w:t>
-      </w:r>
-    </w:p>
-    <w:p>
-      <w:pPr>
-        <w:pStyle w:val="Heading2"/>
-        <w:spacing w:after="80" w:before="200"/>
-      </w:pPr>
-      <w:r>
-        <w:rPr>
-          <w:rFonts w:ascii="Arial" w:cs="Arial" w:eastAsia="Arial" w:hAnsi="Arial"/>
-          <w:b/>
-          <w:bCs/>
-          <w:color w:val="175772"/>
-          <w:sz w:val="26"/>
-          <w:szCs w:val="26"/>
-        </w:rPr>
-        <w:t xml:space="preserve">¿Por qué pagar anual y no mes a mes?</w:t>
-      </w:r>
-    </w:p>
-    <w:p>
-      <w:pPr>
-        <w:spacing w:after="120" w:before="0"/>
-      </w:pPr>
-      <w:r>
-        <w:rPr>
-          <w:rFonts w:ascii="Arial" w:cs="Arial" w:eastAsia="Arial" w:hAnsi="Arial"/>
-          <w:color w:val="0E3A4E"/>
-          <w:sz w:val="22"/>
-          <w:szCs w:val="22"/>
-        </w:rPr>
-        <w:t xml:space="preserve">Pagar anual ahorra $4,187 al año contra pagar mes a mes.</w:t>
-      </w:r>
-    </w:p>
-    <w:p>
-      <w:pPr>
-        <w:pStyle w:val="Heading2"/>
-        <w:spacing w:after="80" w:before="200"/>
-      </w:pPr>
-      <w:r>
-        <w:rPr>
-          <w:rFonts w:ascii="Arial" w:cs="Arial" w:eastAsia="Arial" w:hAnsi="Arial"/>
-          <w:b/>
-          <w:bCs/>
-          <w:color w:val="175772"/>
-          <w:sz w:val="26"/>
-          <w:szCs w:val="26"/>
-        </w:rPr>
-        <w:t xml:space="preserve">¿Factura?</w:t>
-      </w:r>
-    </w:p>
-    <w:p>
-      <w:pPr>
-        <w:spacing w:after="120" w:before="0"/>
-      </w:pPr>
-      <w:r>
-        <w:rPr>
-          <w:rFonts w:ascii="Arial" w:cs="Arial" w:eastAsia="Arial" w:hAnsi="Arial"/>
-          <w:color w:val="0E3A4E"/>
-          <w:sz w:val="22"/>
-          <w:szCs w:val="22"/>
-        </w:rPr>
-        <w:t xml:space="preserve">Son proveedores del extranjero: entregan comprobante de pago descargable, no CFDI. Confirmar con Contabilidad cómo se registra.</w:t>
-      </w:r>
-    </w:p>
-    <w:p>
-      <w:pPr>
-        <w:pStyle w:val="Heading1"/>
-        <w:pBdr>
-          <w:bottom w:val="single" w:color="A8C243" w:sz="12" w:space="4"/>
-        </w:pBdr>
-        <w:spacing w:after="120" w:before="240"/>
-      </w:pPr>
-      <w:r>
-        <w:rPr>
-          <w:rFonts w:ascii="Arial" w:cs="Arial" w:eastAsia="Arial" w:hAnsi="Arial"/>
-          <w:b/>
-          <w:bCs/>
-          <w:color w:val="175772"/>
-          <w:sz w:val="32"/>
-          <w:szCs w:val="32"/>
-        </w:rPr>
-        <w:t xml:space="preserve">9. Links de compra</w:t>
+        <w:t xml:space="preserve">8. Links de compra</w:t>
       </w:r>
     </w:p>
     <w:p>
@@ -4892,7 +4543,7 @@
         </w:numPr>
         <w:spacing w:after="60"/>
       </w:pPr>
-      <w:hyperlink w:history="1" r:id="rIdpcdbvyfsv4taarabgexd3">
+      <w:hyperlink w:history="1" r:id="rIdkiqogky9mlf-6bcxnaasv">
         <w:r>
           <w:rPr>
             <w:rFonts w:ascii="Arial" w:cs="Arial" w:eastAsia="Arial" w:hAnsi="Arial"/>
@@ -4914,7 +4565,7 @@
         </w:numPr>
         <w:spacing w:after="60"/>
       </w:pPr>
-      <w:hyperlink w:history="1" r:id="rIdtjohssvgl8zomiqocpyon">
+      <w:hyperlink w:history="1" r:id="rIdprtnnpbjvcxov592xtb9p">
         <w:r>
           <w:rPr>
             <w:rFonts w:ascii="Arial" w:cs="Arial" w:eastAsia="Arial" w:hAnsi="Arial"/>
@@ -4936,7 +4587,7 @@
         </w:numPr>
         <w:spacing w:after="60"/>
       </w:pPr>
-      <w:hyperlink w:history="1" r:id="rId5mu74hieejclg4ir3v4fq">
+      <w:hyperlink w:history="1" r:id="rIdxmpmcsqhxui94h6mbsan_">
         <w:r>
           <w:rPr>
             <w:rFonts w:ascii="Arial" w:cs="Arial" w:eastAsia="Arial" w:hAnsi="Arial"/>
@@ -4958,7 +4609,7 @@
         </w:numPr>
         <w:spacing w:after="60"/>
       </w:pPr>
-      <w:hyperlink w:history="1" r:id="rId4pwo2z-p3op0vkqu8sa_w">
+      <w:hyperlink w:history="1" r:id="rId75pcmtd2orhchx0ut96sm">
         <w:r>
           <w:rPr>
             <w:rFonts w:ascii="Arial" w:cs="Arial" w:eastAsia="Arial" w:hAnsi="Arial"/>
@@ -4980,7 +4631,7 @@
         </w:numPr>
         <w:spacing w:after="60"/>
       </w:pPr>
-      <w:hyperlink w:history="1" r:id="rIdqono3gie80m2mpjuxf7uu">
+      <w:hyperlink w:history="1" r:id="rIddljt9rgevjzcywmuzsprm">
         <w:r>
           <w:rPr>
             <w:rFonts w:ascii="Arial" w:cs="Arial" w:eastAsia="Arial" w:hAnsi="Arial"/>
@@ -5002,7 +4653,7 @@
         </w:numPr>
         <w:spacing w:after="60"/>
       </w:pPr>
-      <w:hyperlink w:history="1" r:id="rId5qe9ftkw1tdmy1rg6a6b7">
+      <w:hyperlink w:history="1" r:id="rIdzplskevtrilk3zpm9ahm8">
         <w:r>
           <w:rPr>
             <w:rFonts w:ascii="Arial" w:cs="Arial" w:eastAsia="Arial" w:hAnsi="Arial"/>
@@ -5024,7 +4675,7 @@
         </w:numPr>
         <w:spacing w:after="60"/>
       </w:pPr>
-      <w:hyperlink w:history="1" r:id="rId2om8ja5-kbofb94rsg5vp">
+      <w:hyperlink w:history="1" r:id="rIdlwilxek68zjoiuy2txaqm">
         <w:r>
           <w:rPr>
             <w:rFonts w:ascii="Arial" w:cs="Arial" w:eastAsia="Arial" w:hAnsi="Arial"/>
@@ -5054,7 +4705,7 @@
           <w:sz w:val="32"/>
           <w:szCs w:val="32"/>
         </w:rPr>
-        <w:t xml:space="preserve">Notas para Finanzas</w:t>
+        <w:t xml:space="preserve">Condiciones del presupuesto</w:t>
       </w:r>
     </w:p>
     <w:p>
@@ -5073,7 +4724,64 @@
           <w:sz w:val="22"/>
           <w:szCs w:val="22"/>
         </w:rPr>
-        <w:t xml:space="preserve">Precios en pesos mexicanos con IVA, consultados en octubre de 2026.</w:t>
+        <w:t xml:space="preserve">Área solicitante: Comunicación y RRPP. Periodo: enero a diciembre de 2027.</w:t>
+      </w:r>
+    </w:p>
+    <w:p>
+      <w:pPr>
+        <w:pStyle w:val="ListParagraph"/>
+        <w:numPr>
+          <w:ilvl w:val="0"/>
+          <w:numId w:val="2"/>
+        </w:numPr>
+        <w:spacing w:after="60"/>
+      </w:pPr>
+      <w:r>
+        <w:rPr>
+          <w:rFonts w:ascii="Arial" w:cs="Arial" w:eastAsia="Arial" w:hAnsi="Arial"/>
+          <w:color w:val="0E3A4E"/>
+          <w:sz w:val="22"/>
+          <w:szCs w:val="22"/>
+        </w:rPr>
+        <w:t xml:space="preserve">Precios en pesos mexicanos con IVA, consultados en octubre de 2026; sujetos a cambio del proveedor.</w:t>
+      </w:r>
+    </w:p>
+    <w:p>
+      <w:pPr>
+        <w:pStyle w:val="ListParagraph"/>
+        <w:numPr>
+          <w:ilvl w:val="0"/>
+          <w:numId w:val="2"/>
+        </w:numPr>
+        <w:spacing w:after="60"/>
+      </w:pPr>
+      <w:r>
+        <w:rPr>
+          <w:rFonts w:ascii="Arial" w:cs="Arial" w:eastAsia="Arial" w:hAnsi="Arial"/>
+          <w:color w:val="0E3A4E"/>
+          <w:sz w:val="22"/>
+          <w:szCs w:val="22"/>
+        </w:rPr>
+        <w:t xml:space="preserve">Forma de pago: pago anual con tarjeta corporativa a nombre de Poliforum León, desde la página de cada proveedor. Las cámaras se compran una sola vez en tienda oficial o vendedor verificado.</w:t>
+      </w:r>
+    </w:p>
+    <w:p>
+      <w:pPr>
+        <w:pStyle w:val="ListParagraph"/>
+        <w:numPr>
+          <w:ilvl w:val="0"/>
+          <w:numId w:val="2"/>
+        </w:numPr>
+        <w:spacing w:after="60"/>
+      </w:pPr>
+      <w:r>
+        <w:rPr>
+          <w:rFonts w:ascii="Arial" w:cs="Arial" w:eastAsia="Arial" w:hAnsi="Arial"/>
+          <w:color w:val="0E3A4E"/>
+          <w:sz w:val="22"/>
+          <w:szCs w:val="22"/>
+        </w:rPr>
+        <w:t xml:space="preserve">Comprobantes: los proveedores del extranjero entregan comprobante de pago descargable, no CFDI; Contabilidad define cómo se registra.</w:t>
       </w:r>
     </w:p>
     <w:p>

</xml_diff>

<commit_message>
Comunicación: 1 Canva y 1 ChatGPT Plus; Web: 1 Canva y 1 Claude
Co-Authored-By: Claude Opus 5.5 <noreply@anthropic.com>
Claude-Session: https://claude.ai/code/session_01GFkSYVqa8d2zDX8Qy6Lwpz
</commit_message>
<xml_diff>
--- a/Presupuesto_2027_Comunicacion_RRPP_Poliforum_Leon.docx
+++ b/Presupuesto_2027_Comunicacion_RRPP_Poliforum_Leon.docx
@@ -303,7 +303,7 @@
                 <w:sz w:val="19"/>
                 <w:szCs w:val="19"/>
               </w:rPr>
-              <w:t xml:space="preserve">$26,479–27,479</w:t>
+              <w:t xml:space="preserve">$32,477–33,477</w:t>
             </w:r>
           </w:p>
         </w:tc>
@@ -331,7 +331,7 @@
                 <w:sz w:val="19"/>
                 <w:szCs w:val="19"/>
               </w:rPr>
-              <w:t xml:space="preserve">$14,480</w:t>
+              <w:t xml:space="preserve">$20,478</w:t>
             </w:r>
           </w:p>
         </w:tc>
@@ -392,7 +392,7 @@
                 <w:sz w:val="19"/>
                 <w:szCs w:val="19"/>
               </w:rPr>
-              <w:t xml:space="preserve">$35,180–39,980</w:t>
+              <w:t xml:space="preserve">$41,178–45,978</w:t>
             </w:r>
           </w:p>
         </w:tc>
@@ -420,7 +420,7 @@
                 <w:sz w:val="19"/>
                 <w:szCs w:val="19"/>
               </w:rPr>
-              <w:t xml:space="preserve">$14,480</w:t>
+              <w:t xml:space="preserve">$20,478</w:t>
             </w:r>
           </w:p>
         </w:tc>
@@ -481,7 +481,7 @@
                 <w:sz w:val="19"/>
                 <w:szCs w:val="19"/>
               </w:rPr>
-              <w:t xml:space="preserve">$46,680–49,980</w:t>
+              <w:t xml:space="preserve">$52,678–55,978</w:t>
             </w:r>
           </w:p>
         </w:tc>
@@ -509,7 +509,7 @@
                 <w:sz w:val="19"/>
                 <w:szCs w:val="19"/>
               </w:rPr>
-              <w:t xml:space="preserve">$14,480</w:t>
+              <w:t xml:space="preserve">$20,478</w:t>
             </w:r>
           </w:p>
         </w:tc>
@@ -528,7 +528,7 @@
           <w:sz w:val="19"/>
           <w:szCs w:val="19"/>
         </w:rPr>
-        <w:t xml:space="preserve">MXN con IVA. El software (ManyChat Pro, Metricool Starter y X Premium) se paga cada año; la cámara se compra una sola vez, en el año 1.</w:t>
+        <w:t xml:space="preserve">MXN con IVA. El software (ManyChat Pro, Metricool Starter, X Premium, Canva Pro y ChatGPT Plus) se paga cada año; la cámara se compra una sola vez, en el año 1.</w:t>
       </w:r>
     </w:p>
     <w:p>
@@ -843,7 +843,7 @@
             </w:tcMar>
           </w:tcPr>
           <w:p>
-            <w:hyperlink w:history="1" r:id="rIderniwxqwewnj0srbl5nnx">
+            <w:hyperlink w:history="1" r:id="rIdwdavnypa_lqji3cpniskh">
               <w:r>
                 <w:rPr>
                   <w:rFonts w:ascii="Arial" w:cs="Arial" w:eastAsia="Arial" w:hAnsi="Arial"/>
@@ -986,7 +986,7 @@
             </w:tcMar>
           </w:tcPr>
           <w:p>
-            <w:hyperlink w:history="1" r:id="rIdfotayinlk66mbnankd1qm">
+            <w:hyperlink w:history="1" r:id="rIdr5rx-1dpd0sknklcjjdtm">
               <w:r>
                 <w:rPr>
                   <w:rFonts w:ascii="Arial" w:cs="Arial" w:eastAsia="Arial" w:hAnsi="Arial"/>
@@ -1129,7 +1129,7 @@
             </w:tcMar>
           </w:tcPr>
           <w:p>
-            <w:hyperlink w:history="1" r:id="rId2oyiphkeqjwxpn9ypkqwp">
+            <w:hyperlink w:history="1" r:id="rIdsbyarhnfkujomkizuusyd">
               <w:r>
                 <w:rPr>
                   <w:rFonts w:ascii="Arial" w:cs="Arial" w:eastAsia="Arial" w:hAnsi="Arial"/>
@@ -1151,6 +1151,292 @@
         <w:tc>
           <w:tcPr>
             <w:tcW w:type="dxa" w:w="2200"/>
+            <w:shd w:fill="FFFFFF" w:color="auto" w:val="clear"/>
+            <w:tcMar>
+              <w:top w:type="dxa" w:w="70"/>
+              <w:left w:type="dxa" w:w="100"/>
+              <w:bottom w:type="dxa" w:w="70"/>
+              <w:right w:type="dxa" w:w="100"/>
+            </w:tcMar>
+          </w:tcPr>
+          <w:p>
+            <w:pPr>
+              <w:jc w:val="left"/>
+            </w:pPr>
+            <w:r>
+              <w:rPr>
+                <w:rFonts w:ascii="Arial" w:cs="Arial" w:eastAsia="Arial" w:hAnsi="Arial"/>
+                <w:b w:val="false"/>
+                <w:bCs w:val="false"/>
+                <w:color w:val="0E3A4E"/>
+                <w:sz w:val="19"/>
+                <w:szCs w:val="19"/>
+              </w:rPr>
+              <w:t xml:space="preserve">Canva Pro</w:t>
+            </w:r>
+          </w:p>
+        </w:tc>
+        <w:tc>
+          <w:tcPr>
+            <w:tcW w:type="dxa" w:w="1700"/>
+            <w:shd w:fill="FFFFFF" w:color="auto" w:val="clear"/>
+            <w:tcMar>
+              <w:top w:type="dxa" w:w="70"/>
+              <w:left w:type="dxa" w:w="100"/>
+              <w:bottom w:type="dxa" w:w="70"/>
+              <w:right w:type="dxa" w:w="100"/>
+            </w:tcMar>
+          </w:tcPr>
+          <w:p>
+            <w:pPr>
+              <w:jc w:val="left"/>
+            </w:pPr>
+            <w:r>
+              <w:rPr>
+                <w:rFonts w:ascii="Arial" w:cs="Arial" w:eastAsia="Arial" w:hAnsi="Arial"/>
+                <w:b w:val="false"/>
+                <w:bCs w:val="false"/>
+                <w:color w:val="0E3A4E"/>
+                <w:sz w:val="19"/>
+                <w:szCs w:val="19"/>
+              </w:rPr>
+              <w:t xml:space="preserve">1 cuenta</w:t>
+            </w:r>
+          </w:p>
+        </w:tc>
+        <w:tc>
+          <w:tcPr>
+            <w:tcW w:type="dxa" w:w="1300"/>
+            <w:shd w:fill="FFFFFF" w:color="auto" w:val="clear"/>
+            <w:tcMar>
+              <w:top w:type="dxa" w:w="70"/>
+              <w:left w:type="dxa" w:w="100"/>
+              <w:bottom w:type="dxa" w:w="70"/>
+              <w:right w:type="dxa" w:w="100"/>
+            </w:tcMar>
+          </w:tcPr>
+          <w:p>
+            <w:pPr>
+              <w:jc w:val="right"/>
+            </w:pPr>
+            <w:r>
+              <w:rPr>
+                <w:rFonts w:ascii="Arial" w:cs="Arial" w:eastAsia="Arial" w:hAnsi="Arial"/>
+                <w:b w:val="false"/>
+                <w:bCs w:val="false"/>
+                <w:color w:val="0E3A4E"/>
+                <w:sz w:val="19"/>
+                <w:szCs w:val="19"/>
+              </w:rPr>
+              <w:t xml:space="preserve">$1,210</w:t>
+            </w:r>
+          </w:p>
+        </w:tc>
+        <w:tc>
+          <w:tcPr>
+            <w:tcW w:type="dxa" w:w="1500"/>
+            <w:shd w:fill="FFFFFF" w:color="auto" w:val="clear"/>
+            <w:tcMar>
+              <w:top w:type="dxa" w:w="70"/>
+              <w:left w:type="dxa" w:w="100"/>
+              <w:bottom w:type="dxa" w:w="70"/>
+              <w:right w:type="dxa" w:w="100"/>
+            </w:tcMar>
+          </w:tcPr>
+          <w:p>
+            <w:pPr>
+              <w:jc w:val="right"/>
+            </w:pPr>
+            <w:r>
+              <w:rPr>
+                <w:rFonts w:ascii="Arial" w:cs="Arial" w:eastAsia="Arial" w:hAnsi="Arial"/>
+                <w:b w:val="false"/>
+                <w:bCs w:val="false"/>
+                <w:color w:val="0E3A4E"/>
+                <w:sz w:val="19"/>
+                <w:szCs w:val="19"/>
+              </w:rPr>
+              <w:t xml:space="preserve">~$605</w:t>
+            </w:r>
+          </w:p>
+        </w:tc>
+        <w:tc>
+          <w:tcPr>
+            <w:tcW w:type="dxa" w:w="2660"/>
+            <w:shd w:fill="FFFFFF" w:color="auto" w:val="clear"/>
+            <w:tcMar>
+              <w:top w:type="dxa" w:w="70"/>
+              <w:left w:type="dxa" w:w="100"/>
+              <w:bottom w:type="dxa" w:w="70"/>
+              <w:right w:type="dxa" w:w="100"/>
+            </w:tcMar>
+          </w:tcPr>
+          <w:p>
+            <w:hyperlink w:history="1" r:id="rId4dbadn9ewuravnfv9omwf">
+              <w:r>
+                <w:rPr>
+                  <w:rFonts w:ascii="Arial" w:cs="Arial" w:eastAsia="Arial" w:hAnsi="Arial"/>
+                  <w:color w:val="039AD1"/>
+                  <w:sz w:val="20"/>
+                  <w:szCs w:val="20"/>
+                  <w:u w:val="single"/>
+                </w:rPr>
+                <w:t xml:space="preserve">canva.com/pricing</w:t>
+              </w:r>
+            </w:hyperlink>
+          </w:p>
+        </w:tc>
+      </w:tr>
+      <w:tr>
+        <w:trPr>
+          <w:tblHeader w:val="false"/>
+        </w:trPr>
+        <w:tc>
+          <w:tcPr>
+            <w:tcW w:type="dxa" w:w="2200"/>
+            <w:shd w:fill="F6F9FA" w:color="auto" w:val="clear"/>
+            <w:tcMar>
+              <w:top w:type="dxa" w:w="70"/>
+              <w:left w:type="dxa" w:w="100"/>
+              <w:bottom w:type="dxa" w:w="70"/>
+              <w:right w:type="dxa" w:w="100"/>
+            </w:tcMar>
+          </w:tcPr>
+          <w:p>
+            <w:pPr>
+              <w:jc w:val="left"/>
+            </w:pPr>
+            <w:r>
+              <w:rPr>
+                <w:rFonts w:ascii="Arial" w:cs="Arial" w:eastAsia="Arial" w:hAnsi="Arial"/>
+                <w:b w:val="false"/>
+                <w:bCs w:val="false"/>
+                <w:color w:val="0E3A4E"/>
+                <w:sz w:val="19"/>
+                <w:szCs w:val="19"/>
+              </w:rPr>
+              <w:t xml:space="preserve">ChatGPT Plus</w:t>
+            </w:r>
+          </w:p>
+        </w:tc>
+        <w:tc>
+          <w:tcPr>
+            <w:tcW w:type="dxa" w:w="1700"/>
+            <w:shd w:fill="F6F9FA" w:color="auto" w:val="clear"/>
+            <w:tcMar>
+              <w:top w:type="dxa" w:w="70"/>
+              <w:left w:type="dxa" w:w="100"/>
+              <w:bottom w:type="dxa" w:w="70"/>
+              <w:right w:type="dxa" w:w="100"/>
+            </w:tcMar>
+          </w:tcPr>
+          <w:p>
+            <w:pPr>
+              <w:jc w:val="left"/>
+            </w:pPr>
+            <w:r>
+              <w:rPr>
+                <w:rFonts w:ascii="Arial" w:cs="Arial" w:eastAsia="Arial" w:hAnsi="Arial"/>
+                <w:b w:val="false"/>
+                <w:bCs w:val="false"/>
+                <w:color w:val="0E3A4E"/>
+                <w:sz w:val="19"/>
+                <w:szCs w:val="19"/>
+              </w:rPr>
+              <w:t xml:space="preserve">1 cuenta</w:t>
+            </w:r>
+          </w:p>
+        </w:tc>
+        <w:tc>
+          <w:tcPr>
+            <w:tcW w:type="dxa" w:w="1300"/>
+            <w:shd w:fill="F6F9FA" w:color="auto" w:val="clear"/>
+            <w:tcMar>
+              <w:top w:type="dxa" w:w="70"/>
+              <w:left w:type="dxa" w:w="100"/>
+              <w:bottom w:type="dxa" w:w="70"/>
+              <w:right w:type="dxa" w:w="100"/>
+            </w:tcMar>
+          </w:tcPr>
+          <w:p>
+            <w:pPr>
+              <w:jc w:val="right"/>
+            </w:pPr>
+            <w:r>
+              <w:rPr>
+                <w:rFonts w:ascii="Arial" w:cs="Arial" w:eastAsia="Arial" w:hAnsi="Arial"/>
+                <w:b w:val="false"/>
+                <w:bCs w:val="false"/>
+                <w:color w:val="0E3A4E"/>
+                <w:sz w:val="19"/>
+                <w:szCs w:val="19"/>
+              </w:rPr>
+              <w:t xml:space="preserve">~$4,788</w:t>
+            </w:r>
+          </w:p>
+        </w:tc>
+        <w:tc>
+          <w:tcPr>
+            <w:tcW w:type="dxa" w:w="1500"/>
+            <w:shd w:fill="F6F9FA" w:color="auto" w:val="clear"/>
+            <w:tcMar>
+              <w:top w:type="dxa" w:w="70"/>
+              <w:left w:type="dxa" w:w="100"/>
+              <w:bottom w:type="dxa" w:w="70"/>
+              <w:right w:type="dxa" w:w="100"/>
+            </w:tcMar>
+          </w:tcPr>
+          <w:p>
+            <w:pPr>
+              <w:jc w:val="right"/>
+            </w:pPr>
+            <w:r>
+              <w:rPr>
+                <w:rFonts w:ascii="Arial" w:cs="Arial" w:eastAsia="Arial" w:hAnsi="Arial"/>
+                <w:b w:val="false"/>
+                <w:bCs w:val="false"/>
+                <w:color w:val="0E3A4E"/>
+                <w:sz w:val="19"/>
+                <w:szCs w:val="19"/>
+              </w:rPr>
+              <w:t xml:space="preserve">—</w:t>
+            </w:r>
+          </w:p>
+        </w:tc>
+        <w:tc>
+          <w:tcPr>
+            <w:tcW w:type="dxa" w:w="2660"/>
+            <w:shd w:fill="F6F9FA" w:color="auto" w:val="clear"/>
+            <w:tcMar>
+              <w:top w:type="dxa" w:w="70"/>
+              <w:left w:type="dxa" w:w="100"/>
+              <w:bottom w:type="dxa" w:w="70"/>
+              <w:right w:type="dxa" w:w="100"/>
+            </w:tcMar>
+          </w:tcPr>
+          <w:p>
+            <w:hyperlink w:history="1" r:id="rIdstihzr_ynpprrajlxibf9">
+              <w:r>
+                <w:rPr>
+                  <w:rFonts w:ascii="Arial" w:cs="Arial" w:eastAsia="Arial" w:hAnsi="Arial"/>
+                  <w:color w:val="039AD1"/>
+                  <w:sz w:val="20"/>
+                  <w:szCs w:val="20"/>
+                  <w:u w:val="single"/>
+                </w:rPr>
+                <w:t xml:space="preserve">chatgpt.com/pricing</w:t>
+              </w:r>
+            </w:hyperlink>
+          </w:p>
+        </w:tc>
+      </w:tr>
+      <w:tr>
+        <w:trPr>
+          <w:tblHeader w:val="false"/>
+        </w:trPr>
+        <w:tc>
+          <w:tcPr>
+            <w:tcW w:type="dxa" w:w="2200"/>
             <w:shd w:fill="175772" w:color="auto" w:val="clear"/>
             <w:tcMar>
               <w:top w:type="dxa" w:w="70"/>
@@ -1200,7 +1486,7 @@
                 <w:sz w:val="19"/>
                 <w:szCs w:val="19"/>
               </w:rPr>
-              <w:t xml:space="preserve">3 licencias</w:t>
+              <w:t xml:space="preserve">5 licencias</w:t>
             </w:r>
           </w:p>
         </w:tc>
@@ -1228,7 +1514,7 @@
                 <w:sz w:val="19"/>
                 <w:szCs w:val="19"/>
               </w:rPr>
-              <w:t xml:space="preserve">$14,480</w:t>
+              <w:t xml:space="preserve">$20,478</w:t>
             </w:r>
           </w:p>
         </w:tc>
@@ -1256,7 +1542,7 @@
                 <w:sz w:val="19"/>
                 <w:szCs w:val="19"/>
               </w:rPr>
-              <w:t xml:space="preserve">$4,187</w:t>
+              <w:t xml:space="preserve">$4,792</w:t>
             </w:r>
           </w:p>
         </w:tc>
@@ -1303,7 +1589,7 @@
           <w:sz w:val="19"/>
           <w:szCs w:val="19"/>
         </w:rPr>
-        <w:t xml:space="preserve">Ahorro = lo que se ahorra pagando anual contra pagar mes a mes. "~" = estimado.</w:t>
+        <w:t xml:space="preserve">Ahorro = lo que se ahorra pagando anual contra pagar mes a mes. "~" = estimado. ChatGPT Plus solo se cobra mes a mes (~$399 al mes en México); el plan Business pide mínimo 2 usuarios.</w:t>
       </w:r>
     </w:p>
     <w:p>
@@ -1592,6 +1878,140 @@
           <w:szCs w:val="22"/>
         </w:rPr>
         <w:t xml:space="preserve">En un evento masivo, los avisos de accesos, estacionamiento y horarios se reconocen como oficiales al instante.</w:t>
+      </w:r>
+    </w:p>
+    <w:p>
+      <w:pPr>
+        <w:pStyle w:val="Heading2"/>
+        <w:spacing w:after="80" w:before="200"/>
+      </w:pPr>
+      <w:r>
+        <w:rPr>
+          <w:rFonts w:ascii="Arial" w:cs="Arial" w:eastAsia="Arial" w:hAnsi="Arial"/>
+          <w:b/>
+          <w:bCs/>
+          <w:color w:val="175772"/>
+          <w:sz w:val="26"/>
+          <w:szCs w:val="26"/>
+        </w:rPr>
+        <w:t xml:space="preserve">Canva Pro · 1 cuenta · $1,210/año</w:t>
+      </w:r>
+    </w:p>
+    <w:p>
+      <w:pPr>
+        <w:spacing w:after="40" w:before="0"/>
+      </w:pPr>
+      <w:r>
+        <w:rPr>
+          <w:rFonts w:ascii="Arial" w:cs="Arial" w:eastAsia="Arial" w:hAnsi="Arial"/>
+          <w:b/>
+          <w:bCs/>
+          <w:color w:val="0E3A4E"/>
+          <w:sz w:val="22"/>
+          <w:szCs w:val="22"/>
+        </w:rPr>
+        <w:t xml:space="preserve">Por qué: </w:t>
+      </w:r>
+      <w:r>
+        <w:rPr>
+          <w:rFonts w:ascii="Arial" w:cs="Arial" w:eastAsia="Arial" w:hAnsi="Arial"/>
+          <w:color w:val="0E3A4E"/>
+          <w:sz w:val="22"/>
+          <w:szCs w:val="22"/>
+        </w:rPr>
+        <w:t xml:space="preserve">Diseño diario de redes con el kit de marca del recinto: plantillas, quitar fondos y adaptar una pieza a todos los formatos en un clic.</w:t>
+      </w:r>
+    </w:p>
+    <w:p>
+      <w:pPr>
+        <w:spacing w:after="120" w:before="0"/>
+      </w:pPr>
+      <w:r>
+        <w:rPr>
+          <w:rFonts w:ascii="Arial" w:cs="Arial" w:eastAsia="Arial" w:hAnsi="Arial"/>
+          <w:b/>
+          <w:bCs/>
+          <w:color w:val="0E3A4E"/>
+          <w:sz w:val="22"/>
+          <w:szCs w:val="22"/>
+        </w:rPr>
+        <w:t xml:space="preserve">Ejemplo: </w:t>
+      </w:r>
+      <w:r>
+        <w:rPr>
+          <w:rFonts w:ascii="Arial" w:cs="Arial" w:eastAsia="Arial" w:hAnsi="Arial"/>
+          <w:color w:val="0E3A4E"/>
+          <w:sz w:val="22"/>
+          <w:szCs w:val="22"/>
+        </w:rPr>
+        <w:t xml:space="preserve">El post, la historia y el reel de un evento salen del mismo diseño en minutos, siempre con la imagen oficial.</w:t>
+      </w:r>
+    </w:p>
+    <w:p>
+      <w:pPr>
+        <w:pStyle w:val="Heading2"/>
+        <w:spacing w:after="80" w:before="200"/>
+      </w:pPr>
+      <w:r>
+        <w:rPr>
+          <w:rFonts w:ascii="Arial" w:cs="Arial" w:eastAsia="Arial" w:hAnsi="Arial"/>
+          <w:b/>
+          <w:bCs/>
+          <w:color w:val="175772"/>
+          <w:sz w:val="26"/>
+          <w:szCs w:val="26"/>
+        </w:rPr>
+        <w:t xml:space="preserve">ChatGPT Plus · 1 cuenta · ~$4,788/año</w:t>
+      </w:r>
+    </w:p>
+    <w:p>
+      <w:pPr>
+        <w:spacing w:after="40" w:before="0"/>
+      </w:pPr>
+      <w:r>
+        <w:rPr>
+          <w:rFonts w:ascii="Arial" w:cs="Arial" w:eastAsia="Arial" w:hAnsi="Arial"/>
+          <w:b/>
+          <w:bCs/>
+          <w:color w:val="0E3A4E"/>
+          <w:sz w:val="22"/>
+          <w:szCs w:val="22"/>
+        </w:rPr>
+        <w:t xml:space="preserve">Por qué: </w:t>
+      </w:r>
+      <w:r>
+        <w:rPr>
+          <w:rFonts w:ascii="Arial" w:cs="Arial" w:eastAsia="Arial" w:hAnsi="Arial"/>
+          <w:color w:val="0E3A4E"/>
+          <w:sz w:val="22"/>
+          <w:szCs w:val="22"/>
+        </w:rPr>
+        <w:t xml:space="preserve">Agiliza el trabajo diario de Comunicación y RRPP: copys para redes, guiones de video, ideas de campañas, respuestas tipo e imágenes rápidas. Libera tiempo para producir más contenido.</w:t>
+      </w:r>
+    </w:p>
+    <w:p>
+      <w:pPr>
+        <w:spacing w:after="120" w:before="0"/>
+      </w:pPr>
+      <w:r>
+        <w:rPr>
+          <w:rFonts w:ascii="Arial" w:cs="Arial" w:eastAsia="Arial" w:hAnsi="Arial"/>
+          <w:b/>
+          <w:bCs/>
+          <w:color w:val="0E3A4E"/>
+          <w:sz w:val="22"/>
+          <w:szCs w:val="22"/>
+        </w:rPr>
+        <w:t xml:space="preserve">Ejemplo: </w:t>
+      </w:r>
+      <w:r>
+        <w:rPr>
+          <w:rFonts w:ascii="Arial" w:cs="Arial" w:eastAsia="Arial" w:hAnsi="Arial"/>
+          <w:color w:val="0E3A4E"/>
+          <w:sz w:val="22"/>
+          <w:szCs w:val="22"/>
+        </w:rPr>
+        <w:t xml:space="preserve">De la información de un evento salen en minutos los copys para cada red y el guion del reel.</w:t>
       </w:r>
     </w:p>
     <w:p>
@@ -4005,7 +4425,7 @@
                 <w:sz w:val="19"/>
                 <w:szCs w:val="19"/>
               </w:rPr>
-              <w:t xml:space="preserve">$14,480</w:t>
+              <w:t xml:space="preserve">$20,478</w:t>
             </w:r>
           </w:p>
         </w:tc>
@@ -4033,7 +4453,7 @@
                 <w:sz w:val="19"/>
                 <w:szCs w:val="19"/>
               </w:rPr>
-              <w:t xml:space="preserve">$14,480</w:t>
+              <w:t xml:space="preserve">$20,478</w:t>
             </w:r>
           </w:p>
         </w:tc>
@@ -4061,7 +4481,7 @@
                 <w:sz w:val="19"/>
                 <w:szCs w:val="19"/>
               </w:rPr>
-              <w:t xml:space="preserve">$14,480</w:t>
+              <w:t xml:space="preserve">$20,478</w:t>
             </w:r>
           </w:p>
         </w:tc>
@@ -4239,7 +4659,7 @@
                 <w:sz w:val="19"/>
                 <w:szCs w:val="19"/>
               </w:rPr>
-              <w:t xml:space="preserve">$14,480</w:t>
+              <w:t xml:space="preserve">$20,478</w:t>
             </w:r>
           </w:p>
         </w:tc>
@@ -4267,7 +4687,7 @@
                 <w:sz w:val="19"/>
                 <w:szCs w:val="19"/>
               </w:rPr>
-              <w:t xml:space="preserve">$14,480</w:t>
+              <w:t xml:space="preserve">$20,478</w:t>
             </w:r>
           </w:p>
         </w:tc>
@@ -4295,7 +4715,7 @@
                 <w:sz w:val="19"/>
                 <w:szCs w:val="19"/>
               </w:rPr>
-              <w:t xml:space="preserve">$14,480</w:t>
+              <w:t xml:space="preserve">$20,478</w:t>
             </w:r>
           </w:p>
         </w:tc>
@@ -4356,7 +4776,7 @@
                 <w:sz w:val="19"/>
                 <w:szCs w:val="19"/>
               </w:rPr>
-              <w:t xml:space="preserve">$26,479–27,479</w:t>
+              <w:t xml:space="preserve">$32,477–33,477</w:t>
             </w:r>
           </w:p>
         </w:tc>
@@ -4384,7 +4804,7 @@
                 <w:sz w:val="19"/>
                 <w:szCs w:val="19"/>
               </w:rPr>
-              <w:t xml:space="preserve">$35,180–39,980</w:t>
+              <w:t xml:space="preserve">$41,178–45,978</w:t>
             </w:r>
           </w:p>
         </w:tc>
@@ -4412,7 +4832,7 @@
                 <w:sz w:val="19"/>
                 <w:szCs w:val="19"/>
               </w:rPr>
-              <w:t xml:space="preserve">$46,680–49,980</w:t>
+              <w:t xml:space="preserve">$52,678–55,978</w:t>
             </w:r>
           </w:p>
         </w:tc>
@@ -4543,7 +4963,7 @@
         </w:numPr>
         <w:spacing w:after="60"/>
       </w:pPr>
-      <w:hyperlink w:history="1" r:id="rIdkiqogky9mlf-6bcxnaasv">
+      <w:hyperlink w:history="1" r:id="rIdir6ajto4qummjmxlr9ohl">
         <w:r>
           <w:rPr>
             <w:rFonts w:ascii="Arial" w:cs="Arial" w:eastAsia="Arial" w:hAnsi="Arial"/>
@@ -4565,7 +4985,51 @@
         </w:numPr>
         <w:spacing w:after="60"/>
       </w:pPr>
-      <w:hyperlink w:history="1" r:id="rIdprtnnpbjvcxov592xtb9p">
+      <w:hyperlink w:history="1" r:id="rId5cfzggqgumfdcgq8go6yn">
+        <w:r>
+          <w:rPr>
+            <w:rFonts w:ascii="Arial" w:cs="Arial" w:eastAsia="Arial" w:hAnsi="Arial"/>
+            <w:color w:val="039AD1"/>
+            <w:sz w:val="20"/>
+            <w:szCs w:val="20"/>
+            <w:u w:val="single"/>
+          </w:rPr>
+          <w:t xml:space="preserve">Canva Pro</w:t>
+        </w:r>
+      </w:hyperlink>
+    </w:p>
+    <w:p>
+      <w:pPr>
+        <w:pStyle w:val="ListParagraph"/>
+        <w:numPr>
+          <w:ilvl w:val="0"/>
+          <w:numId w:val="2"/>
+        </w:numPr>
+        <w:spacing w:after="60"/>
+      </w:pPr>
+      <w:hyperlink w:history="1" r:id="rIdy-x9iphxxi-pkqp4jis63">
+        <w:r>
+          <w:rPr>
+            <w:rFonts w:ascii="Arial" w:cs="Arial" w:eastAsia="Arial" w:hAnsi="Arial"/>
+            <w:color w:val="039AD1"/>
+            <w:sz w:val="20"/>
+            <w:szCs w:val="20"/>
+            <w:u w:val="single"/>
+          </w:rPr>
+          <w:t xml:space="preserve">ChatGPT Plus</w:t>
+        </w:r>
+      </w:hyperlink>
+    </w:p>
+    <w:p>
+      <w:pPr>
+        <w:pStyle w:val="ListParagraph"/>
+        <w:numPr>
+          <w:ilvl w:val="0"/>
+          <w:numId w:val="2"/>
+        </w:numPr>
+        <w:spacing w:after="60"/>
+      </w:pPr>
+      <w:hyperlink w:history="1" r:id="rId6bmjbpqm9ir8hho9bytr1">
         <w:r>
           <w:rPr>
             <w:rFonts w:ascii="Arial" w:cs="Arial" w:eastAsia="Arial" w:hAnsi="Arial"/>
@@ -4587,7 +5051,7 @@
         </w:numPr>
         <w:spacing w:after="60"/>
       </w:pPr>
-      <w:hyperlink w:history="1" r:id="rIdxmpmcsqhxui94h6mbsan_">
+      <w:hyperlink w:history="1" r:id="rIdgxkwo0kdqpujznn3wplly">
         <w:r>
           <w:rPr>
             <w:rFonts w:ascii="Arial" w:cs="Arial" w:eastAsia="Arial" w:hAnsi="Arial"/>
@@ -4609,7 +5073,7 @@
         </w:numPr>
         <w:spacing w:after="60"/>
       </w:pPr>
-      <w:hyperlink w:history="1" r:id="rId75pcmtd2orhchx0ut96sm">
+      <w:hyperlink w:history="1" r:id="rIdarye4gbdlz4pjbzwasuib">
         <w:r>
           <w:rPr>
             <w:rFonts w:ascii="Arial" w:cs="Arial" w:eastAsia="Arial" w:hAnsi="Arial"/>
@@ -4631,7 +5095,7 @@
         </w:numPr>
         <w:spacing w:after="60"/>
       </w:pPr>
-      <w:hyperlink w:history="1" r:id="rIddljt9rgevjzcywmuzsprm">
+      <w:hyperlink w:history="1" r:id="rId0tw0jn8ce-endzhjvo3d4">
         <w:r>
           <w:rPr>
             <w:rFonts w:ascii="Arial" w:cs="Arial" w:eastAsia="Arial" w:hAnsi="Arial"/>
@@ -4653,7 +5117,7 @@
         </w:numPr>
         <w:spacing w:after="60"/>
       </w:pPr>
-      <w:hyperlink w:history="1" r:id="rIdzplskevtrilk3zpm9ahm8">
+      <w:hyperlink w:history="1" r:id="rIdtdjzat99tjmknfkq2g3ne">
         <w:r>
           <w:rPr>
             <w:rFonts w:ascii="Arial" w:cs="Arial" w:eastAsia="Arial" w:hAnsi="Arial"/>
@@ -4675,7 +5139,7 @@
         </w:numPr>
         <w:spacing w:after="60"/>
       </w:pPr>
-      <w:hyperlink w:history="1" r:id="rIdlwilxek68zjoiuy2txaqm">
+      <w:hyperlink w:history="1" r:id="rIdjqzqrpi_axpbesa9jsd-e">
         <w:r>
           <w:rPr>
             <w:rFonts w:ascii="Arial" w:cs="Arial" w:eastAsia="Arial" w:hAnsi="Arial"/>
@@ -4800,7 +5264,7 @@
           <w:sz w:val="22"/>
           <w:szCs w:val="22"/>
         </w:rPr>
-        <w:t xml:space="preserve">ManyChat y Metricool: precio en dólares convertido a $19.00 por dólar + 16% de IVA. X Premium: precio en México.</w:t>
+        <w:t xml:space="preserve">ManyChat y Metricool: precio en dólares convertido a $19.00 por dólar + 16% de IVA. X Premium y Canva: precio en México. ChatGPT Plus: ~$399 al mes en México, sin plan anual; confirmar el precio al contratar.</w:t>
       </w:r>
     </w:p>
     <w:p>

</xml_diff>

<commit_message>
Comunicación: organizadores en vez de expositores, tono sin promesas
Co-Authored-By: Claude Opus 5.5 <noreply@anthropic.com>
Claude-Session: https://claude.ai/code/session_01GFkSYVqa8d2zDX8Qy6Lwpz
</commit_message>
<xml_diff>
--- a/Presupuesto_2027_Comunicacion_RRPP_Poliforum_Leon.docx
+++ b/Presupuesto_2027_Comunicacion_RRPP_Poliforum_Leon.docx
@@ -843,7 +843,7 @@
             </w:tcMar>
           </w:tcPr>
           <w:p>
-            <w:hyperlink w:history="1" r:id="rIdwdavnypa_lqji3cpniskh">
+            <w:hyperlink w:history="1" r:id="rIdjvuog_spxejggrfreumi4">
               <w:r>
                 <w:rPr>
                   <w:rFonts w:ascii="Arial" w:cs="Arial" w:eastAsia="Arial" w:hAnsi="Arial"/>
@@ -986,7 +986,7 @@
             </w:tcMar>
           </w:tcPr>
           <w:p>
-            <w:hyperlink w:history="1" r:id="rIdr5rx-1dpd0sknklcjjdtm">
+            <w:hyperlink w:history="1" r:id="rIdqbctesqu0yd0j80jkxjyo">
               <w:r>
                 <w:rPr>
                   <w:rFonts w:ascii="Arial" w:cs="Arial" w:eastAsia="Arial" w:hAnsi="Arial"/>
@@ -1129,7 +1129,7 @@
             </w:tcMar>
           </w:tcPr>
           <w:p>
-            <w:hyperlink w:history="1" r:id="rIdsbyarhnfkujomkizuusyd">
+            <w:hyperlink w:history="1" r:id="rIdl5n73vufzlzrs9oby6z3f">
               <w:r>
                 <w:rPr>
                   <w:rFonts w:ascii="Arial" w:cs="Arial" w:eastAsia="Arial" w:hAnsi="Arial"/>
@@ -1272,7 +1272,7 @@
             </w:tcMar>
           </w:tcPr>
           <w:p>
-            <w:hyperlink w:history="1" r:id="rId4dbadn9ewuravnfv9omwf">
+            <w:hyperlink w:history="1" r:id="rIdvsqhyq-xt6ztqc0uprjbs">
               <w:r>
                 <w:rPr>
                   <w:rFonts w:ascii="Arial" w:cs="Arial" w:eastAsia="Arial" w:hAnsi="Arial"/>
@@ -1415,7 +1415,7 @@
             </w:tcMar>
           </w:tcPr>
           <w:p>
-            <w:hyperlink w:history="1" r:id="rIdstihzr_ynpprrajlxibf9">
+            <w:hyperlink w:history="1" r:id="rIdh0idze5an2xyfwwnjlqmj">
               <w:r>
                 <w:rPr>
                   <w:rFonts w:ascii="Arial" w:cs="Arial" w:eastAsia="Arial" w:hAnsi="Arial"/>
@@ -1651,7 +1651,7 @@
           <w:sz w:val="22"/>
           <w:szCs w:val="22"/>
         </w:rPr>
-        <w:t xml:space="preserve">Hacemos contenido para redes y video institucional todo el año. Una mejor cámara sube la calidad de cada video de redes (imagen estable, 4K y buena respuesta con la poca luz de salones y foros), optimiza los tiempos de producción porque ya no hay que contratar producción externa y, con contenido de mejor nivel, podemos vender más paquetes y servicios de difusión a expositores y organizadores.</w:t>
+        <w:t xml:space="preserve">Hacemos contenido para redes y video institucional durante todo el año. Una mejor cámara mejora la calidad de los videos de redes y del material institucional, optimiza la producción y nos permite ofrecer paquetes de promoción de mejor calidad a los organizadores que quieren promocionar su evento en nuestros canales.</w:t>
       </w:r>
     </w:p>
     <w:p>
@@ -1676,7 +1676,7 @@
           <w:sz w:val="22"/>
           <w:szCs w:val="22"/>
         </w:rPr>
-        <w:t xml:space="preserve">El video institucional, los reels de eventos y las cápsulas para expositores se graban en casa con calidad profesional y salen el mismo día. Esa misma calidad se ofrece como paquete de difusión a los expositores.</w:t>
+        <w:t xml:space="preserve">Video institucional del recinto, cobertura de eventos para redes y cápsulas para los organizadores que contratan la promoción de su evento.</w:t>
       </w:r>
     </w:p>
     <w:p>
@@ -1718,7 +1718,7 @@
           <w:sz w:val="22"/>
           <w:szCs w:val="22"/>
         </w:rPr>
-        <w:t xml:space="preserve">Hace dos cosas. 1) Contesta solo los mensajes privados de Instagram, Facebook y Messenger, de día y de noche: si alguien escribe "¿dónde compro boletos para…?" o "estoy buscando trabajo", le llega la respuesta correcta al momento. 2) Convierte comentarios en leads: quien comenta una palabra clave recibe por mensaje privado el link o la información.</w:t>
+        <w:t xml:space="preserve">Responde de forma automática los mensajes privados de Instagram, Facebook y Messenger con las preguntas frecuentes, como "¿dónde compro boletos para…?" o "estoy buscando trabajo". También permite dinámicas de "comenta y te llega" para generar leads en campañas.</w:t>
       </w:r>
     </w:p>
     <w:p>
@@ -1743,7 +1743,7 @@
           <w:sz w:val="22"/>
           <w:szCs w:val="22"/>
         </w:rPr>
-        <w:t xml:space="preserve">En la campaña de Maricela Cordero llegaron 3 leads sin pagar publicidad, respondiendo a mano. Con ManyChat cada comentario se contesta solo y al momento: más leads con el mismo contenido y sin gastar en anuncios.</w:t>
+        <w:t xml:space="preserve">En la campaña de Maricela Cordero se obtuvieron 3 leads sin publicidad pagada, respondiendo de forma manual. ManyChat permite automatizar ese proceso en futuras campañas.</w:t>
       </w:r>
     </w:p>
     <w:p>
@@ -1785,7 +1785,7 @@
           <w:sz w:val="22"/>
           <w:szCs w:val="22"/>
         </w:rPr>
-        <w:t xml:space="preserve">Hace más sencillo y eficaz publicar: un solo calendario para Facebook, Instagram, TikTok, YouTube y LinkedIn, mejores horarios sugeridos y reportes automáticos.</w:t>
+        <w:t xml:space="preserve">Centraliza la publicación de contenido en Facebook, Instagram, TikTok, YouTube y LinkedIn desde un solo calendario, con estadísticas y reportes.</w:t>
       </w:r>
     </w:p>
     <w:p>
@@ -1810,7 +1810,7 @@
           <w:sz w:val="22"/>
           <w:szCs w:val="22"/>
         </w:rPr>
-        <w:t xml:space="preserve">El lunes se programa la semana completa de eventos en una sola sesión, y el reporte mensual para Dirección sale en un clic.</w:t>
+        <w:t xml:space="preserve">Programación semanal de publicaciones y reporte mensual de resultados para Dirección.</w:t>
       </w:r>
     </w:p>
     <w:p>
@@ -1852,7 +1852,7 @@
           <w:sz w:val="22"/>
           <w:szCs w:val="22"/>
         </w:rPr>
-        <w:t xml:space="preserve">Palomita de verificación en la cuenta oficial: la gente distingue la cuenta real de las falsas y las publicaciones tienen más alcance.</w:t>
+        <w:t xml:space="preserve">Verificación de la cuenta oficial del recinto, para distinguirla de cuentas falsas.</w:t>
       </w:r>
     </w:p>
     <w:p>
@@ -1877,7 +1877,7 @@
           <w:sz w:val="22"/>
           <w:szCs w:val="22"/>
         </w:rPr>
-        <w:t xml:space="preserve">En un evento masivo, los avisos de accesos, estacionamiento y horarios se reconocen como oficiales al instante.</w:t>
+        <w:t xml:space="preserve">Avisos oficiales de accesos, estacionamiento y horarios durante eventos masivos.</w:t>
       </w:r>
     </w:p>
     <w:p>
@@ -1919,7 +1919,7 @@
           <w:sz w:val="22"/>
           <w:szCs w:val="22"/>
         </w:rPr>
-        <w:t xml:space="preserve">Diseño diario de redes con el kit de marca del recinto: plantillas, quitar fondos y adaptar una pieza a todos los formatos en un clic.</w:t>
+        <w:t xml:space="preserve">Diseño de piezas para redes con el kit de marca del recinto: plantillas, edición de imágenes y adaptación a distintos formatos.</w:t>
       </w:r>
     </w:p>
     <w:p>
@@ -1944,7 +1944,7 @@
           <w:sz w:val="22"/>
           <w:szCs w:val="22"/>
         </w:rPr>
-        <w:t xml:space="preserve">El post, la historia y el reel de un evento salen del mismo diseño en minutos, siempre con la imagen oficial.</w:t>
+        <w:t xml:space="preserve">Post, historia y portada de reel de un evento a partir de un mismo diseño, con la imagen oficial.</w:t>
       </w:r>
     </w:p>
     <w:p>
@@ -1986,7 +1986,7 @@
           <w:sz w:val="22"/>
           <w:szCs w:val="22"/>
         </w:rPr>
-        <w:t xml:space="preserve">Agiliza el trabajo diario de Comunicación y RRPP: copys para redes, guiones de video, ideas de campañas, respuestas tipo e imágenes rápidas. Libera tiempo para producir más contenido.</w:t>
+        <w:t xml:space="preserve">Apoyo en redacción para Comunicación y RRPP: copys para redes, guiones de video, ideas de campañas y respuestas tipo.</w:t>
       </w:r>
     </w:p>
     <w:p>
@@ -2011,7 +2011,7 @@
           <w:sz w:val="22"/>
           <w:szCs w:val="22"/>
         </w:rPr>
-        <w:t xml:space="preserve">De la información de un evento salen en minutos los copys para cada red y el guion del reel.</w:t>
+        <w:t xml:space="preserve">Copys por red social y guion de video a partir de la información de un evento.</w:t>
       </w:r>
     </w:p>
     <w:p>
@@ -2028,7 +2028,7 @@
           <w:sz w:val="26"/>
           <w:szCs w:val="26"/>
         </w:rPr>
-        <w:t xml:space="preserve">Qué contesta ManyChat en automático</w:t>
+        <w:t xml:space="preserve">Ejemplos de respuestas automáticas</w:t>
       </w:r>
     </w:p>
     <w:tbl>
@@ -2103,7 +2103,7 @@
                 <w:sz w:val="19"/>
                 <w:szCs w:val="19"/>
               </w:rPr>
-              <w:t xml:space="preserve">ManyChat responde al instante con…</w:t>
+              <w:t xml:space="preserve">Respuesta automática</w:t>
             </w:r>
           </w:p>
         </w:tc>
@@ -4963,7 +4963,7 @@
         </w:numPr>
         <w:spacing w:after="60"/>
       </w:pPr>
-      <w:hyperlink w:history="1" r:id="rIdir6ajto4qummjmxlr9ohl">
+      <w:hyperlink w:history="1" r:id="rId9j6kp98wstgbfh59lnjn8">
         <w:r>
           <w:rPr>
             <w:rFonts w:ascii="Arial" w:cs="Arial" w:eastAsia="Arial" w:hAnsi="Arial"/>
@@ -4985,7 +4985,7 @@
         </w:numPr>
         <w:spacing w:after="60"/>
       </w:pPr>
-      <w:hyperlink w:history="1" r:id="rId5cfzggqgumfdcgq8go6yn">
+      <w:hyperlink w:history="1" r:id="rIdnrei7mat1r_rwyq8dwfl6">
         <w:r>
           <w:rPr>
             <w:rFonts w:ascii="Arial" w:cs="Arial" w:eastAsia="Arial" w:hAnsi="Arial"/>
@@ -5007,7 +5007,7 @@
         </w:numPr>
         <w:spacing w:after="60"/>
       </w:pPr>
-      <w:hyperlink w:history="1" r:id="rIdy-x9iphxxi-pkqp4jis63">
+      <w:hyperlink w:history="1" r:id="rIddpzjps-7dsmfibpk7lql1">
         <w:r>
           <w:rPr>
             <w:rFonts w:ascii="Arial" w:cs="Arial" w:eastAsia="Arial" w:hAnsi="Arial"/>
@@ -5029,7 +5029,7 @@
         </w:numPr>
         <w:spacing w:after="60"/>
       </w:pPr>
-      <w:hyperlink w:history="1" r:id="rId6bmjbpqm9ir8hho9bytr1">
+      <w:hyperlink w:history="1" r:id="rIdt1fkuj9ukhtabqut5o-qp">
         <w:r>
           <w:rPr>
             <w:rFonts w:ascii="Arial" w:cs="Arial" w:eastAsia="Arial" w:hAnsi="Arial"/>
@@ -5051,7 +5051,7 @@
         </w:numPr>
         <w:spacing w:after="60"/>
       </w:pPr>
-      <w:hyperlink w:history="1" r:id="rIdgxkwo0kdqpujznn3wplly">
+      <w:hyperlink w:history="1" r:id="rId0zmjsntrr-b6ygbviutco">
         <w:r>
           <w:rPr>
             <w:rFonts w:ascii="Arial" w:cs="Arial" w:eastAsia="Arial" w:hAnsi="Arial"/>
@@ -5073,7 +5073,7 @@
         </w:numPr>
         <w:spacing w:after="60"/>
       </w:pPr>
-      <w:hyperlink w:history="1" r:id="rIdarye4gbdlz4pjbzwasuib">
+      <w:hyperlink w:history="1" r:id="rIduidhugodczc2zekdwylui">
         <w:r>
           <w:rPr>
             <w:rFonts w:ascii="Arial" w:cs="Arial" w:eastAsia="Arial" w:hAnsi="Arial"/>
@@ -5095,7 +5095,7 @@
         </w:numPr>
         <w:spacing w:after="60"/>
       </w:pPr>
-      <w:hyperlink w:history="1" r:id="rId0tw0jn8ce-endzhjvo3d4">
+      <w:hyperlink w:history="1" r:id="rId2s0buh8tyor7-5o_i8w3b">
         <w:r>
           <w:rPr>
             <w:rFonts w:ascii="Arial" w:cs="Arial" w:eastAsia="Arial" w:hAnsi="Arial"/>
@@ -5117,7 +5117,7 @@
         </w:numPr>
         <w:spacing w:after="60"/>
       </w:pPr>
-      <w:hyperlink w:history="1" r:id="rIdtdjzat99tjmknfkq2g3ne">
+      <w:hyperlink w:history="1" r:id="rIdsrjs79zitlrmyzemoemsg">
         <w:r>
           <w:rPr>
             <w:rFonts w:ascii="Arial" w:cs="Arial" w:eastAsia="Arial" w:hAnsi="Arial"/>
@@ -5139,7 +5139,7 @@
         </w:numPr>
         <w:spacing w:after="60"/>
       </w:pPr>
-      <w:hyperlink w:history="1" r:id="rIdjqzqrpi_axpbesa9jsd-e">
+      <w:hyperlink w:history="1" r:id="rId0cdmouiagym9pgs07zsro">
         <w:r>
           <w:rPr>
             <w:rFonts w:ascii="Arial" w:cs="Arial" w:eastAsia="Arial" w:hAnsi="Arial"/>

</xml_diff>

<commit_message>
ChatGPT: generación de imágenes y automatización con Codex
Co-Authored-By: Claude Opus 5.5 <noreply@anthropic.com>
Claude-Session: https://claude.ai/code/session_01GFkSYVqa8d2zDX8Qy6Lwpz
</commit_message>
<xml_diff>
--- a/Presupuesto_2027_Comunicacion_RRPP_Poliforum_Leon.docx
+++ b/Presupuesto_2027_Comunicacion_RRPP_Poliforum_Leon.docx
@@ -843,7 +843,7 @@
             </w:tcMar>
           </w:tcPr>
           <w:p>
-            <w:hyperlink w:history="1" r:id="rIdjvuog_spxejggrfreumi4">
+            <w:hyperlink w:history="1" r:id="rIdlv1pr12bxjejkmo2us6ct">
               <w:r>
                 <w:rPr>
                   <w:rFonts w:ascii="Arial" w:cs="Arial" w:eastAsia="Arial" w:hAnsi="Arial"/>
@@ -986,7 +986,7 @@
             </w:tcMar>
           </w:tcPr>
           <w:p>
-            <w:hyperlink w:history="1" r:id="rIdqbctesqu0yd0j80jkxjyo">
+            <w:hyperlink w:history="1" r:id="rIdduan4c7x-dpgdrwpyg-p4">
               <w:r>
                 <w:rPr>
                   <w:rFonts w:ascii="Arial" w:cs="Arial" w:eastAsia="Arial" w:hAnsi="Arial"/>
@@ -1129,7 +1129,7 @@
             </w:tcMar>
           </w:tcPr>
           <w:p>
-            <w:hyperlink w:history="1" r:id="rIdl5n73vufzlzrs9oby6z3f">
+            <w:hyperlink w:history="1" r:id="rIdb6nur_rstojpf_v1f4c7s">
               <w:r>
                 <w:rPr>
                   <w:rFonts w:ascii="Arial" w:cs="Arial" w:eastAsia="Arial" w:hAnsi="Arial"/>
@@ -1272,7 +1272,7 @@
             </w:tcMar>
           </w:tcPr>
           <w:p>
-            <w:hyperlink w:history="1" r:id="rIdvsqhyq-xt6ztqc0uprjbs">
+            <w:hyperlink w:history="1" r:id="rIdf3gv1i0jznaapsaawvlyp">
               <w:r>
                 <w:rPr>
                   <w:rFonts w:ascii="Arial" w:cs="Arial" w:eastAsia="Arial" w:hAnsi="Arial"/>
@@ -1415,7 +1415,7 @@
             </w:tcMar>
           </w:tcPr>
           <w:p>
-            <w:hyperlink w:history="1" r:id="rIdh0idze5an2xyfwwnjlqmj">
+            <w:hyperlink w:history="1" r:id="rIdeclzz7cs0vqh1gkoirrqu">
               <w:r>
                 <w:rPr>
                   <w:rFonts w:ascii="Arial" w:cs="Arial" w:eastAsia="Arial" w:hAnsi="Arial"/>
@@ -1986,7 +1986,7 @@
           <w:sz w:val="22"/>
           <w:szCs w:val="22"/>
         </w:rPr>
-        <w:t xml:space="preserve">Apoyo en redacción para Comunicación y RRPP: copys para redes, guiones de video, ideas de campañas y respuestas tipo.</w:t>
+        <w:t xml:space="preserve">Apoyo en redacción para Comunicación y RRPP: copys para redes, guiones de video, ideas de campañas y respuestas tipo. También genera imágenes para redes y, con Codex (la herramienta de OpenAI para crear automatizaciones, incluida en el plan), ayuda a automatizar tareas repetitivas y mejorar procesos del departamento.</w:t>
       </w:r>
     </w:p>
     <w:p>
@@ -2011,7 +2011,7 @@
           <w:sz w:val="22"/>
           <w:szCs w:val="22"/>
         </w:rPr>
-        <w:t xml:space="preserve">Copys por red social y guion de video a partir de la información de un evento.</w:t>
+        <w:t xml:space="preserve">Copys por red social, guion de video e imágenes de apoyo a partir de la información de un evento; y automatización de tareas como el reporte mensual o el calendario de publicaciones.</w:t>
       </w:r>
     </w:p>
     <w:p>
@@ -4963,7 +4963,7 @@
         </w:numPr>
         <w:spacing w:after="60"/>
       </w:pPr>
-      <w:hyperlink w:history="1" r:id="rId9j6kp98wstgbfh59lnjn8">
+      <w:hyperlink w:history="1" r:id="rIdxjm06kradd7xiwt-6tjkl">
         <w:r>
           <w:rPr>
             <w:rFonts w:ascii="Arial" w:cs="Arial" w:eastAsia="Arial" w:hAnsi="Arial"/>
@@ -4985,7 +4985,7 @@
         </w:numPr>
         <w:spacing w:after="60"/>
       </w:pPr>
-      <w:hyperlink w:history="1" r:id="rIdnrei7mat1r_rwyq8dwfl6">
+      <w:hyperlink w:history="1" r:id="rIdtymjnwxpl86vwkegzsski">
         <w:r>
           <w:rPr>
             <w:rFonts w:ascii="Arial" w:cs="Arial" w:eastAsia="Arial" w:hAnsi="Arial"/>
@@ -5007,7 +5007,7 @@
         </w:numPr>
         <w:spacing w:after="60"/>
       </w:pPr>
-      <w:hyperlink w:history="1" r:id="rIddpzjps-7dsmfibpk7lql1">
+      <w:hyperlink w:history="1" r:id="rId99oivgjvpqoeq0jhjygkh">
         <w:r>
           <w:rPr>
             <w:rFonts w:ascii="Arial" w:cs="Arial" w:eastAsia="Arial" w:hAnsi="Arial"/>
@@ -5029,7 +5029,7 @@
         </w:numPr>
         <w:spacing w:after="60"/>
       </w:pPr>
-      <w:hyperlink w:history="1" r:id="rIdt1fkuj9ukhtabqut5o-qp">
+      <w:hyperlink w:history="1" r:id="rIdohco3q0jwlu74fwwfezj7">
         <w:r>
           <w:rPr>
             <w:rFonts w:ascii="Arial" w:cs="Arial" w:eastAsia="Arial" w:hAnsi="Arial"/>
@@ -5051,7 +5051,7 @@
         </w:numPr>
         <w:spacing w:after="60"/>
       </w:pPr>
-      <w:hyperlink w:history="1" r:id="rId0zmjsntrr-b6ygbviutco">
+      <w:hyperlink w:history="1" r:id="rIdafzhvxsbefq2tci0flm9j">
         <w:r>
           <w:rPr>
             <w:rFonts w:ascii="Arial" w:cs="Arial" w:eastAsia="Arial" w:hAnsi="Arial"/>
@@ -5073,7 +5073,7 @@
         </w:numPr>
         <w:spacing w:after="60"/>
       </w:pPr>
-      <w:hyperlink w:history="1" r:id="rIduidhugodczc2zekdwylui">
+      <w:hyperlink w:history="1" r:id="rIdknm7u33igpyg6baqzlnwf">
         <w:r>
           <w:rPr>
             <w:rFonts w:ascii="Arial" w:cs="Arial" w:eastAsia="Arial" w:hAnsi="Arial"/>
@@ -5095,7 +5095,7 @@
         </w:numPr>
         <w:spacing w:after="60"/>
       </w:pPr>
-      <w:hyperlink w:history="1" r:id="rId2s0buh8tyor7-5o_i8w3b">
+      <w:hyperlink w:history="1" r:id="rIdvlbz10inc_3nm8f4f_fhr">
         <w:r>
           <w:rPr>
             <w:rFonts w:ascii="Arial" w:cs="Arial" w:eastAsia="Arial" w:hAnsi="Arial"/>
@@ -5117,7 +5117,7 @@
         </w:numPr>
         <w:spacing w:after="60"/>
       </w:pPr>
-      <w:hyperlink w:history="1" r:id="rIdsrjs79zitlrmyzemoemsg">
+      <w:hyperlink w:history="1" r:id="rIdic9mto4k5lzfbdvqmyfft">
         <w:r>
           <w:rPr>
             <w:rFonts w:ascii="Arial" w:cs="Arial" w:eastAsia="Arial" w:hAnsi="Arial"/>
@@ -5139,7 +5139,7 @@
         </w:numPr>
         <w:spacing w:after="60"/>
       </w:pPr>
-      <w:hyperlink w:history="1" r:id="rId0cdmouiagym9pgs07zsro">
+      <w:hyperlink w:history="1" r:id="rIdcyixvnootlqf8yojdsitx">
         <w:r>
           <w:rPr>
             <w:rFonts w:ascii="Arial" w:cs="Arial" w:eastAsia="Arial" w:hAnsi="Arial"/>

</xml_diff>

<commit_message>
Quitar cámaras del presupuesto 2027
Co-Authored-By: Claude Opus 5.5 <noreply@anthropic.com>
Claude-Session: https://claude.ai/code/session_01GFkSYVqa8d2zDX8Qy6Lwpz
</commit_message>
<xml_diff>
--- a/Presupuesto_2027_Comunicacion_RRPP_Poliforum_Leon.docx
+++ b/Presupuesto_2027_Comunicacion_RRPP_Poliforum_Leon.docx
@@ -90,7 +90,7 @@
           <w:sz w:val="26"/>
           <w:szCs w:val="26"/>
         </w:rPr>
-        <w:t xml:space="preserve">Software, página web y cámara de video para redes, campañas, contenido institucional y la nueva web.</w:t>
+        <w:t xml:space="preserve">Software para redes y campañas, y la nueva página web.</w:t>
       </w:r>
     </w:p>
     <w:p>
@@ -138,383 +138,9 @@
           <w:sz w:val="22"/>
           <w:szCs w:val="22"/>
         </w:rPr>
-        <w:t xml:space="preserve">Todo en pago anual. Un solo presupuesto: software del área, la página web y la cámara de video. Tres escenarios según la cámara.</w:t>
-      </w:r>
-    </w:p>
-    <w:tbl>
-      <w:tblPr>
-        <w:tblW w:type="dxa" w:w="9360"/>
-        <w:tblBorders>
-          <w:top w:val="single" w:color="auto" w:sz="4"/>
-          <w:left w:val="single" w:color="auto" w:sz="4"/>
-          <w:bottom w:val="single" w:color="auto" w:sz="4"/>
-          <w:right w:val="single" w:color="auto" w:sz="4"/>
-          <w:insideH w:val="single" w:color="auto" w:sz="4"/>
-          <w:insideV w:val="single" w:color="auto" w:sz="4"/>
-        </w:tblBorders>
-      </w:tblPr>
-      <w:tblGrid>
-        <w:gridCol w:w="3600"/>
-        <w:gridCol w:w="2880"/>
-        <w:gridCol w:w="2880"/>
-      </w:tblGrid>
-      <w:tr>
-        <w:trPr>
-          <w:tblHeader/>
-        </w:trPr>
-        <w:tc>
-          <w:tcPr>
-            <w:tcW w:type="dxa" w:w="3600"/>
-            <w:shd w:fill="DCE6EB" w:color="auto" w:val="clear"/>
-            <w:tcMar>
-              <w:top w:type="dxa" w:w="70"/>
-              <w:left w:type="dxa" w:w="100"/>
-              <w:bottom w:type="dxa" w:w="70"/>
-              <w:right w:type="dxa" w:w="100"/>
-            </w:tcMar>
-          </w:tcPr>
-          <w:p>
-            <w:pPr>
-              <w:jc w:val="left"/>
-            </w:pPr>
-            <w:r>
-              <w:rPr>
-                <w:rFonts w:ascii="Arial" w:cs="Arial" w:eastAsia="Arial" w:hAnsi="Arial"/>
-                <w:b/>
-                <w:bCs/>
-                <w:color w:val="0E3A4E"/>
-                <w:sz w:val="19"/>
-                <w:szCs w:val="19"/>
-              </w:rPr>
-              <w:t xml:space="preserve">Escenario</w:t>
-            </w:r>
-          </w:p>
-        </w:tc>
-        <w:tc>
-          <w:tcPr>
-            <w:tcW w:type="dxa" w:w="2880"/>
-            <w:shd w:fill="DCE6EB" w:color="auto" w:val="clear"/>
-            <w:tcMar>
-              <w:top w:type="dxa" w:w="70"/>
-              <w:left w:type="dxa" w:w="100"/>
-              <w:bottom w:type="dxa" w:w="70"/>
-              <w:right w:type="dxa" w:w="100"/>
-            </w:tcMar>
-          </w:tcPr>
-          <w:p>
-            <w:pPr>
-              <w:jc w:val="right"/>
-            </w:pPr>
-            <w:r>
-              <w:rPr>
-                <w:rFonts w:ascii="Arial" w:cs="Arial" w:eastAsia="Arial" w:hAnsi="Arial"/>
-                <w:b/>
-                <w:bCs/>
-                <w:color w:val="0E3A4E"/>
-                <w:sz w:val="19"/>
-                <w:szCs w:val="19"/>
-              </w:rPr>
-              <w:t xml:space="preserve">Año 1 · 2027</w:t>
-            </w:r>
-          </w:p>
-        </w:tc>
-        <w:tc>
-          <w:tcPr>
-            <w:tcW w:type="dxa" w:w="2880"/>
-            <w:shd w:fill="DCE6EB" w:color="auto" w:val="clear"/>
-            <w:tcMar>
-              <w:top w:type="dxa" w:w="70"/>
-              <w:left w:type="dxa" w:w="100"/>
-              <w:bottom w:type="dxa" w:w="70"/>
-              <w:right w:type="dxa" w:w="100"/>
-            </w:tcMar>
-          </w:tcPr>
-          <w:p>
-            <w:pPr>
-              <w:jc w:val="right"/>
-            </w:pPr>
-            <w:r>
-              <w:rPr>
-                <w:rFonts w:ascii="Arial" w:cs="Arial" w:eastAsia="Arial" w:hAnsi="Arial"/>
-                <w:b/>
-                <w:bCs/>
-                <w:color w:val="0E3A4E"/>
-                <w:sz w:val="19"/>
-                <w:szCs w:val="19"/>
-              </w:rPr>
-              <w:t xml:space="preserve">Año 2 en adelante</w:t>
-            </w:r>
-          </w:p>
-        </w:tc>
-      </w:tr>
-      <w:tr>
-        <w:trPr>
-          <w:tblHeader w:val="false"/>
-        </w:trPr>
-        <w:tc>
-          <w:tcPr>
-            <w:tcW w:type="dxa" w:w="3600"/>
-            <w:shd w:fill="F6F9FA" w:color="auto" w:val="clear"/>
-            <w:tcMar>
-              <w:top w:type="dxa" w:w="70"/>
-              <w:left w:type="dxa" w:w="100"/>
-              <w:bottom w:type="dxa" w:w="70"/>
-              <w:right w:type="dxa" w:w="100"/>
-            </w:tcMar>
-          </w:tcPr>
-          <w:p>
-            <w:pPr>
-              <w:jc w:val="left"/>
-            </w:pPr>
-            <w:r>
-              <w:rPr>
-                <w:rFonts w:ascii="Arial" w:cs="Arial" w:eastAsia="Arial" w:hAnsi="Arial"/>
-                <w:b w:val="false"/>
-                <w:bCs w:val="false"/>
-                <w:color w:val="0E3A4E"/>
-                <w:sz w:val="19"/>
-                <w:szCs w:val="19"/>
-              </w:rPr>
-              <w:t xml:space="preserve">Mínimo · DJI Osmo Pocket 4P</w:t>
-            </w:r>
-          </w:p>
-        </w:tc>
-        <w:tc>
-          <w:tcPr>
-            <w:tcW w:type="dxa" w:w="2880"/>
-            <w:shd w:fill="F6F9FA" w:color="auto" w:val="clear"/>
-            <w:tcMar>
-              <w:top w:type="dxa" w:w="70"/>
-              <w:left w:type="dxa" w:w="100"/>
-              <w:bottom w:type="dxa" w:w="70"/>
-              <w:right w:type="dxa" w:w="100"/>
-            </w:tcMar>
-          </w:tcPr>
-          <w:p>
-            <w:pPr>
-              <w:jc w:val="right"/>
-            </w:pPr>
-            <w:r>
-              <w:rPr>
-                <w:rFonts w:ascii="Arial" w:cs="Arial" w:eastAsia="Arial" w:hAnsi="Arial"/>
-                <w:b/>
-                <w:bCs/>
-                <w:color w:val="0E3A4E"/>
-                <w:sz w:val="19"/>
-                <w:szCs w:val="19"/>
-              </w:rPr>
-              <w:t xml:space="preserve">$43,659–44,659</w:t>
-            </w:r>
-          </w:p>
-        </w:tc>
-        <w:tc>
-          <w:tcPr>
-            <w:tcW w:type="dxa" w:w="2880"/>
-            <w:shd w:fill="F6F9FA" w:color="auto" w:val="clear"/>
-            <w:tcMar>
-              <w:top w:type="dxa" w:w="70"/>
-              <w:left w:type="dxa" w:w="100"/>
-              <w:bottom w:type="dxa" w:w="70"/>
-              <w:right w:type="dxa" w:w="100"/>
-            </w:tcMar>
-          </w:tcPr>
-          <w:p>
-            <w:pPr>
-              <w:jc w:val="right"/>
-            </w:pPr>
-            <w:r>
-              <w:rPr>
-                <w:rFonts w:ascii="Arial" w:cs="Arial" w:eastAsia="Arial" w:hAnsi="Arial"/>
-                <w:b/>
-                <w:bCs/>
-                <w:color w:val="0E3A4E"/>
-                <w:sz w:val="19"/>
-                <w:szCs w:val="19"/>
-              </w:rPr>
-              <w:t xml:space="preserve">$29,224</w:t>
-            </w:r>
-          </w:p>
-        </w:tc>
-      </w:tr>
-      <w:tr>
-        <w:trPr>
-          <w:tblHeader w:val="false"/>
-        </w:trPr>
-        <w:tc>
-          <w:tcPr>
-            <w:tcW w:type="dxa" w:w="3600"/>
-            <w:shd w:fill="FFFFFF" w:color="auto" w:val="clear"/>
-            <w:tcMar>
-              <w:top w:type="dxa" w:w="70"/>
-              <w:left w:type="dxa" w:w="100"/>
-              <w:bottom w:type="dxa" w:w="70"/>
-              <w:right w:type="dxa" w:w="100"/>
-            </w:tcMar>
-          </w:tcPr>
-          <w:p>
-            <w:pPr>
-              <w:jc w:val="left"/>
-            </w:pPr>
-            <w:r>
-              <w:rPr>
-                <w:rFonts w:ascii="Arial" w:cs="Arial" w:eastAsia="Arial" w:hAnsi="Arial"/>
-                <w:b w:val="false"/>
-                <w:bCs w:val="false"/>
-                <w:color w:val="0E3A4E"/>
-                <w:sz w:val="19"/>
-                <w:szCs w:val="19"/>
-              </w:rPr>
-              <w:t xml:space="preserve">Medio · Sony ZV-E10 + estabilizador</w:t>
-            </w:r>
-          </w:p>
-        </w:tc>
-        <w:tc>
-          <w:tcPr>
-            <w:tcW w:type="dxa" w:w="2880"/>
-            <w:shd w:fill="FFFFFF" w:color="auto" w:val="clear"/>
-            <w:tcMar>
-              <w:top w:type="dxa" w:w="70"/>
-              <w:left w:type="dxa" w:w="100"/>
-              <w:bottom w:type="dxa" w:w="70"/>
-              <w:right w:type="dxa" w:w="100"/>
-            </w:tcMar>
-          </w:tcPr>
-          <w:p>
-            <w:pPr>
-              <w:jc w:val="right"/>
-            </w:pPr>
-            <w:r>
-              <w:rPr>
-                <w:rFonts w:ascii="Arial" w:cs="Arial" w:eastAsia="Arial" w:hAnsi="Arial"/>
-                <w:b/>
-                <w:bCs/>
-                <w:color w:val="0E3A4E"/>
-                <w:sz w:val="19"/>
-                <w:szCs w:val="19"/>
-              </w:rPr>
-              <w:t xml:space="preserve">$52,360–57,160</w:t>
-            </w:r>
-          </w:p>
-        </w:tc>
-        <w:tc>
-          <w:tcPr>
-            <w:tcW w:type="dxa" w:w="2880"/>
-            <w:shd w:fill="FFFFFF" w:color="auto" w:val="clear"/>
-            <w:tcMar>
-              <w:top w:type="dxa" w:w="70"/>
-              <w:left w:type="dxa" w:w="100"/>
-              <w:bottom w:type="dxa" w:w="70"/>
-              <w:right w:type="dxa" w:w="100"/>
-            </w:tcMar>
-          </w:tcPr>
-          <w:p>
-            <w:pPr>
-              <w:jc w:val="right"/>
-            </w:pPr>
-            <w:r>
-              <w:rPr>
-                <w:rFonts w:ascii="Arial" w:cs="Arial" w:eastAsia="Arial" w:hAnsi="Arial"/>
-                <w:b/>
-                <w:bCs/>
-                <w:color w:val="0E3A4E"/>
-                <w:sz w:val="19"/>
-                <w:szCs w:val="19"/>
-              </w:rPr>
-              <w:t xml:space="preserve">$29,224</w:t>
-            </w:r>
-          </w:p>
-        </w:tc>
-      </w:tr>
-      <w:tr>
-        <w:trPr>
-          <w:tblHeader w:val="false"/>
-        </w:trPr>
-        <w:tc>
-          <w:tcPr>
-            <w:tcW w:type="dxa" w:w="3600"/>
-            <w:shd w:fill="F6F9FA" w:color="auto" w:val="clear"/>
-            <w:tcMar>
-              <w:top w:type="dxa" w:w="70"/>
-              <w:left w:type="dxa" w:w="100"/>
-              <w:bottom w:type="dxa" w:w="70"/>
-              <w:right w:type="dxa" w:w="100"/>
-            </w:tcMar>
-          </w:tcPr>
-          <w:p>
-            <w:pPr>
-              <w:jc w:val="left"/>
-            </w:pPr>
-            <w:r>
-              <w:rPr>
-                <w:rFonts w:ascii="Arial" w:cs="Arial" w:eastAsia="Arial" w:hAnsi="Arial"/>
-                <w:b w:val="false"/>
-                <w:bCs w:val="false"/>
-                <w:color w:val="0E3A4E"/>
-                <w:sz w:val="19"/>
-                <w:szCs w:val="19"/>
-              </w:rPr>
-              <w:t xml:space="preserve">Ideal · Sony ZV-E10 II + estabilizador</w:t>
-            </w:r>
-          </w:p>
-        </w:tc>
-        <w:tc>
-          <w:tcPr>
-            <w:tcW w:type="dxa" w:w="2880"/>
-            <w:shd w:fill="F6F9FA" w:color="auto" w:val="clear"/>
-            <w:tcMar>
-              <w:top w:type="dxa" w:w="70"/>
-              <w:left w:type="dxa" w:w="100"/>
-              <w:bottom w:type="dxa" w:w="70"/>
-              <w:right w:type="dxa" w:w="100"/>
-            </w:tcMar>
-          </w:tcPr>
-          <w:p>
-            <w:pPr>
-              <w:jc w:val="right"/>
-            </w:pPr>
-            <w:r>
-              <w:rPr>
-                <w:rFonts w:ascii="Arial" w:cs="Arial" w:eastAsia="Arial" w:hAnsi="Arial"/>
-                <w:b/>
-                <w:bCs/>
-                <w:color w:val="0E3A4E"/>
-                <w:sz w:val="19"/>
-                <w:szCs w:val="19"/>
-              </w:rPr>
-              <w:t xml:space="preserve">$63,860–67,160</w:t>
-            </w:r>
-          </w:p>
-        </w:tc>
-        <w:tc>
-          <w:tcPr>
-            <w:tcW w:type="dxa" w:w="2880"/>
-            <w:shd w:fill="F6F9FA" w:color="auto" w:val="clear"/>
-            <w:tcMar>
-              <w:top w:type="dxa" w:w="70"/>
-              <w:left w:type="dxa" w:w="100"/>
-              <w:bottom w:type="dxa" w:w="70"/>
-              <w:right w:type="dxa" w:w="100"/>
-            </w:tcMar>
-          </w:tcPr>
-          <w:p>
-            <w:pPr>
-              <w:jc w:val="right"/>
-            </w:pPr>
-            <w:r>
-              <w:rPr>
-                <w:rFonts w:ascii="Arial" w:cs="Arial" w:eastAsia="Arial" w:hAnsi="Arial"/>
-                <w:b/>
-                <w:bCs/>
-                <w:color w:val="0E3A4E"/>
-                <w:sz w:val="19"/>
-                <w:szCs w:val="19"/>
-              </w:rPr>
-              <w:t xml:space="preserve">$29,224</w:t>
-            </w:r>
-          </w:p>
-        </w:tc>
-      </w:tr>
-    </w:tbl>
+        <w:t xml:space="preserve">Todo en pago anual. Un solo presupuesto con el software del área y la nueva página web.</w:t>
+      </w:r>
+    </w:p>
     <w:tbl>
       <w:tblPr>
         <w:tblW w:type="dxa" w:w="9360"/>
@@ -588,7 +214,7 @@
                 <w:sz w:val="19"/>
                 <w:szCs w:val="19"/>
               </w:rPr>
-              <w:t xml:space="preserve">Año 1</w:t>
+              <w:t xml:space="preserve">Año 1 · 2027</w:t>
             </w:r>
           </w:p>
         </w:tc>
@@ -649,7 +275,7 @@
                 <w:sz w:val="19"/>
                 <w:szCs w:val="19"/>
               </w:rPr>
-              <w:t xml:space="preserve">1 · Software (ManyChat, X Premium, Canva, ChatGPT y Claude)</w:t>
+              <w:t xml:space="preserve">1 · Software (ManyChat, ChatGPT, Claude, Canva y X Premium)</w:t>
             </w:r>
           </w:p>
         </w:tc>
@@ -806,35 +432,35 @@
         <w:tc>
           <w:tcPr>
             <w:tcW w:type="dxa" w:w="4680"/>
-            <w:shd w:fill="F6F9FA" w:color="auto" w:val="clear"/>
-            <w:tcMar>
-              <w:top w:type="dxa" w:w="70"/>
-              <w:left w:type="dxa" w:w="100"/>
-              <w:bottom w:type="dxa" w:w="70"/>
-              <w:right w:type="dxa" w:w="100"/>
-            </w:tcMar>
-          </w:tcPr>
-          <w:p>
-            <w:pPr>
-              <w:jc w:val="left"/>
-            </w:pPr>
-            <w:r>
-              <w:rPr>
-                <w:rFonts w:ascii="Arial" w:cs="Arial" w:eastAsia="Arial" w:hAnsi="Arial"/>
-                <w:b w:val="false"/>
-                <w:bCs w:val="false"/>
-                <w:color w:val="0E3A4E"/>
-                <w:sz w:val="19"/>
-                <w:szCs w:val="19"/>
-              </w:rPr>
-              <w:t xml:space="preserve">3 · Cámara de video (se compra una vez)</w:t>
+            <w:shd w:fill="175772" w:color="auto" w:val="clear"/>
+            <w:tcMar>
+              <w:top w:type="dxa" w:w="70"/>
+              <w:left w:type="dxa" w:w="100"/>
+              <w:bottom w:type="dxa" w:w="70"/>
+              <w:right w:type="dxa" w:w="100"/>
+            </w:tcMar>
+          </w:tcPr>
+          <w:p>
+            <w:pPr>
+              <w:jc w:val="left"/>
+            </w:pPr>
+            <w:r>
+              <w:rPr>
+                <w:rFonts w:ascii="Arial" w:cs="Arial" w:eastAsia="Arial" w:hAnsi="Arial"/>
+                <w:b/>
+                <w:bCs/>
+                <w:color w:val="FFFFFF"/>
+                <w:sz w:val="19"/>
+                <w:szCs w:val="19"/>
+              </w:rPr>
+              <w:t xml:space="preserve">Total</w:t>
             </w:r>
           </w:p>
         </w:tc>
         <w:tc>
           <w:tcPr>
             <w:tcW w:type="dxa" w:w="2340"/>
-            <w:shd w:fill="F6F9FA" w:color="auto" w:val="clear"/>
+            <w:shd w:fill="175772" w:color="auto" w:val="clear"/>
             <w:tcMar>
               <w:top w:type="dxa" w:w="70"/>
               <w:left w:type="dxa" w:w="100"/>
@@ -849,20 +475,20 @@
             <w:r>
               <w:rPr>
                 <w:rFonts w:ascii="Arial" w:cs="Arial" w:eastAsia="Arial" w:hAnsi="Arial"/>
-                <w:b w:val="false"/>
-                <w:bCs w:val="false"/>
-                <w:color w:val="0E3A4E"/>
-                <w:sz w:val="19"/>
-                <w:szCs w:val="19"/>
-              </w:rPr>
-              <w:t xml:space="preserve">$11,999–35,500</w:t>
+                <w:b/>
+                <w:bCs/>
+                <w:color w:val="FFFFFF"/>
+                <w:sz w:val="19"/>
+                <w:szCs w:val="19"/>
+              </w:rPr>
+              <w:t xml:space="preserve">$31,660</w:t>
             </w:r>
           </w:p>
         </w:tc>
         <w:tc>
           <w:tcPr>
             <w:tcW w:type="dxa" w:w="2340"/>
-            <w:shd w:fill="F6F9FA" w:color="auto" w:val="clear"/>
+            <w:shd w:fill="175772" w:color="auto" w:val="clear"/>
             <w:tcMar>
               <w:top w:type="dxa" w:w="70"/>
               <w:left w:type="dxa" w:w="100"/>
@@ -877,13 +503,13 @@
             <w:r>
               <w:rPr>
                 <w:rFonts w:ascii="Arial" w:cs="Arial" w:eastAsia="Arial" w:hAnsi="Arial"/>
-                <w:b w:val="false"/>
-                <w:bCs w:val="false"/>
-                <w:color w:val="0E3A4E"/>
-                <w:sz w:val="19"/>
-                <w:szCs w:val="19"/>
-              </w:rPr>
-              <w:t xml:space="preserve">—</w:t>
+                <w:b/>
+                <w:bCs/>
+                <w:color w:val="A8C243"/>
+                <w:sz w:val="19"/>
+                <w:szCs w:val="19"/>
+              </w:rPr>
+              <w:t xml:space="preserve">$29,224</w:t>
             </w:r>
           </w:p>
         </w:tc>
@@ -902,7 +528,7 @@
           <w:sz w:val="19"/>
           <w:szCs w:val="19"/>
         </w:rPr>
-        <w:t xml:space="preserve">MXN con IVA. El año 2 baja porque la cámara y las llaves de seguridad se compran una sola vez.</w:t>
+        <w:t xml:space="preserve">MXN con IVA. El año 2 baja porque las llaves de seguridad de la web se compran una sola vez.</w:t>
       </w:r>
     </w:p>
     <w:p>
@@ -1217,7 +843,7 @@
             </w:tcMar>
           </w:tcPr>
           <w:p>
-            <w:hyperlink w:history="1" r:id="rIdnu9f5ebb83kmqhie0kls6">
+            <w:hyperlink w:history="1" r:id="rIdku4irpdogwupimqzhpny7">
               <w:r>
                 <w:rPr>
                   <w:rFonts w:ascii="Arial" w:cs="Arial" w:eastAsia="Arial" w:hAnsi="Arial"/>
@@ -1360,7 +986,7 @@
             </w:tcMar>
           </w:tcPr>
           <w:p>
-            <w:hyperlink w:history="1" r:id="rIdxo0-i-4x3fieecnpfusek">
+            <w:hyperlink w:history="1" r:id="rIdgdstc7fegxjkmd3crfgui">
               <w:r>
                 <w:rPr>
                   <w:rFonts w:ascii="Arial" w:cs="Arial" w:eastAsia="Arial" w:hAnsi="Arial"/>
@@ -1503,7 +1129,7 @@
             </w:tcMar>
           </w:tcPr>
           <w:p>
-            <w:hyperlink w:history="1" r:id="rIdh2silr9p-1aswcsmalt4n">
+            <w:hyperlink w:history="1" r:id="rIdmhsig5b4toq0dvjsdngui">
               <w:r>
                 <w:rPr>
                   <w:rFonts w:ascii="Arial" w:cs="Arial" w:eastAsia="Arial" w:hAnsi="Arial"/>
@@ -1646,7 +1272,7 @@
             </w:tcMar>
           </w:tcPr>
           <w:p>
-            <w:hyperlink w:history="1" r:id="rIdd5vheuyst0ty50kat_urm">
+            <w:hyperlink w:history="1" r:id="rIdu_ar810tnyn1hljupvf3n">
               <w:r>
                 <w:rPr>
                   <w:rFonts w:ascii="Arial" w:cs="Arial" w:eastAsia="Arial" w:hAnsi="Arial"/>
@@ -1789,7 +1415,7 @@
             </w:tcMar>
           </w:tcPr>
           <w:p>
-            <w:hyperlink w:history="1" r:id="rIdlyxjbgazkiyalsetrdd5l">
+            <w:hyperlink w:history="1" r:id="rIdmh61qs3cdece_olqd17qa">
               <w:r>
                 <w:rPr>
                   <w:rFonts w:ascii="Arial" w:cs="Arial" w:eastAsia="Arial" w:hAnsi="Arial"/>
@@ -3409,611 +3035,7 @@
           <w:sz w:val="32"/>
           <w:szCs w:val="32"/>
         </w:rPr>
-        <w:t xml:space="preserve">3. Cámara de video: mínimo, medio e ideal</w:t>
-      </w:r>
-    </w:p>
-    <w:p>
-      <w:pPr>
-        <w:spacing w:after="120" w:before="0"/>
-      </w:pPr>
-      <w:r>
-        <w:rPr>
-          <w:rFonts w:ascii="Arial" w:cs="Arial" w:eastAsia="Arial" w:hAnsi="Arial"/>
-          <w:color w:val="0E3A4E"/>
-          <w:sz w:val="22"/>
-          <w:szCs w:val="22"/>
-        </w:rPr>
-        <w:t xml:space="preserve">Solo cámara y estabilizador: los micrófonos ya los tenemos y ninguna cámara necesita software de pago.</w:t>
-      </w:r>
-    </w:p>
-    <w:tbl>
-      <w:tblPr>
-        <w:tblW w:type="dxa" w:w="9360"/>
-        <w:tblBorders>
-          <w:top w:val="single" w:color="auto" w:sz="4"/>
-          <w:left w:val="single" w:color="auto" w:sz="4"/>
-          <w:bottom w:val="single" w:color="auto" w:sz="4"/>
-          <w:right w:val="single" w:color="auto" w:sz="4"/>
-          <w:insideH w:val="single" w:color="auto" w:sz="4"/>
-          <w:insideV w:val="single" w:color="auto" w:sz="4"/>
-        </w:tblBorders>
-      </w:tblPr>
-      <w:tblGrid>
-        <w:gridCol w:w="1800"/>
-        <w:gridCol w:w="2520"/>
-        <w:gridCol w:w="2520"/>
-        <w:gridCol w:w="2520"/>
-      </w:tblGrid>
-      <w:tr>
-        <w:trPr>
-          <w:tblHeader/>
-        </w:trPr>
-        <w:tc>
-          <w:tcPr>
-            <w:tcW w:type="dxa" w:w="1800"/>
-            <w:shd w:fill="DCE6EB" w:color="auto" w:val="clear"/>
-            <w:tcMar>
-              <w:top w:type="dxa" w:w="70"/>
-              <w:left w:type="dxa" w:w="100"/>
-              <w:bottom w:type="dxa" w:w="70"/>
-              <w:right w:type="dxa" w:w="100"/>
-            </w:tcMar>
-          </w:tcPr>
-          <w:p>
-            <w:pPr>
-              <w:jc w:val="left"/>
-            </w:pPr>
-            <w:r>
-              <w:rPr>
-                <w:rFonts w:ascii="Arial" w:cs="Arial" w:eastAsia="Arial" w:hAnsi="Arial"/>
-                <w:b/>
-                <w:bCs/>
-                <w:color w:val="0E3A4E"/>
-                <w:sz w:val="19"/>
-                <w:szCs w:val="19"/>
-              </w:rPr>
-              <w:t xml:space="preserve">Concepto</w:t>
-            </w:r>
-          </w:p>
-        </w:tc>
-        <w:tc>
-          <w:tcPr>
-            <w:tcW w:type="dxa" w:w="2520"/>
-            <w:shd w:fill="DCE6EB" w:color="auto" w:val="clear"/>
-            <w:tcMar>
-              <w:top w:type="dxa" w:w="70"/>
-              <w:left w:type="dxa" w:w="100"/>
-              <w:bottom w:type="dxa" w:w="70"/>
-              <w:right w:type="dxa" w:w="100"/>
-            </w:tcMar>
-          </w:tcPr>
-          <w:p>
-            <w:pPr>
-              <w:jc w:val="left"/>
-            </w:pPr>
-            <w:r>
-              <w:rPr>
-                <w:rFonts w:ascii="Arial" w:cs="Arial" w:eastAsia="Arial" w:hAnsi="Arial"/>
-                <w:b/>
-                <w:bCs/>
-                <w:color w:val="0E3A4E"/>
-                <w:sz w:val="19"/>
-                <w:szCs w:val="19"/>
-              </w:rPr>
-              <w:t xml:space="preserve">Mínimo · DJI Osmo Pocket 4P</w:t>
-            </w:r>
-          </w:p>
-        </w:tc>
-        <w:tc>
-          <w:tcPr>
-            <w:tcW w:type="dxa" w:w="2520"/>
-            <w:shd w:fill="DCE6EB" w:color="auto" w:val="clear"/>
-            <w:tcMar>
-              <w:top w:type="dxa" w:w="70"/>
-              <w:left w:type="dxa" w:w="100"/>
-              <w:bottom w:type="dxa" w:w="70"/>
-              <w:right w:type="dxa" w:w="100"/>
-            </w:tcMar>
-          </w:tcPr>
-          <w:p>
-            <w:pPr>
-              <w:jc w:val="left"/>
-            </w:pPr>
-            <w:r>
-              <w:rPr>
-                <w:rFonts w:ascii="Arial" w:cs="Arial" w:eastAsia="Arial" w:hAnsi="Arial"/>
-                <w:b/>
-                <w:bCs/>
-                <w:color w:val="0E3A4E"/>
-                <w:sz w:val="19"/>
-                <w:szCs w:val="19"/>
-              </w:rPr>
-              <w:t xml:space="preserve">Medio · Sony ZV-E10</w:t>
-            </w:r>
-          </w:p>
-        </w:tc>
-        <w:tc>
-          <w:tcPr>
-            <w:tcW w:type="dxa" w:w="2520"/>
-            <w:shd w:fill="DCE6EB" w:color="auto" w:val="clear"/>
-            <w:tcMar>
-              <w:top w:type="dxa" w:w="70"/>
-              <w:left w:type="dxa" w:w="100"/>
-              <w:bottom w:type="dxa" w:w="70"/>
-              <w:right w:type="dxa" w:w="100"/>
-            </w:tcMar>
-          </w:tcPr>
-          <w:p>
-            <w:pPr>
-              <w:jc w:val="left"/>
-            </w:pPr>
-            <w:r>
-              <w:rPr>
-                <w:rFonts w:ascii="Arial" w:cs="Arial" w:eastAsia="Arial" w:hAnsi="Arial"/>
-                <w:b/>
-                <w:bCs/>
-                <w:color w:val="0E3A4E"/>
-                <w:sz w:val="19"/>
-                <w:szCs w:val="19"/>
-              </w:rPr>
-              <w:t xml:space="preserve">Ideal · Sony ZV-E10 II</w:t>
-            </w:r>
-          </w:p>
-        </w:tc>
-      </w:tr>
-      <w:tr>
-        <w:trPr>
-          <w:tblHeader w:val="false"/>
-        </w:trPr>
-        <w:tc>
-          <w:tcPr>
-            <w:tcW w:type="dxa" w:w="1800"/>
-            <w:shd w:fill="F6F9FA" w:color="auto" w:val="clear"/>
-            <w:tcMar>
-              <w:top w:type="dxa" w:w="70"/>
-              <w:left w:type="dxa" w:w="100"/>
-              <w:bottom w:type="dxa" w:w="70"/>
-              <w:right w:type="dxa" w:w="100"/>
-            </w:tcMar>
-          </w:tcPr>
-          <w:p>
-            <w:pPr>
-              <w:jc w:val="left"/>
-            </w:pPr>
-            <w:r>
-              <w:rPr>
-                <w:rFonts w:ascii="Arial" w:cs="Arial" w:eastAsia="Arial" w:hAnsi="Arial"/>
-                <w:b w:val="false"/>
-                <w:bCs w:val="false"/>
-                <w:color w:val="0E3A4E"/>
-                <w:sz w:val="19"/>
-                <w:szCs w:val="19"/>
-              </w:rPr>
-              <w:t xml:space="preserve">Cámara</w:t>
-            </w:r>
-          </w:p>
-        </w:tc>
-        <w:tc>
-          <w:tcPr>
-            <w:tcW w:type="dxa" w:w="2520"/>
-            <w:shd w:fill="F6F9FA" w:color="auto" w:val="clear"/>
-            <w:tcMar>
-              <w:top w:type="dxa" w:w="70"/>
-              <w:left w:type="dxa" w:w="100"/>
-              <w:bottom w:type="dxa" w:w="70"/>
-              <w:right w:type="dxa" w:w="100"/>
-            </w:tcMar>
-          </w:tcPr>
-          <w:p>
-            <w:pPr>
-              <w:jc w:val="left"/>
-            </w:pPr>
-            <w:r>
-              <w:rPr>
-                <w:rFonts w:ascii="Arial" w:cs="Arial" w:eastAsia="Arial" w:hAnsi="Arial"/>
-                <w:b w:val="false"/>
-                <w:bCs w:val="false"/>
-                <w:color w:val="0E3A4E"/>
-                <w:sz w:val="19"/>
-                <w:szCs w:val="19"/>
-              </w:rPr>
-              <w:t xml:space="preserve">Standard Combo · $11,999–12,999</w:t>
-            </w:r>
-          </w:p>
-        </w:tc>
-        <w:tc>
-          <w:tcPr>
-            <w:tcW w:type="dxa" w:w="2520"/>
-            <w:shd w:fill="F6F9FA" w:color="auto" w:val="clear"/>
-            <w:tcMar>
-              <w:top w:type="dxa" w:w="70"/>
-              <w:left w:type="dxa" w:w="100"/>
-              <w:bottom w:type="dxa" w:w="70"/>
-              <w:right w:type="dxa" w:w="100"/>
-            </w:tcMar>
-          </w:tcPr>
-          <w:p>
-            <w:pPr>
-              <w:jc w:val="left"/>
-            </w:pPr>
-            <w:r>
-              <w:rPr>
-                <w:rFonts w:ascii="Arial" w:cs="Arial" w:eastAsia="Arial" w:hAnsi="Arial"/>
-                <w:b w:val="false"/>
-                <w:bCs w:val="false"/>
-                <w:color w:val="0E3A4E"/>
-                <w:sz w:val="19"/>
-                <w:szCs w:val="19"/>
-              </w:rPr>
-              <w:t xml:space="preserve">+ lente 16-50 · $13,500–18,000</w:t>
-            </w:r>
-          </w:p>
-        </w:tc>
-        <w:tc>
-          <w:tcPr>
-            <w:tcW w:type="dxa" w:w="2520"/>
-            <w:shd w:fill="F6F9FA" w:color="auto" w:val="clear"/>
-            <w:tcMar>
-              <w:top w:type="dxa" w:w="70"/>
-              <w:left w:type="dxa" w:w="100"/>
-              <w:bottom w:type="dxa" w:w="70"/>
-              <w:right w:type="dxa" w:w="100"/>
-            </w:tcMar>
-          </w:tcPr>
-          <w:p>
-            <w:pPr>
-              <w:jc w:val="left"/>
-            </w:pPr>
-            <w:r>
-              <w:rPr>
-                <w:rFonts w:ascii="Arial" w:cs="Arial" w:eastAsia="Arial" w:hAnsi="Arial"/>
-                <w:b w:val="false"/>
-                <w:bCs w:val="false"/>
-                <w:color w:val="0E3A4E"/>
-                <w:sz w:val="19"/>
-                <w:szCs w:val="19"/>
-              </w:rPr>
-              <w:t xml:space="preserve">+ lente 16-50 · $25,000–28,000</w:t>
-            </w:r>
-          </w:p>
-        </w:tc>
-      </w:tr>
-      <w:tr>
-        <w:trPr>
-          <w:tblHeader w:val="false"/>
-        </w:trPr>
-        <w:tc>
-          <w:tcPr>
-            <w:tcW w:type="dxa" w:w="1800"/>
-            <w:shd w:fill="FFFFFF" w:color="auto" w:val="clear"/>
-            <w:tcMar>
-              <w:top w:type="dxa" w:w="70"/>
-              <w:left w:type="dxa" w:w="100"/>
-              <w:bottom w:type="dxa" w:w="70"/>
-              <w:right w:type="dxa" w:w="100"/>
-            </w:tcMar>
-          </w:tcPr>
-          <w:p>
-            <w:pPr>
-              <w:jc w:val="left"/>
-            </w:pPr>
-            <w:r>
-              <w:rPr>
-                <w:rFonts w:ascii="Arial" w:cs="Arial" w:eastAsia="Arial" w:hAnsi="Arial"/>
-                <w:b w:val="false"/>
-                <w:bCs w:val="false"/>
-                <w:color w:val="0E3A4E"/>
-                <w:sz w:val="19"/>
-                <w:szCs w:val="19"/>
-              </w:rPr>
-              <w:t xml:space="preserve">Estabilizador</w:t>
-            </w:r>
-          </w:p>
-        </w:tc>
-        <w:tc>
-          <w:tcPr>
-            <w:tcW w:type="dxa" w:w="2520"/>
-            <w:shd w:fill="FFFFFF" w:color="auto" w:val="clear"/>
-            <w:tcMar>
-              <w:top w:type="dxa" w:w="70"/>
-              <w:left w:type="dxa" w:w="100"/>
-              <w:bottom w:type="dxa" w:w="70"/>
-              <w:right w:type="dxa" w:w="100"/>
-            </w:tcMar>
-          </w:tcPr>
-          <w:p>
-            <w:pPr>
-              <w:jc w:val="left"/>
-            </w:pPr>
-            <w:r>
-              <w:rPr>
-                <w:rFonts w:ascii="Arial" w:cs="Arial" w:eastAsia="Arial" w:hAnsi="Arial"/>
-                <w:b w:val="false"/>
-                <w:bCs w:val="false"/>
-                <w:color w:val="0E3A4E"/>
-                <w:sz w:val="19"/>
-                <w:szCs w:val="19"/>
-              </w:rPr>
-              <w:t xml:space="preserve">Integrado (3 ejes)</w:t>
-            </w:r>
-          </w:p>
-        </w:tc>
-        <w:tc>
-          <w:tcPr>
-            <w:tcW w:type="dxa" w:w="2520"/>
-            <w:shd w:fill="FFFFFF" w:color="auto" w:val="clear"/>
-            <w:tcMar>
-              <w:top w:type="dxa" w:w="70"/>
-              <w:left w:type="dxa" w:w="100"/>
-              <w:bottom w:type="dxa" w:w="70"/>
-              <w:right w:type="dxa" w:w="100"/>
-            </w:tcMar>
-          </w:tcPr>
-          <w:p>
-            <w:pPr>
-              <w:jc w:val="left"/>
-            </w:pPr>
-            <w:r>
-              <w:rPr>
-                <w:rFonts w:ascii="Arial" w:cs="Arial" w:eastAsia="Arial" w:hAnsi="Arial"/>
-                <w:b w:val="false"/>
-                <w:bCs w:val="false"/>
-                <w:color w:val="0E3A4E"/>
-                <w:sz w:val="19"/>
-                <w:szCs w:val="19"/>
-              </w:rPr>
-              <w:t xml:space="preserve">DJI RS 4 Mini · $7,200–7,500</w:t>
-            </w:r>
-          </w:p>
-        </w:tc>
-        <w:tc>
-          <w:tcPr>
-            <w:tcW w:type="dxa" w:w="2520"/>
-            <w:shd w:fill="FFFFFF" w:color="auto" w:val="clear"/>
-            <w:tcMar>
-              <w:top w:type="dxa" w:w="70"/>
-              <w:left w:type="dxa" w:w="100"/>
-              <w:bottom w:type="dxa" w:w="70"/>
-              <w:right w:type="dxa" w:w="100"/>
-            </w:tcMar>
-          </w:tcPr>
-          <w:p>
-            <w:pPr>
-              <w:jc w:val="left"/>
-            </w:pPr>
-            <w:r>
-              <w:rPr>
-                <w:rFonts w:ascii="Arial" w:cs="Arial" w:eastAsia="Arial" w:hAnsi="Arial"/>
-                <w:b w:val="false"/>
-                <w:bCs w:val="false"/>
-                <w:color w:val="0E3A4E"/>
-                <w:sz w:val="19"/>
-                <w:szCs w:val="19"/>
-              </w:rPr>
-              <w:t xml:space="preserve">DJI RS 4 Mini · $7,200–7,500</w:t>
-            </w:r>
-          </w:p>
-        </w:tc>
-      </w:tr>
-      <w:tr>
-        <w:trPr>
-          <w:tblHeader w:val="false"/>
-        </w:trPr>
-        <w:tc>
-          <w:tcPr>
-            <w:tcW w:type="dxa" w:w="1800"/>
-            <w:shd w:fill="175772" w:color="auto" w:val="clear"/>
-            <w:tcMar>
-              <w:top w:type="dxa" w:w="70"/>
-              <w:left w:type="dxa" w:w="100"/>
-              <w:bottom w:type="dxa" w:w="70"/>
-              <w:right w:type="dxa" w:w="100"/>
-            </w:tcMar>
-          </w:tcPr>
-          <w:p>
-            <w:pPr>
-              <w:jc w:val="left"/>
-            </w:pPr>
-            <w:r>
-              <w:rPr>
-                <w:rFonts w:ascii="Arial" w:cs="Arial" w:eastAsia="Arial" w:hAnsi="Arial"/>
-                <w:b/>
-                <w:bCs/>
-                <w:color w:val="FFFFFF"/>
-                <w:sz w:val="19"/>
-                <w:szCs w:val="19"/>
-              </w:rPr>
-              <w:t xml:space="preserve">Rango estimado</w:t>
-            </w:r>
-          </w:p>
-        </w:tc>
-        <w:tc>
-          <w:tcPr>
-            <w:tcW w:type="dxa" w:w="2520"/>
-            <w:shd w:fill="175772" w:color="auto" w:val="clear"/>
-            <w:tcMar>
-              <w:top w:type="dxa" w:w="70"/>
-              <w:left w:type="dxa" w:w="100"/>
-              <w:bottom w:type="dxa" w:w="70"/>
-              <w:right w:type="dxa" w:w="100"/>
-            </w:tcMar>
-          </w:tcPr>
-          <w:p>
-            <w:pPr>
-              <w:jc w:val="left"/>
-            </w:pPr>
-            <w:r>
-              <w:rPr>
-                <w:rFonts w:ascii="Arial" w:cs="Arial" w:eastAsia="Arial" w:hAnsi="Arial"/>
-                <w:b/>
-                <w:bCs/>
-                <w:color w:val="FFFFFF"/>
-                <w:sz w:val="19"/>
-                <w:szCs w:val="19"/>
-              </w:rPr>
-              <w:t xml:space="preserve">$11,999–12,999</w:t>
-            </w:r>
-          </w:p>
-        </w:tc>
-        <w:tc>
-          <w:tcPr>
-            <w:tcW w:type="dxa" w:w="2520"/>
-            <w:shd w:fill="175772" w:color="auto" w:val="clear"/>
-            <w:tcMar>
-              <w:top w:type="dxa" w:w="70"/>
-              <w:left w:type="dxa" w:w="100"/>
-              <w:bottom w:type="dxa" w:w="70"/>
-              <w:right w:type="dxa" w:w="100"/>
-            </w:tcMar>
-          </w:tcPr>
-          <w:p>
-            <w:pPr>
-              <w:jc w:val="left"/>
-            </w:pPr>
-            <w:r>
-              <w:rPr>
-                <w:rFonts w:ascii="Arial" w:cs="Arial" w:eastAsia="Arial" w:hAnsi="Arial"/>
-                <w:b/>
-                <w:bCs/>
-                <w:color w:val="FFFFFF"/>
-                <w:sz w:val="19"/>
-                <w:szCs w:val="19"/>
-              </w:rPr>
-              <w:t xml:space="preserve">$20,700–25,500</w:t>
-            </w:r>
-          </w:p>
-        </w:tc>
-        <w:tc>
-          <w:tcPr>
-            <w:tcW w:type="dxa" w:w="2520"/>
-            <w:shd w:fill="175772" w:color="auto" w:val="clear"/>
-            <w:tcMar>
-              <w:top w:type="dxa" w:w="70"/>
-              <w:left w:type="dxa" w:w="100"/>
-              <w:bottom w:type="dxa" w:w="70"/>
-              <w:right w:type="dxa" w:w="100"/>
-            </w:tcMar>
-          </w:tcPr>
-          <w:p>
-            <w:pPr>
-              <w:jc w:val="left"/>
-            </w:pPr>
-            <w:r>
-              <w:rPr>
-                <w:rFonts w:ascii="Arial" w:cs="Arial" w:eastAsia="Arial" w:hAnsi="Arial"/>
-                <w:b/>
-                <w:bCs/>
-                <w:color w:val="FFFFFF"/>
-                <w:sz w:val="19"/>
-                <w:szCs w:val="19"/>
-              </w:rPr>
-              <w:t xml:space="preserve">$32,200–35,500</w:t>
-            </w:r>
-          </w:p>
-        </w:tc>
-      </w:tr>
-    </w:tbl>
-    <w:p>
-      <w:pPr>
-        <w:spacing w:after="120" w:before="80"/>
-      </w:pPr>
-      <w:r>
-        <w:rPr>
-          <w:rFonts w:ascii="Arial" w:cs="Arial" w:eastAsia="Arial" w:hAnsi="Arial"/>
-          <w:i/>
-          <w:iCs/>
-          <w:color w:val="3D5866"/>
-          <w:sz w:val="19"/>
-          <w:szCs w:val="19"/>
-        </w:rPr>
-        <w:t xml:space="preserve">Rangos de Mercado Libre y tiendas oficiales; el precio cambia según vendedor. Las tres combinaciones son compatibles (el RS 4 Mini carga hasta 2 kg).</w:t>
-      </w:r>
-    </w:p>
-    <w:p>
-      <w:pPr>
-        <w:pStyle w:val="Heading1"/>
-        <w:pBdr>
-          <w:bottom w:val="single" w:color="A8C243" w:sz="12" w:space="4"/>
-        </w:pBdr>
-        <w:spacing w:after="120" w:before="240"/>
-      </w:pPr>
-      <w:r>
-        <w:rPr>
-          <w:rFonts w:ascii="Arial" w:cs="Arial" w:eastAsia="Arial" w:hAnsi="Arial"/>
-          <w:b/>
-          <w:bCs/>
-          <w:color w:val="175772"/>
-          <w:sz w:val="32"/>
-          <w:szCs w:val="32"/>
-        </w:rPr>
-        <w:t xml:space="preserve">4. Por qué cada cosa</w:t>
-      </w:r>
-    </w:p>
-    <w:p>
-      <w:pPr>
-        <w:pStyle w:val="Heading2"/>
-        <w:spacing w:after="80" w:before="200"/>
-      </w:pPr>
-      <w:r>
-        <w:rPr>
-          <w:rFonts w:ascii="Arial" w:cs="Arial" w:eastAsia="Arial" w:hAnsi="Arial"/>
-          <w:b/>
-          <w:bCs/>
-          <w:color w:val="175772"/>
-          <w:sz w:val="26"/>
-          <w:szCs w:val="26"/>
-        </w:rPr>
-        <w:t xml:space="preserve">Cámara de video</w:t>
-      </w:r>
-    </w:p>
-    <w:p>
-      <w:pPr>
-        <w:spacing w:after="40" w:before="0"/>
-      </w:pPr>
-      <w:r>
-        <w:rPr>
-          <w:rFonts w:ascii="Arial" w:cs="Arial" w:eastAsia="Arial" w:hAnsi="Arial"/>
-          <w:b/>
-          <w:bCs/>
-          <w:color w:val="0E3A4E"/>
-          <w:sz w:val="22"/>
-          <w:szCs w:val="22"/>
-        </w:rPr>
-        <w:t xml:space="preserve">Por qué: </w:t>
-      </w:r>
-      <w:r>
-        <w:rPr>
-          <w:rFonts w:ascii="Arial" w:cs="Arial" w:eastAsia="Arial" w:hAnsi="Arial"/>
-          <w:color w:val="0E3A4E"/>
-          <w:sz w:val="22"/>
-          <w:szCs w:val="22"/>
-        </w:rPr>
-        <w:t xml:space="preserve">Hacemos contenido para redes y video institucional durante todo el año. Una mejor cámara mejora la calidad de los videos de redes y del material institucional, optimiza la producción y nos permite ofrecer paquetes de promoción de mejor calidad a los organizadores que quieren promocionar su evento en nuestros canales.</w:t>
-      </w:r>
-    </w:p>
-    <w:p>
-      <w:pPr>
-        <w:spacing w:after="120" w:before="0"/>
-      </w:pPr>
-      <w:r>
-        <w:rPr>
-          <w:rFonts w:ascii="Arial" w:cs="Arial" w:eastAsia="Arial" w:hAnsi="Arial"/>
-          <w:b/>
-          <w:bCs/>
-          <w:color w:val="0E3A4E"/>
-          <w:sz w:val="22"/>
-          <w:szCs w:val="22"/>
-        </w:rPr>
-        <w:t xml:space="preserve">Ejemplo: </w:t>
-      </w:r>
-      <w:r>
-        <w:rPr>
-          <w:rFonts w:ascii="Arial" w:cs="Arial" w:eastAsia="Arial" w:hAnsi="Arial"/>
-          <w:color w:val="0E3A4E"/>
-          <w:sz w:val="22"/>
-          <w:szCs w:val="22"/>
-        </w:rPr>
-        <w:t xml:space="preserve">Video institucional del recinto, cobertura de eventos para redes y cápsulas para los organizadores que contratan la promoción de su evento.</w:t>
+        <w:t xml:space="preserve">3. Por qué cada cosa</w:t>
       </w:r>
     </w:p>
     <w:p>
@@ -4774,7 +3796,7 @@
           <w:sz w:val="32"/>
           <w:szCs w:val="32"/>
         </w:rPr>
-        <w:t xml:space="preserve">5. Links de compra</w:t>
+        <w:t xml:space="preserve">4. Links de compra</w:t>
       </w:r>
     </w:p>
     <w:p>
@@ -4786,7 +3808,7 @@
         </w:numPr>
         <w:spacing w:after="60"/>
       </w:pPr>
-      <w:hyperlink w:history="1" r:id="rIdtpvk2y3h4sqeiqhhi_a5q">
+      <w:hyperlink w:history="1" r:id="rIdyhuoxiwqqvfcgfjxr2qyp">
         <w:r>
           <w:rPr>
             <w:rFonts w:ascii="Arial" w:cs="Arial" w:eastAsia="Arial" w:hAnsi="Arial"/>
@@ -4808,7 +3830,7 @@
         </w:numPr>
         <w:spacing w:after="60"/>
       </w:pPr>
-      <w:hyperlink w:history="1" r:id="rIdddonvzallbv4hu7nwhpna">
+      <w:hyperlink w:history="1" r:id="rIdwugbubouyfcsplpbhuktl">
         <w:r>
           <w:rPr>
             <w:rFonts w:ascii="Arial" w:cs="Arial" w:eastAsia="Arial" w:hAnsi="Arial"/>
@@ -4830,7 +3852,7 @@
         </w:numPr>
         <w:spacing w:after="60"/>
       </w:pPr>
-      <w:hyperlink w:history="1" r:id="rIdeal8q4te0mopibcf0h8mk">
+      <w:hyperlink w:history="1" r:id="rIdga3i3fc51hkq77v9lqba0">
         <w:r>
           <w:rPr>
             <w:rFonts w:ascii="Arial" w:cs="Arial" w:eastAsia="Arial" w:hAnsi="Arial"/>
@@ -4852,7 +3874,7 @@
         </w:numPr>
         <w:spacing w:after="60"/>
       </w:pPr>
-      <w:hyperlink w:history="1" r:id="rIdrtvv6tmakoqkdlo7lwqkc">
+      <w:hyperlink w:history="1" r:id="rIdplbzwjpgirfqzd7zt6lio">
         <w:r>
           <w:rPr>
             <w:rFonts w:ascii="Arial" w:cs="Arial" w:eastAsia="Arial" w:hAnsi="Arial"/>
@@ -4874,7 +3896,7 @@
         </w:numPr>
         <w:spacing w:after="60"/>
       </w:pPr>
-      <w:hyperlink w:history="1" r:id="rIdgm8lmwcjdntaiozg5nyvz">
+      <w:hyperlink w:history="1" r:id="rIdo17uvj3ncwkmzzoryu1pn">
         <w:r>
           <w:rPr>
             <w:rFonts w:ascii="Arial" w:cs="Arial" w:eastAsia="Arial" w:hAnsi="Arial"/>
@@ -4896,7 +3918,7 @@
         </w:numPr>
         <w:spacing w:after="60"/>
       </w:pPr>
-      <w:hyperlink w:history="1" r:id="rIdn19d69bxfqjxqfv-qec4l">
+      <w:hyperlink w:history="1" r:id="rId42hsnfimftx_mtxp7c4nt">
         <w:r>
           <w:rPr>
             <w:rFonts w:ascii="Arial" w:cs="Arial" w:eastAsia="Arial" w:hAnsi="Arial"/>
@@ -4918,7 +3940,7 @@
         </w:numPr>
         <w:spacing w:after="60"/>
       </w:pPr>
-      <w:hyperlink w:history="1" r:id="rIdf_omzm1qfaav6ttfwdc_7">
+      <w:hyperlink w:history="1" r:id="rIdo8tne0wfzour5mkmdugks">
         <w:r>
           <w:rPr>
             <w:rFonts w:ascii="Arial" w:cs="Arial" w:eastAsia="Arial" w:hAnsi="Arial"/>
@@ -4940,7 +3962,7 @@
         </w:numPr>
         <w:spacing w:after="60"/>
       </w:pPr>
-      <w:hyperlink w:history="1" r:id="rIdontxrv65orhd9vzn8tl-u">
+      <w:hyperlink w:history="1" r:id="rIdmeuyuxvzkym3biov6n3qt">
         <w:r>
           <w:rPr>
             <w:rFonts w:ascii="Arial" w:cs="Arial" w:eastAsia="Arial" w:hAnsi="Arial"/>
@@ -4962,7 +3984,7 @@
         </w:numPr>
         <w:spacing w:after="60"/>
       </w:pPr>
-      <w:hyperlink w:history="1" r:id="rIdx-_vhjwmzr3ncyaguyoic">
+      <w:hyperlink w:history="1" r:id="rIdn57g2pxxr_rdqvpe0snns">
         <w:r>
           <w:rPr>
             <w:rFonts w:ascii="Arial" w:cs="Arial" w:eastAsia="Arial" w:hAnsi="Arial"/>
@@ -4977,6 +3999,26 @@
     </w:p>
     <w:p>
       <w:pPr>
+        <w:pStyle w:val="Heading1"/>
+        <w:pBdr>
+          <w:bottom w:val="single" w:color="A8C243" w:sz="12" w:space="4"/>
+        </w:pBdr>
+        <w:spacing w:after="120" w:before="240"/>
+      </w:pPr>
+      <w:r>
+        <w:rPr>
+          <w:rFonts w:ascii="Arial" w:cs="Arial" w:eastAsia="Arial" w:hAnsi="Arial"/>
+          <w:b/>
+          <w:bCs/>
+          <w:color w:val="175772"/>
+          <w:sz w:val="32"/>
+          <w:szCs w:val="32"/>
+        </w:rPr>
+        <w:t xml:space="preserve">Condiciones del presupuesto</w:t>
+      </w:r>
+    </w:p>
+    <w:p>
+      <w:pPr>
         <w:pStyle w:val="ListParagraph"/>
         <w:numPr>
           <w:ilvl w:val="0"/>
@@ -4984,18 +4026,15 @@
         </w:numPr>
         <w:spacing w:after="60"/>
       </w:pPr>
-      <w:hyperlink w:history="1" r:id="rId0mv35p-rshoi9flrpllnh">
-        <w:r>
-          <w:rPr>
-            <w:rFonts w:ascii="Arial" w:cs="Arial" w:eastAsia="Arial" w:hAnsi="Arial"/>
-            <w:color w:val="039AD1"/>
-            <w:sz w:val="20"/>
-            <w:szCs w:val="20"/>
-            <w:u w:val="single"/>
-          </w:rPr>
-          <w:t xml:space="preserve">Osmo Pocket 4P Standard Combo · DJI Store</w:t>
-        </w:r>
-      </w:hyperlink>
+      <w:r>
+        <w:rPr>
+          <w:rFonts w:ascii="Arial" w:cs="Arial" w:eastAsia="Arial" w:hAnsi="Arial"/>
+          <w:color w:val="0E3A4E"/>
+          <w:sz w:val="22"/>
+          <w:szCs w:val="22"/>
+        </w:rPr>
+        <w:t xml:space="preserve">Área solicitante: Comunicación y RRPP. Periodo: enero a diciembre de 2027.</w:t>
+      </w:r>
     </w:p>
     <w:p>
       <w:pPr>
@@ -5006,18 +4045,15 @@
         </w:numPr>
         <w:spacing w:after="60"/>
       </w:pPr>
-      <w:hyperlink w:history="1" r:id="rIdiyhge_h4pstyb5s4bo3n2">
-        <w:r>
-          <w:rPr>
-            <w:rFonts w:ascii="Arial" w:cs="Arial" w:eastAsia="Arial" w:hAnsi="Arial"/>
-            <w:color w:val="039AD1"/>
-            <w:sz w:val="20"/>
-            <w:szCs w:val="20"/>
-            <w:u w:val="single"/>
-          </w:rPr>
-          <w:t xml:space="preserve">Sony ZV-E10 + lente 16-50 · Mercado Libre</w:t>
-        </w:r>
-      </w:hyperlink>
+      <w:r>
+        <w:rPr>
+          <w:rFonts w:ascii="Arial" w:cs="Arial" w:eastAsia="Arial" w:hAnsi="Arial"/>
+          <w:color w:val="0E3A4E"/>
+          <w:sz w:val="22"/>
+          <w:szCs w:val="22"/>
+        </w:rPr>
+        <w:t xml:space="preserve">Precios en pesos mexicanos con IVA, consultados en octubre de 2026; sujetos a cambio del proveedor.</w:t>
+      </w:r>
     </w:p>
     <w:p>
       <w:pPr>
@@ -5028,70 +4064,6 @@
         </w:numPr>
         <w:spacing w:after="60"/>
       </w:pPr>
-      <w:hyperlink w:history="1" r:id="rIdf_3m3pf36xnjnvfpntoqc">
-        <w:r>
-          <w:rPr>
-            <w:rFonts w:ascii="Arial" w:cs="Arial" w:eastAsia="Arial" w:hAnsi="Arial"/>
-            <w:color w:val="039AD1"/>
-            <w:sz w:val="20"/>
-            <w:szCs w:val="20"/>
-            <w:u w:val="single"/>
-          </w:rPr>
-          <w:t xml:space="preserve">Sony ZV-E10 II + lente 16-50 · Mercado Libre</w:t>
-        </w:r>
-      </w:hyperlink>
-    </w:p>
-    <w:p>
-      <w:pPr>
-        <w:pStyle w:val="ListParagraph"/>
-        <w:numPr>
-          <w:ilvl w:val="0"/>
-          <w:numId w:val="2"/>
-        </w:numPr>
-        <w:spacing w:after="60"/>
-      </w:pPr>
-      <w:hyperlink w:history="1" r:id="rIdfzmwewd10g3pbyktgeqod">
-        <w:r>
-          <w:rPr>
-            <w:rFonts w:ascii="Arial" w:cs="Arial" w:eastAsia="Arial" w:hAnsi="Arial"/>
-            <w:color w:val="039AD1"/>
-            <w:sz w:val="20"/>
-            <w:szCs w:val="20"/>
-            <w:u w:val="single"/>
-          </w:rPr>
-          <w:t xml:space="preserve">DJI RS 4 Mini · DJI Store</w:t>
-        </w:r>
-      </w:hyperlink>
-    </w:p>
-    <w:p>
-      <w:pPr>
-        <w:pStyle w:val="Heading1"/>
-        <w:pBdr>
-          <w:bottom w:val="single" w:color="A8C243" w:sz="12" w:space="4"/>
-        </w:pBdr>
-        <w:spacing w:after="120" w:before="240"/>
-      </w:pPr>
-      <w:r>
-        <w:rPr>
-          <w:rFonts w:ascii="Arial" w:cs="Arial" w:eastAsia="Arial" w:hAnsi="Arial"/>
-          <w:b/>
-          <w:bCs/>
-          <w:color w:val="175772"/>
-          <w:sz w:val="32"/>
-          <w:szCs w:val="32"/>
-        </w:rPr>
-        <w:t xml:space="preserve">Condiciones del presupuesto</w:t>
-      </w:r>
-    </w:p>
-    <w:p>
-      <w:pPr>
-        <w:pStyle w:val="ListParagraph"/>
-        <w:numPr>
-          <w:ilvl w:val="0"/>
-          <w:numId w:val="2"/>
-        </w:numPr>
-        <w:spacing w:after="60"/>
-      </w:pPr>
       <w:r>
         <w:rPr>
           <w:rFonts w:ascii="Arial" w:cs="Arial" w:eastAsia="Arial" w:hAnsi="Arial"/>
@@ -5099,45 +4071,7 @@
           <w:sz w:val="22"/>
           <w:szCs w:val="22"/>
         </w:rPr>
-        <w:t xml:space="preserve">Área solicitante: Comunicación y RRPP. Periodo: enero a diciembre de 2027.</w:t>
-      </w:r>
-    </w:p>
-    <w:p>
-      <w:pPr>
-        <w:pStyle w:val="ListParagraph"/>
-        <w:numPr>
-          <w:ilvl w:val="0"/>
-          <w:numId w:val="2"/>
-        </w:numPr>
-        <w:spacing w:after="60"/>
-      </w:pPr>
-      <w:r>
-        <w:rPr>
-          <w:rFonts w:ascii="Arial" w:cs="Arial" w:eastAsia="Arial" w:hAnsi="Arial"/>
-          <w:color w:val="0E3A4E"/>
-          <w:sz w:val="22"/>
-          <w:szCs w:val="22"/>
-        </w:rPr>
-        <w:t xml:space="preserve">Precios en pesos mexicanos con IVA, consultados en octubre de 2026; sujetos a cambio del proveedor.</w:t>
-      </w:r>
-    </w:p>
-    <w:p>
-      <w:pPr>
-        <w:pStyle w:val="ListParagraph"/>
-        <w:numPr>
-          <w:ilvl w:val="0"/>
-          <w:numId w:val="2"/>
-        </w:numPr>
-        <w:spacing w:after="60"/>
-      </w:pPr>
-      <w:r>
-        <w:rPr>
-          <w:rFonts w:ascii="Arial" w:cs="Arial" w:eastAsia="Arial" w:hAnsi="Arial"/>
-          <w:color w:val="0E3A4E"/>
-          <w:sz w:val="22"/>
-          <w:szCs w:val="22"/>
-        </w:rPr>
-        <w:t xml:space="preserve">Forma de pago: pago anual con tarjeta corporativa a nombre de Poliforum León, con correo institucional. La cámara se compra una sola vez en tienda oficial o vendedor verificado.</w:t>
+        <w:t xml:space="preserve">Forma de pago: pago anual con tarjeta corporativa a nombre de Poliforum León, con correo institucional.</w:t>
       </w:r>
     </w:p>
     <w:p>

</xml_diff>

<commit_message>
Separar dentro del mismo presupuesto: Comunicación y Página web
Co-Authored-By: Claude Opus 5.5 <noreply@anthropic.com>
Claude-Session: https://claude.ai/code/session_01GFkSYVqa8d2zDX8Qy6Lwpz
</commit_message>
<xml_diff>
--- a/Presupuesto_2027_Comunicacion_RRPP_Poliforum_Leon.docx
+++ b/Presupuesto_2027_Comunicacion_RRPP_Poliforum_Leon.docx
@@ -138,7 +138,7 @@
           <w:sz w:val="22"/>
           <w:szCs w:val="22"/>
         </w:rPr>
-        <w:t xml:space="preserve">Todo en pago anual. Un solo presupuesto con el software del área y la nueva página web.</w:t>
+        <w:t xml:space="preserve">Todo en pago anual. Un solo presupuesto con dos partes: Comunicación y la nueva página web.</w:t>
       </w:r>
     </w:p>
     <w:tbl>
@@ -275,7 +275,7 @@
                 <w:sz w:val="19"/>
                 <w:szCs w:val="19"/>
               </w:rPr>
-              <w:t xml:space="preserve">1 · Software (ManyChat, ChatGPT, Claude, Canva y X Premium)</w:t>
+              <w:t xml:space="preserve">1 · Presupuesto Comunicación: ManyChat, ChatGPT, Canva y X Premium</w:t>
             </w:r>
           </w:p>
         </w:tc>
@@ -303,7 +303,7 @@
                 <w:sz w:val="19"/>
                 <w:szCs w:val="19"/>
               </w:rPr>
-              <w:t xml:space="preserve">$19,847</w:t>
+              <w:t xml:space="preserve">$15,188</w:t>
             </w:r>
           </w:p>
         </w:tc>
@@ -331,7 +331,7 @@
                 <w:sz w:val="19"/>
                 <w:szCs w:val="19"/>
               </w:rPr>
-              <w:t xml:space="preserve">$19,847</w:t>
+              <w:t xml:space="preserve">$15,188</w:t>
             </w:r>
           </w:p>
         </w:tc>
@@ -364,7 +364,7 @@
                 <w:sz w:val="19"/>
                 <w:szCs w:val="19"/>
               </w:rPr>
-              <w:t xml:space="preserve">2 · Página web (servidor, chatbot, seguridad y dominio)</w:t>
+              <w:t xml:space="preserve">2 · Presupuesto Página web: servidor, chatbot, seguridad, dominio, Claude y Canva</w:t>
             </w:r>
           </w:p>
         </w:tc>
@@ -392,7 +392,7 @@
                 <w:sz w:val="19"/>
                 <w:szCs w:val="19"/>
               </w:rPr>
-              <w:t xml:space="preserve">$11,813</w:t>
+              <w:t xml:space="preserve">$16,472</w:t>
             </w:r>
           </w:p>
         </w:tc>
@@ -420,7 +420,7 @@
                 <w:sz w:val="19"/>
                 <w:szCs w:val="19"/>
               </w:rPr>
-              <w:t xml:space="preserve">$9,377</w:t>
+              <w:t xml:space="preserve">$14,036</w:t>
             </w:r>
           </w:p>
         </w:tc>
@@ -548,7 +548,7 @@
           <w:sz w:val="32"/>
           <w:szCs w:val="32"/>
         </w:rPr>
-        <w:t xml:space="preserve">1. Software</w:t>
+        <w:t xml:space="preserve">1. Presupuesto Comunicación</w:t>
       </w:r>
     </w:p>
     <w:tbl>
@@ -843,7 +843,7 @@
             </w:tcMar>
           </w:tcPr>
           <w:p>
-            <w:hyperlink w:history="1" r:id="rIdku4irpdogwupimqzhpny7">
+            <w:hyperlink w:history="1" r:id="rIdw20yposedtx14vpv3whf4">
               <w:r>
                 <w:rPr>
                   <w:rFonts w:ascii="Arial" w:cs="Arial" w:eastAsia="Arial" w:hAnsi="Arial"/>
@@ -986,7 +986,7 @@
             </w:tcMar>
           </w:tcPr>
           <w:p>
-            <w:hyperlink w:history="1" r:id="rIdgdstc7fegxjkmd3crfgui">
+            <w:hyperlink w:history="1" r:id="rIdvlhxkxk0nrures4tycicc">
               <w:r>
                 <w:rPr>
                   <w:rFonts w:ascii="Arial" w:cs="Arial" w:eastAsia="Arial" w:hAnsi="Arial"/>
@@ -1029,7 +1029,7 @@
                 <w:sz w:val="19"/>
                 <w:szCs w:val="19"/>
               </w:rPr>
-              <w:t xml:space="preserve">Claude Pro</w:t>
+              <w:t xml:space="preserve">Canva Pro</w:t>
             </w:r>
           </w:p>
         </w:tc>
@@ -1085,7 +1085,7 @@
                 <w:sz w:val="19"/>
                 <w:szCs w:val="19"/>
               </w:rPr>
-              <w:t xml:space="preserve">Mantenimiento de la página web</w:t>
+              <w:t xml:space="preserve">Diseño para redes con el kit de marca</w:t>
             </w:r>
           </w:p>
         </w:tc>
@@ -1113,7 +1113,7 @@
                 <w:sz w:val="19"/>
                 <w:szCs w:val="19"/>
               </w:rPr>
-              <w:t xml:space="preserve">$3,449</w:t>
+              <w:t xml:space="preserve">$1,210</w:t>
             </w:r>
           </w:p>
         </w:tc>
@@ -1129,150 +1129,7 @@
             </w:tcMar>
           </w:tcPr>
           <w:p>
-            <w:hyperlink w:history="1" r:id="rIdmhsig5b4toq0dvjsdngui">
-              <w:r>
-                <w:rPr>
-                  <w:rFonts w:ascii="Arial" w:cs="Arial" w:eastAsia="Arial" w:hAnsi="Arial"/>
-                  <w:color w:val="039AD1"/>
-                  <w:sz w:val="20"/>
-                  <w:szCs w:val="20"/>
-                  <w:u w:val="single"/>
-                </w:rPr>
-                <w:t xml:space="preserve">claude.com</w:t>
-              </w:r>
-            </w:hyperlink>
-          </w:p>
-        </w:tc>
-      </w:tr>
-      <w:tr>
-        <w:trPr>
-          <w:tblHeader w:val="false"/>
-        </w:trPr>
-        <w:tc>
-          <w:tcPr>
-            <w:tcW w:type="dxa" w:w="2000"/>
-            <w:shd w:fill="FFFFFF" w:color="auto" w:val="clear"/>
-            <w:tcMar>
-              <w:top w:type="dxa" w:w="70"/>
-              <w:left w:type="dxa" w:w="100"/>
-              <w:bottom w:type="dxa" w:w="70"/>
-              <w:right w:type="dxa" w:w="100"/>
-            </w:tcMar>
-          </w:tcPr>
-          <w:p>
-            <w:pPr>
-              <w:jc w:val="left"/>
-            </w:pPr>
-            <w:r>
-              <w:rPr>
-                <w:rFonts w:ascii="Arial" w:cs="Arial" w:eastAsia="Arial" w:hAnsi="Arial"/>
-                <w:b w:val="false"/>
-                <w:bCs w:val="false"/>
-                <w:color w:val="0E3A4E"/>
-                <w:sz w:val="19"/>
-                <w:szCs w:val="19"/>
-              </w:rPr>
-              <w:t xml:space="preserve">Canva Pro</w:t>
-            </w:r>
-          </w:p>
-        </w:tc>
-        <w:tc>
-          <w:tcPr>
-            <w:tcW w:type="dxa" w:w="1300"/>
-            <w:shd w:fill="FFFFFF" w:color="auto" w:val="clear"/>
-            <w:tcMar>
-              <w:top w:type="dxa" w:w="70"/>
-              <w:left w:type="dxa" w:w="100"/>
-              <w:bottom w:type="dxa" w:w="70"/>
-              <w:right w:type="dxa" w:w="100"/>
-            </w:tcMar>
-          </w:tcPr>
-          <w:p>
-            <w:pPr>
-              <w:jc w:val="left"/>
-            </w:pPr>
-            <w:r>
-              <w:rPr>
-                <w:rFonts w:ascii="Arial" w:cs="Arial" w:eastAsia="Arial" w:hAnsi="Arial"/>
-                <w:b w:val="false"/>
-                <w:bCs w:val="false"/>
-                <w:color w:val="0E3A4E"/>
-                <w:sz w:val="19"/>
-                <w:szCs w:val="19"/>
-              </w:rPr>
-              <w:t xml:space="preserve">2 cuentas</w:t>
-            </w:r>
-          </w:p>
-        </w:tc>
-        <w:tc>
-          <w:tcPr>
-            <w:tcW w:type="dxa" w:w="3000"/>
-            <w:shd w:fill="FFFFFF" w:color="auto" w:val="clear"/>
-            <w:tcMar>
-              <w:top w:type="dxa" w:w="70"/>
-              <w:left w:type="dxa" w:w="100"/>
-              <w:bottom w:type="dxa" w:w="70"/>
-              <w:right w:type="dxa" w:w="100"/>
-            </w:tcMar>
-          </w:tcPr>
-          <w:p>
-            <w:pPr>
-              <w:jc w:val="left"/>
-            </w:pPr>
-            <w:r>
-              <w:rPr>
-                <w:rFonts w:ascii="Arial" w:cs="Arial" w:eastAsia="Arial" w:hAnsi="Arial"/>
-                <w:b w:val="false"/>
-                <w:bCs w:val="false"/>
-                <w:color w:val="0E3A4E"/>
-                <w:sz w:val="19"/>
-                <w:szCs w:val="19"/>
-              </w:rPr>
-              <w:t xml:space="preserve">Diseño para redes (1) y para la web (1)</w:t>
-            </w:r>
-          </w:p>
-        </w:tc>
-        <w:tc>
-          <w:tcPr>
-            <w:tcW w:type="dxa" w:w="1300"/>
-            <w:shd w:fill="FFFFFF" w:color="auto" w:val="clear"/>
-            <w:tcMar>
-              <w:top w:type="dxa" w:w="70"/>
-              <w:left w:type="dxa" w:w="100"/>
-              <w:bottom w:type="dxa" w:w="70"/>
-              <w:right w:type="dxa" w:w="100"/>
-            </w:tcMar>
-          </w:tcPr>
-          <w:p>
-            <w:pPr>
-              <w:jc w:val="right"/>
-            </w:pPr>
-            <w:r>
-              <w:rPr>
-                <w:rFonts w:ascii="Arial" w:cs="Arial" w:eastAsia="Arial" w:hAnsi="Arial"/>
-                <w:b w:val="false"/>
-                <w:bCs w:val="false"/>
-                <w:color w:val="0E3A4E"/>
-                <w:sz w:val="19"/>
-                <w:szCs w:val="19"/>
-              </w:rPr>
-              <w:t xml:space="preserve">$2,420</w:t>
-            </w:r>
-          </w:p>
-        </w:tc>
-        <w:tc>
-          <w:tcPr>
-            <w:tcW w:type="dxa" w:w="1760"/>
-            <w:shd w:fill="FFFFFF" w:color="auto" w:val="clear"/>
-            <w:tcMar>
-              <w:top w:type="dxa" w:w="70"/>
-              <w:left w:type="dxa" w:w="100"/>
-              <w:bottom w:type="dxa" w:w="70"/>
-              <w:right w:type="dxa" w:w="100"/>
-            </w:tcMar>
-          </w:tcPr>
-          <w:p>
-            <w:hyperlink w:history="1" r:id="rIdu_ar810tnyn1hljupvf3n">
+            <w:hyperlink w:history="1" r:id="rIdprefrrv3mvy7trgkrzazl">
               <w:r>
                 <w:rPr>
                   <w:rFonts w:ascii="Arial" w:cs="Arial" w:eastAsia="Arial" w:hAnsi="Arial"/>
@@ -1294,7 +1151,7 @@
         <w:tc>
           <w:tcPr>
             <w:tcW w:type="dxa" w:w="2000"/>
-            <w:shd w:fill="F6F9FA" w:color="auto" w:val="clear"/>
+            <w:shd w:fill="FFFFFF" w:color="auto" w:val="clear"/>
             <w:tcMar>
               <w:top w:type="dxa" w:w="70"/>
               <w:left w:type="dxa" w:w="100"/>
@@ -1322,7 +1179,7 @@
         <w:tc>
           <w:tcPr>
             <w:tcW w:type="dxa" w:w="1300"/>
-            <w:shd w:fill="F6F9FA" w:color="auto" w:val="clear"/>
+            <w:shd w:fill="FFFFFF" w:color="auto" w:val="clear"/>
             <w:tcMar>
               <w:top w:type="dxa" w:w="70"/>
               <w:left w:type="dxa" w:w="100"/>
@@ -1350,7 +1207,7 @@
         <w:tc>
           <w:tcPr>
             <w:tcW w:type="dxa" w:w="3000"/>
-            <w:shd w:fill="F6F9FA" w:color="auto" w:val="clear"/>
+            <w:shd w:fill="FFFFFF" w:color="auto" w:val="clear"/>
             <w:tcMar>
               <w:top w:type="dxa" w:w="70"/>
               <w:left w:type="dxa" w:w="100"/>
@@ -1378,7 +1235,7 @@
         <w:tc>
           <w:tcPr>
             <w:tcW w:type="dxa" w:w="1300"/>
-            <w:shd w:fill="F6F9FA" w:color="auto" w:val="clear"/>
+            <w:shd w:fill="FFFFFF" w:color="auto" w:val="clear"/>
             <w:tcMar>
               <w:top w:type="dxa" w:w="70"/>
               <w:left w:type="dxa" w:w="100"/>
@@ -1406,16 +1263,16 @@
         <w:tc>
           <w:tcPr>
             <w:tcW w:type="dxa" w:w="1760"/>
-            <w:shd w:fill="F6F9FA" w:color="auto" w:val="clear"/>
-            <w:tcMar>
-              <w:top w:type="dxa" w:w="70"/>
-              <w:left w:type="dxa" w:w="100"/>
-              <w:bottom w:type="dxa" w:w="70"/>
-              <w:right w:type="dxa" w:w="100"/>
-            </w:tcMar>
-          </w:tcPr>
-          <w:p>
-            <w:hyperlink w:history="1" r:id="rIdmh61qs3cdece_olqd17qa">
+            <w:shd w:fill="FFFFFF" w:color="auto" w:val="clear"/>
+            <w:tcMar>
+              <w:top w:type="dxa" w:w="70"/>
+              <w:left w:type="dxa" w:w="100"/>
+              <w:bottom w:type="dxa" w:w="70"/>
+              <w:right w:type="dxa" w:w="100"/>
+            </w:tcMar>
+          </w:tcPr>
+          <w:p>
+            <w:hyperlink w:history="1" r:id="rIdajqxet02xcbhz9tmlinml">
               <w:r>
                 <w:rPr>
                   <w:rFonts w:ascii="Arial" w:cs="Arial" w:eastAsia="Arial" w:hAnsi="Arial"/>
@@ -1458,7 +1315,7 @@
                 <w:sz w:val="19"/>
                 <w:szCs w:val="19"/>
               </w:rPr>
-              <w:t xml:space="preserve">Total cada año</w:t>
+              <w:t xml:space="preserve">Total Comunicación (cada año)</w:t>
             </w:r>
           </w:p>
         </w:tc>
@@ -1542,7 +1399,7 @@
                 <w:sz w:val="19"/>
                 <w:szCs w:val="19"/>
               </w:rPr>
-              <w:t xml:space="preserve">$19,847</w:t>
+              <w:t xml:space="preserve">$15,188</w:t>
             </w:r>
           </w:p>
         </w:tc>
@@ -1594,6 +1451,635 @@
     </w:p>
     <w:p>
       <w:pPr>
+        <w:pStyle w:val="Heading2"/>
+        <w:spacing w:after="80" w:before="200"/>
+      </w:pPr>
+      <w:r>
+        <w:rPr>
+          <w:rFonts w:ascii="Arial" w:cs="Arial" w:eastAsia="Arial" w:hAnsi="Arial"/>
+          <w:b/>
+          <w:bCs/>
+          <w:color w:val="175772"/>
+          <w:sz w:val="26"/>
+          <w:szCs w:val="26"/>
+        </w:rPr>
+        <w:t xml:space="preserve">Por qué cada cosa</w:t>
+      </w:r>
+    </w:p>
+    <w:p>
+      <w:pPr>
+        <w:pStyle w:val="Heading2"/>
+        <w:spacing w:after="80" w:before="200"/>
+      </w:pPr>
+      <w:r>
+        <w:rPr>
+          <w:rFonts w:ascii="Arial" w:cs="Arial" w:eastAsia="Arial" w:hAnsi="Arial"/>
+          <w:b/>
+          <w:bCs/>
+          <w:color w:val="175772"/>
+          <w:sz w:val="26"/>
+          <w:szCs w:val="26"/>
+        </w:rPr>
+        <w:t xml:space="preserve">ManyChat Pro</w:t>
+      </w:r>
+    </w:p>
+    <w:p>
+      <w:pPr>
+        <w:spacing w:after="40" w:before="0"/>
+      </w:pPr>
+      <w:r>
+        <w:rPr>
+          <w:rFonts w:ascii="Arial" w:cs="Arial" w:eastAsia="Arial" w:hAnsi="Arial"/>
+          <w:b/>
+          <w:bCs/>
+          <w:color w:val="0E3A4E"/>
+          <w:sz w:val="22"/>
+          <w:szCs w:val="22"/>
+        </w:rPr>
+        <w:t xml:space="preserve">Por qué: </w:t>
+      </w:r>
+      <w:r>
+        <w:rPr>
+          <w:rFonts w:ascii="Arial" w:cs="Arial" w:eastAsia="Arial" w:hAnsi="Arial"/>
+          <w:color w:val="0E3A4E"/>
+          <w:sz w:val="22"/>
+          <w:szCs w:val="22"/>
+        </w:rPr>
+        <w:t xml:space="preserve">Responde de forma automática los mensajes privados de Instagram, Facebook y Messenger con las preguntas frecuentes, como "¿dónde compro boletos para…?" o "estoy buscando trabajo". También permite dinámicas de "comenta y te llega" para generar leads en campañas.</w:t>
+      </w:r>
+    </w:p>
+    <w:p>
+      <w:pPr>
+        <w:spacing w:after="120" w:before="0"/>
+      </w:pPr>
+      <w:r>
+        <w:rPr>
+          <w:rFonts w:ascii="Arial" w:cs="Arial" w:eastAsia="Arial" w:hAnsi="Arial"/>
+          <w:b/>
+          <w:bCs/>
+          <w:color w:val="0E3A4E"/>
+          <w:sz w:val="22"/>
+          <w:szCs w:val="22"/>
+        </w:rPr>
+        <w:t xml:space="preserve">Ejemplo: </w:t>
+      </w:r>
+      <w:r>
+        <w:rPr>
+          <w:rFonts w:ascii="Arial" w:cs="Arial" w:eastAsia="Arial" w:hAnsi="Arial"/>
+          <w:color w:val="0E3A4E"/>
+          <w:sz w:val="22"/>
+          <w:szCs w:val="22"/>
+        </w:rPr>
+        <w:t xml:space="preserve">En la campaña de Maricela Cordero se obtuvieron 3 leads sin publicidad pagada, respondiendo de forma manual. ManyChat permite automatizar ese proceso en futuras campañas.</w:t>
+      </w:r>
+    </w:p>
+    <w:p>
+      <w:pPr>
+        <w:pStyle w:val="Heading2"/>
+        <w:spacing w:after="80" w:before="200"/>
+      </w:pPr>
+      <w:r>
+        <w:rPr>
+          <w:rFonts w:ascii="Arial" w:cs="Arial" w:eastAsia="Arial" w:hAnsi="Arial"/>
+          <w:b/>
+          <w:bCs/>
+          <w:color w:val="175772"/>
+          <w:sz w:val="26"/>
+          <w:szCs w:val="26"/>
+        </w:rPr>
+        <w:t xml:space="preserve">ChatGPT Plus</w:t>
+      </w:r>
+    </w:p>
+    <w:p>
+      <w:pPr>
+        <w:spacing w:after="40" w:before="0"/>
+      </w:pPr>
+      <w:r>
+        <w:rPr>
+          <w:rFonts w:ascii="Arial" w:cs="Arial" w:eastAsia="Arial" w:hAnsi="Arial"/>
+          <w:b/>
+          <w:bCs/>
+          <w:color w:val="0E3A4E"/>
+          <w:sz w:val="22"/>
+          <w:szCs w:val="22"/>
+        </w:rPr>
+        <w:t xml:space="preserve">Por qué: </w:t>
+      </w:r>
+      <w:r>
+        <w:rPr>
+          <w:rFonts w:ascii="Arial" w:cs="Arial" w:eastAsia="Arial" w:hAnsi="Arial"/>
+          <w:color w:val="0E3A4E"/>
+          <w:sz w:val="22"/>
+          <w:szCs w:val="22"/>
+        </w:rPr>
+        <w:t xml:space="preserve">Producción de imágenes para redes y apoyo para hacer crecer y potenciar nuestras cuentas: ideas de contenido y campañas, copys, y análisis de los resultados de las publicaciones para decidir qué funciona mejor. Con Codex ayuda a automatizar tareas repetitivas del departamento.</w:t>
+      </w:r>
+    </w:p>
+    <w:p>
+      <w:pPr>
+        <w:spacing w:after="120" w:before="0"/>
+      </w:pPr>
+      <w:r>
+        <w:rPr>
+          <w:rFonts w:ascii="Arial" w:cs="Arial" w:eastAsia="Arial" w:hAnsi="Arial"/>
+          <w:b/>
+          <w:bCs/>
+          <w:color w:val="0E3A4E"/>
+          <w:sz w:val="22"/>
+          <w:szCs w:val="22"/>
+        </w:rPr>
+        <w:t xml:space="preserve">Ejemplo: </w:t>
+      </w:r>
+      <w:r>
+        <w:rPr>
+          <w:rFonts w:ascii="Arial" w:cs="Arial" w:eastAsia="Arial" w:hAnsi="Arial"/>
+          <w:color w:val="0E3A4E"/>
+          <w:sz w:val="22"/>
+          <w:szCs w:val="22"/>
+        </w:rPr>
+        <w:t xml:space="preserve">Imágenes para publicaciones de eventos y análisis mensual de las estadísticas de Facebook, Instagram y TikTok para ajustar el contenido.</w:t>
+      </w:r>
+    </w:p>
+    <w:p>
+      <w:pPr>
+        <w:pStyle w:val="Heading2"/>
+        <w:spacing w:after="80" w:before="200"/>
+      </w:pPr>
+      <w:r>
+        <w:rPr>
+          <w:rFonts w:ascii="Arial" w:cs="Arial" w:eastAsia="Arial" w:hAnsi="Arial"/>
+          <w:b/>
+          <w:bCs/>
+          <w:color w:val="175772"/>
+          <w:sz w:val="26"/>
+          <w:szCs w:val="26"/>
+        </w:rPr>
+        <w:t xml:space="preserve">Canva Pro · 1 cuenta</w:t>
+      </w:r>
+    </w:p>
+    <w:p>
+      <w:pPr>
+        <w:spacing w:after="40" w:before="0"/>
+      </w:pPr>
+      <w:r>
+        <w:rPr>
+          <w:rFonts w:ascii="Arial" w:cs="Arial" w:eastAsia="Arial" w:hAnsi="Arial"/>
+          <w:b/>
+          <w:bCs/>
+          <w:color w:val="0E3A4E"/>
+          <w:sz w:val="22"/>
+          <w:szCs w:val="22"/>
+        </w:rPr>
+        <w:t xml:space="preserve">Por qué: </w:t>
+      </w:r>
+      <w:r>
+        <w:rPr>
+          <w:rFonts w:ascii="Arial" w:cs="Arial" w:eastAsia="Arial" w:hAnsi="Arial"/>
+          <w:color w:val="0E3A4E"/>
+          <w:sz w:val="22"/>
+          <w:szCs w:val="22"/>
+        </w:rPr>
+        <w:t xml:space="preserve">Diseño de piezas para redes con el kit de marca del recinto: plantillas, edición de imágenes y adaptación a distintos formatos.</w:t>
+      </w:r>
+    </w:p>
+    <w:p>
+      <w:pPr>
+        <w:spacing w:after="120" w:before="0"/>
+      </w:pPr>
+      <w:r>
+        <w:rPr>
+          <w:rFonts w:ascii="Arial" w:cs="Arial" w:eastAsia="Arial" w:hAnsi="Arial"/>
+          <w:b/>
+          <w:bCs/>
+          <w:color w:val="0E3A4E"/>
+          <w:sz w:val="22"/>
+          <w:szCs w:val="22"/>
+        </w:rPr>
+        <w:t xml:space="preserve">Ejemplo: </w:t>
+      </w:r>
+      <w:r>
+        <w:rPr>
+          <w:rFonts w:ascii="Arial" w:cs="Arial" w:eastAsia="Arial" w:hAnsi="Arial"/>
+          <w:color w:val="0E3A4E"/>
+          <w:sz w:val="22"/>
+          <w:szCs w:val="22"/>
+        </w:rPr>
+        <w:t xml:space="preserve">Post, historia y portada de reel de un evento a partir de un mismo diseño, con la imagen oficial.</w:t>
+      </w:r>
+    </w:p>
+    <w:p>
+      <w:pPr>
+        <w:pStyle w:val="Heading2"/>
+        <w:spacing w:after="80" w:before="200"/>
+      </w:pPr>
+      <w:r>
+        <w:rPr>
+          <w:rFonts w:ascii="Arial" w:cs="Arial" w:eastAsia="Arial" w:hAnsi="Arial"/>
+          <w:b/>
+          <w:bCs/>
+          <w:color w:val="175772"/>
+          <w:sz w:val="26"/>
+          <w:szCs w:val="26"/>
+        </w:rPr>
+        <w:t xml:space="preserve">X Premium</w:t>
+      </w:r>
+    </w:p>
+    <w:p>
+      <w:pPr>
+        <w:spacing w:after="40" w:before="0"/>
+      </w:pPr>
+      <w:r>
+        <w:rPr>
+          <w:rFonts w:ascii="Arial" w:cs="Arial" w:eastAsia="Arial" w:hAnsi="Arial"/>
+          <w:b/>
+          <w:bCs/>
+          <w:color w:val="0E3A4E"/>
+          <w:sz w:val="22"/>
+          <w:szCs w:val="22"/>
+        </w:rPr>
+        <w:t xml:space="preserve">Por qué: </w:t>
+      </w:r>
+      <w:r>
+        <w:rPr>
+          <w:rFonts w:ascii="Arial" w:cs="Arial" w:eastAsia="Arial" w:hAnsi="Arial"/>
+          <w:color w:val="0E3A4E"/>
+          <w:sz w:val="22"/>
+          <w:szCs w:val="22"/>
+        </w:rPr>
+        <w:t xml:space="preserve">Verificación de la cuenta oficial del recinto, para distinguirla de cuentas falsas.</w:t>
+      </w:r>
+    </w:p>
+    <w:p>
+      <w:pPr>
+        <w:spacing w:after="120" w:before="0"/>
+      </w:pPr>
+      <w:r>
+        <w:rPr>
+          <w:rFonts w:ascii="Arial" w:cs="Arial" w:eastAsia="Arial" w:hAnsi="Arial"/>
+          <w:b/>
+          <w:bCs/>
+          <w:color w:val="0E3A4E"/>
+          <w:sz w:val="22"/>
+          <w:szCs w:val="22"/>
+        </w:rPr>
+        <w:t xml:space="preserve">Ejemplo: </w:t>
+      </w:r>
+      <w:r>
+        <w:rPr>
+          <w:rFonts w:ascii="Arial" w:cs="Arial" w:eastAsia="Arial" w:hAnsi="Arial"/>
+          <w:color w:val="0E3A4E"/>
+          <w:sz w:val="22"/>
+          <w:szCs w:val="22"/>
+        </w:rPr>
+        <w:t xml:space="preserve">Avisos oficiales de accesos, estacionamiento y horarios durante eventos masivos.</w:t>
+      </w:r>
+    </w:p>
+    <w:p>
+      <w:pPr>
+        <w:pStyle w:val="Heading2"/>
+        <w:spacing w:after="80" w:before="200"/>
+      </w:pPr>
+      <w:r>
+        <w:rPr>
+          <w:rFonts w:ascii="Arial" w:cs="Arial" w:eastAsia="Arial" w:hAnsi="Arial"/>
+          <w:b/>
+          <w:bCs/>
+          <w:color w:val="175772"/>
+          <w:sz w:val="26"/>
+          <w:szCs w:val="26"/>
+        </w:rPr>
+        <w:t xml:space="preserve">Ejemplos de respuestas automáticas de ManyChat</w:t>
+      </w:r>
+    </w:p>
+    <w:tbl>
+      <w:tblPr>
+        <w:tblW w:type="dxa" w:w="9360"/>
+        <w:tblBorders>
+          <w:top w:val="single" w:color="auto" w:sz="4"/>
+          <w:left w:val="single" w:color="auto" w:sz="4"/>
+          <w:bottom w:val="single" w:color="auto" w:sz="4"/>
+          <w:right w:val="single" w:color="auto" w:sz="4"/>
+          <w:insideH w:val="single" w:color="auto" w:sz="4"/>
+          <w:insideV w:val="single" w:color="auto" w:sz="4"/>
+        </w:tblBorders>
+      </w:tblPr>
+      <w:tblGrid>
+        <w:gridCol w:w="4200"/>
+        <w:gridCol w:w="5160"/>
+      </w:tblGrid>
+      <w:tr>
+        <w:trPr>
+          <w:tblHeader/>
+        </w:trPr>
+        <w:tc>
+          <w:tcPr>
+            <w:tcW w:type="dxa" w:w="4200"/>
+            <w:shd w:fill="DCE6EB" w:color="auto" w:val="clear"/>
+            <w:tcMar>
+              <w:top w:type="dxa" w:w="70"/>
+              <w:left w:type="dxa" w:w="100"/>
+              <w:bottom w:type="dxa" w:w="70"/>
+              <w:right w:type="dxa" w:w="100"/>
+            </w:tcMar>
+          </w:tcPr>
+          <w:p>
+            <w:pPr>
+              <w:jc w:val="left"/>
+            </w:pPr>
+            <w:r>
+              <w:rPr>
+                <w:rFonts w:ascii="Arial" w:cs="Arial" w:eastAsia="Arial" w:hAnsi="Arial"/>
+                <w:b/>
+                <w:bCs/>
+                <w:color w:val="0E3A4E"/>
+                <w:sz w:val="19"/>
+                <w:szCs w:val="19"/>
+              </w:rPr>
+              <w:t xml:space="preserve">Si alguien escribe…</w:t>
+            </w:r>
+          </w:p>
+        </w:tc>
+        <w:tc>
+          <w:tcPr>
+            <w:tcW w:type="dxa" w:w="5160"/>
+            <w:shd w:fill="DCE6EB" w:color="auto" w:val="clear"/>
+            <w:tcMar>
+              <w:top w:type="dxa" w:w="70"/>
+              <w:left w:type="dxa" w:w="100"/>
+              <w:bottom w:type="dxa" w:w="70"/>
+              <w:right w:type="dxa" w:w="100"/>
+            </w:tcMar>
+          </w:tcPr>
+          <w:p>
+            <w:pPr>
+              <w:jc w:val="left"/>
+            </w:pPr>
+            <w:r>
+              <w:rPr>
+                <w:rFonts w:ascii="Arial" w:cs="Arial" w:eastAsia="Arial" w:hAnsi="Arial"/>
+                <w:b/>
+                <w:bCs/>
+                <w:color w:val="0E3A4E"/>
+                <w:sz w:val="19"/>
+                <w:szCs w:val="19"/>
+              </w:rPr>
+              <w:t xml:space="preserve">Respuesta automática</w:t>
+            </w:r>
+          </w:p>
+        </w:tc>
+      </w:tr>
+      <w:tr>
+        <w:trPr>
+          <w:tblHeader w:val="false"/>
+        </w:trPr>
+        <w:tc>
+          <w:tcPr>
+            <w:tcW w:type="dxa" w:w="4200"/>
+            <w:shd w:fill="F6F9FA" w:color="auto" w:val="clear"/>
+            <w:tcMar>
+              <w:top w:type="dxa" w:w="70"/>
+              <w:left w:type="dxa" w:w="100"/>
+              <w:bottom w:type="dxa" w:w="70"/>
+              <w:right w:type="dxa" w:w="100"/>
+            </w:tcMar>
+          </w:tcPr>
+          <w:p>
+            <w:pPr>
+              <w:jc w:val="left"/>
+            </w:pPr>
+            <w:r>
+              <w:rPr>
+                <w:rFonts w:ascii="Arial" w:cs="Arial" w:eastAsia="Arial" w:hAnsi="Arial"/>
+                <w:b w:val="false"/>
+                <w:bCs w:val="false"/>
+                <w:color w:val="0E3A4E"/>
+                <w:sz w:val="19"/>
+                <w:szCs w:val="19"/>
+              </w:rPr>
+              <w:t xml:space="preserve">"¿Dónde puedo comprar boletos para…?"</w:t>
+            </w:r>
+          </w:p>
+        </w:tc>
+        <w:tc>
+          <w:tcPr>
+            <w:tcW w:type="dxa" w:w="5160"/>
+            <w:shd w:fill="F6F9FA" w:color="auto" w:val="clear"/>
+            <w:tcMar>
+              <w:top w:type="dxa" w:w="70"/>
+              <w:left w:type="dxa" w:w="100"/>
+              <w:bottom w:type="dxa" w:w="70"/>
+              <w:right w:type="dxa" w:w="100"/>
+            </w:tcMar>
+          </w:tcPr>
+          <w:p>
+            <w:pPr>
+              <w:jc w:val="left"/>
+            </w:pPr>
+            <w:r>
+              <w:rPr>
+                <w:rFonts w:ascii="Arial" w:cs="Arial" w:eastAsia="Arial" w:hAnsi="Arial"/>
+                <w:b w:val="false"/>
+                <w:bCs w:val="false"/>
+                <w:color w:val="0E3A4E"/>
+                <w:sz w:val="19"/>
+                <w:szCs w:val="19"/>
+              </w:rPr>
+              <w:t xml:space="preserve">El link oficial de boletos, fecha y horario</w:t>
+            </w:r>
+          </w:p>
+        </w:tc>
+      </w:tr>
+      <w:tr>
+        <w:trPr>
+          <w:tblHeader w:val="false"/>
+        </w:trPr>
+        <w:tc>
+          <w:tcPr>
+            <w:tcW w:type="dxa" w:w="4200"/>
+            <w:shd w:fill="FFFFFF" w:color="auto" w:val="clear"/>
+            <w:tcMar>
+              <w:top w:type="dxa" w:w="70"/>
+              <w:left w:type="dxa" w:w="100"/>
+              <w:bottom w:type="dxa" w:w="70"/>
+              <w:right w:type="dxa" w:w="100"/>
+            </w:tcMar>
+          </w:tcPr>
+          <w:p>
+            <w:pPr>
+              <w:jc w:val="left"/>
+            </w:pPr>
+            <w:r>
+              <w:rPr>
+                <w:rFonts w:ascii="Arial" w:cs="Arial" w:eastAsia="Arial" w:hAnsi="Arial"/>
+                <w:b w:val="false"/>
+                <w:bCs w:val="false"/>
+                <w:color w:val="0E3A4E"/>
+                <w:sz w:val="19"/>
+                <w:szCs w:val="19"/>
+              </w:rPr>
+              <w:t xml:space="preserve">"Estoy buscando trabajo" / "¿tienen vacantes?"</w:t>
+            </w:r>
+          </w:p>
+        </w:tc>
+        <w:tc>
+          <w:tcPr>
+            <w:tcW w:type="dxa" w:w="5160"/>
+            <w:shd w:fill="FFFFFF" w:color="auto" w:val="clear"/>
+            <w:tcMar>
+              <w:top w:type="dxa" w:w="70"/>
+              <w:left w:type="dxa" w:w="100"/>
+              <w:bottom w:type="dxa" w:w="70"/>
+              <w:right w:type="dxa" w:w="100"/>
+            </w:tcMar>
+          </w:tcPr>
+          <w:p>
+            <w:pPr>
+              <w:jc w:val="left"/>
+            </w:pPr>
+            <w:r>
+              <w:rPr>
+                <w:rFonts w:ascii="Arial" w:cs="Arial" w:eastAsia="Arial" w:hAnsi="Arial"/>
+                <w:b w:val="false"/>
+                <w:bCs w:val="false"/>
+                <w:color w:val="0E3A4E"/>
+                <w:sz w:val="19"/>
+                <w:szCs w:val="19"/>
+              </w:rPr>
+              <w:t xml:space="preserve">El correo o link de Recursos Humanos</w:t>
+            </w:r>
+          </w:p>
+        </w:tc>
+      </w:tr>
+      <w:tr>
+        <w:trPr>
+          <w:tblHeader w:val="false"/>
+        </w:trPr>
+        <w:tc>
+          <w:tcPr>
+            <w:tcW w:type="dxa" w:w="4200"/>
+            <w:shd w:fill="F6F9FA" w:color="auto" w:val="clear"/>
+            <w:tcMar>
+              <w:top w:type="dxa" w:w="70"/>
+              <w:left w:type="dxa" w:w="100"/>
+              <w:bottom w:type="dxa" w:w="70"/>
+              <w:right w:type="dxa" w:w="100"/>
+            </w:tcMar>
+          </w:tcPr>
+          <w:p>
+            <w:pPr>
+              <w:jc w:val="left"/>
+            </w:pPr>
+            <w:r>
+              <w:rPr>
+                <w:rFonts w:ascii="Arial" w:cs="Arial" w:eastAsia="Arial" w:hAnsi="Arial"/>
+                <w:b w:val="false"/>
+                <w:bCs w:val="false"/>
+                <w:color w:val="0E3A4E"/>
+                <w:sz w:val="19"/>
+                <w:szCs w:val="19"/>
+              </w:rPr>
+              <w:t xml:space="preserve">"¿Cómo llego?" / "¿dónde me estaciono?"</w:t>
+            </w:r>
+          </w:p>
+        </w:tc>
+        <w:tc>
+          <w:tcPr>
+            <w:tcW w:type="dxa" w:w="5160"/>
+            <w:shd w:fill="F6F9FA" w:color="auto" w:val="clear"/>
+            <w:tcMar>
+              <w:top w:type="dxa" w:w="70"/>
+              <w:left w:type="dxa" w:w="100"/>
+              <w:bottom w:type="dxa" w:w="70"/>
+              <w:right w:type="dxa" w:w="100"/>
+            </w:tcMar>
+          </w:tcPr>
+          <w:p>
+            <w:pPr>
+              <w:jc w:val="left"/>
+            </w:pPr>
+            <w:r>
+              <w:rPr>
+                <w:rFonts w:ascii="Arial" w:cs="Arial" w:eastAsia="Arial" w:hAnsi="Arial"/>
+                <w:b w:val="false"/>
+                <w:bCs w:val="false"/>
+                <w:color w:val="0E3A4E"/>
+                <w:sz w:val="19"/>
+                <w:szCs w:val="19"/>
+              </w:rPr>
+              <w:t xml:space="preserve">Ubicación en Google Maps, accesos y estacionamiento</w:t>
+            </w:r>
+          </w:p>
+        </w:tc>
+      </w:tr>
+      <w:tr>
+        <w:trPr>
+          <w:tblHeader w:val="false"/>
+        </w:trPr>
+        <w:tc>
+          <w:tcPr>
+            <w:tcW w:type="dxa" w:w="4200"/>
+            <w:shd w:fill="FFFFFF" w:color="auto" w:val="clear"/>
+            <w:tcMar>
+              <w:top w:type="dxa" w:w="70"/>
+              <w:left w:type="dxa" w:w="100"/>
+              <w:bottom w:type="dxa" w:w="70"/>
+              <w:right w:type="dxa" w:w="100"/>
+            </w:tcMar>
+          </w:tcPr>
+          <w:p>
+            <w:pPr>
+              <w:jc w:val="left"/>
+            </w:pPr>
+            <w:r>
+              <w:rPr>
+                <w:rFonts w:ascii="Arial" w:cs="Arial" w:eastAsia="Arial" w:hAnsi="Arial"/>
+                <w:b w:val="false"/>
+                <w:bCs w:val="false"/>
+                <w:color w:val="0E3A4E"/>
+                <w:sz w:val="19"/>
+                <w:szCs w:val="19"/>
+              </w:rPr>
+              <w:t xml:space="preserve">"Quiero rentar un salón"</w:t>
+            </w:r>
+          </w:p>
+        </w:tc>
+        <w:tc>
+          <w:tcPr>
+            <w:tcW w:type="dxa" w:w="5160"/>
+            <w:shd w:fill="FFFFFF" w:color="auto" w:val="clear"/>
+            <w:tcMar>
+              <w:top w:type="dxa" w:w="70"/>
+              <w:left w:type="dxa" w:w="100"/>
+              <w:bottom w:type="dxa" w:w="70"/>
+              <w:right w:type="dxa" w:w="100"/>
+            </w:tcMar>
+          </w:tcPr>
+          <w:p>
+            <w:pPr>
+              <w:jc w:val="left"/>
+            </w:pPr>
+            <w:r>
+              <w:rPr>
+                <w:rFonts w:ascii="Arial" w:cs="Arial" w:eastAsia="Arial" w:hAnsi="Arial"/>
+                <w:b w:val="false"/>
+                <w:bCs w:val="false"/>
+                <w:color w:val="0E3A4E"/>
+                <w:sz w:val="19"/>
+                <w:szCs w:val="19"/>
+              </w:rPr>
+              <w:t xml:space="preserve">Pide nombre, fecha y número de personas, y avisa al ejecutivo comercial</w:t>
+            </w:r>
+          </w:p>
+        </w:tc>
+      </w:tr>
+    </w:tbl>
+    <w:p>
+      <w:r>
+        <w:br w:type="page"/>
+      </w:r>
+    </w:p>
+    <w:p>
+      <w:pPr>
         <w:pStyle w:val="Heading1"/>
         <w:pBdr>
           <w:bottom w:val="single" w:color="A8C243" w:sz="12" w:space="4"/>
@@ -1609,7 +2095,7 @@
           <w:sz w:val="32"/>
           <w:szCs w:val="32"/>
         </w:rPr>
-        <w:t xml:space="preserve">2. Página web</w:t>
+        <w:t xml:space="preserve">2. Presupuesto Página web</w:t>
       </w:r>
     </w:p>
     <w:p>
@@ -1623,7 +2109,7 @@
           <w:sz w:val="22"/>
           <w:szCs w:val="22"/>
         </w:rPr>
-        <w:t xml:space="preserve">Lo necesario para que la nueva web esté encendida, segura y con un chatbot que atiende a los clientes. La web ya está hecha y la actualiza el equipo desde su portal, sin agencia.</w:t>
+        <w:t xml:space="preserve">Lo necesario para que la nueva web esté encendida, segura, con un chatbot que atiende a los clientes, y con las herramientas para mantenerla al día. La web ya está hecha y la actualiza el equipo desde su portal, sin agencia.</w:t>
       </w:r>
     </w:p>
     <w:tbl>
@@ -2470,6 +2956,240 @@
         <w:tc>
           <w:tcPr>
             <w:tcW w:type="dxa" w:w="3000"/>
+            <w:shd w:fill="F6F9FA" w:color="auto" w:val="clear"/>
+            <w:tcMar>
+              <w:top w:type="dxa" w:w="70"/>
+              <w:left w:type="dxa" w:w="100"/>
+              <w:bottom w:type="dxa" w:w="70"/>
+              <w:right w:type="dxa" w:w="100"/>
+            </w:tcMar>
+          </w:tcPr>
+          <w:p>
+            <w:pPr>
+              <w:jc w:val="left"/>
+            </w:pPr>
+            <w:r>
+              <w:rPr>
+                <w:rFonts w:ascii="Arial" w:cs="Arial" w:eastAsia="Arial" w:hAnsi="Arial"/>
+                <w:b w:val="false"/>
+                <w:bCs w:val="false"/>
+                <w:color w:val="0E3A4E"/>
+                <w:sz w:val="19"/>
+                <w:szCs w:val="19"/>
+              </w:rPr>
+              <w:t xml:space="preserve">Claude Pro · 1 cuenta</w:t>
+            </w:r>
+          </w:p>
+        </w:tc>
+        <w:tc>
+          <w:tcPr>
+            <w:tcW w:type="dxa" w:w="3360"/>
+            <w:shd w:fill="F6F9FA" w:color="auto" w:val="clear"/>
+            <w:tcMar>
+              <w:top w:type="dxa" w:w="70"/>
+              <w:left w:type="dxa" w:w="100"/>
+              <w:bottom w:type="dxa" w:w="70"/>
+              <w:right w:type="dxa" w:w="100"/>
+            </w:tcMar>
+          </w:tcPr>
+          <w:p>
+            <w:pPr>
+              <w:jc w:val="left"/>
+            </w:pPr>
+            <w:r>
+              <w:rPr>
+                <w:rFonts w:ascii="Arial" w:cs="Arial" w:eastAsia="Arial" w:hAnsi="Arial"/>
+                <w:b w:val="false"/>
+                <w:bCs w:val="false"/>
+                <w:color w:val="0E3A4E"/>
+                <w:sz w:val="19"/>
+                <w:szCs w:val="19"/>
+              </w:rPr>
+              <w:t xml:space="preserve">Mantenimiento de la página web</w:t>
+            </w:r>
+          </w:p>
+        </w:tc>
+        <w:tc>
+          <w:tcPr>
+            <w:tcW w:type="dxa" w:w="1500"/>
+            <w:shd w:fill="F6F9FA" w:color="auto" w:val="clear"/>
+            <w:tcMar>
+              <w:top w:type="dxa" w:w="70"/>
+              <w:left w:type="dxa" w:w="100"/>
+              <w:bottom w:type="dxa" w:w="70"/>
+              <w:right w:type="dxa" w:w="100"/>
+            </w:tcMar>
+          </w:tcPr>
+          <w:p>
+            <w:pPr>
+              <w:jc w:val="right"/>
+            </w:pPr>
+            <w:r>
+              <w:rPr>
+                <w:rFonts w:ascii="Arial" w:cs="Arial" w:eastAsia="Arial" w:hAnsi="Arial"/>
+                <w:b w:val="false"/>
+                <w:bCs w:val="false"/>
+                <w:color w:val="0E3A4E"/>
+                <w:sz w:val="19"/>
+                <w:szCs w:val="19"/>
+              </w:rPr>
+              <w:t xml:space="preserve">$3,449</w:t>
+            </w:r>
+          </w:p>
+        </w:tc>
+        <w:tc>
+          <w:tcPr>
+            <w:tcW w:type="dxa" w:w="1500"/>
+            <w:shd w:fill="F6F9FA" w:color="auto" w:val="clear"/>
+            <w:tcMar>
+              <w:top w:type="dxa" w:w="70"/>
+              <w:left w:type="dxa" w:w="100"/>
+              <w:bottom w:type="dxa" w:w="70"/>
+              <w:right w:type="dxa" w:w="100"/>
+            </w:tcMar>
+          </w:tcPr>
+          <w:p>
+            <w:pPr>
+              <w:jc w:val="right"/>
+            </w:pPr>
+            <w:r>
+              <w:rPr>
+                <w:rFonts w:ascii="Arial" w:cs="Arial" w:eastAsia="Arial" w:hAnsi="Arial"/>
+                <w:b w:val="false"/>
+                <w:bCs w:val="false"/>
+                <w:color w:val="0E3A4E"/>
+                <w:sz w:val="19"/>
+                <w:szCs w:val="19"/>
+              </w:rPr>
+              <w:t xml:space="preserve">$3,449</w:t>
+            </w:r>
+          </w:p>
+        </w:tc>
+      </w:tr>
+      <w:tr>
+        <w:trPr>
+          <w:tblHeader w:val="false"/>
+        </w:trPr>
+        <w:tc>
+          <w:tcPr>
+            <w:tcW w:type="dxa" w:w="3000"/>
+            <w:shd w:fill="FFFFFF" w:color="auto" w:val="clear"/>
+            <w:tcMar>
+              <w:top w:type="dxa" w:w="70"/>
+              <w:left w:type="dxa" w:w="100"/>
+              <w:bottom w:type="dxa" w:w="70"/>
+              <w:right w:type="dxa" w:w="100"/>
+            </w:tcMar>
+          </w:tcPr>
+          <w:p>
+            <w:pPr>
+              <w:jc w:val="left"/>
+            </w:pPr>
+            <w:r>
+              <w:rPr>
+                <w:rFonts w:ascii="Arial" w:cs="Arial" w:eastAsia="Arial" w:hAnsi="Arial"/>
+                <w:b w:val="false"/>
+                <w:bCs w:val="false"/>
+                <w:color w:val="0E3A4E"/>
+                <w:sz w:val="19"/>
+                <w:szCs w:val="19"/>
+              </w:rPr>
+              <w:t xml:space="preserve">Canva Pro · 1 cuenta</w:t>
+            </w:r>
+          </w:p>
+        </w:tc>
+        <w:tc>
+          <w:tcPr>
+            <w:tcW w:type="dxa" w:w="3360"/>
+            <w:shd w:fill="FFFFFF" w:color="auto" w:val="clear"/>
+            <w:tcMar>
+              <w:top w:type="dxa" w:w="70"/>
+              <w:left w:type="dxa" w:w="100"/>
+              <w:bottom w:type="dxa" w:w="70"/>
+              <w:right w:type="dxa" w:w="100"/>
+            </w:tcMar>
+          </w:tcPr>
+          <w:p>
+            <w:pPr>
+              <w:jc w:val="left"/>
+            </w:pPr>
+            <w:r>
+              <w:rPr>
+                <w:rFonts w:ascii="Arial" w:cs="Arial" w:eastAsia="Arial" w:hAnsi="Arial"/>
+                <w:b w:val="false"/>
+                <w:bCs w:val="false"/>
+                <w:color w:val="0E3A4E"/>
+                <w:sz w:val="19"/>
+                <w:szCs w:val="19"/>
+              </w:rPr>
+              <w:t xml:space="preserve">Banners y gráficos de cada evento para la web</w:t>
+            </w:r>
+          </w:p>
+        </w:tc>
+        <w:tc>
+          <w:tcPr>
+            <w:tcW w:type="dxa" w:w="1500"/>
+            <w:shd w:fill="FFFFFF" w:color="auto" w:val="clear"/>
+            <w:tcMar>
+              <w:top w:type="dxa" w:w="70"/>
+              <w:left w:type="dxa" w:w="100"/>
+              <w:bottom w:type="dxa" w:w="70"/>
+              <w:right w:type="dxa" w:w="100"/>
+            </w:tcMar>
+          </w:tcPr>
+          <w:p>
+            <w:pPr>
+              <w:jc w:val="right"/>
+            </w:pPr>
+            <w:r>
+              <w:rPr>
+                <w:rFonts w:ascii="Arial" w:cs="Arial" w:eastAsia="Arial" w:hAnsi="Arial"/>
+                <w:b w:val="false"/>
+                <w:bCs w:val="false"/>
+                <w:color w:val="0E3A4E"/>
+                <w:sz w:val="19"/>
+                <w:szCs w:val="19"/>
+              </w:rPr>
+              <w:t xml:space="preserve">$1,210</w:t>
+            </w:r>
+          </w:p>
+        </w:tc>
+        <w:tc>
+          <w:tcPr>
+            <w:tcW w:type="dxa" w:w="1500"/>
+            <w:shd w:fill="FFFFFF" w:color="auto" w:val="clear"/>
+            <w:tcMar>
+              <w:top w:type="dxa" w:w="70"/>
+              <w:left w:type="dxa" w:w="100"/>
+              <w:bottom w:type="dxa" w:w="70"/>
+              <w:right w:type="dxa" w:w="100"/>
+            </w:tcMar>
+          </w:tcPr>
+          <w:p>
+            <w:pPr>
+              <w:jc w:val="right"/>
+            </w:pPr>
+            <w:r>
+              <w:rPr>
+                <w:rFonts w:ascii="Arial" w:cs="Arial" w:eastAsia="Arial" w:hAnsi="Arial"/>
+                <w:b w:val="false"/>
+                <w:bCs w:val="false"/>
+                <w:color w:val="0E3A4E"/>
+                <w:sz w:val="19"/>
+                <w:szCs w:val="19"/>
+              </w:rPr>
+              <w:t xml:space="preserve">$1,210</w:t>
+            </w:r>
+          </w:p>
+        </w:tc>
+      </w:tr>
+      <w:tr>
+        <w:trPr>
+          <w:tblHeader w:val="false"/>
+        </w:trPr>
+        <w:tc>
+          <w:tcPr>
+            <w:tcW w:type="dxa" w:w="3000"/>
             <w:shd w:fill="175772" w:color="auto" w:val="clear"/>
             <w:tcMar>
               <w:top w:type="dxa" w:w="70"/>
@@ -2491,7 +3211,7 @@
                 <w:sz w:val="19"/>
                 <w:szCs w:val="19"/>
               </w:rPr>
-              <w:t xml:space="preserve">Total página web</w:t>
+              <w:t xml:space="preserve">Total Página web</w:t>
             </w:r>
           </w:p>
         </w:tc>
@@ -2547,7 +3267,7 @@
                 <w:sz w:val="19"/>
                 <w:szCs w:val="19"/>
               </w:rPr>
-              <w:t xml:space="preserve">$11,813</w:t>
+              <w:t xml:space="preserve">$16,472</w:t>
             </w:r>
           </w:p>
         </w:tc>
@@ -2575,7 +3295,7 @@
                 <w:sz w:val="19"/>
                 <w:szCs w:val="19"/>
               </w:rPr>
-              <w:t xml:space="preserve">$9,377</w:t>
+              <w:t xml:space="preserve">$14,036</w:t>
             </w:r>
           </w:p>
         </w:tc>
@@ -2985,7 +3705,7 @@
           <w:sz w:val="19"/>
           <w:szCs w:val="19"/>
         </w:rPr>
-        <w:t xml:space="preserve">Cobra por conversación, no por visita. Tiene límite de gasto mensual. Precios de la cotización de la web ($18.20 por dólar) con 16% de IVA.</w:t>
+        <w:t xml:space="preserve">Cobra por conversación, no por visita. Tiene límite de gasto mensual. Infraestructura según la cotización de la web ($18.20 por dólar) con 16% de IVA.</w:t>
       </w:r>
     </w:p>
     <w:p>
@@ -3014,8 +3734,221 @@
       </w:r>
     </w:p>
     <w:p>
-      <w:r>
-        <w:br w:type="page"/>
+      <w:pPr>
+        <w:pStyle w:val="Heading2"/>
+        <w:spacing w:after="80" w:before="200"/>
+      </w:pPr>
+      <w:r>
+        <w:rPr>
+          <w:rFonts w:ascii="Arial" w:cs="Arial" w:eastAsia="Arial" w:hAnsi="Arial"/>
+          <w:b/>
+          <w:bCs/>
+          <w:color w:val="175772"/>
+          <w:sz w:val="26"/>
+          <w:szCs w:val="26"/>
+        </w:rPr>
+        <w:t xml:space="preserve">Por qué cada cosa</w:t>
+      </w:r>
+    </w:p>
+    <w:p>
+      <w:pPr>
+        <w:pStyle w:val="Heading2"/>
+        <w:spacing w:after="80" w:before="200"/>
+      </w:pPr>
+      <w:r>
+        <w:rPr>
+          <w:rFonts w:ascii="Arial" w:cs="Arial" w:eastAsia="Arial" w:hAnsi="Arial"/>
+          <w:b/>
+          <w:bCs/>
+          <w:color w:val="175772"/>
+          <w:sz w:val="26"/>
+          <w:szCs w:val="26"/>
+        </w:rPr>
+        <w:t xml:space="preserve">Claude Pro</w:t>
+      </w:r>
+    </w:p>
+    <w:p>
+      <w:pPr>
+        <w:spacing w:after="40" w:before="0"/>
+      </w:pPr>
+      <w:r>
+        <w:rPr>
+          <w:rFonts w:ascii="Arial" w:cs="Arial" w:eastAsia="Arial" w:hAnsi="Arial"/>
+          <w:b/>
+          <w:bCs/>
+          <w:color w:val="0E3A4E"/>
+          <w:sz w:val="22"/>
+          <w:szCs w:val="22"/>
+        </w:rPr>
+        <w:t xml:space="preserve">Por qué: </w:t>
+      </w:r>
+      <w:r>
+        <w:rPr>
+          <w:rFonts w:ascii="Arial" w:cs="Arial" w:eastAsia="Arial" w:hAnsi="Arial"/>
+          <w:color w:val="0E3A4E"/>
+          <w:sz w:val="22"/>
+          <w:szCs w:val="22"/>
+        </w:rPr>
+        <w:t xml:space="preserve">Mantenimiento de la página web: actualización de textos, eventos, noticias y preguntas frecuentes, y apoyo para ajustes del sitio. Es el mismo proveedor del chatbot de la web.</w:t>
+      </w:r>
+    </w:p>
+    <w:p>
+      <w:pPr>
+        <w:spacing w:after="120" w:before="0"/>
+      </w:pPr>
+      <w:r>
+        <w:rPr>
+          <w:rFonts w:ascii="Arial" w:cs="Arial" w:eastAsia="Arial" w:hAnsi="Arial"/>
+          <w:b/>
+          <w:bCs/>
+          <w:color w:val="0E3A4E"/>
+          <w:sz w:val="22"/>
+          <w:szCs w:val="22"/>
+        </w:rPr>
+        <w:t xml:space="preserve">Ejemplo: </w:t>
+      </w:r>
+      <w:r>
+        <w:rPr>
+          <w:rFonts w:ascii="Arial" w:cs="Arial" w:eastAsia="Arial" w:hAnsi="Arial"/>
+          <w:color w:val="0E3A4E"/>
+          <w:sz w:val="22"/>
+          <w:szCs w:val="22"/>
+        </w:rPr>
+        <w:t xml:space="preserve">Alta de un evento nuevo en el sitio con su descripción y preguntas frecuentes.</w:t>
+      </w:r>
+    </w:p>
+    <w:p>
+      <w:pPr>
+        <w:pStyle w:val="Heading2"/>
+        <w:spacing w:after="80" w:before="200"/>
+      </w:pPr>
+      <w:r>
+        <w:rPr>
+          <w:rFonts w:ascii="Arial" w:cs="Arial" w:eastAsia="Arial" w:hAnsi="Arial"/>
+          <w:b/>
+          <w:bCs/>
+          <w:color w:val="175772"/>
+          <w:sz w:val="26"/>
+          <w:szCs w:val="26"/>
+        </w:rPr>
+        <w:t xml:space="preserve">Canva Pro · 1 cuenta</w:t>
+      </w:r>
+    </w:p>
+    <w:p>
+      <w:pPr>
+        <w:spacing w:after="40" w:before="0"/>
+      </w:pPr>
+      <w:r>
+        <w:rPr>
+          <w:rFonts w:ascii="Arial" w:cs="Arial" w:eastAsia="Arial" w:hAnsi="Arial"/>
+          <w:b/>
+          <w:bCs/>
+          <w:color w:val="0E3A4E"/>
+          <w:sz w:val="22"/>
+          <w:szCs w:val="22"/>
+        </w:rPr>
+        <w:t xml:space="preserve">Por qué: </w:t>
+      </w:r>
+      <w:r>
+        <w:rPr>
+          <w:rFonts w:ascii="Arial" w:cs="Arial" w:eastAsia="Arial" w:hAnsi="Arial"/>
+          <w:color w:val="0E3A4E"/>
+          <w:sz w:val="22"/>
+          <w:szCs w:val="22"/>
+        </w:rPr>
+        <w:t xml:space="preserve">Diseño de banners y gráficos para la web con el kit de marca del recinto.</w:t>
+      </w:r>
+    </w:p>
+    <w:p>
+      <w:pPr>
+        <w:spacing w:after="120" w:before="0"/>
+      </w:pPr>
+      <w:r>
+        <w:rPr>
+          <w:rFonts w:ascii="Arial" w:cs="Arial" w:eastAsia="Arial" w:hAnsi="Arial"/>
+          <w:b/>
+          <w:bCs/>
+          <w:color w:val="0E3A4E"/>
+          <w:sz w:val="22"/>
+          <w:szCs w:val="22"/>
+        </w:rPr>
+        <w:t xml:space="preserve">Ejemplo: </w:t>
+      </w:r>
+      <w:r>
+        <w:rPr>
+          <w:rFonts w:ascii="Arial" w:cs="Arial" w:eastAsia="Arial" w:hAnsi="Arial"/>
+          <w:color w:val="0E3A4E"/>
+          <w:sz w:val="22"/>
+          <w:szCs w:val="22"/>
+        </w:rPr>
+        <w:t xml:space="preserve">Banner de cada evento para la portada y el calendario del sitio.</w:t>
+      </w:r>
+    </w:p>
+    <w:p>
+      <w:pPr>
+        <w:pStyle w:val="Heading2"/>
+        <w:spacing w:after="80" w:before="200"/>
+      </w:pPr>
+      <w:r>
+        <w:rPr>
+          <w:rFonts w:ascii="Arial" w:cs="Arial" w:eastAsia="Arial" w:hAnsi="Arial"/>
+          <w:b/>
+          <w:bCs/>
+          <w:color w:val="175772"/>
+          <w:sz w:val="26"/>
+          <w:szCs w:val="26"/>
+        </w:rPr>
+        <w:t xml:space="preserve">Página web</w:t>
+      </w:r>
+    </w:p>
+    <w:p>
+      <w:pPr>
+        <w:spacing w:after="40" w:before="0"/>
+      </w:pPr>
+      <w:r>
+        <w:rPr>
+          <w:rFonts w:ascii="Arial" w:cs="Arial" w:eastAsia="Arial" w:hAnsi="Arial"/>
+          <w:b/>
+          <w:bCs/>
+          <w:color w:val="0E3A4E"/>
+          <w:sz w:val="22"/>
+          <w:szCs w:val="22"/>
+        </w:rPr>
+        <w:t xml:space="preserve">Por qué: </w:t>
+      </w:r>
+      <w:r>
+        <w:rPr>
+          <w:rFonts w:ascii="Arial" w:cs="Arial" w:eastAsia="Arial" w:hAnsi="Arial"/>
+          <w:color w:val="0E3A4E"/>
+          <w:sz w:val="22"/>
+          <w:szCs w:val="22"/>
+        </w:rPr>
+        <w:t xml:space="preserve">La nueva web necesita servidor propio, seguridad y dominio para funcionar; el chatbot atiende las preguntas de los clientes y deja la solicitud lista para el ejecutivo comercial.</w:t>
+      </w:r>
+    </w:p>
+    <w:p>
+      <w:pPr>
+        <w:spacing w:after="120" w:before="0"/>
+      </w:pPr>
+      <w:r>
+        <w:rPr>
+          <w:rFonts w:ascii="Arial" w:cs="Arial" w:eastAsia="Arial" w:hAnsi="Arial"/>
+          <w:b/>
+          <w:bCs/>
+          <w:color w:val="0E3A4E"/>
+          <w:sz w:val="22"/>
+          <w:szCs w:val="22"/>
+        </w:rPr>
+        <w:t xml:space="preserve">Ejemplo: </w:t>
+      </w:r>
+      <w:r>
+        <w:rPr>
+          <w:rFonts w:ascii="Arial" w:cs="Arial" w:eastAsia="Arial" w:hAnsi="Arial"/>
+          <w:color w:val="0E3A4E"/>
+          <w:sz w:val="22"/>
+          <w:szCs w:val="22"/>
+        </w:rPr>
+        <w:t xml:space="preserve">Un organizador pregunta por una sala para 600 personas; el chatbot le pide fecha y correo y avisa al ejecutivo.</w:t>
       </w:r>
     </w:p>
     <w:p>
@@ -3035,7 +3968,7 @@
           <w:sz w:val="32"/>
           <w:szCs w:val="32"/>
         </w:rPr>
-        <w:t xml:space="preserve">3. Por qué cada cosa</w:t>
+        <w:t xml:space="preserve">3. Links de compra</w:t>
       </w:r>
     </w:p>
     <w:p>
@@ -3052,751 +3985,7 @@
           <w:sz w:val="26"/>
           <w:szCs w:val="26"/>
         </w:rPr>
-        <w:t xml:space="preserve">ManyChat Pro</w:t>
-      </w:r>
-    </w:p>
-    <w:p>
-      <w:pPr>
-        <w:spacing w:after="40" w:before="0"/>
-      </w:pPr>
-      <w:r>
-        <w:rPr>
-          <w:rFonts w:ascii="Arial" w:cs="Arial" w:eastAsia="Arial" w:hAnsi="Arial"/>
-          <w:b/>
-          <w:bCs/>
-          <w:color w:val="0E3A4E"/>
-          <w:sz w:val="22"/>
-          <w:szCs w:val="22"/>
-        </w:rPr>
-        <w:t xml:space="preserve">Por qué: </w:t>
-      </w:r>
-      <w:r>
-        <w:rPr>
-          <w:rFonts w:ascii="Arial" w:cs="Arial" w:eastAsia="Arial" w:hAnsi="Arial"/>
-          <w:color w:val="0E3A4E"/>
-          <w:sz w:val="22"/>
-          <w:szCs w:val="22"/>
-        </w:rPr>
-        <w:t xml:space="preserve">Responde de forma automática los mensajes privados de Instagram, Facebook y Messenger con las preguntas frecuentes, como "¿dónde compro boletos para…?" o "estoy buscando trabajo". También permite dinámicas de "comenta y te llega" para generar leads en campañas.</w:t>
-      </w:r>
-    </w:p>
-    <w:p>
-      <w:pPr>
-        <w:spacing w:after="120" w:before="0"/>
-      </w:pPr>
-      <w:r>
-        <w:rPr>
-          <w:rFonts w:ascii="Arial" w:cs="Arial" w:eastAsia="Arial" w:hAnsi="Arial"/>
-          <w:b/>
-          <w:bCs/>
-          <w:color w:val="0E3A4E"/>
-          <w:sz w:val="22"/>
-          <w:szCs w:val="22"/>
-        </w:rPr>
-        <w:t xml:space="preserve">Ejemplo: </w:t>
-      </w:r>
-      <w:r>
-        <w:rPr>
-          <w:rFonts w:ascii="Arial" w:cs="Arial" w:eastAsia="Arial" w:hAnsi="Arial"/>
-          <w:color w:val="0E3A4E"/>
-          <w:sz w:val="22"/>
-          <w:szCs w:val="22"/>
-        </w:rPr>
-        <w:t xml:space="preserve">En la campaña de Maricela Cordero se obtuvieron 3 leads sin publicidad pagada, respondiendo de forma manual. ManyChat permite automatizar ese proceso en futuras campañas.</w:t>
-      </w:r>
-    </w:p>
-    <w:p>
-      <w:pPr>
-        <w:pStyle w:val="Heading2"/>
-        <w:spacing w:after="80" w:before="200"/>
-      </w:pPr>
-      <w:r>
-        <w:rPr>
-          <w:rFonts w:ascii="Arial" w:cs="Arial" w:eastAsia="Arial" w:hAnsi="Arial"/>
-          <w:b/>
-          <w:bCs/>
-          <w:color w:val="175772"/>
-          <w:sz w:val="26"/>
-          <w:szCs w:val="26"/>
-        </w:rPr>
-        <w:t xml:space="preserve">ChatGPT Plus</w:t>
-      </w:r>
-    </w:p>
-    <w:p>
-      <w:pPr>
-        <w:spacing w:after="40" w:before="0"/>
-      </w:pPr>
-      <w:r>
-        <w:rPr>
-          <w:rFonts w:ascii="Arial" w:cs="Arial" w:eastAsia="Arial" w:hAnsi="Arial"/>
-          <w:b/>
-          <w:bCs/>
-          <w:color w:val="0E3A4E"/>
-          <w:sz w:val="22"/>
-          <w:szCs w:val="22"/>
-        </w:rPr>
-        <w:t xml:space="preserve">Por qué: </w:t>
-      </w:r>
-      <w:r>
-        <w:rPr>
-          <w:rFonts w:ascii="Arial" w:cs="Arial" w:eastAsia="Arial" w:hAnsi="Arial"/>
-          <w:color w:val="0E3A4E"/>
-          <w:sz w:val="22"/>
-          <w:szCs w:val="22"/>
-        </w:rPr>
-        <w:t xml:space="preserve">Producción de imágenes para redes y apoyo para hacer crecer y potenciar nuestras cuentas: ideas de contenido y campañas, copys, y análisis de los resultados de las publicaciones para decidir qué funciona mejor. Con Codex ayuda a automatizar tareas repetitivas del departamento.</w:t>
-      </w:r>
-    </w:p>
-    <w:p>
-      <w:pPr>
-        <w:spacing w:after="120" w:before="0"/>
-      </w:pPr>
-      <w:r>
-        <w:rPr>
-          <w:rFonts w:ascii="Arial" w:cs="Arial" w:eastAsia="Arial" w:hAnsi="Arial"/>
-          <w:b/>
-          <w:bCs/>
-          <w:color w:val="0E3A4E"/>
-          <w:sz w:val="22"/>
-          <w:szCs w:val="22"/>
-        </w:rPr>
-        <w:t xml:space="preserve">Ejemplo: </w:t>
-      </w:r>
-      <w:r>
-        <w:rPr>
-          <w:rFonts w:ascii="Arial" w:cs="Arial" w:eastAsia="Arial" w:hAnsi="Arial"/>
-          <w:color w:val="0E3A4E"/>
-          <w:sz w:val="22"/>
-          <w:szCs w:val="22"/>
-        </w:rPr>
-        <w:t xml:space="preserve">Imágenes para publicaciones de eventos y análisis mensual de las estadísticas de Facebook, Instagram y TikTok para ajustar el contenido.</w:t>
-      </w:r>
-    </w:p>
-    <w:p>
-      <w:pPr>
-        <w:pStyle w:val="Heading2"/>
-        <w:spacing w:after="80" w:before="200"/>
-      </w:pPr>
-      <w:r>
-        <w:rPr>
-          <w:rFonts w:ascii="Arial" w:cs="Arial" w:eastAsia="Arial" w:hAnsi="Arial"/>
-          <w:b/>
-          <w:bCs/>
-          <w:color w:val="175772"/>
-          <w:sz w:val="26"/>
-          <w:szCs w:val="26"/>
-        </w:rPr>
-        <w:t xml:space="preserve">Claude Pro</w:t>
-      </w:r>
-    </w:p>
-    <w:p>
-      <w:pPr>
-        <w:spacing w:after="40" w:before="0"/>
-      </w:pPr>
-      <w:r>
-        <w:rPr>
-          <w:rFonts w:ascii="Arial" w:cs="Arial" w:eastAsia="Arial" w:hAnsi="Arial"/>
-          <w:b/>
-          <w:bCs/>
-          <w:color w:val="0E3A4E"/>
-          <w:sz w:val="22"/>
-          <w:szCs w:val="22"/>
-        </w:rPr>
-        <w:t xml:space="preserve">Por qué: </w:t>
-      </w:r>
-      <w:r>
-        <w:rPr>
-          <w:rFonts w:ascii="Arial" w:cs="Arial" w:eastAsia="Arial" w:hAnsi="Arial"/>
-          <w:color w:val="0E3A4E"/>
-          <w:sz w:val="22"/>
-          <w:szCs w:val="22"/>
-        </w:rPr>
-        <w:t xml:space="preserve">Mantenimiento de la página web: actualización de textos, eventos, noticias y preguntas frecuentes, y apoyo para ajustes del sitio. Es el mismo proveedor del chatbot de la web.</w:t>
-      </w:r>
-    </w:p>
-    <w:p>
-      <w:pPr>
-        <w:spacing w:after="120" w:before="0"/>
-      </w:pPr>
-      <w:r>
-        <w:rPr>
-          <w:rFonts w:ascii="Arial" w:cs="Arial" w:eastAsia="Arial" w:hAnsi="Arial"/>
-          <w:b/>
-          <w:bCs/>
-          <w:color w:val="0E3A4E"/>
-          <w:sz w:val="22"/>
-          <w:szCs w:val="22"/>
-        </w:rPr>
-        <w:t xml:space="preserve">Ejemplo: </w:t>
-      </w:r>
-      <w:r>
-        <w:rPr>
-          <w:rFonts w:ascii="Arial" w:cs="Arial" w:eastAsia="Arial" w:hAnsi="Arial"/>
-          <w:color w:val="0E3A4E"/>
-          <w:sz w:val="22"/>
-          <w:szCs w:val="22"/>
-        </w:rPr>
-        <w:t xml:space="preserve">Alta de un evento nuevo en el sitio con su descripción y preguntas frecuentes.</w:t>
-      </w:r>
-    </w:p>
-    <w:p>
-      <w:pPr>
-        <w:pStyle w:val="Heading2"/>
-        <w:spacing w:after="80" w:before="200"/>
-      </w:pPr>
-      <w:r>
-        <w:rPr>
-          <w:rFonts w:ascii="Arial" w:cs="Arial" w:eastAsia="Arial" w:hAnsi="Arial"/>
-          <w:b/>
-          <w:bCs/>
-          <w:color w:val="175772"/>
-          <w:sz w:val="26"/>
-          <w:szCs w:val="26"/>
-        </w:rPr>
-        <w:t xml:space="preserve">Canva Pro · 2 cuentas</w:t>
-      </w:r>
-    </w:p>
-    <w:p>
-      <w:pPr>
-        <w:spacing w:after="40" w:before="0"/>
-      </w:pPr>
-      <w:r>
-        <w:rPr>
-          <w:rFonts w:ascii="Arial" w:cs="Arial" w:eastAsia="Arial" w:hAnsi="Arial"/>
-          <w:b/>
-          <w:bCs/>
-          <w:color w:val="0E3A4E"/>
-          <w:sz w:val="22"/>
-          <w:szCs w:val="22"/>
-        </w:rPr>
-        <w:t xml:space="preserve">Por qué: </w:t>
-      </w:r>
-      <w:r>
-        <w:rPr>
-          <w:rFonts w:ascii="Arial" w:cs="Arial" w:eastAsia="Arial" w:hAnsi="Arial"/>
-          <w:color w:val="0E3A4E"/>
-          <w:sz w:val="22"/>
-          <w:szCs w:val="22"/>
-        </w:rPr>
-        <w:t xml:space="preserve">Diseño con el kit de marca del recinto: una cuenta para redes y otra para la página web (banners y gráficos de cada evento).</w:t>
-      </w:r>
-    </w:p>
-    <w:p>
-      <w:pPr>
-        <w:spacing w:after="120" w:before="0"/>
-      </w:pPr>
-      <w:r>
-        <w:rPr>
-          <w:rFonts w:ascii="Arial" w:cs="Arial" w:eastAsia="Arial" w:hAnsi="Arial"/>
-          <w:b/>
-          <w:bCs/>
-          <w:color w:val="0E3A4E"/>
-          <w:sz w:val="22"/>
-          <w:szCs w:val="22"/>
-        </w:rPr>
-        <w:t xml:space="preserve">Ejemplo: </w:t>
-      </w:r>
-      <w:r>
-        <w:rPr>
-          <w:rFonts w:ascii="Arial" w:cs="Arial" w:eastAsia="Arial" w:hAnsi="Arial"/>
-          <w:color w:val="0E3A4E"/>
-          <w:sz w:val="22"/>
-          <w:szCs w:val="22"/>
-        </w:rPr>
-        <w:t xml:space="preserve">Post e historia de un evento para redes, y su banner para la web, con la imagen oficial.</w:t>
-      </w:r>
-    </w:p>
-    <w:p>
-      <w:pPr>
-        <w:pStyle w:val="Heading2"/>
-        <w:spacing w:after="80" w:before="200"/>
-      </w:pPr>
-      <w:r>
-        <w:rPr>
-          <w:rFonts w:ascii="Arial" w:cs="Arial" w:eastAsia="Arial" w:hAnsi="Arial"/>
-          <w:b/>
-          <w:bCs/>
-          <w:color w:val="175772"/>
-          <w:sz w:val="26"/>
-          <w:szCs w:val="26"/>
-        </w:rPr>
-        <w:t xml:space="preserve">X Premium</w:t>
-      </w:r>
-    </w:p>
-    <w:p>
-      <w:pPr>
-        <w:spacing w:after="40" w:before="0"/>
-      </w:pPr>
-      <w:r>
-        <w:rPr>
-          <w:rFonts w:ascii="Arial" w:cs="Arial" w:eastAsia="Arial" w:hAnsi="Arial"/>
-          <w:b/>
-          <w:bCs/>
-          <w:color w:val="0E3A4E"/>
-          <w:sz w:val="22"/>
-          <w:szCs w:val="22"/>
-        </w:rPr>
-        <w:t xml:space="preserve">Por qué: </w:t>
-      </w:r>
-      <w:r>
-        <w:rPr>
-          <w:rFonts w:ascii="Arial" w:cs="Arial" w:eastAsia="Arial" w:hAnsi="Arial"/>
-          <w:color w:val="0E3A4E"/>
-          <w:sz w:val="22"/>
-          <w:szCs w:val="22"/>
-        </w:rPr>
-        <w:t xml:space="preserve">Verificación de la cuenta oficial del recinto, para distinguirla de cuentas falsas.</w:t>
-      </w:r>
-    </w:p>
-    <w:p>
-      <w:pPr>
-        <w:spacing w:after="120" w:before="0"/>
-      </w:pPr>
-      <w:r>
-        <w:rPr>
-          <w:rFonts w:ascii="Arial" w:cs="Arial" w:eastAsia="Arial" w:hAnsi="Arial"/>
-          <w:b/>
-          <w:bCs/>
-          <w:color w:val="0E3A4E"/>
-          <w:sz w:val="22"/>
-          <w:szCs w:val="22"/>
-        </w:rPr>
-        <w:t xml:space="preserve">Ejemplo: </w:t>
-      </w:r>
-      <w:r>
-        <w:rPr>
-          <w:rFonts w:ascii="Arial" w:cs="Arial" w:eastAsia="Arial" w:hAnsi="Arial"/>
-          <w:color w:val="0E3A4E"/>
-          <w:sz w:val="22"/>
-          <w:szCs w:val="22"/>
-        </w:rPr>
-        <w:t xml:space="preserve">Avisos oficiales de accesos, estacionamiento y horarios durante eventos masivos.</w:t>
-      </w:r>
-    </w:p>
-    <w:p>
-      <w:pPr>
-        <w:pStyle w:val="Heading2"/>
-        <w:spacing w:after="80" w:before="200"/>
-      </w:pPr>
-      <w:r>
-        <w:rPr>
-          <w:rFonts w:ascii="Arial" w:cs="Arial" w:eastAsia="Arial" w:hAnsi="Arial"/>
-          <w:b/>
-          <w:bCs/>
-          <w:color w:val="175772"/>
-          <w:sz w:val="26"/>
-          <w:szCs w:val="26"/>
-        </w:rPr>
-        <w:t xml:space="preserve">Página web</w:t>
-      </w:r>
-    </w:p>
-    <w:p>
-      <w:pPr>
-        <w:spacing w:after="40" w:before="0"/>
-      </w:pPr>
-      <w:r>
-        <w:rPr>
-          <w:rFonts w:ascii="Arial" w:cs="Arial" w:eastAsia="Arial" w:hAnsi="Arial"/>
-          <w:b/>
-          <w:bCs/>
-          <w:color w:val="0E3A4E"/>
-          <w:sz w:val="22"/>
-          <w:szCs w:val="22"/>
-        </w:rPr>
-        <w:t xml:space="preserve">Por qué: </w:t>
-      </w:r>
-      <w:r>
-        <w:rPr>
-          <w:rFonts w:ascii="Arial" w:cs="Arial" w:eastAsia="Arial" w:hAnsi="Arial"/>
-          <w:color w:val="0E3A4E"/>
-          <w:sz w:val="22"/>
-          <w:szCs w:val="22"/>
-        </w:rPr>
-        <w:t xml:space="preserve">La nueva web necesita servidor propio, seguridad y dominio para funcionar; el chatbot atiende las preguntas de los clientes y deja la solicitud lista para el ejecutivo comercial.</w:t>
-      </w:r>
-    </w:p>
-    <w:p>
-      <w:pPr>
-        <w:spacing w:after="120" w:before="0"/>
-      </w:pPr>
-      <w:r>
-        <w:rPr>
-          <w:rFonts w:ascii="Arial" w:cs="Arial" w:eastAsia="Arial" w:hAnsi="Arial"/>
-          <w:b/>
-          <w:bCs/>
-          <w:color w:val="0E3A4E"/>
-          <w:sz w:val="22"/>
-          <w:szCs w:val="22"/>
-        </w:rPr>
-        <w:t xml:space="preserve">Ejemplo: </w:t>
-      </w:r>
-      <w:r>
-        <w:rPr>
-          <w:rFonts w:ascii="Arial" w:cs="Arial" w:eastAsia="Arial" w:hAnsi="Arial"/>
-          <w:color w:val="0E3A4E"/>
-          <w:sz w:val="22"/>
-          <w:szCs w:val="22"/>
-        </w:rPr>
-        <w:t xml:space="preserve">Un organizador pregunta por una sala para 600 personas; el chatbot le pide fecha y correo y avisa al ejecutivo.</w:t>
-      </w:r>
-    </w:p>
-    <w:p>
-      <w:pPr>
-        <w:pStyle w:val="Heading2"/>
-        <w:spacing w:after="80" w:before="200"/>
-      </w:pPr>
-      <w:r>
-        <w:rPr>
-          <w:rFonts w:ascii="Arial" w:cs="Arial" w:eastAsia="Arial" w:hAnsi="Arial"/>
-          <w:b/>
-          <w:bCs/>
-          <w:color w:val="175772"/>
-          <w:sz w:val="26"/>
-          <w:szCs w:val="26"/>
-        </w:rPr>
-        <w:t xml:space="preserve">Ejemplos de respuestas automáticas de ManyChat</w:t>
-      </w:r>
-    </w:p>
-    <w:tbl>
-      <w:tblPr>
-        <w:tblW w:type="dxa" w:w="9360"/>
-        <w:tblBorders>
-          <w:top w:val="single" w:color="auto" w:sz="4"/>
-          <w:left w:val="single" w:color="auto" w:sz="4"/>
-          <w:bottom w:val="single" w:color="auto" w:sz="4"/>
-          <w:right w:val="single" w:color="auto" w:sz="4"/>
-          <w:insideH w:val="single" w:color="auto" w:sz="4"/>
-          <w:insideV w:val="single" w:color="auto" w:sz="4"/>
-        </w:tblBorders>
-      </w:tblPr>
-      <w:tblGrid>
-        <w:gridCol w:w="4200"/>
-        <w:gridCol w:w="5160"/>
-      </w:tblGrid>
-      <w:tr>
-        <w:trPr>
-          <w:tblHeader/>
-        </w:trPr>
-        <w:tc>
-          <w:tcPr>
-            <w:tcW w:type="dxa" w:w="4200"/>
-            <w:shd w:fill="DCE6EB" w:color="auto" w:val="clear"/>
-            <w:tcMar>
-              <w:top w:type="dxa" w:w="70"/>
-              <w:left w:type="dxa" w:w="100"/>
-              <w:bottom w:type="dxa" w:w="70"/>
-              <w:right w:type="dxa" w:w="100"/>
-            </w:tcMar>
-          </w:tcPr>
-          <w:p>
-            <w:pPr>
-              <w:jc w:val="left"/>
-            </w:pPr>
-            <w:r>
-              <w:rPr>
-                <w:rFonts w:ascii="Arial" w:cs="Arial" w:eastAsia="Arial" w:hAnsi="Arial"/>
-                <w:b/>
-                <w:bCs/>
-                <w:color w:val="0E3A4E"/>
-                <w:sz w:val="19"/>
-                <w:szCs w:val="19"/>
-              </w:rPr>
-              <w:t xml:space="preserve">Si alguien escribe…</w:t>
-            </w:r>
-          </w:p>
-        </w:tc>
-        <w:tc>
-          <w:tcPr>
-            <w:tcW w:type="dxa" w:w="5160"/>
-            <w:shd w:fill="DCE6EB" w:color="auto" w:val="clear"/>
-            <w:tcMar>
-              <w:top w:type="dxa" w:w="70"/>
-              <w:left w:type="dxa" w:w="100"/>
-              <w:bottom w:type="dxa" w:w="70"/>
-              <w:right w:type="dxa" w:w="100"/>
-            </w:tcMar>
-          </w:tcPr>
-          <w:p>
-            <w:pPr>
-              <w:jc w:val="left"/>
-            </w:pPr>
-            <w:r>
-              <w:rPr>
-                <w:rFonts w:ascii="Arial" w:cs="Arial" w:eastAsia="Arial" w:hAnsi="Arial"/>
-                <w:b/>
-                <w:bCs/>
-                <w:color w:val="0E3A4E"/>
-                <w:sz w:val="19"/>
-                <w:szCs w:val="19"/>
-              </w:rPr>
-              <w:t xml:space="preserve">Respuesta automática</w:t>
-            </w:r>
-          </w:p>
-        </w:tc>
-      </w:tr>
-      <w:tr>
-        <w:trPr>
-          <w:tblHeader w:val="false"/>
-        </w:trPr>
-        <w:tc>
-          <w:tcPr>
-            <w:tcW w:type="dxa" w:w="4200"/>
-            <w:shd w:fill="F6F9FA" w:color="auto" w:val="clear"/>
-            <w:tcMar>
-              <w:top w:type="dxa" w:w="70"/>
-              <w:left w:type="dxa" w:w="100"/>
-              <w:bottom w:type="dxa" w:w="70"/>
-              <w:right w:type="dxa" w:w="100"/>
-            </w:tcMar>
-          </w:tcPr>
-          <w:p>
-            <w:pPr>
-              <w:jc w:val="left"/>
-            </w:pPr>
-            <w:r>
-              <w:rPr>
-                <w:rFonts w:ascii="Arial" w:cs="Arial" w:eastAsia="Arial" w:hAnsi="Arial"/>
-                <w:b w:val="false"/>
-                <w:bCs w:val="false"/>
-                <w:color w:val="0E3A4E"/>
-                <w:sz w:val="19"/>
-                <w:szCs w:val="19"/>
-              </w:rPr>
-              <w:t xml:space="preserve">"¿Dónde puedo comprar boletos para…?"</w:t>
-            </w:r>
-          </w:p>
-        </w:tc>
-        <w:tc>
-          <w:tcPr>
-            <w:tcW w:type="dxa" w:w="5160"/>
-            <w:shd w:fill="F6F9FA" w:color="auto" w:val="clear"/>
-            <w:tcMar>
-              <w:top w:type="dxa" w:w="70"/>
-              <w:left w:type="dxa" w:w="100"/>
-              <w:bottom w:type="dxa" w:w="70"/>
-              <w:right w:type="dxa" w:w="100"/>
-            </w:tcMar>
-          </w:tcPr>
-          <w:p>
-            <w:pPr>
-              <w:jc w:val="left"/>
-            </w:pPr>
-            <w:r>
-              <w:rPr>
-                <w:rFonts w:ascii="Arial" w:cs="Arial" w:eastAsia="Arial" w:hAnsi="Arial"/>
-                <w:b w:val="false"/>
-                <w:bCs w:val="false"/>
-                <w:color w:val="0E3A4E"/>
-                <w:sz w:val="19"/>
-                <w:szCs w:val="19"/>
-              </w:rPr>
-              <w:t xml:space="preserve">El link oficial de boletos, fecha y horario</w:t>
-            </w:r>
-          </w:p>
-        </w:tc>
-      </w:tr>
-      <w:tr>
-        <w:trPr>
-          <w:tblHeader w:val="false"/>
-        </w:trPr>
-        <w:tc>
-          <w:tcPr>
-            <w:tcW w:type="dxa" w:w="4200"/>
-            <w:shd w:fill="FFFFFF" w:color="auto" w:val="clear"/>
-            <w:tcMar>
-              <w:top w:type="dxa" w:w="70"/>
-              <w:left w:type="dxa" w:w="100"/>
-              <w:bottom w:type="dxa" w:w="70"/>
-              <w:right w:type="dxa" w:w="100"/>
-            </w:tcMar>
-          </w:tcPr>
-          <w:p>
-            <w:pPr>
-              <w:jc w:val="left"/>
-            </w:pPr>
-            <w:r>
-              <w:rPr>
-                <w:rFonts w:ascii="Arial" w:cs="Arial" w:eastAsia="Arial" w:hAnsi="Arial"/>
-                <w:b w:val="false"/>
-                <w:bCs w:val="false"/>
-                <w:color w:val="0E3A4E"/>
-                <w:sz w:val="19"/>
-                <w:szCs w:val="19"/>
-              </w:rPr>
-              <w:t xml:space="preserve">"Estoy buscando trabajo" / "¿tienen vacantes?"</w:t>
-            </w:r>
-          </w:p>
-        </w:tc>
-        <w:tc>
-          <w:tcPr>
-            <w:tcW w:type="dxa" w:w="5160"/>
-            <w:shd w:fill="FFFFFF" w:color="auto" w:val="clear"/>
-            <w:tcMar>
-              <w:top w:type="dxa" w:w="70"/>
-              <w:left w:type="dxa" w:w="100"/>
-              <w:bottom w:type="dxa" w:w="70"/>
-              <w:right w:type="dxa" w:w="100"/>
-            </w:tcMar>
-          </w:tcPr>
-          <w:p>
-            <w:pPr>
-              <w:jc w:val="left"/>
-            </w:pPr>
-            <w:r>
-              <w:rPr>
-                <w:rFonts w:ascii="Arial" w:cs="Arial" w:eastAsia="Arial" w:hAnsi="Arial"/>
-                <w:b w:val="false"/>
-                <w:bCs w:val="false"/>
-                <w:color w:val="0E3A4E"/>
-                <w:sz w:val="19"/>
-                <w:szCs w:val="19"/>
-              </w:rPr>
-              <w:t xml:space="preserve">El correo o link de Recursos Humanos</w:t>
-            </w:r>
-          </w:p>
-        </w:tc>
-      </w:tr>
-      <w:tr>
-        <w:trPr>
-          <w:tblHeader w:val="false"/>
-        </w:trPr>
-        <w:tc>
-          <w:tcPr>
-            <w:tcW w:type="dxa" w:w="4200"/>
-            <w:shd w:fill="F6F9FA" w:color="auto" w:val="clear"/>
-            <w:tcMar>
-              <w:top w:type="dxa" w:w="70"/>
-              <w:left w:type="dxa" w:w="100"/>
-              <w:bottom w:type="dxa" w:w="70"/>
-              <w:right w:type="dxa" w:w="100"/>
-            </w:tcMar>
-          </w:tcPr>
-          <w:p>
-            <w:pPr>
-              <w:jc w:val="left"/>
-            </w:pPr>
-            <w:r>
-              <w:rPr>
-                <w:rFonts w:ascii="Arial" w:cs="Arial" w:eastAsia="Arial" w:hAnsi="Arial"/>
-                <w:b w:val="false"/>
-                <w:bCs w:val="false"/>
-                <w:color w:val="0E3A4E"/>
-                <w:sz w:val="19"/>
-                <w:szCs w:val="19"/>
-              </w:rPr>
-              <w:t xml:space="preserve">"¿Cómo llego?" / "¿dónde me estaciono?"</w:t>
-            </w:r>
-          </w:p>
-        </w:tc>
-        <w:tc>
-          <w:tcPr>
-            <w:tcW w:type="dxa" w:w="5160"/>
-            <w:shd w:fill="F6F9FA" w:color="auto" w:val="clear"/>
-            <w:tcMar>
-              <w:top w:type="dxa" w:w="70"/>
-              <w:left w:type="dxa" w:w="100"/>
-              <w:bottom w:type="dxa" w:w="70"/>
-              <w:right w:type="dxa" w:w="100"/>
-            </w:tcMar>
-          </w:tcPr>
-          <w:p>
-            <w:pPr>
-              <w:jc w:val="left"/>
-            </w:pPr>
-            <w:r>
-              <w:rPr>
-                <w:rFonts w:ascii="Arial" w:cs="Arial" w:eastAsia="Arial" w:hAnsi="Arial"/>
-                <w:b w:val="false"/>
-                <w:bCs w:val="false"/>
-                <w:color w:val="0E3A4E"/>
-                <w:sz w:val="19"/>
-                <w:szCs w:val="19"/>
-              </w:rPr>
-              <w:t xml:space="preserve">Ubicación en Google Maps, accesos y estacionamiento</w:t>
-            </w:r>
-          </w:p>
-        </w:tc>
-      </w:tr>
-      <w:tr>
-        <w:trPr>
-          <w:tblHeader w:val="false"/>
-        </w:trPr>
-        <w:tc>
-          <w:tcPr>
-            <w:tcW w:type="dxa" w:w="4200"/>
-            <w:shd w:fill="FFFFFF" w:color="auto" w:val="clear"/>
-            <w:tcMar>
-              <w:top w:type="dxa" w:w="70"/>
-              <w:left w:type="dxa" w:w="100"/>
-              <w:bottom w:type="dxa" w:w="70"/>
-              <w:right w:type="dxa" w:w="100"/>
-            </w:tcMar>
-          </w:tcPr>
-          <w:p>
-            <w:pPr>
-              <w:jc w:val="left"/>
-            </w:pPr>
-            <w:r>
-              <w:rPr>
-                <w:rFonts w:ascii="Arial" w:cs="Arial" w:eastAsia="Arial" w:hAnsi="Arial"/>
-                <w:b w:val="false"/>
-                <w:bCs w:val="false"/>
-                <w:color w:val="0E3A4E"/>
-                <w:sz w:val="19"/>
-                <w:szCs w:val="19"/>
-              </w:rPr>
-              <w:t xml:space="preserve">"Quiero rentar un salón"</w:t>
-            </w:r>
-          </w:p>
-        </w:tc>
-        <w:tc>
-          <w:tcPr>
-            <w:tcW w:type="dxa" w:w="5160"/>
-            <w:shd w:fill="FFFFFF" w:color="auto" w:val="clear"/>
-            <w:tcMar>
-              <w:top w:type="dxa" w:w="70"/>
-              <w:left w:type="dxa" w:w="100"/>
-              <w:bottom w:type="dxa" w:w="70"/>
-              <w:right w:type="dxa" w:w="100"/>
-            </w:tcMar>
-          </w:tcPr>
-          <w:p>
-            <w:pPr>
-              <w:jc w:val="left"/>
-            </w:pPr>
-            <w:r>
-              <w:rPr>
-                <w:rFonts w:ascii="Arial" w:cs="Arial" w:eastAsia="Arial" w:hAnsi="Arial"/>
-                <w:b w:val="false"/>
-                <w:bCs w:val="false"/>
-                <w:color w:val="0E3A4E"/>
-                <w:sz w:val="19"/>
-                <w:szCs w:val="19"/>
-              </w:rPr>
-              <w:t xml:space="preserve">Pide nombre, fecha y número de personas, y avisa al ejecutivo comercial</w:t>
-            </w:r>
-          </w:p>
-        </w:tc>
-      </w:tr>
-    </w:tbl>
-    <w:p>
-      <w:pPr>
-        <w:pStyle w:val="Heading1"/>
-        <w:pBdr>
-          <w:bottom w:val="single" w:color="A8C243" w:sz="12" w:space="4"/>
-        </w:pBdr>
-        <w:spacing w:after="120" w:before="240"/>
-      </w:pPr>
-      <w:r>
-        <w:rPr>
-          <w:rFonts w:ascii="Arial" w:cs="Arial" w:eastAsia="Arial" w:hAnsi="Arial"/>
-          <w:b/>
-          <w:bCs/>
-          <w:color w:val="175772"/>
-          <w:sz w:val="32"/>
-          <w:szCs w:val="32"/>
-        </w:rPr>
-        <w:t xml:space="preserve">4. Links de compra</w:t>
+        <w:t xml:space="preserve">Comunicación</w:t>
       </w:r>
     </w:p>
     <w:p>
@@ -3808,7 +3997,7 @@
         </w:numPr>
         <w:spacing w:after="60"/>
       </w:pPr>
-      <w:hyperlink w:history="1" r:id="rIdyhuoxiwqqvfcgfjxr2qyp">
+      <w:hyperlink w:history="1" r:id="rIdpdtjxn2lkxuflnhl018bl">
         <w:r>
           <w:rPr>
             <w:rFonts w:ascii="Arial" w:cs="Arial" w:eastAsia="Arial" w:hAnsi="Arial"/>
@@ -3830,7 +4019,7 @@
         </w:numPr>
         <w:spacing w:after="60"/>
       </w:pPr>
-      <w:hyperlink w:history="1" r:id="rIdwugbubouyfcsplpbhuktl">
+      <w:hyperlink w:history="1" r:id="rId7-efdlnffp2lqjr8ejzsq">
         <w:r>
           <w:rPr>
             <w:rFonts w:ascii="Arial" w:cs="Arial" w:eastAsia="Arial" w:hAnsi="Arial"/>
@@ -3852,7 +4041,156 @@
         </w:numPr>
         <w:spacing w:after="60"/>
       </w:pPr>
-      <w:hyperlink w:history="1" r:id="rIdga3i3fc51hkq77v9lqba0">
+      <w:hyperlink w:history="1" r:id="rIdndgd-uapwm4f2wqv-x3hx">
+        <w:r>
+          <w:rPr>
+            <w:rFonts w:ascii="Arial" w:cs="Arial" w:eastAsia="Arial" w:hAnsi="Arial"/>
+            <w:color w:val="039AD1"/>
+            <w:sz w:val="20"/>
+            <w:szCs w:val="20"/>
+            <w:u w:val="single"/>
+          </w:rPr>
+          <w:t xml:space="preserve">Canva Pro</w:t>
+        </w:r>
+      </w:hyperlink>
+    </w:p>
+    <w:p>
+      <w:pPr>
+        <w:pStyle w:val="ListParagraph"/>
+        <w:numPr>
+          <w:ilvl w:val="0"/>
+          <w:numId w:val="2"/>
+        </w:numPr>
+        <w:spacing w:after="60"/>
+      </w:pPr>
+      <w:hyperlink w:history="1" r:id="rId77akguuvafnxukrnkiioz">
+        <w:r>
+          <w:rPr>
+            <w:rFonts w:ascii="Arial" w:cs="Arial" w:eastAsia="Arial" w:hAnsi="Arial"/>
+            <w:color w:val="039AD1"/>
+            <w:sz w:val="20"/>
+            <w:szCs w:val="20"/>
+            <w:u w:val="single"/>
+          </w:rPr>
+          <w:t xml:space="preserve">X Premium</w:t>
+        </w:r>
+      </w:hyperlink>
+    </w:p>
+    <w:p>
+      <w:pPr>
+        <w:pStyle w:val="Heading2"/>
+        <w:spacing w:after="80" w:before="200"/>
+      </w:pPr>
+      <w:r>
+        <w:rPr>
+          <w:rFonts w:ascii="Arial" w:cs="Arial" w:eastAsia="Arial" w:hAnsi="Arial"/>
+          <w:b/>
+          <w:bCs/>
+          <w:color w:val="175772"/>
+          <w:sz w:val="26"/>
+          <w:szCs w:val="26"/>
+        </w:rPr>
+        <w:t xml:space="preserve">Página web</w:t>
+      </w:r>
+    </w:p>
+    <w:p>
+      <w:pPr>
+        <w:pStyle w:val="ListParagraph"/>
+        <w:numPr>
+          <w:ilvl w:val="0"/>
+          <w:numId w:val="2"/>
+        </w:numPr>
+        <w:spacing w:after="60"/>
+      </w:pPr>
+      <w:hyperlink w:history="1" r:id="rIdhus2tm2kfryoq4ay8g609">
+        <w:r>
+          <w:rPr>
+            <w:rFonts w:ascii="Arial" w:cs="Arial" w:eastAsia="Arial" w:hAnsi="Arial"/>
+            <w:color w:val="039AD1"/>
+            <w:sz w:val="20"/>
+            <w:szCs w:val="20"/>
+            <w:u w:val="single"/>
+          </w:rPr>
+          <w:t xml:space="preserve">Servidor · DigitalOcean</w:t>
+        </w:r>
+      </w:hyperlink>
+    </w:p>
+    <w:p>
+      <w:pPr>
+        <w:pStyle w:val="ListParagraph"/>
+        <w:numPr>
+          <w:ilvl w:val="0"/>
+          <w:numId w:val="2"/>
+        </w:numPr>
+        <w:spacing w:after="60"/>
+      </w:pPr>
+      <w:hyperlink w:history="1" r:id="rIdtxsihqz0z8_7a-4hy9vwf">
+        <w:r>
+          <w:rPr>
+            <w:rFonts w:ascii="Arial" w:cs="Arial" w:eastAsia="Arial" w:hAnsi="Arial"/>
+            <w:color w:val="039AD1"/>
+            <w:sz w:val="20"/>
+            <w:szCs w:val="20"/>
+            <w:u w:val="single"/>
+          </w:rPr>
+          <w:t xml:space="preserve">Chatbot · console.anthropic.com</w:t>
+        </w:r>
+      </w:hyperlink>
+    </w:p>
+    <w:p>
+      <w:pPr>
+        <w:pStyle w:val="ListParagraph"/>
+        <w:numPr>
+          <w:ilvl w:val="0"/>
+          <w:numId w:val="2"/>
+        </w:numPr>
+        <w:spacing w:after="60"/>
+      </w:pPr>
+      <w:hyperlink w:history="1" r:id="rIdaypv9tomjogqfim1sqccg">
+        <w:r>
+          <w:rPr>
+            <w:rFonts w:ascii="Arial" w:cs="Arial" w:eastAsia="Arial" w:hAnsi="Arial"/>
+            <w:color w:val="039AD1"/>
+            <w:sz w:val="20"/>
+            <w:szCs w:val="20"/>
+            <w:u w:val="single"/>
+          </w:rPr>
+          <w:t xml:space="preserve">Bitwarden Teams</w:t>
+        </w:r>
+      </w:hyperlink>
+    </w:p>
+    <w:p>
+      <w:pPr>
+        <w:pStyle w:val="ListParagraph"/>
+        <w:numPr>
+          <w:ilvl w:val="0"/>
+          <w:numId w:val="2"/>
+        </w:numPr>
+        <w:spacing w:after="60"/>
+      </w:pPr>
+      <w:hyperlink w:history="1" r:id="rIdx6zykartkwlc10rvom5jg">
+        <w:r>
+          <w:rPr>
+            <w:rFonts w:ascii="Arial" w:cs="Arial" w:eastAsia="Arial" w:hAnsi="Arial"/>
+            <w:color w:val="039AD1"/>
+            <w:sz w:val="20"/>
+            <w:szCs w:val="20"/>
+            <w:u w:val="single"/>
+          </w:rPr>
+          <w:t xml:space="preserve">Llaves Yubico</w:t>
+        </w:r>
+      </w:hyperlink>
+    </w:p>
+    <w:p>
+      <w:pPr>
+        <w:pStyle w:val="ListParagraph"/>
+        <w:numPr>
+          <w:ilvl w:val="0"/>
+          <w:numId w:val="2"/>
+        </w:numPr>
+        <w:spacing w:after="60"/>
+      </w:pPr>
+      <w:hyperlink w:history="1" r:id="rId4p9dkdaqtlx7br_8gvkk4">
         <w:r>
           <w:rPr>
             <w:rFonts w:ascii="Arial" w:cs="Arial" w:eastAsia="Arial" w:hAnsi="Arial"/>
@@ -3874,7 +4212,7 @@
         </w:numPr>
         <w:spacing w:after="60"/>
       </w:pPr>
-      <w:hyperlink w:history="1" r:id="rIdplbzwjpgirfqzd7zt6lio">
+      <w:hyperlink w:history="1" r:id="rIdnmkc0hag1sucg9m-32spx">
         <w:r>
           <w:rPr>
             <w:rFonts w:ascii="Arial" w:cs="Arial" w:eastAsia="Arial" w:hAnsi="Arial"/>
@@ -3884,116 +4222,6 @@
             <w:u w:val="single"/>
           </w:rPr>
           <w:t xml:space="preserve">Canva Pro</w:t>
-        </w:r>
-      </w:hyperlink>
-    </w:p>
-    <w:p>
-      <w:pPr>
-        <w:pStyle w:val="ListParagraph"/>
-        <w:numPr>
-          <w:ilvl w:val="0"/>
-          <w:numId w:val="2"/>
-        </w:numPr>
-        <w:spacing w:after="60"/>
-      </w:pPr>
-      <w:hyperlink w:history="1" r:id="rIdo17uvj3ncwkmzzoryu1pn">
-        <w:r>
-          <w:rPr>
-            <w:rFonts w:ascii="Arial" w:cs="Arial" w:eastAsia="Arial" w:hAnsi="Arial"/>
-            <w:color w:val="039AD1"/>
-            <w:sz w:val="20"/>
-            <w:szCs w:val="20"/>
-            <w:u w:val="single"/>
-          </w:rPr>
-          <w:t xml:space="preserve">X Premium</w:t>
-        </w:r>
-      </w:hyperlink>
-    </w:p>
-    <w:p>
-      <w:pPr>
-        <w:pStyle w:val="ListParagraph"/>
-        <w:numPr>
-          <w:ilvl w:val="0"/>
-          <w:numId w:val="2"/>
-        </w:numPr>
-        <w:spacing w:after="60"/>
-      </w:pPr>
-      <w:hyperlink w:history="1" r:id="rId42hsnfimftx_mtxp7c4nt">
-        <w:r>
-          <w:rPr>
-            <w:rFonts w:ascii="Arial" w:cs="Arial" w:eastAsia="Arial" w:hAnsi="Arial"/>
-            <w:color w:val="039AD1"/>
-            <w:sz w:val="20"/>
-            <w:szCs w:val="20"/>
-            <w:u w:val="single"/>
-          </w:rPr>
-          <w:t xml:space="preserve">Servidor · DigitalOcean</w:t>
-        </w:r>
-      </w:hyperlink>
-    </w:p>
-    <w:p>
-      <w:pPr>
-        <w:pStyle w:val="ListParagraph"/>
-        <w:numPr>
-          <w:ilvl w:val="0"/>
-          <w:numId w:val="2"/>
-        </w:numPr>
-        <w:spacing w:after="60"/>
-      </w:pPr>
-      <w:hyperlink w:history="1" r:id="rIdo8tne0wfzour5mkmdugks">
-        <w:r>
-          <w:rPr>
-            <w:rFonts w:ascii="Arial" w:cs="Arial" w:eastAsia="Arial" w:hAnsi="Arial"/>
-            <w:color w:val="039AD1"/>
-            <w:sz w:val="20"/>
-            <w:szCs w:val="20"/>
-            <w:u w:val="single"/>
-          </w:rPr>
-          <w:t xml:space="preserve">Chatbot · console.anthropic.com</w:t>
-        </w:r>
-      </w:hyperlink>
-    </w:p>
-    <w:p>
-      <w:pPr>
-        <w:pStyle w:val="ListParagraph"/>
-        <w:numPr>
-          <w:ilvl w:val="0"/>
-          <w:numId w:val="2"/>
-        </w:numPr>
-        <w:spacing w:after="60"/>
-      </w:pPr>
-      <w:hyperlink w:history="1" r:id="rIdmeuyuxvzkym3biov6n3qt">
-        <w:r>
-          <w:rPr>
-            <w:rFonts w:ascii="Arial" w:cs="Arial" w:eastAsia="Arial" w:hAnsi="Arial"/>
-            <w:color w:val="039AD1"/>
-            <w:sz w:val="20"/>
-            <w:szCs w:val="20"/>
-            <w:u w:val="single"/>
-          </w:rPr>
-          <w:t xml:space="preserve">Bitwarden Teams</w:t>
-        </w:r>
-      </w:hyperlink>
-    </w:p>
-    <w:p>
-      <w:pPr>
-        <w:pStyle w:val="ListParagraph"/>
-        <w:numPr>
-          <w:ilvl w:val="0"/>
-          <w:numId w:val="2"/>
-        </w:numPr>
-        <w:spacing w:after="60"/>
-      </w:pPr>
-      <w:hyperlink w:history="1" r:id="rIdn57g2pxxr_rdqvpe0snns">
-        <w:r>
-          <w:rPr>
-            <w:rFonts w:ascii="Arial" w:cs="Arial" w:eastAsia="Arial" w:hAnsi="Arial"/>
-            <w:color w:val="039AD1"/>
-            <w:sz w:val="20"/>
-            <w:szCs w:val="20"/>
-            <w:u w:val="single"/>
-          </w:rPr>
-          <w:t xml:space="preserve">Llaves Yubico</w:t>
         </w:r>
       </w:hyperlink>
     </w:p>

</xml_diff>

<commit_message>
Quitar llaves Yubico del presupuesto
Co-Authored-By: Claude Opus 5.5 <noreply@anthropic.com>
Claude-Session: https://claude.ai/code/session_01GFkSYVqa8d2zDX8Qy6Lwpz
</commit_message>
<xml_diff>
--- a/Presupuesto_2027_Comunicacion_RRPP_Poliforum_Leon.docx
+++ b/Presupuesto_2027_Comunicacion_RRPP_Poliforum_Leon.docx
@@ -154,9 +154,8 @@
         </w:tblBorders>
       </w:tblPr>
       <w:tblGrid>
-        <w:gridCol w:w="4680"/>
-        <w:gridCol w:w="2340"/>
-        <w:gridCol w:w="2340"/>
+        <w:gridCol w:w="6560"/>
+        <w:gridCol w:w="2800"/>
       </w:tblGrid>
       <w:tr>
         <w:trPr>
@@ -164,7 +163,7 @@
         </w:trPr>
         <w:tc>
           <w:tcPr>
-            <w:tcW w:type="dxa" w:w="4680"/>
+            <w:tcW w:type="dxa" w:w="6560"/>
             <w:shd w:fill="DCE6EB" w:color="auto" w:val="clear"/>
             <w:tcMar>
               <w:top w:type="dxa" w:w="70"/>
@@ -192,7 +191,7 @@
         </w:tc>
         <w:tc>
           <w:tcPr>
-            <w:tcW w:type="dxa" w:w="2340"/>
+            <w:tcW w:type="dxa" w:w="2800"/>
             <w:shd w:fill="DCE6EB" w:color="auto" w:val="clear"/>
             <w:tcMar>
               <w:top w:type="dxa" w:w="70"/>
@@ -214,35 +213,7 @@
                 <w:sz w:val="19"/>
                 <w:szCs w:val="19"/>
               </w:rPr>
-              <w:t xml:space="preserve">Año 1 · 2027</w:t>
-            </w:r>
-          </w:p>
-        </w:tc>
-        <w:tc>
-          <w:tcPr>
-            <w:tcW w:type="dxa" w:w="2340"/>
-            <w:shd w:fill="DCE6EB" w:color="auto" w:val="clear"/>
-            <w:tcMar>
-              <w:top w:type="dxa" w:w="70"/>
-              <w:left w:type="dxa" w:w="100"/>
-              <w:bottom w:type="dxa" w:w="70"/>
-              <w:right w:type="dxa" w:w="100"/>
-            </w:tcMar>
-          </w:tcPr>
-          <w:p>
-            <w:pPr>
-              <w:jc w:val="right"/>
-            </w:pPr>
-            <w:r>
-              <w:rPr>
-                <w:rFonts w:ascii="Arial" w:cs="Arial" w:eastAsia="Arial" w:hAnsi="Arial"/>
-                <w:b/>
-                <w:bCs/>
-                <w:color w:val="0E3A4E"/>
-                <w:sz w:val="19"/>
-                <w:szCs w:val="19"/>
-              </w:rPr>
-              <w:t xml:space="preserve">Año 2 en adelante</w:t>
+              <w:t xml:space="preserve">Al año</w:t>
             </w:r>
           </w:p>
         </w:tc>
@@ -253,7 +224,7 @@
         </w:trPr>
         <w:tc>
           <w:tcPr>
-            <w:tcW w:type="dxa" w:w="4680"/>
+            <w:tcW w:type="dxa" w:w="6560"/>
             <w:shd w:fill="F6F9FA" w:color="auto" w:val="clear"/>
             <w:tcMar>
               <w:top w:type="dxa" w:w="70"/>
@@ -281,35 +252,7 @@
         </w:tc>
         <w:tc>
           <w:tcPr>
-            <w:tcW w:type="dxa" w:w="2340"/>
-            <w:shd w:fill="F6F9FA" w:color="auto" w:val="clear"/>
-            <w:tcMar>
-              <w:top w:type="dxa" w:w="70"/>
-              <w:left w:type="dxa" w:w="100"/>
-              <w:bottom w:type="dxa" w:w="70"/>
-              <w:right w:type="dxa" w:w="100"/>
-            </w:tcMar>
-          </w:tcPr>
-          <w:p>
-            <w:pPr>
-              <w:jc w:val="right"/>
-            </w:pPr>
-            <w:r>
-              <w:rPr>
-                <w:rFonts w:ascii="Arial" w:cs="Arial" w:eastAsia="Arial" w:hAnsi="Arial"/>
-                <w:b w:val="false"/>
-                <w:bCs w:val="false"/>
-                <w:color w:val="0E3A4E"/>
-                <w:sz w:val="19"/>
-                <w:szCs w:val="19"/>
-              </w:rPr>
-              <w:t xml:space="preserve">$15,188</w:t>
-            </w:r>
-          </w:p>
-        </w:tc>
-        <w:tc>
-          <w:tcPr>
-            <w:tcW w:type="dxa" w:w="2340"/>
+            <w:tcW w:type="dxa" w:w="2800"/>
             <w:shd w:fill="F6F9FA" w:color="auto" w:val="clear"/>
             <w:tcMar>
               <w:top w:type="dxa" w:w="70"/>
@@ -342,7 +285,7 @@
         </w:trPr>
         <w:tc>
           <w:tcPr>
-            <w:tcW w:type="dxa" w:w="4680"/>
+            <w:tcW w:type="dxa" w:w="6560"/>
             <w:shd w:fill="FFFFFF" w:color="auto" w:val="clear"/>
             <w:tcMar>
               <w:top w:type="dxa" w:w="70"/>
@@ -370,35 +313,7 @@
         </w:tc>
         <w:tc>
           <w:tcPr>
-            <w:tcW w:type="dxa" w:w="2340"/>
-            <w:shd w:fill="FFFFFF" w:color="auto" w:val="clear"/>
-            <w:tcMar>
-              <w:top w:type="dxa" w:w="70"/>
-              <w:left w:type="dxa" w:w="100"/>
-              <w:bottom w:type="dxa" w:w="70"/>
-              <w:right w:type="dxa" w:w="100"/>
-            </w:tcMar>
-          </w:tcPr>
-          <w:p>
-            <w:pPr>
-              <w:jc w:val="right"/>
-            </w:pPr>
-            <w:r>
-              <w:rPr>
-                <w:rFonts w:ascii="Arial" w:cs="Arial" w:eastAsia="Arial" w:hAnsi="Arial"/>
-                <w:b w:val="false"/>
-                <w:bCs w:val="false"/>
-                <w:color w:val="0E3A4E"/>
-                <w:sz w:val="19"/>
-                <w:szCs w:val="19"/>
-              </w:rPr>
-              <w:t xml:space="preserve">$16,472</w:t>
-            </w:r>
-          </w:p>
-        </w:tc>
-        <w:tc>
-          <w:tcPr>
-            <w:tcW w:type="dxa" w:w="2340"/>
+            <w:tcW w:type="dxa" w:w="2800"/>
             <w:shd w:fill="FFFFFF" w:color="auto" w:val="clear"/>
             <w:tcMar>
               <w:top w:type="dxa" w:w="70"/>
@@ -431,7 +346,7 @@
         </w:trPr>
         <w:tc>
           <w:tcPr>
-            <w:tcW w:type="dxa" w:w="4680"/>
+            <w:tcW w:type="dxa" w:w="6560"/>
             <w:shd w:fill="175772" w:color="auto" w:val="clear"/>
             <w:tcMar>
               <w:top w:type="dxa" w:w="70"/>
@@ -453,13 +368,13 @@
                 <w:sz w:val="19"/>
                 <w:szCs w:val="19"/>
               </w:rPr>
-              <w:t xml:space="preserve">Total</w:t>
-            </w:r>
-          </w:p>
-        </w:tc>
-        <w:tc>
-          <w:tcPr>
-            <w:tcW w:type="dxa" w:w="2340"/>
+              <w:t xml:space="preserve">Total 2027</w:t>
+            </w:r>
+          </w:p>
+        </w:tc>
+        <w:tc>
+          <w:tcPr>
+            <w:tcW w:type="dxa" w:w="2800"/>
             <w:shd w:fill="175772" w:color="auto" w:val="clear"/>
             <w:tcMar>
               <w:top w:type="dxa" w:w="70"/>
@@ -478,34 +393,6 @@
                 <w:b/>
                 <w:bCs/>
                 <w:color w:val="FFFFFF"/>
-                <w:sz w:val="19"/>
-                <w:szCs w:val="19"/>
-              </w:rPr>
-              <w:t xml:space="preserve">$31,660</w:t>
-            </w:r>
-          </w:p>
-        </w:tc>
-        <w:tc>
-          <w:tcPr>
-            <w:tcW w:type="dxa" w:w="2340"/>
-            <w:shd w:fill="175772" w:color="auto" w:val="clear"/>
-            <w:tcMar>
-              <w:top w:type="dxa" w:w="70"/>
-              <w:left w:type="dxa" w:w="100"/>
-              <w:bottom w:type="dxa" w:w="70"/>
-              <w:right w:type="dxa" w:w="100"/>
-            </w:tcMar>
-          </w:tcPr>
-          <w:p>
-            <w:pPr>
-              <w:jc w:val="right"/>
-            </w:pPr>
-            <w:r>
-              <w:rPr>
-                <w:rFonts w:ascii="Arial" w:cs="Arial" w:eastAsia="Arial" w:hAnsi="Arial"/>
-                <w:b/>
-                <w:bCs/>
-                <w:color w:val="A8C243"/>
                 <w:sz w:val="19"/>
                 <w:szCs w:val="19"/>
               </w:rPr>
@@ -528,7 +415,7 @@
           <w:sz w:val="19"/>
           <w:szCs w:val="19"/>
         </w:rPr>
-        <w:t xml:space="preserve">MXN con IVA. El año 2 baja porque las llaves de seguridad de la web se compran una sola vez.</w:t>
+        <w:t xml:space="preserve">MXN con IVA. Todo se paga de forma anual.</w:t>
       </w:r>
     </w:p>
     <w:p>
@@ -843,7 +730,7 @@
             </w:tcMar>
           </w:tcPr>
           <w:p>
-            <w:hyperlink w:history="1" r:id="rIdw20yposedtx14vpv3whf4">
+            <w:hyperlink w:history="1" r:id="rIdhqhsshmojvmh6ol6ghrev">
               <w:r>
                 <w:rPr>
                   <w:rFonts w:ascii="Arial" w:cs="Arial" w:eastAsia="Arial" w:hAnsi="Arial"/>
@@ -986,7 +873,7 @@
             </w:tcMar>
           </w:tcPr>
           <w:p>
-            <w:hyperlink w:history="1" r:id="rIdvlhxkxk0nrures4tycicc">
+            <w:hyperlink w:history="1" r:id="rIdgfpc_sfson7syl_slzopu">
               <w:r>
                 <w:rPr>
                   <w:rFonts w:ascii="Arial" w:cs="Arial" w:eastAsia="Arial" w:hAnsi="Arial"/>
@@ -1129,7 +1016,7 @@
             </w:tcMar>
           </w:tcPr>
           <w:p>
-            <w:hyperlink w:history="1" r:id="rIdprefrrv3mvy7trgkrzazl">
+            <w:hyperlink w:history="1" r:id="rIdjs6_lhepk1zfn7expwsni">
               <w:r>
                 <w:rPr>
                   <w:rFonts w:ascii="Arial" w:cs="Arial" w:eastAsia="Arial" w:hAnsi="Arial"/>
@@ -1272,7 +1159,7 @@
             </w:tcMar>
           </w:tcPr>
           <w:p>
-            <w:hyperlink w:history="1" r:id="rIdajqxet02xcbhz9tmlinml">
+            <w:hyperlink w:history="1" r:id="rId4rv_s_4va3wbe-jfltcph">
               <w:r>
                 <w:rPr>
                   <w:rFonts w:ascii="Arial" w:cs="Arial" w:eastAsia="Arial" w:hAnsi="Arial"/>
@@ -2126,9 +2013,8 @@
       </w:tblPr>
       <w:tblGrid>
         <w:gridCol w:w="3000"/>
-        <w:gridCol w:w="3360"/>
-        <w:gridCol w:w="1500"/>
-        <w:gridCol w:w="1500"/>
+        <w:gridCol w:w="4360"/>
+        <w:gridCol w:w="2000"/>
       </w:tblGrid>
       <w:tr>
         <w:trPr>
@@ -2164,7 +2050,7 @@
         </w:tc>
         <w:tc>
           <w:tcPr>
-            <w:tcW w:type="dxa" w:w="3360"/>
+            <w:tcW w:type="dxa" w:w="4360"/>
             <w:shd w:fill="DCE6EB" w:color="auto" w:val="clear"/>
             <w:tcMar>
               <w:top w:type="dxa" w:w="70"/>
@@ -2192,7 +2078,7 @@
         </w:tc>
         <w:tc>
           <w:tcPr>
-            <w:tcW w:type="dxa" w:w="1500"/>
+            <w:tcW w:type="dxa" w:w="2000"/>
             <w:shd w:fill="DCE6EB" w:color="auto" w:val="clear"/>
             <w:tcMar>
               <w:top w:type="dxa" w:w="70"/>
@@ -2214,35 +2100,7 @@
                 <w:sz w:val="19"/>
                 <w:szCs w:val="19"/>
               </w:rPr>
-              <w:t xml:space="preserve">Año 1</w:t>
-            </w:r>
-          </w:p>
-        </w:tc>
-        <w:tc>
-          <w:tcPr>
-            <w:tcW w:type="dxa" w:w="1500"/>
-            <w:shd w:fill="DCE6EB" w:color="auto" w:val="clear"/>
-            <w:tcMar>
-              <w:top w:type="dxa" w:w="70"/>
-              <w:left w:type="dxa" w:w="100"/>
-              <w:bottom w:type="dxa" w:w="70"/>
-              <w:right w:type="dxa" w:w="100"/>
-            </w:tcMar>
-          </w:tcPr>
-          <w:p>
-            <w:pPr>
-              <w:jc w:val="right"/>
-            </w:pPr>
-            <w:r>
-              <w:rPr>
-                <w:rFonts w:ascii="Arial" w:cs="Arial" w:eastAsia="Arial" w:hAnsi="Arial"/>
-                <w:b/>
-                <w:bCs/>
-                <w:color w:val="0E3A4E"/>
-                <w:sz w:val="19"/>
-                <w:szCs w:val="19"/>
-              </w:rPr>
-              <w:t xml:space="preserve">Año 2 en adelante</w:t>
+              <w:t xml:space="preserve">Al año</w:t>
             </w:r>
           </w:p>
         </w:tc>
@@ -2281,7 +2139,7 @@
         </w:tc>
         <w:tc>
           <w:tcPr>
-            <w:tcW w:type="dxa" w:w="3360"/>
+            <w:tcW w:type="dxa" w:w="4360"/>
             <w:shd w:fill="F6F9FA" w:color="auto" w:val="clear"/>
             <w:tcMar>
               <w:top w:type="dxa" w:w="70"/>
@@ -2309,35 +2167,7 @@
         </w:tc>
         <w:tc>
           <w:tcPr>
-            <w:tcW w:type="dxa" w:w="1500"/>
-            <w:shd w:fill="F6F9FA" w:color="auto" w:val="clear"/>
-            <w:tcMar>
-              <w:top w:type="dxa" w:w="70"/>
-              <w:left w:type="dxa" w:w="100"/>
-              <w:bottom w:type="dxa" w:w="70"/>
-              <w:right w:type="dxa" w:w="100"/>
-            </w:tcMar>
-          </w:tcPr>
-          <w:p>
-            <w:pPr>
-              <w:jc w:val="right"/>
-            </w:pPr>
-            <w:r>
-              <w:rPr>
-                <w:rFonts w:ascii="Arial" w:cs="Arial" w:eastAsia="Arial" w:hAnsi="Arial"/>
-                <w:b w:val="false"/>
-                <w:bCs w:val="false"/>
-                <w:color w:val="0E3A4E"/>
-                <w:sz w:val="19"/>
-                <w:szCs w:val="19"/>
-              </w:rPr>
-              <w:t xml:space="preserve">$3,952</w:t>
-            </w:r>
-          </w:p>
-        </w:tc>
-        <w:tc>
-          <w:tcPr>
-            <w:tcW w:type="dxa" w:w="1500"/>
+            <w:tcW w:type="dxa" w:w="2000"/>
             <w:shd w:fill="F6F9FA" w:color="auto" w:val="clear"/>
             <w:tcMar>
               <w:top w:type="dxa" w:w="70"/>
@@ -2398,7 +2228,7 @@
         </w:tc>
         <w:tc>
           <w:tcPr>
-            <w:tcW w:type="dxa" w:w="3360"/>
+            <w:tcW w:type="dxa" w:w="4360"/>
             <w:shd w:fill="FFFFFF" w:color="auto" w:val="clear"/>
             <w:tcMar>
               <w:top w:type="dxa" w:w="70"/>
@@ -2426,35 +2256,7 @@
         </w:tc>
         <w:tc>
           <w:tcPr>
-            <w:tcW w:type="dxa" w:w="1500"/>
-            <w:shd w:fill="FFFFFF" w:color="auto" w:val="clear"/>
-            <w:tcMar>
-              <w:top w:type="dxa" w:w="70"/>
-              <w:left w:type="dxa" w:w="100"/>
-              <w:bottom w:type="dxa" w:w="70"/>
-              <w:right w:type="dxa" w:w="100"/>
-            </w:tcMar>
-          </w:tcPr>
-          <w:p>
-            <w:pPr>
-              <w:jc w:val="right"/>
-            </w:pPr>
-            <w:r>
-              <w:rPr>
-                <w:rFonts w:ascii="Arial" w:cs="Arial" w:eastAsia="Arial" w:hAnsi="Arial"/>
-                <w:b w:val="false"/>
-                <w:bCs w:val="false"/>
-                <w:color w:val="0E3A4E"/>
-                <w:sz w:val="19"/>
-                <w:szCs w:val="19"/>
-              </w:rPr>
-              <w:t xml:space="preserve">$1,747</w:t>
-            </w:r>
-          </w:p>
-        </w:tc>
-        <w:tc>
-          <w:tcPr>
-            <w:tcW w:type="dxa" w:w="1500"/>
+            <w:tcW w:type="dxa" w:w="2000"/>
             <w:shd w:fill="FFFFFF" w:color="auto" w:val="clear"/>
             <w:tcMar>
               <w:top w:type="dxa" w:w="70"/>
@@ -2515,7 +2317,7 @@
         </w:tc>
         <w:tc>
           <w:tcPr>
-            <w:tcW w:type="dxa" w:w="3360"/>
+            <w:tcW w:type="dxa" w:w="4360"/>
             <w:shd w:fill="F6F9FA" w:color="auto" w:val="clear"/>
             <w:tcMar>
               <w:top w:type="dxa" w:w="70"/>
@@ -2543,35 +2345,7 @@
         </w:tc>
         <w:tc>
           <w:tcPr>
-            <w:tcW w:type="dxa" w:w="1500"/>
-            <w:shd w:fill="F6F9FA" w:color="auto" w:val="clear"/>
-            <w:tcMar>
-              <w:top w:type="dxa" w:w="70"/>
-              <w:left w:type="dxa" w:w="100"/>
-              <w:bottom w:type="dxa" w:w="70"/>
-              <w:right w:type="dxa" w:w="100"/>
-            </w:tcMar>
-          </w:tcPr>
-          <w:p>
-            <w:pPr>
-              <w:jc w:val="right"/>
-            </w:pPr>
-            <w:r>
-              <w:rPr>
-                <w:rFonts w:ascii="Arial" w:cs="Arial" w:eastAsia="Arial" w:hAnsi="Arial"/>
-                <w:b w:val="false"/>
-                <w:bCs w:val="false"/>
-                <w:color w:val="0E3A4E"/>
-                <w:sz w:val="19"/>
-                <w:szCs w:val="19"/>
-              </w:rPr>
-              <w:t xml:space="preserve">$3,040</w:t>
-            </w:r>
-          </w:p>
-        </w:tc>
-        <w:tc>
-          <w:tcPr>
-            <w:tcW w:type="dxa" w:w="1500"/>
+            <w:tcW w:type="dxa" w:w="2000"/>
             <w:shd w:fill="F6F9FA" w:color="auto" w:val="clear"/>
             <w:tcMar>
               <w:top w:type="dxa" w:w="70"/>
@@ -2632,7 +2406,7 @@
         </w:tc>
         <w:tc>
           <w:tcPr>
-            <w:tcW w:type="dxa" w:w="3360"/>
+            <w:tcW w:type="dxa" w:w="4360"/>
             <w:shd w:fill="FFFFFF" w:color="auto" w:val="clear"/>
             <w:tcMar>
               <w:top w:type="dxa" w:w="70"/>
@@ -2660,35 +2434,7 @@
         </w:tc>
         <w:tc>
           <w:tcPr>
-            <w:tcW w:type="dxa" w:w="1500"/>
-            <w:shd w:fill="FFFFFF" w:color="auto" w:val="clear"/>
-            <w:tcMar>
-              <w:top w:type="dxa" w:w="70"/>
-              <w:left w:type="dxa" w:w="100"/>
-              <w:bottom w:type="dxa" w:w="70"/>
-              <w:right w:type="dxa" w:w="100"/>
-            </w:tcMar>
-          </w:tcPr>
-          <w:p>
-            <w:pPr>
-              <w:jc w:val="right"/>
-            </w:pPr>
-            <w:r>
-              <w:rPr>
-                <w:rFonts w:ascii="Arial" w:cs="Arial" w:eastAsia="Arial" w:hAnsi="Arial"/>
-                <w:b w:val="false"/>
-                <w:bCs w:val="false"/>
-                <w:color w:val="0E3A4E"/>
-                <w:sz w:val="19"/>
-                <w:szCs w:val="19"/>
-              </w:rPr>
-              <w:t xml:space="preserve">$638</w:t>
-            </w:r>
-          </w:p>
-        </w:tc>
-        <w:tc>
-          <w:tcPr>
-            <w:tcW w:type="dxa" w:w="1500"/>
+            <w:tcW w:type="dxa" w:w="2000"/>
             <w:shd w:fill="FFFFFF" w:color="auto" w:val="clear"/>
             <w:tcMar>
               <w:top w:type="dxa" w:w="70"/>
@@ -2749,7 +2495,7 @@
         </w:tc>
         <w:tc>
           <w:tcPr>
-            <w:tcW w:type="dxa" w:w="3360"/>
+            <w:tcW w:type="dxa" w:w="4360"/>
             <w:shd w:fill="F6F9FA" w:color="auto" w:val="clear"/>
             <w:tcMar>
               <w:top w:type="dxa" w:w="70"/>
@@ -2777,35 +2523,7 @@
         </w:tc>
         <w:tc>
           <w:tcPr>
-            <w:tcW w:type="dxa" w:w="1500"/>
-            <w:shd w:fill="F6F9FA" w:color="auto" w:val="clear"/>
-            <w:tcMar>
-              <w:top w:type="dxa" w:w="70"/>
-              <w:left w:type="dxa" w:w="100"/>
-              <w:bottom w:type="dxa" w:w="70"/>
-              <w:right w:type="dxa" w:w="100"/>
-            </w:tcMar>
-          </w:tcPr>
-          <w:p>
-            <w:pPr>
-              <w:jc w:val="right"/>
-            </w:pPr>
-            <w:r>
-              <w:rPr>
-                <w:rFonts w:ascii="Arial" w:cs="Arial" w:eastAsia="Arial" w:hAnsi="Arial"/>
-                <w:b w:val="false"/>
-                <w:bCs w:val="false"/>
-                <w:color w:val="0E3A4E"/>
-                <w:sz w:val="19"/>
-                <w:szCs w:val="19"/>
-              </w:rPr>
-              <w:t xml:space="preserve">$0</w:t>
-            </w:r>
-          </w:p>
-        </w:tc>
-        <w:tc>
-          <w:tcPr>
-            <w:tcW w:type="dxa" w:w="1500"/>
+            <w:tcW w:type="dxa" w:w="2000"/>
             <w:shd w:fill="F6F9FA" w:color="auto" w:val="clear"/>
             <w:tcMar>
               <w:top w:type="dxa" w:w="70"/>
@@ -2860,13 +2578,13 @@
                 <w:sz w:val="19"/>
                 <w:szCs w:val="19"/>
               </w:rPr>
-              <w:t xml:space="preserve">4 llaves físicas Yubico</w:t>
-            </w:r>
-          </w:p>
-        </w:tc>
-        <w:tc>
-          <w:tcPr>
-            <w:tcW w:type="dxa" w:w="3360"/>
+              <w:t xml:space="preserve">Claude Pro · 1 cuenta</w:t>
+            </w:r>
+          </w:p>
+        </w:tc>
+        <w:tc>
+          <w:tcPr>
+            <w:tcW w:type="dxa" w:w="4360"/>
             <w:shd w:fill="FFFFFF" w:color="auto" w:val="clear"/>
             <w:tcMar>
               <w:top w:type="dxa" w:w="70"/>
@@ -2888,13 +2606,13 @@
                 <w:sz w:val="19"/>
                 <w:szCs w:val="19"/>
               </w:rPr>
-              <w:t xml:space="preserve">Protegen las cuentas aunque roben una contraseña; se compran una vez</w:t>
-            </w:r>
-          </w:p>
-        </w:tc>
-        <w:tc>
-          <w:tcPr>
-            <w:tcW w:type="dxa" w:w="1500"/>
+              <w:t xml:space="preserve">Mantenimiento de la página web</w:t>
+            </w:r>
+          </w:p>
+        </w:tc>
+        <w:tc>
+          <w:tcPr>
+            <w:tcW w:type="dxa" w:w="2000"/>
             <w:shd w:fill="FFFFFF" w:color="auto" w:val="clear"/>
             <w:tcMar>
               <w:top w:type="dxa" w:w="70"/>
@@ -2916,35 +2634,7 @@
                 <w:sz w:val="19"/>
                 <w:szCs w:val="19"/>
               </w:rPr>
-              <w:t xml:space="preserve">$2,436</w:t>
-            </w:r>
-          </w:p>
-        </w:tc>
-        <w:tc>
-          <w:tcPr>
-            <w:tcW w:type="dxa" w:w="1500"/>
-            <w:shd w:fill="FFFFFF" w:color="auto" w:val="clear"/>
-            <w:tcMar>
-              <w:top w:type="dxa" w:w="70"/>
-              <w:left w:type="dxa" w:w="100"/>
-              <w:bottom w:type="dxa" w:w="70"/>
-              <w:right w:type="dxa" w:w="100"/>
-            </w:tcMar>
-          </w:tcPr>
-          <w:p>
-            <w:pPr>
-              <w:jc w:val="right"/>
-            </w:pPr>
-            <w:r>
-              <w:rPr>
-                <w:rFonts w:ascii="Arial" w:cs="Arial" w:eastAsia="Arial" w:hAnsi="Arial"/>
-                <w:b w:val="false"/>
-                <w:bCs w:val="false"/>
-                <w:color w:val="0E3A4E"/>
-                <w:sz w:val="19"/>
-                <w:szCs w:val="19"/>
-              </w:rPr>
-              <w:t xml:space="preserve">—</w:t>
+              <w:t xml:space="preserve">$3,449</w:t>
             </w:r>
           </w:p>
         </w:tc>
@@ -2977,13 +2667,13 @@
                 <w:sz w:val="19"/>
                 <w:szCs w:val="19"/>
               </w:rPr>
-              <w:t xml:space="preserve">Claude Pro · 1 cuenta</w:t>
-            </w:r>
-          </w:p>
-        </w:tc>
-        <w:tc>
-          <w:tcPr>
-            <w:tcW w:type="dxa" w:w="3360"/>
+              <w:t xml:space="preserve">Canva Pro · 1 cuenta</w:t>
+            </w:r>
+          </w:p>
+        </w:tc>
+        <w:tc>
+          <w:tcPr>
+            <w:tcW w:type="dxa" w:w="4360"/>
             <w:shd w:fill="F6F9FA" w:color="auto" w:val="clear"/>
             <w:tcMar>
               <w:top w:type="dxa" w:w="70"/>
@@ -3005,13 +2695,13 @@
                 <w:sz w:val="19"/>
                 <w:szCs w:val="19"/>
               </w:rPr>
-              <w:t xml:space="preserve">Mantenimiento de la página web</w:t>
-            </w:r>
-          </w:p>
-        </w:tc>
-        <w:tc>
-          <w:tcPr>
-            <w:tcW w:type="dxa" w:w="1500"/>
+              <w:t xml:space="preserve">Banners y gráficos de cada evento para la web</w:t>
+            </w:r>
+          </w:p>
+        </w:tc>
+        <w:tc>
+          <w:tcPr>
+            <w:tcW w:type="dxa" w:w="2000"/>
             <w:shd w:fill="F6F9FA" w:color="auto" w:val="clear"/>
             <w:tcMar>
               <w:top w:type="dxa" w:w="70"/>
@@ -3033,35 +2723,7 @@
                 <w:sz w:val="19"/>
                 <w:szCs w:val="19"/>
               </w:rPr>
-              <w:t xml:space="preserve">$3,449</w:t>
-            </w:r>
-          </w:p>
-        </w:tc>
-        <w:tc>
-          <w:tcPr>
-            <w:tcW w:type="dxa" w:w="1500"/>
-            <w:shd w:fill="F6F9FA" w:color="auto" w:val="clear"/>
-            <w:tcMar>
-              <w:top w:type="dxa" w:w="70"/>
-              <w:left w:type="dxa" w:w="100"/>
-              <w:bottom w:type="dxa" w:w="70"/>
-              <w:right w:type="dxa" w:w="100"/>
-            </w:tcMar>
-          </w:tcPr>
-          <w:p>
-            <w:pPr>
-              <w:jc w:val="right"/>
-            </w:pPr>
-            <w:r>
-              <w:rPr>
-                <w:rFonts w:ascii="Arial" w:cs="Arial" w:eastAsia="Arial" w:hAnsi="Arial"/>
-                <w:b w:val="false"/>
-                <w:bCs w:val="false"/>
-                <w:color w:val="0E3A4E"/>
-                <w:sz w:val="19"/>
-                <w:szCs w:val="19"/>
-              </w:rPr>
-              <w:t xml:space="preserve">$3,449</w:t>
+              <w:t xml:space="preserve">$1,210</w:t>
             </w:r>
           </w:p>
         </w:tc>
@@ -3073,123 +2735,6 @@
         <w:tc>
           <w:tcPr>
             <w:tcW w:type="dxa" w:w="3000"/>
-            <w:shd w:fill="FFFFFF" w:color="auto" w:val="clear"/>
-            <w:tcMar>
-              <w:top w:type="dxa" w:w="70"/>
-              <w:left w:type="dxa" w:w="100"/>
-              <w:bottom w:type="dxa" w:w="70"/>
-              <w:right w:type="dxa" w:w="100"/>
-            </w:tcMar>
-          </w:tcPr>
-          <w:p>
-            <w:pPr>
-              <w:jc w:val="left"/>
-            </w:pPr>
-            <w:r>
-              <w:rPr>
-                <w:rFonts w:ascii="Arial" w:cs="Arial" w:eastAsia="Arial" w:hAnsi="Arial"/>
-                <w:b w:val="false"/>
-                <w:bCs w:val="false"/>
-                <w:color w:val="0E3A4E"/>
-                <w:sz w:val="19"/>
-                <w:szCs w:val="19"/>
-              </w:rPr>
-              <w:t xml:space="preserve">Canva Pro · 1 cuenta</w:t>
-            </w:r>
-          </w:p>
-        </w:tc>
-        <w:tc>
-          <w:tcPr>
-            <w:tcW w:type="dxa" w:w="3360"/>
-            <w:shd w:fill="FFFFFF" w:color="auto" w:val="clear"/>
-            <w:tcMar>
-              <w:top w:type="dxa" w:w="70"/>
-              <w:left w:type="dxa" w:w="100"/>
-              <w:bottom w:type="dxa" w:w="70"/>
-              <w:right w:type="dxa" w:w="100"/>
-            </w:tcMar>
-          </w:tcPr>
-          <w:p>
-            <w:pPr>
-              <w:jc w:val="left"/>
-            </w:pPr>
-            <w:r>
-              <w:rPr>
-                <w:rFonts w:ascii="Arial" w:cs="Arial" w:eastAsia="Arial" w:hAnsi="Arial"/>
-                <w:b w:val="false"/>
-                <w:bCs w:val="false"/>
-                <w:color w:val="0E3A4E"/>
-                <w:sz w:val="19"/>
-                <w:szCs w:val="19"/>
-              </w:rPr>
-              <w:t xml:space="preserve">Banners y gráficos de cada evento para la web</w:t>
-            </w:r>
-          </w:p>
-        </w:tc>
-        <w:tc>
-          <w:tcPr>
-            <w:tcW w:type="dxa" w:w="1500"/>
-            <w:shd w:fill="FFFFFF" w:color="auto" w:val="clear"/>
-            <w:tcMar>
-              <w:top w:type="dxa" w:w="70"/>
-              <w:left w:type="dxa" w:w="100"/>
-              <w:bottom w:type="dxa" w:w="70"/>
-              <w:right w:type="dxa" w:w="100"/>
-            </w:tcMar>
-          </w:tcPr>
-          <w:p>
-            <w:pPr>
-              <w:jc w:val="right"/>
-            </w:pPr>
-            <w:r>
-              <w:rPr>
-                <w:rFonts w:ascii="Arial" w:cs="Arial" w:eastAsia="Arial" w:hAnsi="Arial"/>
-                <w:b w:val="false"/>
-                <w:bCs w:val="false"/>
-                <w:color w:val="0E3A4E"/>
-                <w:sz w:val="19"/>
-                <w:szCs w:val="19"/>
-              </w:rPr>
-              <w:t xml:space="preserve">$1,210</w:t>
-            </w:r>
-          </w:p>
-        </w:tc>
-        <w:tc>
-          <w:tcPr>
-            <w:tcW w:type="dxa" w:w="1500"/>
-            <w:shd w:fill="FFFFFF" w:color="auto" w:val="clear"/>
-            <w:tcMar>
-              <w:top w:type="dxa" w:w="70"/>
-              <w:left w:type="dxa" w:w="100"/>
-              <w:bottom w:type="dxa" w:w="70"/>
-              <w:right w:type="dxa" w:w="100"/>
-            </w:tcMar>
-          </w:tcPr>
-          <w:p>
-            <w:pPr>
-              <w:jc w:val="right"/>
-            </w:pPr>
-            <w:r>
-              <w:rPr>
-                <w:rFonts w:ascii="Arial" w:cs="Arial" w:eastAsia="Arial" w:hAnsi="Arial"/>
-                <w:b w:val="false"/>
-                <w:bCs w:val="false"/>
-                <w:color w:val="0E3A4E"/>
-                <w:sz w:val="19"/>
-                <w:szCs w:val="19"/>
-              </w:rPr>
-              <w:t xml:space="preserve">$1,210</w:t>
-            </w:r>
-          </w:p>
-        </w:tc>
-      </w:tr>
-      <w:tr>
-        <w:trPr>
-          <w:tblHeader w:val="false"/>
-        </w:trPr>
-        <w:tc>
-          <w:tcPr>
-            <w:tcW w:type="dxa" w:w="3000"/>
             <w:shd w:fill="175772" w:color="auto" w:val="clear"/>
             <w:tcMar>
               <w:top w:type="dxa" w:w="70"/>
@@ -3217,7 +2762,7 @@
         </w:tc>
         <w:tc>
           <w:tcPr>
-            <w:tcW w:type="dxa" w:w="3360"/>
+            <w:tcW w:type="dxa" w:w="4360"/>
             <w:shd w:fill="175772" w:color="auto" w:val="clear"/>
             <w:tcMar>
               <w:top w:type="dxa" w:w="70"/>
@@ -3245,35 +2790,7 @@
         </w:tc>
         <w:tc>
           <w:tcPr>
-            <w:tcW w:type="dxa" w:w="1500"/>
-            <w:shd w:fill="175772" w:color="auto" w:val="clear"/>
-            <w:tcMar>
-              <w:top w:type="dxa" w:w="70"/>
-              <w:left w:type="dxa" w:w="100"/>
-              <w:bottom w:type="dxa" w:w="70"/>
-              <w:right w:type="dxa" w:w="100"/>
-            </w:tcMar>
-          </w:tcPr>
-          <w:p>
-            <w:pPr>
-              <w:jc w:val="right"/>
-            </w:pPr>
-            <w:r>
-              <w:rPr>
-                <w:rFonts w:ascii="Arial" w:cs="Arial" w:eastAsia="Arial" w:hAnsi="Arial"/>
-                <w:b/>
-                <w:bCs/>
-                <w:color w:val="A8C243"/>
-                <w:sz w:val="19"/>
-                <w:szCs w:val="19"/>
-              </w:rPr>
-              <w:t xml:space="preserve">$16,472</w:t>
-            </w:r>
-          </w:p>
-        </w:tc>
-        <w:tc>
-          <w:tcPr>
-            <w:tcW w:type="dxa" w:w="1500"/>
+            <w:tcW w:type="dxa" w:w="2000"/>
             <w:shd w:fill="175772" w:color="auto" w:val="clear"/>
             <w:tcMar>
               <w:top w:type="dxa" w:w="70"/>
@@ -3997,7 +3514,7 @@
         </w:numPr>
         <w:spacing w:after="60"/>
       </w:pPr>
-      <w:hyperlink w:history="1" r:id="rIdpdtjxn2lkxuflnhl018bl">
+      <w:hyperlink w:history="1" r:id="rIdrz4lo1s1xblcmpvy_shan">
         <w:r>
           <w:rPr>
             <w:rFonts w:ascii="Arial" w:cs="Arial" w:eastAsia="Arial" w:hAnsi="Arial"/>
@@ -4019,7 +3536,7 @@
         </w:numPr>
         <w:spacing w:after="60"/>
       </w:pPr>
-      <w:hyperlink w:history="1" r:id="rId7-efdlnffp2lqjr8ejzsq">
+      <w:hyperlink w:history="1" r:id="rIduh2prnqegx7zu1mx9r2av">
         <w:r>
           <w:rPr>
             <w:rFonts w:ascii="Arial" w:cs="Arial" w:eastAsia="Arial" w:hAnsi="Arial"/>
@@ -4041,7 +3558,7 @@
         </w:numPr>
         <w:spacing w:after="60"/>
       </w:pPr>
-      <w:hyperlink w:history="1" r:id="rIdndgd-uapwm4f2wqv-x3hx">
+      <w:hyperlink w:history="1" r:id="rIdyfkyrsnpl_myt3ax2fmpj">
         <w:r>
           <w:rPr>
             <w:rFonts w:ascii="Arial" w:cs="Arial" w:eastAsia="Arial" w:hAnsi="Arial"/>
@@ -4063,7 +3580,7 @@
         </w:numPr>
         <w:spacing w:after="60"/>
       </w:pPr>
-      <w:hyperlink w:history="1" r:id="rId77akguuvafnxukrnkiioz">
+      <w:hyperlink w:history="1" r:id="rIdnjxgxqr-c8ytr9v00dzxy">
         <w:r>
           <w:rPr>
             <w:rFonts w:ascii="Arial" w:cs="Arial" w:eastAsia="Arial" w:hAnsi="Arial"/>
@@ -4102,7 +3619,7 @@
         </w:numPr>
         <w:spacing w:after="60"/>
       </w:pPr>
-      <w:hyperlink w:history="1" r:id="rIdhus2tm2kfryoq4ay8g609">
+      <w:hyperlink w:history="1" r:id="rIddwfd8xbx4tet43qazlf3r">
         <w:r>
           <w:rPr>
             <w:rFonts w:ascii="Arial" w:cs="Arial" w:eastAsia="Arial" w:hAnsi="Arial"/>
@@ -4124,7 +3641,7 @@
         </w:numPr>
         <w:spacing w:after="60"/>
       </w:pPr>
-      <w:hyperlink w:history="1" r:id="rIdtxsihqz0z8_7a-4hy9vwf">
+      <w:hyperlink w:history="1" r:id="rIdxw_6bmniwe33ov8rdioi6">
         <w:r>
           <w:rPr>
             <w:rFonts w:ascii="Arial" w:cs="Arial" w:eastAsia="Arial" w:hAnsi="Arial"/>
@@ -4146,7 +3663,7 @@
         </w:numPr>
         <w:spacing w:after="60"/>
       </w:pPr>
-      <w:hyperlink w:history="1" r:id="rIdaypv9tomjogqfim1sqccg">
+      <w:hyperlink w:history="1" r:id="rIdll7ug05izuvolubjt-_bz">
         <w:r>
           <w:rPr>
             <w:rFonts w:ascii="Arial" w:cs="Arial" w:eastAsia="Arial" w:hAnsi="Arial"/>
@@ -4168,29 +3685,7 @@
         </w:numPr>
         <w:spacing w:after="60"/>
       </w:pPr>
-      <w:hyperlink w:history="1" r:id="rIdx6zykartkwlc10rvom5jg">
-        <w:r>
-          <w:rPr>
-            <w:rFonts w:ascii="Arial" w:cs="Arial" w:eastAsia="Arial" w:hAnsi="Arial"/>
-            <w:color w:val="039AD1"/>
-            <w:sz w:val="20"/>
-            <w:szCs w:val="20"/>
-            <w:u w:val="single"/>
-          </w:rPr>
-          <w:t xml:space="preserve">Llaves Yubico</w:t>
-        </w:r>
-      </w:hyperlink>
-    </w:p>
-    <w:p>
-      <w:pPr>
-        <w:pStyle w:val="ListParagraph"/>
-        <w:numPr>
-          <w:ilvl w:val="0"/>
-          <w:numId w:val="2"/>
-        </w:numPr>
-        <w:spacing w:after="60"/>
-      </w:pPr>
-      <w:hyperlink w:history="1" r:id="rId4p9dkdaqtlx7br_8gvkk4">
+      <w:hyperlink w:history="1" r:id="rIdwm9afw95_hs37bxr5balb">
         <w:r>
           <w:rPr>
             <w:rFonts w:ascii="Arial" w:cs="Arial" w:eastAsia="Arial" w:hAnsi="Arial"/>
@@ -4212,7 +3707,7 @@
         </w:numPr>
         <w:spacing w:after="60"/>
       </w:pPr>
-      <w:hyperlink w:history="1" r:id="rIdnmkc0hag1sucg9m-32spx">
+      <w:hyperlink w:history="1" r:id="rIdzckz5uf0tjkpkrp9i27bx">
         <w:r>
           <w:rPr>
             <w:rFonts w:ascii="Arial" w:cs="Arial" w:eastAsia="Arial" w:hAnsi="Arial"/>

</xml_diff>

<commit_message>
Chatbot: solo conversaciones y costo al mes
Co-Authored-By: Claude Opus 5.5 <noreply@anthropic.com>
Claude-Session: https://claude.ai/code/session_01GFkSYVqa8d2zDX8Qy6Lwpz
</commit_message>
<xml_diff>
--- a/Presupuesto_2027_Comunicacion_RRPP_Poliforum_Leon.docx
+++ b/Presupuesto_2027_Comunicacion_RRPP_Poliforum_Leon.docx
@@ -730,7 +730,7 @@
             </w:tcMar>
           </w:tcPr>
           <w:p>
-            <w:hyperlink w:history="1" r:id="rIdhqhsshmojvmh6ol6ghrev">
+            <w:hyperlink w:history="1" r:id="rIdv371j6prpmw4xrt8ml1i1">
               <w:r>
                 <w:rPr>
                   <w:rFonts w:ascii="Arial" w:cs="Arial" w:eastAsia="Arial" w:hAnsi="Arial"/>
@@ -873,7 +873,7 @@
             </w:tcMar>
           </w:tcPr>
           <w:p>
-            <w:hyperlink w:history="1" r:id="rIdgfpc_sfson7syl_slzopu">
+            <w:hyperlink w:history="1" r:id="rIduy5j9fecu9dw_b9ookaa2">
               <w:r>
                 <w:rPr>
                   <w:rFonts w:ascii="Arial" w:cs="Arial" w:eastAsia="Arial" w:hAnsi="Arial"/>
@@ -1016,7 +1016,7 @@
             </w:tcMar>
           </w:tcPr>
           <w:p>
-            <w:hyperlink w:history="1" r:id="rIdjs6_lhepk1zfn7expwsni">
+            <w:hyperlink w:history="1" r:id="rIduehraz3nnn7psv8u-kxuz">
               <w:r>
                 <w:rPr>
                   <w:rFonts w:ascii="Arial" w:cs="Arial" w:eastAsia="Arial" w:hAnsi="Arial"/>
@@ -1159,7 +1159,7 @@
             </w:tcMar>
           </w:tcPr>
           <w:p>
-            <w:hyperlink w:history="1" r:id="rId4rv_s_4va3wbe-jfltcph">
+            <w:hyperlink w:history="1" r:id="rIdgh6b8jrgwsb5yzzuvvibb">
               <w:r>
                 <w:rPr>
                   <w:rFonts w:ascii="Arial" w:cs="Arial" w:eastAsia="Arial" w:hAnsi="Arial"/>
@@ -2222,7 +2222,7 @@
                 <w:sz w:val="19"/>
                 <w:szCs w:val="19"/>
               </w:rPr>
-              <w:t xml:space="preserve">Chatbot · Claude (modelo económico)</w:t>
+              <w:t xml:space="preserve">Chatbot · Claude</w:t>
             </w:r>
           </w:p>
         </w:tc>
@@ -2969,7 +2969,7 @@
                 <w:sz w:val="19"/>
                 <w:szCs w:val="19"/>
               </w:rPr>
-              <w:t xml:space="preserve">9,000 (hoy)</w:t>
+              <w:t xml:space="preserve">5,000</w:t>
             </w:r>
           </w:p>
         </w:tc>
@@ -2997,7 +2997,7 @@
                 <w:sz w:val="19"/>
                 <w:szCs w:val="19"/>
               </w:rPr>
-              <w:t xml:space="preserve">270</w:t>
+              <w:t xml:space="preserve">150</w:t>
             </w:r>
           </w:p>
         </w:tc>
@@ -3025,7 +3025,7 @@
                 <w:sz w:val="19"/>
                 <w:szCs w:val="19"/>
               </w:rPr>
-              <w:t xml:space="preserve">~$126</w:t>
+              <w:t xml:space="preserve">~$70</w:t>
             </w:r>
           </w:p>
         </w:tc>
@@ -3058,7 +3058,7 @@
                 <w:sz w:val="19"/>
                 <w:szCs w:val="19"/>
               </w:rPr>
-              <w:t xml:space="preserve">20,000</w:t>
+              <w:t xml:space="preserve">9,000 (hoy)</w:t>
             </w:r>
           </w:p>
         </w:tc>
@@ -3086,7 +3086,7 @@
                 <w:sz w:val="19"/>
                 <w:szCs w:val="19"/>
               </w:rPr>
-              <w:t xml:space="preserve">600</w:t>
+              <w:t xml:space="preserve">270</w:t>
             </w:r>
           </w:p>
         </w:tc>
@@ -3114,7 +3114,7 @@
                 <w:sz w:val="19"/>
                 <w:szCs w:val="19"/>
               </w:rPr>
-              <w:t xml:space="preserve">~$279</w:t>
+              <w:t xml:space="preserve">~$126</w:t>
             </w:r>
           </w:p>
         </w:tc>
@@ -3147,7 +3147,7 @@
                 <w:sz w:val="19"/>
                 <w:szCs w:val="19"/>
               </w:rPr>
-              <w:t xml:space="preserve">40,000</w:t>
+              <w:t xml:space="preserve">20,000</w:t>
             </w:r>
           </w:p>
         </w:tc>
@@ -3175,7 +3175,7 @@
                 <w:sz w:val="19"/>
                 <w:szCs w:val="19"/>
               </w:rPr>
-              <w:t xml:space="preserve">1,200</w:t>
+              <w:t xml:space="preserve">600</w:t>
             </w:r>
           </w:p>
         </w:tc>
@@ -3183,6 +3183,95 @@
           <w:tcPr>
             <w:tcW w:type="dxa" w:w="3120"/>
             <w:shd w:fill="F6F9FA" w:color="auto" w:val="clear"/>
+            <w:tcMar>
+              <w:top w:type="dxa" w:w="70"/>
+              <w:left w:type="dxa" w:w="100"/>
+              <w:bottom w:type="dxa" w:w="70"/>
+              <w:right w:type="dxa" w:w="100"/>
+            </w:tcMar>
+          </w:tcPr>
+          <w:p>
+            <w:pPr>
+              <w:jc w:val="right"/>
+            </w:pPr>
+            <w:r>
+              <w:rPr>
+                <w:rFonts w:ascii="Arial" w:cs="Arial" w:eastAsia="Arial" w:hAnsi="Arial"/>
+                <w:b w:val="false"/>
+                <w:bCs w:val="false"/>
+                <w:color w:val="0E3A4E"/>
+                <w:sz w:val="19"/>
+                <w:szCs w:val="19"/>
+              </w:rPr>
+              <w:t xml:space="preserve">~$279</w:t>
+            </w:r>
+          </w:p>
+        </w:tc>
+      </w:tr>
+      <w:tr>
+        <w:trPr>
+          <w:tblHeader w:val="false"/>
+        </w:trPr>
+        <w:tc>
+          <w:tcPr>
+            <w:tcW w:type="dxa" w:w="3120"/>
+            <w:shd w:fill="FFFFFF" w:color="auto" w:val="clear"/>
+            <w:tcMar>
+              <w:top w:type="dxa" w:w="70"/>
+              <w:left w:type="dxa" w:w="100"/>
+              <w:bottom w:type="dxa" w:w="70"/>
+              <w:right w:type="dxa" w:w="100"/>
+            </w:tcMar>
+          </w:tcPr>
+          <w:p>
+            <w:pPr>
+              <w:jc w:val="left"/>
+            </w:pPr>
+            <w:r>
+              <w:rPr>
+                <w:rFonts w:ascii="Arial" w:cs="Arial" w:eastAsia="Arial" w:hAnsi="Arial"/>
+                <w:b w:val="false"/>
+                <w:bCs w:val="false"/>
+                <w:color w:val="0E3A4E"/>
+                <w:sz w:val="19"/>
+                <w:szCs w:val="19"/>
+              </w:rPr>
+              <w:t xml:space="preserve">40,000</w:t>
+            </w:r>
+          </w:p>
+        </w:tc>
+        <w:tc>
+          <w:tcPr>
+            <w:tcW w:type="dxa" w:w="3120"/>
+            <w:shd w:fill="FFFFFF" w:color="auto" w:val="clear"/>
+            <w:tcMar>
+              <w:top w:type="dxa" w:w="70"/>
+              <w:left w:type="dxa" w:w="100"/>
+              <w:bottom w:type="dxa" w:w="70"/>
+              <w:right w:type="dxa" w:w="100"/>
+            </w:tcMar>
+          </w:tcPr>
+          <w:p>
+            <w:pPr>
+              <w:jc w:val="left"/>
+            </w:pPr>
+            <w:r>
+              <w:rPr>
+                <w:rFonts w:ascii="Arial" w:cs="Arial" w:eastAsia="Arial" w:hAnsi="Arial"/>
+                <w:b w:val="false"/>
+                <w:bCs w:val="false"/>
+                <w:color w:val="0E3A4E"/>
+                <w:sz w:val="19"/>
+                <w:szCs w:val="19"/>
+              </w:rPr>
+              <w:t xml:space="preserve">1,200</w:t>
+            </w:r>
+          </w:p>
+        </w:tc>
+        <w:tc>
+          <w:tcPr>
+            <w:tcW w:type="dxa" w:w="3120"/>
+            <w:shd w:fill="FFFFFF" w:color="auto" w:val="clear"/>
             <w:tcMar>
               <w:top w:type="dxa" w:w="70"/>
               <w:left w:type="dxa" w:w="100"/>
@@ -3514,7 +3603,7 @@
         </w:numPr>
         <w:spacing w:after="60"/>
       </w:pPr>
-      <w:hyperlink w:history="1" r:id="rIdrz4lo1s1xblcmpvy_shan">
+      <w:hyperlink w:history="1" r:id="rIdhqp7kiq1mnpxynua_jj4j">
         <w:r>
           <w:rPr>
             <w:rFonts w:ascii="Arial" w:cs="Arial" w:eastAsia="Arial" w:hAnsi="Arial"/>
@@ -3536,7 +3625,7 @@
         </w:numPr>
         <w:spacing w:after="60"/>
       </w:pPr>
-      <w:hyperlink w:history="1" r:id="rIduh2prnqegx7zu1mx9r2av">
+      <w:hyperlink w:history="1" r:id="rIdloioqgyo3qjtpfj1fxwbr">
         <w:r>
           <w:rPr>
             <w:rFonts w:ascii="Arial" w:cs="Arial" w:eastAsia="Arial" w:hAnsi="Arial"/>
@@ -3558,7 +3647,7 @@
         </w:numPr>
         <w:spacing w:after="60"/>
       </w:pPr>
-      <w:hyperlink w:history="1" r:id="rIdyfkyrsnpl_myt3ax2fmpj">
+      <w:hyperlink w:history="1" r:id="rIdrsmpkuylx86m77ijyllgv">
         <w:r>
           <w:rPr>
             <w:rFonts w:ascii="Arial" w:cs="Arial" w:eastAsia="Arial" w:hAnsi="Arial"/>
@@ -3580,7 +3669,7 @@
         </w:numPr>
         <w:spacing w:after="60"/>
       </w:pPr>
-      <w:hyperlink w:history="1" r:id="rIdnjxgxqr-c8ytr9v00dzxy">
+      <w:hyperlink w:history="1" r:id="rId8s0gtbrgeilj3sn-tse3k">
         <w:r>
           <w:rPr>
             <w:rFonts w:ascii="Arial" w:cs="Arial" w:eastAsia="Arial" w:hAnsi="Arial"/>
@@ -3619,7 +3708,7 @@
         </w:numPr>
         <w:spacing w:after="60"/>
       </w:pPr>
-      <w:hyperlink w:history="1" r:id="rIddwfd8xbx4tet43qazlf3r">
+      <w:hyperlink w:history="1" r:id="rIdrckjlvog35oyn9dusxwu0">
         <w:r>
           <w:rPr>
             <w:rFonts w:ascii="Arial" w:cs="Arial" w:eastAsia="Arial" w:hAnsi="Arial"/>
@@ -3641,7 +3730,7 @@
         </w:numPr>
         <w:spacing w:after="60"/>
       </w:pPr>
-      <w:hyperlink w:history="1" r:id="rIdxw_6bmniwe33ov8rdioi6">
+      <w:hyperlink w:history="1" r:id="rIdjkdmebqchr6e5ybbgwbcb">
         <w:r>
           <w:rPr>
             <w:rFonts w:ascii="Arial" w:cs="Arial" w:eastAsia="Arial" w:hAnsi="Arial"/>
@@ -3663,7 +3752,7 @@
         </w:numPr>
         <w:spacing w:after="60"/>
       </w:pPr>
-      <w:hyperlink w:history="1" r:id="rIdll7ug05izuvolubjt-_bz">
+      <w:hyperlink w:history="1" r:id="rIdzdp8ep6wyk5epzvmrduk5">
         <w:r>
           <w:rPr>
             <w:rFonts w:ascii="Arial" w:cs="Arial" w:eastAsia="Arial" w:hAnsi="Arial"/>
@@ -3685,7 +3774,7 @@
         </w:numPr>
         <w:spacing w:after="60"/>
       </w:pPr>
-      <w:hyperlink w:history="1" r:id="rIdwm9afw95_hs37bxr5balb">
+      <w:hyperlink w:history="1" r:id="rIdlaydhoge1cevvorazayfl">
         <w:r>
           <w:rPr>
             <w:rFonts w:ascii="Arial" w:cs="Arial" w:eastAsia="Arial" w:hAnsi="Arial"/>
@@ -3707,7 +3796,7 @@
         </w:numPr>
         <w:spacing w:after="60"/>
       </w:pPr>
-      <w:hyperlink w:history="1" r:id="rIdzckz5uf0tjkpkrp9i27bx">
+      <w:hyperlink w:history="1" r:id="rIdoled4yiu84ytvkoik4lru">
         <w:r>
           <w:rPr>
             <w:rFonts w:ascii="Arial" w:cs="Arial" w:eastAsia="Arial" w:hAnsi="Arial"/>

</xml_diff>

<commit_message>
Precios actualizados: ChatGPT, X Plus, Claude; notas de DigitalOcean y Bitwarden
Co-Authored-By: Claude Opus 5.5 <noreply@anthropic.com>
Claude-Session: https://claude.ai/code/session_01GFkSYVqa8d2zDX8Qy6Lwpz
</commit_message>
<xml_diff>
--- a/Presupuesto_2027_Comunicacion_RRPP_Poliforum_Leon.docx
+++ b/Presupuesto_2027_Comunicacion_RRPP_Poliforum_Leon.docx
@@ -246,7 +246,7 @@
                 <w:sz w:val="19"/>
                 <w:szCs w:val="19"/>
               </w:rPr>
-              <w:t xml:space="preserve">1 · Presupuesto Comunicación: ManyChat, ChatGPT, Canva y X Premium</w:t>
+              <w:t xml:space="preserve">1 · Presupuesto Comunicación: ManyChat, ChatGPT, Canva y X Plus (verificación)</w:t>
             </w:r>
           </w:p>
         </w:tc>
@@ -274,7 +274,7 @@
                 <w:sz w:val="19"/>
                 <w:szCs w:val="19"/>
               </w:rPr>
-              <w:t xml:space="preserve">$15,188</w:t>
+              <w:t xml:space="preserve">$15,176</w:t>
             </w:r>
           </w:p>
         </w:tc>
@@ -335,7 +335,7 @@
                 <w:sz w:val="19"/>
                 <w:szCs w:val="19"/>
               </w:rPr>
-              <w:t xml:space="preserve">$14,036</w:t>
+              <w:t xml:space="preserve">$14,037</w:t>
             </w:r>
           </w:p>
         </w:tc>
@@ -396,7 +396,7 @@
                 <w:sz w:val="19"/>
                 <w:szCs w:val="19"/>
               </w:rPr>
-              <w:t xml:space="preserve">$29,224</w:t>
+              <w:t xml:space="preserve">$29,213</w:t>
             </w:r>
           </w:p>
         </w:tc>
@@ -730,7 +730,7 @@
             </w:tcMar>
           </w:tcPr>
           <w:p>
-            <w:hyperlink w:history="1" r:id="rIdv371j6prpmw4xrt8ml1i1">
+            <w:hyperlink w:history="1" r:id="rIdszm7yveq9y5dqgab3_cif">
               <w:r>
                 <w:rPr>
                   <w:rFonts w:ascii="Arial" w:cs="Arial" w:eastAsia="Arial" w:hAnsi="Arial"/>
@@ -857,7 +857,7 @@
                 <w:sz w:val="19"/>
                 <w:szCs w:val="19"/>
               </w:rPr>
-              <w:t xml:space="preserve">~$4,788</w:t>
+              <w:t xml:space="preserve">~$4,800</w:t>
             </w:r>
           </w:p>
         </w:tc>
@@ -873,7 +873,7 @@
             </w:tcMar>
           </w:tcPr>
           <w:p>
-            <w:hyperlink w:history="1" r:id="rIduy5j9fecu9dw_b9ookaa2">
+            <w:hyperlink w:history="1" r:id="rIdpdc5fnz3r1demzy5vjfh0">
               <w:r>
                 <w:rPr>
                   <w:rFonts w:ascii="Arial" w:cs="Arial" w:eastAsia="Arial" w:hAnsi="Arial"/>
@@ -1016,7 +1016,7 @@
             </w:tcMar>
           </w:tcPr>
           <w:p>
-            <w:hyperlink w:history="1" r:id="rIduehraz3nnn7psv8u-kxuz">
+            <w:hyperlink w:history="1" r:id="rIdfsa-iqv9uigiluvgo6lr6">
               <w:r>
                 <w:rPr>
                   <w:rFonts w:ascii="Arial" w:cs="Arial" w:eastAsia="Arial" w:hAnsi="Arial"/>
@@ -1059,7 +1059,7 @@
                 <w:sz w:val="19"/>
                 <w:szCs w:val="19"/>
               </w:rPr>
-              <w:t xml:space="preserve">X Premium</w:t>
+              <w:t xml:space="preserve">X Plus (verificación)</w:t>
             </w:r>
           </w:p>
         </w:tc>
@@ -1143,7 +1143,7 @@
                 <w:sz w:val="19"/>
                 <w:szCs w:val="19"/>
               </w:rPr>
-              <w:t xml:space="preserve">$1,520</w:t>
+              <w:t xml:space="preserve">$1,496</w:t>
             </w:r>
           </w:p>
         </w:tc>
@@ -1159,7 +1159,7 @@
             </w:tcMar>
           </w:tcPr>
           <w:p>
-            <w:hyperlink w:history="1" r:id="rIdgh6b8jrgwsb5yzzuvvibb">
+            <w:hyperlink w:history="1" r:id="rIdr1xcgefdhy_wgc1zl47pw">
               <w:r>
                 <w:rPr>
                   <w:rFonts w:ascii="Arial" w:cs="Arial" w:eastAsia="Arial" w:hAnsi="Arial"/>
@@ -1286,7 +1286,7 @@
                 <w:sz w:val="19"/>
                 <w:szCs w:val="19"/>
               </w:rPr>
-              <w:t xml:space="preserve">$15,188</w:t>
+              <w:t xml:space="preserve">$15,176</w:t>
             </w:r>
           </w:p>
         </w:tc>
@@ -1333,7 +1333,7 @@
           <w:sz w:val="19"/>
           <w:szCs w:val="19"/>
         </w:rPr>
-        <w:t xml:space="preserve">ChatGPT Plus solo se cobra mes a mes (~$399 al mes en México); confirmar al contratar.</w:t>
+        <w:t xml:space="preserve">ChatGPT Plus solo se cobra mes a mes (~$400 al mes en México). X Plus: MX$1,290 al año + IVA; es el plan más barato con palomita de verificación.</w:t>
       </w:r>
     </w:p>
     <w:p>
@@ -1568,7 +1568,7 @@
           <w:sz w:val="26"/>
           <w:szCs w:val="26"/>
         </w:rPr>
-        <w:t xml:space="preserve">X Premium</w:t>
+        <w:t xml:space="preserve">X Plus (verificación)</w:t>
       </w:r>
     </w:p>
     <w:p>
@@ -2634,7 +2634,7 @@
                 <w:sz w:val="19"/>
                 <w:szCs w:val="19"/>
               </w:rPr>
-              <w:t xml:space="preserve">$3,449</w:t>
+              <w:t xml:space="preserve">$3,450</w:t>
             </w:r>
           </w:p>
         </w:tc>
@@ -2812,7 +2812,7 @@
                 <w:sz w:val="19"/>
                 <w:szCs w:val="19"/>
               </w:rPr>
-              <w:t xml:space="preserve">$14,036</w:t>
+              <w:t xml:space="preserve">$14,037</w:t>
             </w:r>
           </w:p>
         </w:tc>
@@ -3336,7 +3336,32 @@
           <w:sz w:val="22"/>
           <w:szCs w:val="22"/>
         </w:rPr>
-        <w:t xml:space="preserve">DigitalOcean es un servidor privado en la nube. El hosting compartido de Hostinger o GoDaddy no permite correr el portal ni el chatbot; el dominio puede quedarse en GoDaddy.</w:t>
+        <w:t xml:space="preserve">DigitalOcean es un servidor privado en la nube (US$12 al mes + US$3.60 de respaldos), que se cobra cada mes a la tarjeta según lo que se usa. El hosting compartido de Hostinger o GoDaddy no permite correr el portal ni el chatbot; el dominio puede quedarse en GoDaddy. Plan de soporte de DigitalOcean: el gratuito (Motor de arranque); los planes de soporte de pago no hacen falta.</w:t>
+      </w:r>
+    </w:p>
+    <w:p>
+      <w:pPr>
+        <w:spacing w:after="120" w:before="0"/>
+      </w:pPr>
+      <w:r>
+        <w:rPr>
+          <w:rFonts w:ascii="Arial" w:cs="Arial" w:eastAsia="Arial" w:hAnsi="Arial"/>
+          <w:b/>
+          <w:bCs/>
+          <w:color w:val="0E3A4E"/>
+          <w:sz w:val="22"/>
+          <w:szCs w:val="22"/>
+        </w:rPr>
+        <w:t xml:space="preserve">Contraseñas: </w:t>
+      </w:r>
+      <w:r>
+        <w:rPr>
+          <w:rFonts w:ascii="Arial" w:cs="Arial" w:eastAsia="Arial" w:hAnsi="Arial"/>
+          <w:color w:val="0E3A4E"/>
+          <w:sz w:val="22"/>
+          <w:szCs w:val="22"/>
+        </w:rPr>
+        <w:t xml:space="preserve">Bitwarden Teams para 3 personas (US$4 por persona al mes, pago anual). Si solo 2 personas manejan los accesos, el plan gratuito de organización de Bitwarden alcanza y este concepto baja a $0.</w:t>
       </w:r>
     </w:p>
     <w:p>
@@ -3603,7 +3628,7 @@
         </w:numPr>
         <w:spacing w:after="60"/>
       </w:pPr>
-      <w:hyperlink w:history="1" r:id="rIdhqp7kiq1mnpxynua_jj4j">
+      <w:hyperlink w:history="1" r:id="rIdzwiki0zt_fqkjyh-wv0ug">
         <w:r>
           <w:rPr>
             <w:rFonts w:ascii="Arial" w:cs="Arial" w:eastAsia="Arial" w:hAnsi="Arial"/>
@@ -3625,7 +3650,7 @@
         </w:numPr>
         <w:spacing w:after="60"/>
       </w:pPr>
-      <w:hyperlink w:history="1" r:id="rIdloioqgyo3qjtpfj1fxwbr">
+      <w:hyperlink w:history="1" r:id="rIdkymfag-iqyze1p4n_lqgi">
         <w:r>
           <w:rPr>
             <w:rFonts w:ascii="Arial" w:cs="Arial" w:eastAsia="Arial" w:hAnsi="Arial"/>
@@ -3647,7 +3672,7 @@
         </w:numPr>
         <w:spacing w:after="60"/>
       </w:pPr>
-      <w:hyperlink w:history="1" r:id="rIdrsmpkuylx86m77ijyllgv">
+      <w:hyperlink w:history="1" r:id="rIduz-u5h3hj878h83puyrp6">
         <w:r>
           <w:rPr>
             <w:rFonts w:ascii="Arial" w:cs="Arial" w:eastAsia="Arial" w:hAnsi="Arial"/>
@@ -3669,7 +3694,7 @@
         </w:numPr>
         <w:spacing w:after="60"/>
       </w:pPr>
-      <w:hyperlink w:history="1" r:id="rId8s0gtbrgeilj3sn-tse3k">
+      <w:hyperlink w:history="1" r:id="rIdxdq-bsptvq96sxhdxwkur">
         <w:r>
           <w:rPr>
             <w:rFonts w:ascii="Arial" w:cs="Arial" w:eastAsia="Arial" w:hAnsi="Arial"/>
@@ -3678,7 +3703,7 @@
             <w:szCs w:val="20"/>
             <w:u w:val="single"/>
           </w:rPr>
-          <w:t xml:space="preserve">X Premium</w:t>
+          <w:t xml:space="preserve">X Plus (verificación)</w:t>
         </w:r>
       </w:hyperlink>
     </w:p>
@@ -3708,7 +3733,7 @@
         </w:numPr>
         <w:spacing w:after="60"/>
       </w:pPr>
-      <w:hyperlink w:history="1" r:id="rIdrckjlvog35oyn9dusxwu0">
+      <w:hyperlink w:history="1" r:id="rIdtuaauneruuerk2-vhy572">
         <w:r>
           <w:rPr>
             <w:rFonts w:ascii="Arial" w:cs="Arial" w:eastAsia="Arial" w:hAnsi="Arial"/>
@@ -3730,7 +3755,7 @@
         </w:numPr>
         <w:spacing w:after="60"/>
       </w:pPr>
-      <w:hyperlink w:history="1" r:id="rIdjkdmebqchr6e5ybbgwbcb">
+      <w:hyperlink w:history="1" r:id="rIduiii7eqhzr7q1ojz4vy-e">
         <w:r>
           <w:rPr>
             <w:rFonts w:ascii="Arial" w:cs="Arial" w:eastAsia="Arial" w:hAnsi="Arial"/>
@@ -3752,7 +3777,7 @@
         </w:numPr>
         <w:spacing w:after="60"/>
       </w:pPr>
-      <w:hyperlink w:history="1" r:id="rIdzdp8ep6wyk5epzvmrduk5">
+      <w:hyperlink w:history="1" r:id="rIdvmi_cwsfukfnknlcdq3mf">
         <w:r>
           <w:rPr>
             <w:rFonts w:ascii="Arial" w:cs="Arial" w:eastAsia="Arial" w:hAnsi="Arial"/>
@@ -3774,7 +3799,7 @@
         </w:numPr>
         <w:spacing w:after="60"/>
       </w:pPr>
-      <w:hyperlink w:history="1" r:id="rIdlaydhoge1cevvorazayfl">
+      <w:hyperlink w:history="1" r:id="rIdvsfpjxl5y3f4q-r0krp6u">
         <w:r>
           <w:rPr>
             <w:rFonts w:ascii="Arial" w:cs="Arial" w:eastAsia="Arial" w:hAnsi="Arial"/>
@@ -3796,7 +3821,7 @@
         </w:numPr>
         <w:spacing w:after="60"/>
       </w:pPr>
-      <w:hyperlink w:history="1" r:id="rIdoled4yiu84ytvkoik4lru">
+      <w:hyperlink w:history="1" r:id="rIdts2shcr-9kyvblensiusn">
         <w:r>
           <w:rPr>
             <w:rFonts w:ascii="Arial" w:cs="Arial" w:eastAsia="Arial" w:hAnsi="Arial"/>
@@ -3921,7 +3946,7 @@
           <w:sz w:val="22"/>
           <w:szCs w:val="22"/>
         </w:rPr>
-        <w:t xml:space="preserve">ManyChat: precio en dólares a $19.00 por dólar + 16% de IVA. Página web: cotización a $18.20 por dólar + 16% de IVA. Canva, Claude y X Premium: precios en México.</w:t>
+        <w:t xml:space="preserve">ManyChat: precio en dólares a $19.00 por dólar + 16% de IVA. Página web: cotización a $18.20 por dólar + 16% de IVA. Canva, Claude y X Plus (verificación): precios en México.</w:t>
       </w:r>
     </w:p>
     <w:p>

</xml_diff>

<commit_message>
Un solo Canva Pro para redes y web
Co-Authored-By: Claude Opus 5.5 <noreply@anthropic.com>
Claude-Session: https://claude.ai/code/session_01GFkSYVqa8d2zDX8Qy6Lwpz
</commit_message>
<xml_diff>
--- a/Presupuesto_2027_Comunicacion_RRPP_Poliforum_Leon.docx
+++ b/Presupuesto_2027_Comunicacion_RRPP_Poliforum_Leon.docx
@@ -307,7 +307,7 @@
                 <w:sz w:val="19"/>
                 <w:szCs w:val="19"/>
               </w:rPr>
-              <w:t xml:space="preserve">2 · Presupuesto Página web: servidor, chatbot, seguridad, dominio, Claude y Canva</w:t>
+              <w:t xml:space="preserve">2 · Presupuesto Página web: servidor, chatbot, seguridad, dominio y Claude</w:t>
             </w:r>
           </w:p>
         </w:tc>
@@ -335,7 +335,7 @@
                 <w:sz w:val="19"/>
                 <w:szCs w:val="19"/>
               </w:rPr>
-              <w:t xml:space="preserve">$14,037</w:t>
+              <w:t xml:space="preserve">$12,827</w:t>
             </w:r>
           </w:p>
         </w:tc>
@@ -396,7 +396,7 @@
                 <w:sz w:val="19"/>
                 <w:szCs w:val="19"/>
               </w:rPr>
-              <w:t xml:space="preserve">$29,213</w:t>
+              <w:t xml:space="preserve">$28,003</w:t>
             </w:r>
           </w:p>
         </w:tc>
@@ -730,7 +730,7 @@
             </w:tcMar>
           </w:tcPr>
           <w:p>
-            <w:hyperlink w:history="1" r:id="rIdszm7yveq9y5dqgab3_cif">
+            <w:hyperlink w:history="1" r:id="rIdygnou3ggpuhkgwytliwzu">
               <w:r>
                 <w:rPr>
                   <w:rFonts w:ascii="Arial" w:cs="Arial" w:eastAsia="Arial" w:hAnsi="Arial"/>
@@ -873,7 +873,7 @@
             </w:tcMar>
           </w:tcPr>
           <w:p>
-            <w:hyperlink w:history="1" r:id="rIdpdc5fnz3r1demzy5vjfh0">
+            <w:hyperlink w:history="1" r:id="rIdxccvgeaavkkrughhrgluy">
               <w:r>
                 <w:rPr>
                   <w:rFonts w:ascii="Arial" w:cs="Arial" w:eastAsia="Arial" w:hAnsi="Arial"/>
@@ -972,7 +972,7 @@
                 <w:sz w:val="19"/>
                 <w:szCs w:val="19"/>
               </w:rPr>
-              <w:t xml:space="preserve">Diseño para redes con el kit de marca</w:t>
+              <w:t xml:space="preserve">Diseño para redes y para la página web</w:t>
             </w:r>
           </w:p>
         </w:tc>
@@ -1016,7 +1016,7 @@
             </w:tcMar>
           </w:tcPr>
           <w:p>
-            <w:hyperlink w:history="1" r:id="rIdfsa-iqv9uigiluvgo6lr6">
+            <w:hyperlink w:history="1" r:id="rIdlqtrjgkbaeqrb4hrd82_k">
               <w:r>
                 <w:rPr>
                   <w:rFonts w:ascii="Arial" w:cs="Arial" w:eastAsia="Arial" w:hAnsi="Arial"/>
@@ -1159,7 +1159,7 @@
             </w:tcMar>
           </w:tcPr>
           <w:p>
-            <w:hyperlink w:history="1" r:id="rIdr1xcgefdhy_wgc1zl47pw">
+            <w:hyperlink w:history="1" r:id="rIdgquqo6edsnsymcsvs-g0a">
               <w:r>
                 <w:rPr>
                   <w:rFonts w:ascii="Arial" w:cs="Arial" w:eastAsia="Arial" w:hAnsi="Arial"/>
@@ -1526,7 +1526,7 @@
           <w:sz w:val="22"/>
           <w:szCs w:val="22"/>
         </w:rPr>
-        <w:t xml:space="preserve">Diseño de piezas para redes con el kit de marca del recinto: plantillas, edición de imágenes y adaptación a distintos formatos.</w:t>
+        <w:t xml:space="preserve">Diseño con el kit de marca del recinto para redes y para la página web: plantillas, edición de imágenes y adaptación a distintos formatos. Una sola cuenta cubre las dos.</w:t>
       </w:r>
     </w:p>
     <w:p>
@@ -1551,7 +1551,7 @@
           <w:sz w:val="22"/>
           <w:szCs w:val="22"/>
         </w:rPr>
-        <w:t xml:space="preserve">Post, historia y portada de reel de un evento a partir de un mismo diseño, con la imagen oficial.</w:t>
+        <w:t xml:space="preserve">Post e historia de un evento para redes, y su banner para la web, a partir de un mismo diseño.</w:t>
       </w:r>
     </w:p>
     <w:p>
@@ -1996,7 +1996,7 @@
           <w:sz w:val="22"/>
           <w:szCs w:val="22"/>
         </w:rPr>
-        <w:t xml:space="preserve">Lo necesario para que la nueva web esté encendida, segura, con un chatbot que atiende a los clientes, y con las herramientas para mantenerla al día. La web ya está hecha y la actualiza el equipo desde su portal, sin agencia.</w:t>
+        <w:t xml:space="preserve">Lo necesario para que la nueva web esté encendida, segura, con un chatbot que atiende a los clientes, y con Claude para mantenerla al día. La web ya está hecha y la actualiza el equipo desde su portal, sin agencia.</w:t>
       </w:r>
     </w:p>
     <w:tbl>
@@ -2646,95 +2646,6 @@
         <w:tc>
           <w:tcPr>
             <w:tcW w:type="dxa" w:w="3000"/>
-            <w:shd w:fill="F6F9FA" w:color="auto" w:val="clear"/>
-            <w:tcMar>
-              <w:top w:type="dxa" w:w="70"/>
-              <w:left w:type="dxa" w:w="100"/>
-              <w:bottom w:type="dxa" w:w="70"/>
-              <w:right w:type="dxa" w:w="100"/>
-            </w:tcMar>
-          </w:tcPr>
-          <w:p>
-            <w:pPr>
-              <w:jc w:val="left"/>
-            </w:pPr>
-            <w:r>
-              <w:rPr>
-                <w:rFonts w:ascii="Arial" w:cs="Arial" w:eastAsia="Arial" w:hAnsi="Arial"/>
-                <w:b w:val="false"/>
-                <w:bCs w:val="false"/>
-                <w:color w:val="0E3A4E"/>
-                <w:sz w:val="19"/>
-                <w:szCs w:val="19"/>
-              </w:rPr>
-              <w:t xml:space="preserve">Canva Pro · 1 cuenta</w:t>
-            </w:r>
-          </w:p>
-        </w:tc>
-        <w:tc>
-          <w:tcPr>
-            <w:tcW w:type="dxa" w:w="4360"/>
-            <w:shd w:fill="F6F9FA" w:color="auto" w:val="clear"/>
-            <w:tcMar>
-              <w:top w:type="dxa" w:w="70"/>
-              <w:left w:type="dxa" w:w="100"/>
-              <w:bottom w:type="dxa" w:w="70"/>
-              <w:right w:type="dxa" w:w="100"/>
-            </w:tcMar>
-          </w:tcPr>
-          <w:p>
-            <w:pPr>
-              <w:jc w:val="left"/>
-            </w:pPr>
-            <w:r>
-              <w:rPr>
-                <w:rFonts w:ascii="Arial" w:cs="Arial" w:eastAsia="Arial" w:hAnsi="Arial"/>
-                <w:b w:val="false"/>
-                <w:bCs w:val="false"/>
-                <w:color w:val="0E3A4E"/>
-                <w:sz w:val="19"/>
-                <w:szCs w:val="19"/>
-              </w:rPr>
-              <w:t xml:space="preserve">Banners y gráficos de cada evento para la web</w:t>
-            </w:r>
-          </w:p>
-        </w:tc>
-        <w:tc>
-          <w:tcPr>
-            <w:tcW w:type="dxa" w:w="2000"/>
-            <w:shd w:fill="F6F9FA" w:color="auto" w:val="clear"/>
-            <w:tcMar>
-              <w:top w:type="dxa" w:w="70"/>
-              <w:left w:type="dxa" w:w="100"/>
-              <w:bottom w:type="dxa" w:w="70"/>
-              <w:right w:type="dxa" w:w="100"/>
-            </w:tcMar>
-          </w:tcPr>
-          <w:p>
-            <w:pPr>
-              <w:jc w:val="right"/>
-            </w:pPr>
-            <w:r>
-              <w:rPr>
-                <w:rFonts w:ascii="Arial" w:cs="Arial" w:eastAsia="Arial" w:hAnsi="Arial"/>
-                <w:b w:val="false"/>
-                <w:bCs w:val="false"/>
-                <w:color w:val="0E3A4E"/>
-                <w:sz w:val="19"/>
-                <w:szCs w:val="19"/>
-              </w:rPr>
-              <w:t xml:space="preserve">$1,210</w:t>
-            </w:r>
-          </w:p>
-        </w:tc>
-      </w:tr>
-      <w:tr>
-        <w:trPr>
-          <w:tblHeader w:val="false"/>
-        </w:trPr>
-        <w:tc>
-          <w:tcPr>
-            <w:tcW w:type="dxa" w:w="3000"/>
             <w:shd w:fill="175772" w:color="auto" w:val="clear"/>
             <w:tcMar>
               <w:top w:type="dxa" w:w="70"/>
@@ -2812,7 +2723,7 @@
                 <w:sz w:val="19"/>
                 <w:szCs w:val="19"/>
               </w:rPr>
-              <w:t xml:space="preserve">$14,037</w:t>
+              <w:t xml:space="preserve">$12,827</w:t>
             </w:r>
           </w:p>
         </w:tc>
@@ -3462,73 +3373,6 @@
           <w:sz w:val="26"/>
           <w:szCs w:val="26"/>
         </w:rPr>
-        <w:t xml:space="preserve">Canva Pro · 1 cuenta</w:t>
-      </w:r>
-    </w:p>
-    <w:p>
-      <w:pPr>
-        <w:spacing w:after="40" w:before="0"/>
-      </w:pPr>
-      <w:r>
-        <w:rPr>
-          <w:rFonts w:ascii="Arial" w:cs="Arial" w:eastAsia="Arial" w:hAnsi="Arial"/>
-          <w:b/>
-          <w:bCs/>
-          <w:color w:val="0E3A4E"/>
-          <w:sz w:val="22"/>
-          <w:szCs w:val="22"/>
-        </w:rPr>
-        <w:t xml:space="preserve">Por qué: </w:t>
-      </w:r>
-      <w:r>
-        <w:rPr>
-          <w:rFonts w:ascii="Arial" w:cs="Arial" w:eastAsia="Arial" w:hAnsi="Arial"/>
-          <w:color w:val="0E3A4E"/>
-          <w:sz w:val="22"/>
-          <w:szCs w:val="22"/>
-        </w:rPr>
-        <w:t xml:space="preserve">Diseño de banners y gráficos para la web con el kit de marca del recinto.</w:t>
-      </w:r>
-    </w:p>
-    <w:p>
-      <w:pPr>
-        <w:spacing w:after="120" w:before="0"/>
-      </w:pPr>
-      <w:r>
-        <w:rPr>
-          <w:rFonts w:ascii="Arial" w:cs="Arial" w:eastAsia="Arial" w:hAnsi="Arial"/>
-          <w:b/>
-          <w:bCs/>
-          <w:color w:val="0E3A4E"/>
-          <w:sz w:val="22"/>
-          <w:szCs w:val="22"/>
-        </w:rPr>
-        <w:t xml:space="preserve">Ejemplo: </w:t>
-      </w:r>
-      <w:r>
-        <w:rPr>
-          <w:rFonts w:ascii="Arial" w:cs="Arial" w:eastAsia="Arial" w:hAnsi="Arial"/>
-          <w:color w:val="0E3A4E"/>
-          <w:sz w:val="22"/>
-          <w:szCs w:val="22"/>
-        </w:rPr>
-        <w:t xml:space="preserve">Banner de cada evento para la portada y el calendario del sitio.</w:t>
-      </w:r>
-    </w:p>
-    <w:p>
-      <w:pPr>
-        <w:pStyle w:val="Heading2"/>
-        <w:spacing w:after="80" w:before="200"/>
-      </w:pPr>
-      <w:r>
-        <w:rPr>
-          <w:rFonts w:ascii="Arial" w:cs="Arial" w:eastAsia="Arial" w:hAnsi="Arial"/>
-          <w:b/>
-          <w:bCs/>
-          <w:color w:val="175772"/>
-          <w:sz w:val="26"/>
-          <w:szCs w:val="26"/>
-        </w:rPr>
         <w:t xml:space="preserve">Página web</w:t>
       </w:r>
     </w:p>
@@ -3628,7 +3472,7 @@
         </w:numPr>
         <w:spacing w:after="60"/>
       </w:pPr>
-      <w:hyperlink w:history="1" r:id="rIdzwiki0zt_fqkjyh-wv0ug">
+      <w:hyperlink w:history="1" r:id="rIdotpernzr0z4o6zn_ouifu">
         <w:r>
           <w:rPr>
             <w:rFonts w:ascii="Arial" w:cs="Arial" w:eastAsia="Arial" w:hAnsi="Arial"/>
@@ -3650,7 +3494,7 @@
         </w:numPr>
         <w:spacing w:after="60"/>
       </w:pPr>
-      <w:hyperlink w:history="1" r:id="rIdkymfag-iqyze1p4n_lqgi">
+      <w:hyperlink w:history="1" r:id="rIdmozflrz_am7d517sen_bj">
         <w:r>
           <w:rPr>
             <w:rFonts w:ascii="Arial" w:cs="Arial" w:eastAsia="Arial" w:hAnsi="Arial"/>
@@ -3672,7 +3516,7 @@
         </w:numPr>
         <w:spacing w:after="60"/>
       </w:pPr>
-      <w:hyperlink w:history="1" r:id="rIduz-u5h3hj878h83puyrp6">
+      <w:hyperlink w:history="1" r:id="rIdiymgrbqnx0xh5zmp63rrt">
         <w:r>
           <w:rPr>
             <w:rFonts w:ascii="Arial" w:cs="Arial" w:eastAsia="Arial" w:hAnsi="Arial"/>
@@ -3694,7 +3538,7 @@
         </w:numPr>
         <w:spacing w:after="60"/>
       </w:pPr>
-      <w:hyperlink w:history="1" r:id="rIdxdq-bsptvq96sxhdxwkur">
+      <w:hyperlink w:history="1" r:id="rIdprhbnylnolwypbdi8lsno">
         <w:r>
           <w:rPr>
             <w:rFonts w:ascii="Arial" w:cs="Arial" w:eastAsia="Arial" w:hAnsi="Arial"/>
@@ -3733,7 +3577,7 @@
         </w:numPr>
         <w:spacing w:after="60"/>
       </w:pPr>
-      <w:hyperlink w:history="1" r:id="rIdtuaauneruuerk2-vhy572">
+      <w:hyperlink w:history="1" r:id="rId1trmd-fmj9x0vbyxtm5zi">
         <w:r>
           <w:rPr>
             <w:rFonts w:ascii="Arial" w:cs="Arial" w:eastAsia="Arial" w:hAnsi="Arial"/>
@@ -3755,7 +3599,7 @@
         </w:numPr>
         <w:spacing w:after="60"/>
       </w:pPr>
-      <w:hyperlink w:history="1" r:id="rIduiii7eqhzr7q1ojz4vy-e">
+      <w:hyperlink w:history="1" r:id="rIdtf124muu548lomkchhqcz">
         <w:r>
           <w:rPr>
             <w:rFonts w:ascii="Arial" w:cs="Arial" w:eastAsia="Arial" w:hAnsi="Arial"/>
@@ -3777,7 +3621,7 @@
         </w:numPr>
         <w:spacing w:after="60"/>
       </w:pPr>
-      <w:hyperlink w:history="1" r:id="rIdvmi_cwsfukfnknlcdq3mf">
+      <w:hyperlink w:history="1" r:id="rId4mwp90pybe0jdvlxoiqty">
         <w:r>
           <w:rPr>
             <w:rFonts w:ascii="Arial" w:cs="Arial" w:eastAsia="Arial" w:hAnsi="Arial"/>
@@ -3799,7 +3643,7 @@
         </w:numPr>
         <w:spacing w:after="60"/>
       </w:pPr>
-      <w:hyperlink w:history="1" r:id="rIdvsfpjxl5y3f4q-r0krp6u">
+      <w:hyperlink w:history="1" r:id="rIdjbu21ytskdkti5xlalwl8">
         <w:r>
           <w:rPr>
             <w:rFonts w:ascii="Arial" w:cs="Arial" w:eastAsia="Arial" w:hAnsi="Arial"/>
@@ -3809,28 +3653,6 @@
             <w:u w:val="single"/>
           </w:rPr>
           <w:t xml:space="preserve">Claude Pro</w:t>
-        </w:r>
-      </w:hyperlink>
-    </w:p>
-    <w:p>
-      <w:pPr>
-        <w:pStyle w:val="ListParagraph"/>
-        <w:numPr>
-          <w:ilvl w:val="0"/>
-          <w:numId w:val="2"/>
-        </w:numPr>
-        <w:spacing w:after="60"/>
-      </w:pPr>
-      <w:hyperlink w:history="1" r:id="rIdts2shcr-9kyvblensiusn">
-        <w:r>
-          <w:rPr>
-            <w:rFonts w:ascii="Arial" w:cs="Arial" w:eastAsia="Arial" w:hAnsi="Arial"/>
-            <w:color w:val="039AD1"/>
-            <w:sz w:val="20"/>
-            <w:szCs w:val="20"/>
-            <w:u w:val="single"/>
-          </w:rPr>
-          <w:t xml:space="preserve">Canva Pro</w:t>
         </w:r>
       </w:hyperlink>
     </w:p>

</xml_diff>

<commit_message>
Bitwarden plan gratuito (2 personas)
Co-Authored-By: Claude Opus 5.5 <noreply@anthropic.com>
Claude-Session: https://claude.ai/code/session_01GFkSYVqa8d2zDX8Qy6Lwpz
</commit_message>
<xml_diff>
--- a/Presupuesto_2027_Comunicacion_RRPP_Poliforum_Leon.docx
+++ b/Presupuesto_2027_Comunicacion_RRPP_Poliforum_Leon.docx
@@ -335,7 +335,7 @@
                 <w:sz w:val="19"/>
                 <w:szCs w:val="19"/>
               </w:rPr>
-              <w:t xml:space="preserve">$12,827</w:t>
+              <w:t xml:space="preserve">$9,787</w:t>
             </w:r>
           </w:p>
         </w:tc>
@@ -396,7 +396,7 @@
                 <w:sz w:val="19"/>
                 <w:szCs w:val="19"/>
               </w:rPr>
-              <w:t xml:space="preserve">$28,003</w:t>
+              <w:t xml:space="preserve">$24,963</w:t>
             </w:r>
           </w:p>
         </w:tc>
@@ -730,7 +730,7 @@
             </w:tcMar>
           </w:tcPr>
           <w:p>
-            <w:hyperlink w:history="1" r:id="rIdygnou3ggpuhkgwytliwzu">
+            <w:hyperlink w:history="1" r:id="rId7nmp0mt69bafcp2gj1fil">
               <w:r>
                 <w:rPr>
                   <w:rFonts w:ascii="Arial" w:cs="Arial" w:eastAsia="Arial" w:hAnsi="Arial"/>
@@ -873,7 +873,7 @@
             </w:tcMar>
           </w:tcPr>
           <w:p>
-            <w:hyperlink w:history="1" r:id="rIdxccvgeaavkkrughhrgluy">
+            <w:hyperlink w:history="1" r:id="rIdw67bdoiv478bt0v005xuw">
               <w:r>
                 <w:rPr>
                   <w:rFonts w:ascii="Arial" w:cs="Arial" w:eastAsia="Arial" w:hAnsi="Arial"/>
@@ -1016,7 +1016,7 @@
             </w:tcMar>
           </w:tcPr>
           <w:p>
-            <w:hyperlink w:history="1" r:id="rIdlqtrjgkbaeqrb4hrd82_k">
+            <w:hyperlink w:history="1" r:id="rIdogkf5mxthpdbp64jap27v">
               <w:r>
                 <w:rPr>
                   <w:rFonts w:ascii="Arial" w:cs="Arial" w:eastAsia="Arial" w:hAnsi="Arial"/>
@@ -1159,7 +1159,7 @@
             </w:tcMar>
           </w:tcPr>
           <w:p>
-            <w:hyperlink w:history="1" r:id="rIdgquqo6edsnsymcsvs-g0a">
+            <w:hyperlink w:history="1" r:id="rIdatvs9y9tkyxz9kgkebqjj">
               <w:r>
                 <w:rPr>
                   <w:rFonts w:ascii="Arial" w:cs="Arial" w:eastAsia="Arial" w:hAnsi="Arial"/>
@@ -2311,7 +2311,7 @@
                 <w:sz w:val="19"/>
                 <w:szCs w:val="19"/>
               </w:rPr>
-              <w:t xml:space="preserve">Gestor de contraseñas · Bitwarden Teams (3)</w:t>
+              <w:t xml:space="preserve">Gestor de contraseñas · Bitwarden (plan gratuito, 2 personas)</w:t>
             </w:r>
           </w:p>
         </w:tc>
@@ -2367,7 +2367,7 @@
                 <w:sz w:val="19"/>
                 <w:szCs w:val="19"/>
               </w:rPr>
-              <w:t xml:space="preserve">$3,040</w:t>
+              <w:t xml:space="preserve">$0</w:t>
             </w:r>
           </w:p>
         </w:tc>
@@ -2723,7 +2723,7 @@
                 <w:sz w:val="19"/>
                 <w:szCs w:val="19"/>
               </w:rPr>
-              <w:t xml:space="preserve">$12,827</w:t>
+              <w:t xml:space="preserve">$9,787</w:t>
             </w:r>
           </w:p>
         </w:tc>
@@ -3272,7 +3272,7 @@
           <w:sz w:val="22"/>
           <w:szCs w:val="22"/>
         </w:rPr>
-        <w:t xml:space="preserve">Bitwarden Teams para 3 personas (US$4 por persona al mes, pago anual). Si solo 2 personas manejan los accesos, el plan gratuito de organización de Bitwarden alcanza y este concepto baja a $0.</w:t>
+        <w:t xml:space="preserve">La web la manejan 2 personas, así que alcanza el plan gratuito de organización de Bitwarden. Si en el futuro se suma una tercera persona, el plan Equipos cuesta US$4 por persona al mes.</w:t>
       </w:r>
     </w:p>
     <w:p>
@@ -3472,7 +3472,7 @@
         </w:numPr>
         <w:spacing w:after="60"/>
       </w:pPr>
-      <w:hyperlink w:history="1" r:id="rIdotpernzr0z4o6zn_ouifu">
+      <w:hyperlink w:history="1" r:id="rId_fs4xogoro8nlbswtugrg">
         <w:r>
           <w:rPr>
             <w:rFonts w:ascii="Arial" w:cs="Arial" w:eastAsia="Arial" w:hAnsi="Arial"/>
@@ -3494,7 +3494,7 @@
         </w:numPr>
         <w:spacing w:after="60"/>
       </w:pPr>
-      <w:hyperlink w:history="1" r:id="rIdmozflrz_am7d517sen_bj">
+      <w:hyperlink w:history="1" r:id="rIdne4up07t4zolo-5x8hiis">
         <w:r>
           <w:rPr>
             <w:rFonts w:ascii="Arial" w:cs="Arial" w:eastAsia="Arial" w:hAnsi="Arial"/>
@@ -3516,7 +3516,7 @@
         </w:numPr>
         <w:spacing w:after="60"/>
       </w:pPr>
-      <w:hyperlink w:history="1" r:id="rIdiymgrbqnx0xh5zmp63rrt">
+      <w:hyperlink w:history="1" r:id="rId1t12xyzqa1tfpws0aukwp">
         <w:r>
           <w:rPr>
             <w:rFonts w:ascii="Arial" w:cs="Arial" w:eastAsia="Arial" w:hAnsi="Arial"/>
@@ -3538,7 +3538,7 @@
         </w:numPr>
         <w:spacing w:after="60"/>
       </w:pPr>
-      <w:hyperlink w:history="1" r:id="rIdprhbnylnolwypbdi8lsno">
+      <w:hyperlink w:history="1" r:id="rIdacr2k9hir5ajyoab5z09a">
         <w:r>
           <w:rPr>
             <w:rFonts w:ascii="Arial" w:cs="Arial" w:eastAsia="Arial" w:hAnsi="Arial"/>
@@ -3577,7 +3577,7 @@
         </w:numPr>
         <w:spacing w:after="60"/>
       </w:pPr>
-      <w:hyperlink w:history="1" r:id="rId1trmd-fmj9x0vbyxtm5zi">
+      <w:hyperlink w:history="1" r:id="rIdk2qieftcdb84fufht0hyg">
         <w:r>
           <w:rPr>
             <w:rFonts w:ascii="Arial" w:cs="Arial" w:eastAsia="Arial" w:hAnsi="Arial"/>
@@ -3599,7 +3599,7 @@
         </w:numPr>
         <w:spacing w:after="60"/>
       </w:pPr>
-      <w:hyperlink w:history="1" r:id="rIdtf124muu548lomkchhqcz">
+      <w:hyperlink w:history="1" r:id="rIdvwuukwrgkl3ukvsolsdkc">
         <w:r>
           <w:rPr>
             <w:rFonts w:ascii="Arial" w:cs="Arial" w:eastAsia="Arial" w:hAnsi="Arial"/>
@@ -3621,7 +3621,7 @@
         </w:numPr>
         <w:spacing w:after="60"/>
       </w:pPr>
-      <w:hyperlink w:history="1" r:id="rId4mwp90pybe0jdvlxoiqty">
+      <w:hyperlink w:history="1" r:id="rId0eqytwupf2riicypb1uav">
         <w:r>
           <w:rPr>
             <w:rFonts w:ascii="Arial" w:cs="Arial" w:eastAsia="Arial" w:hAnsi="Arial"/>
@@ -3630,7 +3630,7 @@
             <w:szCs w:val="20"/>
             <w:u w:val="single"/>
           </w:rPr>
-          <w:t xml:space="preserve">Bitwarden Teams</w:t>
+          <w:t xml:space="preserve">Bitwarden (plan gratuito)</w:t>
         </w:r>
       </w:hyperlink>
     </w:p>
@@ -3643,7 +3643,7 @@
         </w:numPr>
         <w:spacing w:after="60"/>
       </w:pPr>
-      <w:hyperlink w:history="1" r:id="rIdjbu21ytskdkti5xlalwl8">
+      <w:hyperlink w:history="1" r:id="rIdwtxs93nijamhlxmodufap">
         <w:r>
           <w:rPr>
             <w:rFonts w:ascii="Arial" w:cs="Arial" w:eastAsia="Arial" w:hAnsi="Arial"/>

</xml_diff>

<commit_message>
Servidor: Hostinger VPS KVM 1 en lugar de DigitalOcean
Co-Authored-By: Claude Opus 5.5 <noreply@anthropic.com>
Claude-Session: https://claude.ai/code/session_01GFkSYVqa8d2zDX8Qy6Lwpz
</commit_message>
<xml_diff>
--- a/Presupuesto_2027_Comunicacion_RRPP_Poliforum_Leon.docx
+++ b/Presupuesto_2027_Comunicacion_RRPP_Poliforum_Leon.docx
@@ -335,7 +335,7 @@
                 <w:sz w:val="19"/>
                 <w:szCs w:val="19"/>
               </w:rPr>
-              <w:t xml:space="preserve">$9,787</w:t>
+              <w:t xml:space="preserve">$8,758</w:t>
             </w:r>
           </w:p>
         </w:tc>
@@ -396,7 +396,7 @@
                 <w:sz w:val="19"/>
                 <w:szCs w:val="19"/>
               </w:rPr>
-              <w:t xml:space="preserve">$24,963</w:t>
+              <w:t xml:space="preserve">$23,934</w:t>
             </w:r>
           </w:p>
         </w:tc>
@@ -730,7 +730,7 @@
             </w:tcMar>
           </w:tcPr>
           <w:p>
-            <w:hyperlink w:history="1" r:id="rId7nmp0mt69bafcp2gj1fil">
+            <w:hyperlink w:history="1" r:id="rIdnpsdf7odsxzvhtvnql6vj">
               <w:r>
                 <w:rPr>
                   <w:rFonts w:ascii="Arial" w:cs="Arial" w:eastAsia="Arial" w:hAnsi="Arial"/>
@@ -873,7 +873,7 @@
             </w:tcMar>
           </w:tcPr>
           <w:p>
-            <w:hyperlink w:history="1" r:id="rIdw67bdoiv478bt0v005xuw">
+            <w:hyperlink w:history="1" r:id="rId5vznqnehr1qcfajtterio">
               <w:r>
                 <w:rPr>
                   <w:rFonts w:ascii="Arial" w:cs="Arial" w:eastAsia="Arial" w:hAnsi="Arial"/>
@@ -1016,7 +1016,7 @@
             </w:tcMar>
           </w:tcPr>
           <w:p>
-            <w:hyperlink w:history="1" r:id="rIdogkf5mxthpdbp64jap27v">
+            <w:hyperlink w:history="1" r:id="rIdkicxx3yanb0ykmb8qyhl-">
               <w:r>
                 <w:rPr>
                   <w:rFonts w:ascii="Arial" w:cs="Arial" w:eastAsia="Arial" w:hAnsi="Arial"/>
@@ -1159,7 +1159,7 @@
             </w:tcMar>
           </w:tcPr>
           <w:p>
-            <w:hyperlink w:history="1" r:id="rIdatvs9y9tkyxz9kgkebqjj">
+            <w:hyperlink w:history="1" r:id="rIdskglynmki7--6pv26ytgu">
               <w:r>
                 <w:rPr>
                   <w:rFonts w:ascii="Arial" w:cs="Arial" w:eastAsia="Arial" w:hAnsi="Arial"/>
@@ -2133,7 +2133,7 @@
                 <w:sz w:val="19"/>
                 <w:szCs w:val="19"/>
               </w:rPr>
-              <w:t xml:space="preserve">Servidor y respaldos · DigitalOcean</w:t>
+              <w:t xml:space="preserve">Servidor VPS · Hostinger KVM 1 (pago de 24 meses)</w:t>
             </w:r>
           </w:p>
         </w:tc>
@@ -2161,7 +2161,7 @@
                 <w:sz w:val="19"/>
                 <w:szCs w:val="19"/>
               </w:rPr>
-              <w:t xml:space="preserve">Donde vive la web, 24 horas, con respaldo diario</w:t>
+              <w:t xml:space="preserve">Donde vive la web, 24 horas; cubre 2027 y 2028, con respaldo semanal incluido</w:t>
             </w:r>
           </w:p>
         </w:tc>
@@ -2189,7 +2189,7 @@
                 <w:sz w:val="19"/>
                 <w:szCs w:val="19"/>
               </w:rPr>
-              <w:t xml:space="preserve">$3,952</w:t>
+              <w:t xml:space="preserve">$2,923</w:t>
             </w:r>
           </w:p>
         </w:tc>
@@ -2723,7 +2723,7 @@
                 <w:sz w:val="19"/>
                 <w:szCs w:val="19"/>
               </w:rPr>
-              <w:t xml:space="preserve">$9,787</w:t>
+              <w:t xml:space="preserve">$8,758</w:t>
             </w:r>
           </w:p>
         </w:tc>
@@ -3247,7 +3247,7 @@
           <w:sz w:val="22"/>
           <w:szCs w:val="22"/>
         </w:rPr>
-        <w:t xml:space="preserve">DigitalOcean es un servidor privado en la nube (US$12 al mes + US$3.60 de respaldos), que se cobra cada mes a la tarjeta según lo que se usa. El hosting compartido de Hostinger o GoDaddy no permite correr el portal ni el chatbot; el dominio puede quedarse en GoDaddy. Plan de soporte de DigitalOcean: el gratuito (Motor de arranque); los planes de soporte de pago no hacen falta.</w:t>
+        <w:t xml:space="preserve">Hostinger VPS KVM 1: 1 núcleo, 4 GB de RAM y 50 GB de disco, suficiente para el portal y el chatbot. MXN 104.99 al mes pagando 24 meses por adelantado ($2,923 con IVA, cubre 2027 y 2028); renueva a MXN 210.99 al mes. Se instala con Ubuntu 24.04. Debe ser VPS: el hosting compartido normal no permite correr el portal ni el chatbot.</w:t>
       </w:r>
     </w:p>
     <w:p>
@@ -3472,7 +3472,7 @@
         </w:numPr>
         <w:spacing w:after="60"/>
       </w:pPr>
-      <w:hyperlink w:history="1" r:id="rId_fs4xogoro8nlbswtugrg">
+      <w:hyperlink w:history="1" r:id="rIdl63pjpufuywulyt39ilkj">
         <w:r>
           <w:rPr>
             <w:rFonts w:ascii="Arial" w:cs="Arial" w:eastAsia="Arial" w:hAnsi="Arial"/>
@@ -3494,7 +3494,7 @@
         </w:numPr>
         <w:spacing w:after="60"/>
       </w:pPr>
-      <w:hyperlink w:history="1" r:id="rIdne4up07t4zolo-5x8hiis">
+      <w:hyperlink w:history="1" r:id="rIdylzqe84iyntm_bafuuvsv">
         <w:r>
           <w:rPr>
             <w:rFonts w:ascii="Arial" w:cs="Arial" w:eastAsia="Arial" w:hAnsi="Arial"/>
@@ -3516,7 +3516,7 @@
         </w:numPr>
         <w:spacing w:after="60"/>
       </w:pPr>
-      <w:hyperlink w:history="1" r:id="rId1t12xyzqa1tfpws0aukwp">
+      <w:hyperlink w:history="1" r:id="rIdrryrgllrygayhyjnjqos3">
         <w:r>
           <w:rPr>
             <w:rFonts w:ascii="Arial" w:cs="Arial" w:eastAsia="Arial" w:hAnsi="Arial"/>
@@ -3538,7 +3538,7 @@
         </w:numPr>
         <w:spacing w:after="60"/>
       </w:pPr>
-      <w:hyperlink w:history="1" r:id="rIdacr2k9hir5ajyoab5z09a">
+      <w:hyperlink w:history="1" r:id="rIdiwyptyy8ctwr9__fpsmes">
         <w:r>
           <w:rPr>
             <w:rFonts w:ascii="Arial" w:cs="Arial" w:eastAsia="Arial" w:hAnsi="Arial"/>
@@ -3577,7 +3577,7 @@
         </w:numPr>
         <w:spacing w:after="60"/>
       </w:pPr>
-      <w:hyperlink w:history="1" r:id="rIdk2qieftcdb84fufht0hyg">
+      <w:hyperlink w:history="1" r:id="rIddahvkwuqksndh0shh_8ap">
         <w:r>
           <w:rPr>
             <w:rFonts w:ascii="Arial" w:cs="Arial" w:eastAsia="Arial" w:hAnsi="Arial"/>
@@ -3586,7 +3586,7 @@
             <w:szCs w:val="20"/>
             <w:u w:val="single"/>
           </w:rPr>
-          <w:t xml:space="preserve">Servidor · DigitalOcean</w:t>
+          <w:t xml:space="preserve">Servidor VPS · Hostinger</w:t>
         </w:r>
       </w:hyperlink>
     </w:p>
@@ -3599,7 +3599,7 @@
         </w:numPr>
         <w:spacing w:after="60"/>
       </w:pPr>
-      <w:hyperlink w:history="1" r:id="rIdvwuukwrgkl3ukvsolsdkc">
+      <w:hyperlink w:history="1" r:id="rIdinfu-f7wqpvrh0hskfems">
         <w:r>
           <w:rPr>
             <w:rFonts w:ascii="Arial" w:cs="Arial" w:eastAsia="Arial" w:hAnsi="Arial"/>
@@ -3621,7 +3621,7 @@
         </w:numPr>
         <w:spacing w:after="60"/>
       </w:pPr>
-      <w:hyperlink w:history="1" r:id="rId0eqytwupf2riicypb1uav">
+      <w:hyperlink w:history="1" r:id="rIdwdjmoznjlqq2tzf6hdka7">
         <w:r>
           <w:rPr>
             <w:rFonts w:ascii="Arial" w:cs="Arial" w:eastAsia="Arial" w:hAnsi="Arial"/>
@@ -3643,7 +3643,7 @@
         </w:numPr>
         <w:spacing w:after="60"/>
       </w:pPr>
-      <w:hyperlink w:history="1" r:id="rIdwtxs93nijamhlxmodufap">
+      <w:hyperlink w:history="1" r:id="rId9ojzosogcvymj8cofwbik">
         <w:r>
           <w:rPr>
             <w:rFonts w:ascii="Arial" w:cs="Arial" w:eastAsia="Arial" w:hAnsi="Arial"/>
@@ -3768,7 +3768,7 @@
           <w:sz w:val="22"/>
           <w:szCs w:val="22"/>
         </w:rPr>
-        <w:t xml:space="preserve">ManyChat: precio en dólares a $19.00 por dólar + 16% de IVA. Página web: cotización a $18.20 por dólar + 16% de IVA. Canva, Claude y X Plus (verificación): precios en México.</w:t>
+        <w:t xml:space="preserve">ManyChat: precio en dólares a $19.00 por dólar + 16% de IVA. Página web: Hostinger en pesos + IVA; chatbot y dominio según la cotización de la web. Canva, Claude y X Plus (verificación): precios en México.</w:t>
       </w:r>
     </w:p>
     <w:p>

</xml_diff>

<commit_message>
Servidor: Hostinger KVM 2 (24 meses), sin respaldo diario de pago
Co-Authored-By: Claude Opus 5.5 <noreply@anthropic.com>
Claude-Session: https://claude.ai/code/session_01GFkSYVqa8d2zDX8Qy6Lwpz
</commit_message>
<xml_diff>
--- a/Presupuesto_2027_Comunicacion_RRPP_Poliforum_Leon.docx
+++ b/Presupuesto_2027_Comunicacion_RRPP_Poliforum_Leon.docx
@@ -335,7 +335,7 @@
                 <w:sz w:val="19"/>
                 <w:szCs w:val="19"/>
               </w:rPr>
-              <w:t xml:space="preserve">$8,758</w:t>
+              <w:t xml:space="preserve">$10,150</w:t>
             </w:r>
           </w:p>
         </w:tc>
@@ -396,7 +396,7 @@
                 <w:sz w:val="19"/>
                 <w:szCs w:val="19"/>
               </w:rPr>
-              <w:t xml:space="preserve">$23,934</w:t>
+              <w:t xml:space="preserve">$25,326</w:t>
             </w:r>
           </w:p>
         </w:tc>
@@ -730,7 +730,7 @@
             </w:tcMar>
           </w:tcPr>
           <w:p>
-            <w:hyperlink w:history="1" r:id="rIdnpsdf7odsxzvhtvnql6vj">
+            <w:hyperlink w:history="1" r:id="rIdh-8d4nwj2lqkyjyejnbjv">
               <w:r>
                 <w:rPr>
                   <w:rFonts w:ascii="Arial" w:cs="Arial" w:eastAsia="Arial" w:hAnsi="Arial"/>
@@ -873,7 +873,7 @@
             </w:tcMar>
           </w:tcPr>
           <w:p>
-            <w:hyperlink w:history="1" r:id="rId5vznqnehr1qcfajtterio">
+            <w:hyperlink w:history="1" r:id="rIdtmhzrxec8t9gblc7cwx7c">
               <w:r>
                 <w:rPr>
                   <w:rFonts w:ascii="Arial" w:cs="Arial" w:eastAsia="Arial" w:hAnsi="Arial"/>
@@ -1016,7 +1016,7 @@
             </w:tcMar>
           </w:tcPr>
           <w:p>
-            <w:hyperlink w:history="1" r:id="rIdkicxx3yanb0ykmb8qyhl-">
+            <w:hyperlink w:history="1" r:id="rIddotuzgcax5ew04ot5rfjg">
               <w:r>
                 <w:rPr>
                   <w:rFonts w:ascii="Arial" w:cs="Arial" w:eastAsia="Arial" w:hAnsi="Arial"/>
@@ -1159,7 +1159,7 @@
             </w:tcMar>
           </w:tcPr>
           <w:p>
-            <w:hyperlink w:history="1" r:id="rIdskglynmki7--6pv26ytgu">
+            <w:hyperlink w:history="1" r:id="rIdeq5gvahelwh_vh5tqz4s-">
               <w:r>
                 <w:rPr>
                   <w:rFonts w:ascii="Arial" w:cs="Arial" w:eastAsia="Arial" w:hAnsi="Arial"/>
@@ -2133,7 +2133,7 @@
                 <w:sz w:val="19"/>
                 <w:szCs w:val="19"/>
               </w:rPr>
-              <w:t xml:space="preserve">Servidor VPS · Hostinger KVM 1 (pago de 24 meses)</w:t>
+              <w:t xml:space="preserve">Servidor VPS · Hostinger KVM 2 (pago de 24 meses)</w:t>
             </w:r>
           </w:p>
         </w:tc>
@@ -2161,7 +2161,7 @@
                 <w:sz w:val="19"/>
                 <w:szCs w:val="19"/>
               </w:rPr>
-              <w:t xml:space="preserve">Donde vive la web, 24 horas; cubre 2027 y 2028, con respaldo semanal incluido</w:t>
+              <w:t xml:space="preserve">Donde vive la web, 24 horas; cubre 2027 y 2028, con margen para crecer</w:t>
             </w:r>
           </w:p>
         </w:tc>
@@ -2189,7 +2189,7 @@
                 <w:sz w:val="19"/>
                 <w:szCs w:val="19"/>
               </w:rPr>
-              <w:t xml:space="preserve">$2,923</w:t>
+              <w:t xml:space="preserve">$4,315</w:t>
             </w:r>
           </w:p>
         </w:tc>
@@ -2723,7 +2723,7 @@
                 <w:sz w:val="19"/>
                 <w:szCs w:val="19"/>
               </w:rPr>
-              <w:t xml:space="preserve">$8,758</w:t>
+              <w:t xml:space="preserve">$10,150</w:t>
             </w:r>
           </w:p>
         </w:tc>
@@ -3247,7 +3247,7 @@
           <w:sz w:val="22"/>
           <w:szCs w:val="22"/>
         </w:rPr>
-        <w:t xml:space="preserve">Hostinger VPS KVM 1: 1 núcleo, 4 GB de RAM y 50 GB de disco, suficiente para el portal y el chatbot. MXN 104.99 al mes pagando 24 meses por adelantado ($2,923 con IVA, cubre 2027 y 2028); renueva a MXN 210.99 al mes. Se instala con Ubuntu 24.04. Debe ser VPS: el hosting compartido normal no permite correr el portal ni el chatbot.</w:t>
+        <w:t xml:space="preserve">Hostinger VPS KVM 2: 2 núcleos, 8 GB de RAM y 100 GB de disco, con margen para crecer. MXN 3,719.76 por 24 meses (MXN 154.99 al mes) + IVA = $4,315; cubre 2027 y 2028. Renueva a MXN 273.99 al mes. Se instala con Ubuntu 24.04. No hace falta el respaldo diario de pago (MXN 122.99 al mes): la instalación de la web ya hace un respaldo diario propio con copia externa gratuita, y Hostinger incluye respaldo semanal. Tampoco hace falta el dominio gratis que ofrece, porque ya tenemos poliforumleon.com.mx.</w:t>
       </w:r>
     </w:p>
     <w:p>
@@ -3472,7 +3472,7 @@
         </w:numPr>
         <w:spacing w:after="60"/>
       </w:pPr>
-      <w:hyperlink w:history="1" r:id="rIdl63pjpufuywulyt39ilkj">
+      <w:hyperlink w:history="1" r:id="rIdmdluw856z8ikhyfceb3lc">
         <w:r>
           <w:rPr>
             <w:rFonts w:ascii="Arial" w:cs="Arial" w:eastAsia="Arial" w:hAnsi="Arial"/>
@@ -3494,7 +3494,7 @@
         </w:numPr>
         <w:spacing w:after="60"/>
       </w:pPr>
-      <w:hyperlink w:history="1" r:id="rIdylzqe84iyntm_bafuuvsv">
+      <w:hyperlink w:history="1" r:id="rId-nayxlvpvszmx8vt5se7s">
         <w:r>
           <w:rPr>
             <w:rFonts w:ascii="Arial" w:cs="Arial" w:eastAsia="Arial" w:hAnsi="Arial"/>
@@ -3516,7 +3516,7 @@
         </w:numPr>
         <w:spacing w:after="60"/>
       </w:pPr>
-      <w:hyperlink w:history="1" r:id="rIdrryrgllrygayhyjnjqos3">
+      <w:hyperlink w:history="1" r:id="rId_nxc1espcmcfcislnxqyn">
         <w:r>
           <w:rPr>
             <w:rFonts w:ascii="Arial" w:cs="Arial" w:eastAsia="Arial" w:hAnsi="Arial"/>
@@ -3538,7 +3538,7 @@
         </w:numPr>
         <w:spacing w:after="60"/>
       </w:pPr>
-      <w:hyperlink w:history="1" r:id="rIdiwyptyy8ctwr9__fpsmes">
+      <w:hyperlink w:history="1" r:id="rIdl01oejwrbneztz4mu-sle">
         <w:r>
           <w:rPr>
             <w:rFonts w:ascii="Arial" w:cs="Arial" w:eastAsia="Arial" w:hAnsi="Arial"/>
@@ -3577,7 +3577,7 @@
         </w:numPr>
         <w:spacing w:after="60"/>
       </w:pPr>
-      <w:hyperlink w:history="1" r:id="rIddahvkwuqksndh0shh_8ap">
+      <w:hyperlink w:history="1" r:id="rIdacscozpnjbqusp2x4d7wv">
         <w:r>
           <w:rPr>
             <w:rFonts w:ascii="Arial" w:cs="Arial" w:eastAsia="Arial" w:hAnsi="Arial"/>
@@ -3599,7 +3599,7 @@
         </w:numPr>
         <w:spacing w:after="60"/>
       </w:pPr>
-      <w:hyperlink w:history="1" r:id="rIdinfu-f7wqpvrh0hskfems">
+      <w:hyperlink w:history="1" r:id="rIdb1anubzalvb2w97j_-xd-">
         <w:r>
           <w:rPr>
             <w:rFonts w:ascii="Arial" w:cs="Arial" w:eastAsia="Arial" w:hAnsi="Arial"/>
@@ -3621,7 +3621,7 @@
         </w:numPr>
         <w:spacing w:after="60"/>
       </w:pPr>
-      <w:hyperlink w:history="1" r:id="rIdwdjmoznjlqq2tzf6hdka7">
+      <w:hyperlink w:history="1" r:id="rIdg40yl9t0mpek0wr1uyy8v">
         <w:r>
           <w:rPr>
             <w:rFonts w:ascii="Arial" w:cs="Arial" w:eastAsia="Arial" w:hAnsi="Arial"/>
@@ -3643,7 +3643,7 @@
         </w:numPr>
         <w:spacing w:after="60"/>
       </w:pPr>
-      <w:hyperlink w:history="1" r:id="rId9ojzosogcvymj8cofwbik">
+      <w:hyperlink w:history="1" r:id="rId4tzkpo-hvtrxzteoccedq">
         <w:r>
           <w:rPr>
             <w:rFonts w:ascii="Arial" w:cs="Arial" w:eastAsia="Arial" w:hAnsi="Arial"/>

</xml_diff>

<commit_message>
Hostinger KVM 2 al total del carrito (3,720)
Co-Authored-By: Claude Opus 5.5 <noreply@anthropic.com>
Claude-Session: https://claude.ai/code/session_01GFkSYVqa8d2zDX8Qy6Lwpz
</commit_message>
<xml_diff>
--- a/Presupuesto_2027_Comunicacion_RRPP_Poliforum_Leon.docx
+++ b/Presupuesto_2027_Comunicacion_RRPP_Poliforum_Leon.docx
@@ -335,7 +335,7 @@
                 <w:sz w:val="19"/>
                 <w:szCs w:val="19"/>
               </w:rPr>
-              <w:t xml:space="preserve">$10,150</w:t>
+              <w:t xml:space="preserve">$9,555</w:t>
             </w:r>
           </w:p>
         </w:tc>
@@ -396,7 +396,7 @@
                 <w:sz w:val="19"/>
                 <w:szCs w:val="19"/>
               </w:rPr>
-              <w:t xml:space="preserve">$25,326</w:t>
+              <w:t xml:space="preserve">$24,731</w:t>
             </w:r>
           </w:p>
         </w:tc>
@@ -730,7 +730,7 @@
             </w:tcMar>
           </w:tcPr>
           <w:p>
-            <w:hyperlink w:history="1" r:id="rIdh-8d4nwj2lqkyjyejnbjv">
+            <w:hyperlink w:history="1" r:id="rIdjkc4li24eny-vexwcxzec">
               <w:r>
                 <w:rPr>
                   <w:rFonts w:ascii="Arial" w:cs="Arial" w:eastAsia="Arial" w:hAnsi="Arial"/>
@@ -873,7 +873,7 @@
             </w:tcMar>
           </w:tcPr>
           <w:p>
-            <w:hyperlink w:history="1" r:id="rIdtmhzrxec8t9gblc7cwx7c">
+            <w:hyperlink w:history="1" r:id="rIdenqhop8e4joqewgg8j_sd">
               <w:r>
                 <w:rPr>
                   <w:rFonts w:ascii="Arial" w:cs="Arial" w:eastAsia="Arial" w:hAnsi="Arial"/>
@@ -1016,7 +1016,7 @@
             </w:tcMar>
           </w:tcPr>
           <w:p>
-            <w:hyperlink w:history="1" r:id="rIddotuzgcax5ew04ot5rfjg">
+            <w:hyperlink w:history="1" r:id="rId-oxw8togcjtdy_2c2c3pn">
               <w:r>
                 <w:rPr>
                   <w:rFonts w:ascii="Arial" w:cs="Arial" w:eastAsia="Arial" w:hAnsi="Arial"/>
@@ -1159,7 +1159,7 @@
             </w:tcMar>
           </w:tcPr>
           <w:p>
-            <w:hyperlink w:history="1" r:id="rIdeq5gvahelwh_vh5tqz4s-">
+            <w:hyperlink w:history="1" r:id="rIdd53e1-xrsri7w7pksndwd">
               <w:r>
                 <w:rPr>
                   <w:rFonts w:ascii="Arial" w:cs="Arial" w:eastAsia="Arial" w:hAnsi="Arial"/>
@@ -2189,7 +2189,7 @@
                 <w:sz w:val="19"/>
                 <w:szCs w:val="19"/>
               </w:rPr>
-              <w:t xml:space="preserve">$4,315</w:t>
+              <w:t xml:space="preserve">$3,720</w:t>
             </w:r>
           </w:p>
         </w:tc>
@@ -2723,7 +2723,7 @@
                 <w:sz w:val="19"/>
                 <w:szCs w:val="19"/>
               </w:rPr>
-              <w:t xml:space="preserve">$10,150</w:t>
+              <w:t xml:space="preserve">$9,555</w:t>
             </w:r>
           </w:p>
         </w:tc>
@@ -3247,7 +3247,7 @@
           <w:sz w:val="22"/>
           <w:szCs w:val="22"/>
         </w:rPr>
-        <w:t xml:space="preserve">Hostinger VPS KVM 2: 2 núcleos, 8 GB de RAM y 100 GB de disco, con margen para crecer. MXN 3,719.76 por 24 meses (MXN 154.99 al mes) + IVA = $4,315; cubre 2027 y 2028. Renueva a MXN 273.99 al mes. Se instala con Ubuntu 24.04. No hace falta el respaldo diario de pago (MXN 122.99 al mes): la instalación de la web ya hace un respaldo diario propio con copia externa gratuita, y Hostinger incluye respaldo semanal. Tampoco hace falta el dominio gratis que ofrece, porque ya tenemos poliforumleon.com.mx.</w:t>
+        <w:t xml:space="preserve">Hostinger VPS KVM 2: 2 núcleos, 8 GB de RAM y 100 GB de disco, con margen para crecer. MXN 3,719.76 por 24 meses (MXN 154.99 al mes), total del carrito con impuestos en $0; cubre 2027 y 2028. Si al facturar se suma IVA, serían $4,315. Renueva a MXN 273.99 al mes. Se instala con Ubuntu 24.04. No hace falta el respaldo diario de pago (MXN 122.99 al mes): la instalación de la web ya hace un respaldo diario propio con copia externa gratuita, y Hostinger incluye respaldo semanal. Tampoco hace falta el dominio gratis que ofrece, porque ya tenemos poliforumleon.com.mx.</w:t>
       </w:r>
     </w:p>
     <w:p>
@@ -3472,7 +3472,7 @@
         </w:numPr>
         <w:spacing w:after="60"/>
       </w:pPr>
-      <w:hyperlink w:history="1" r:id="rIdmdluw856z8ikhyfceb3lc">
+      <w:hyperlink w:history="1" r:id="rIduptyf1l9_a_bxo97iia-l">
         <w:r>
           <w:rPr>
             <w:rFonts w:ascii="Arial" w:cs="Arial" w:eastAsia="Arial" w:hAnsi="Arial"/>
@@ -3494,7 +3494,7 @@
         </w:numPr>
         <w:spacing w:after="60"/>
       </w:pPr>
-      <w:hyperlink w:history="1" r:id="rId-nayxlvpvszmx8vt5se7s">
+      <w:hyperlink w:history="1" r:id="rIduzz_5fxdizx8hr7oemeda">
         <w:r>
           <w:rPr>
             <w:rFonts w:ascii="Arial" w:cs="Arial" w:eastAsia="Arial" w:hAnsi="Arial"/>
@@ -3516,7 +3516,7 @@
         </w:numPr>
         <w:spacing w:after="60"/>
       </w:pPr>
-      <w:hyperlink w:history="1" r:id="rId_nxc1espcmcfcislnxqyn">
+      <w:hyperlink w:history="1" r:id="rIdavml-8ljsyckuxfex7utq">
         <w:r>
           <w:rPr>
             <w:rFonts w:ascii="Arial" w:cs="Arial" w:eastAsia="Arial" w:hAnsi="Arial"/>
@@ -3538,7 +3538,7 @@
         </w:numPr>
         <w:spacing w:after="60"/>
       </w:pPr>
-      <w:hyperlink w:history="1" r:id="rIdl01oejwrbneztz4mu-sle">
+      <w:hyperlink w:history="1" r:id="rIdmcmfcv7wtcvrgwln9nkkp">
         <w:r>
           <w:rPr>
             <w:rFonts w:ascii="Arial" w:cs="Arial" w:eastAsia="Arial" w:hAnsi="Arial"/>
@@ -3577,7 +3577,7 @@
         </w:numPr>
         <w:spacing w:after="60"/>
       </w:pPr>
-      <w:hyperlink w:history="1" r:id="rIdacscozpnjbqusp2x4d7wv">
+      <w:hyperlink w:history="1" r:id="rId2metzzbo6br3jib2tfjzp">
         <w:r>
           <w:rPr>
             <w:rFonts w:ascii="Arial" w:cs="Arial" w:eastAsia="Arial" w:hAnsi="Arial"/>
@@ -3599,7 +3599,7 @@
         </w:numPr>
         <w:spacing w:after="60"/>
       </w:pPr>
-      <w:hyperlink w:history="1" r:id="rIdb1anubzalvb2w97j_-xd-">
+      <w:hyperlink w:history="1" r:id="rIdcipwamcxf9dd5bjvimqri">
         <w:r>
           <w:rPr>
             <w:rFonts w:ascii="Arial" w:cs="Arial" w:eastAsia="Arial" w:hAnsi="Arial"/>
@@ -3621,7 +3621,7 @@
         </w:numPr>
         <w:spacing w:after="60"/>
       </w:pPr>
-      <w:hyperlink w:history="1" r:id="rIdg40yl9t0mpek0wr1uyy8v">
+      <w:hyperlink w:history="1" r:id="rIdpmxe_txytbxhilpkillhi">
         <w:r>
           <w:rPr>
             <w:rFonts w:ascii="Arial" w:cs="Arial" w:eastAsia="Arial" w:hAnsi="Arial"/>
@@ -3643,7 +3643,7 @@
         </w:numPr>
         <w:spacing w:after="60"/>
       </w:pPr>
-      <w:hyperlink w:history="1" r:id="rId4tzkpo-hvtrxzteoccedq">
+      <w:hyperlink w:history="1" r:id="rIdpdvmcyuqi0qtkbu3uf5pa">
         <w:r>
           <w:rPr>
             <w:rFonts w:ascii="Arial" w:cs="Arial" w:eastAsia="Arial" w:hAnsi="Arial"/>

</xml_diff>

<commit_message>
Hostinger KVM 2 con IVA (4,315)
Co-Authored-By: Claude Opus 5.5 <noreply@anthropic.com>
Claude-Session: https://claude.ai/code/session_01GFkSYVqa8d2zDX8Qy6Lwpz
</commit_message>
<xml_diff>
--- a/Presupuesto_2027_Comunicacion_RRPP_Poliforum_Leon.docx
+++ b/Presupuesto_2027_Comunicacion_RRPP_Poliforum_Leon.docx
@@ -335,7 +335,7 @@
                 <w:sz w:val="19"/>
                 <w:szCs w:val="19"/>
               </w:rPr>
-              <w:t xml:space="preserve">$9,555</w:t>
+              <w:t xml:space="preserve">$10,150</w:t>
             </w:r>
           </w:p>
         </w:tc>
@@ -396,7 +396,7 @@
                 <w:sz w:val="19"/>
                 <w:szCs w:val="19"/>
               </w:rPr>
-              <w:t xml:space="preserve">$24,731</w:t>
+              <w:t xml:space="preserve">$25,326</w:t>
             </w:r>
           </w:p>
         </w:tc>
@@ -730,7 +730,7 @@
             </w:tcMar>
           </w:tcPr>
           <w:p>
-            <w:hyperlink w:history="1" r:id="rIdjkc4li24eny-vexwcxzec">
+            <w:hyperlink w:history="1" r:id="rId_th0itpdiqbzg90kb-o01">
               <w:r>
                 <w:rPr>
                   <w:rFonts w:ascii="Arial" w:cs="Arial" w:eastAsia="Arial" w:hAnsi="Arial"/>
@@ -873,7 +873,7 @@
             </w:tcMar>
           </w:tcPr>
           <w:p>
-            <w:hyperlink w:history="1" r:id="rIdenqhop8e4joqewgg8j_sd">
+            <w:hyperlink w:history="1" r:id="rIdtgylhkzwux-dkxxvcihmi">
               <w:r>
                 <w:rPr>
                   <w:rFonts w:ascii="Arial" w:cs="Arial" w:eastAsia="Arial" w:hAnsi="Arial"/>
@@ -1016,7 +1016,7 @@
             </w:tcMar>
           </w:tcPr>
           <w:p>
-            <w:hyperlink w:history="1" r:id="rId-oxw8togcjtdy_2c2c3pn">
+            <w:hyperlink w:history="1" r:id="rIdxiz0dm-mvquv6nw2bm53y">
               <w:r>
                 <w:rPr>
                   <w:rFonts w:ascii="Arial" w:cs="Arial" w:eastAsia="Arial" w:hAnsi="Arial"/>
@@ -1159,7 +1159,7 @@
             </w:tcMar>
           </w:tcPr>
           <w:p>
-            <w:hyperlink w:history="1" r:id="rIdd53e1-xrsri7w7pksndwd">
+            <w:hyperlink w:history="1" r:id="rIdzcdtsshwuytw-6jooetno">
               <w:r>
                 <w:rPr>
                   <w:rFonts w:ascii="Arial" w:cs="Arial" w:eastAsia="Arial" w:hAnsi="Arial"/>
@@ -2189,7 +2189,7 @@
                 <w:sz w:val="19"/>
                 <w:szCs w:val="19"/>
               </w:rPr>
-              <w:t xml:space="preserve">$3,720</w:t>
+              <w:t xml:space="preserve">$4,315</w:t>
             </w:r>
           </w:p>
         </w:tc>
@@ -2723,7 +2723,7 @@
                 <w:sz w:val="19"/>
                 <w:szCs w:val="19"/>
               </w:rPr>
-              <w:t xml:space="preserve">$9,555</w:t>
+              <w:t xml:space="preserve">$10,150</w:t>
             </w:r>
           </w:p>
         </w:tc>
@@ -3247,7 +3247,7 @@
           <w:sz w:val="22"/>
           <w:szCs w:val="22"/>
         </w:rPr>
-        <w:t xml:space="preserve">Hostinger VPS KVM 2: 2 núcleos, 8 GB de RAM y 100 GB de disco, con margen para crecer. MXN 3,719.76 por 24 meses (MXN 154.99 al mes), total del carrito con impuestos en $0; cubre 2027 y 2028. Si al facturar se suma IVA, serían $4,315. Renueva a MXN 273.99 al mes. Se instala con Ubuntu 24.04. No hace falta el respaldo diario de pago (MXN 122.99 al mes): la instalación de la web ya hace un respaldo diario propio con copia externa gratuita, y Hostinger incluye respaldo semanal. Tampoco hace falta el dominio gratis que ofrece, porque ya tenemos poliforumleon.com.mx.</w:t>
+        <w:t xml:space="preserve">Hostinger VPS KVM 2: 2 núcleos, 8 GB de RAM y 100 GB de disco, con margen para crecer. MXN 3,719.76 por 24 meses (MXN 154.99 al mes) + IVA = $4,315; un solo pago que cubre 2027 y 2028. Renueva a MXN 273.99 al mes. Se instala con Ubuntu 24.04. No hace falta el respaldo diario de pago (MXN 122.99 al mes): la instalación de la web ya hace un respaldo diario propio con copia externa gratuita, y Hostinger incluye respaldo semanal. Tampoco hace falta el dominio gratis que ofrece, porque ya tenemos poliforumleon.com.mx.</w:t>
       </w:r>
     </w:p>
     <w:p>
@@ -3472,7 +3472,7 @@
         </w:numPr>
         <w:spacing w:after="60"/>
       </w:pPr>
-      <w:hyperlink w:history="1" r:id="rIduptyf1l9_a_bxo97iia-l">
+      <w:hyperlink w:history="1" r:id="rIdhr4pcktzgvmdxlyacb70_">
         <w:r>
           <w:rPr>
             <w:rFonts w:ascii="Arial" w:cs="Arial" w:eastAsia="Arial" w:hAnsi="Arial"/>
@@ -3494,7 +3494,7 @@
         </w:numPr>
         <w:spacing w:after="60"/>
       </w:pPr>
-      <w:hyperlink w:history="1" r:id="rIduzz_5fxdizx8hr7oemeda">
+      <w:hyperlink w:history="1" r:id="rIdnii3g_4qi2_ybflgoe1n5">
         <w:r>
           <w:rPr>
             <w:rFonts w:ascii="Arial" w:cs="Arial" w:eastAsia="Arial" w:hAnsi="Arial"/>
@@ -3516,7 +3516,7 @@
         </w:numPr>
         <w:spacing w:after="60"/>
       </w:pPr>
-      <w:hyperlink w:history="1" r:id="rIdavml-8ljsyckuxfex7utq">
+      <w:hyperlink w:history="1" r:id="rIdoxlhvhmdawortbebbezip">
         <w:r>
           <w:rPr>
             <w:rFonts w:ascii="Arial" w:cs="Arial" w:eastAsia="Arial" w:hAnsi="Arial"/>
@@ -3538,7 +3538,7 @@
         </w:numPr>
         <w:spacing w:after="60"/>
       </w:pPr>
-      <w:hyperlink w:history="1" r:id="rIdmcmfcv7wtcvrgwln9nkkp">
+      <w:hyperlink w:history="1" r:id="rIdb77px2li9j82krz_z_rbx">
         <w:r>
           <w:rPr>
             <w:rFonts w:ascii="Arial" w:cs="Arial" w:eastAsia="Arial" w:hAnsi="Arial"/>
@@ -3577,7 +3577,7 @@
         </w:numPr>
         <w:spacing w:after="60"/>
       </w:pPr>
-      <w:hyperlink w:history="1" r:id="rId2metzzbo6br3jib2tfjzp">
+      <w:hyperlink w:history="1" r:id="rIdd8iax61ddbacv5jkw29w9">
         <w:r>
           <w:rPr>
             <w:rFonts w:ascii="Arial" w:cs="Arial" w:eastAsia="Arial" w:hAnsi="Arial"/>
@@ -3599,7 +3599,7 @@
         </w:numPr>
         <w:spacing w:after="60"/>
       </w:pPr>
-      <w:hyperlink w:history="1" r:id="rIdcipwamcxf9dd5bjvimqri">
+      <w:hyperlink w:history="1" r:id="rIdgkusawrigsv0ph8vbqiyo">
         <w:r>
           <w:rPr>
             <w:rFonts w:ascii="Arial" w:cs="Arial" w:eastAsia="Arial" w:hAnsi="Arial"/>
@@ -3621,7 +3621,7 @@
         </w:numPr>
         <w:spacing w:after="60"/>
       </w:pPr>
-      <w:hyperlink w:history="1" r:id="rIdpmxe_txytbxhilpkillhi">
+      <w:hyperlink w:history="1" r:id="rIdco3cbmmt-jblk1_2qjd-d">
         <w:r>
           <w:rPr>
             <w:rFonts w:ascii="Arial" w:cs="Arial" w:eastAsia="Arial" w:hAnsi="Arial"/>
@@ -3643,7 +3643,7 @@
         </w:numPr>
         <w:spacing w:after="60"/>
       </w:pPr>
-      <w:hyperlink w:history="1" r:id="rIdpdvmcyuqi0qtkbu3uf5pa">
+      <w:hyperlink w:history="1" r:id="rIdbpgm5wpcxqnfznoks6wrr">
         <w:r>
           <w:rPr>
             <w:rFonts w:ascii="Arial" w:cs="Arial" w:eastAsia="Arial" w:hAnsi="Arial"/>

</xml_diff>

<commit_message>
Word: primer y segundo año en la web
Co-Authored-By: Claude Opus 5.5 <noreply@anthropic.com>
Claude-Session: https://claude.ai/code/session_01GFkSYVqa8d2zDX8Qy6Lwpz
</commit_message>
<xml_diff>
--- a/Presupuesto_2027_Comunicacion_RRPP_Poliforum_Leon.docx
+++ b/Presupuesto_2027_Comunicacion_RRPP_Poliforum_Leon.docx
@@ -154,8 +154,9 @@
         </w:tblBorders>
       </w:tblPr>
       <w:tblGrid>
-        <w:gridCol w:w="6560"/>
-        <w:gridCol w:w="2800"/>
+        <w:gridCol w:w="5160"/>
+        <w:gridCol w:w="2100"/>
+        <w:gridCol w:w="2100"/>
       </w:tblGrid>
       <w:tr>
         <w:trPr>
@@ -163,7 +164,7 @@
         </w:trPr>
         <w:tc>
           <w:tcPr>
-            <w:tcW w:type="dxa" w:w="6560"/>
+            <w:tcW w:type="dxa" w:w="5160"/>
             <w:shd w:fill="DCE6EB" w:color="auto" w:val="clear"/>
             <w:tcMar>
               <w:top w:type="dxa" w:w="70"/>
@@ -191,7 +192,7 @@
         </w:tc>
         <w:tc>
           <w:tcPr>
-            <w:tcW w:type="dxa" w:w="2800"/>
+            <w:tcW w:type="dxa" w:w="2100"/>
             <w:shd w:fill="DCE6EB" w:color="auto" w:val="clear"/>
             <w:tcMar>
               <w:top w:type="dxa" w:w="70"/>
@@ -213,7 +214,35 @@
                 <w:sz w:val="19"/>
                 <w:szCs w:val="19"/>
               </w:rPr>
-              <w:t xml:space="preserve">Al año</w:t>
+              <w:t xml:space="preserve">Primer año · 2027</w:t>
+            </w:r>
+          </w:p>
+        </w:tc>
+        <w:tc>
+          <w:tcPr>
+            <w:tcW w:type="dxa" w:w="2100"/>
+            <w:shd w:fill="DCE6EB" w:color="auto" w:val="clear"/>
+            <w:tcMar>
+              <w:top w:type="dxa" w:w="70"/>
+              <w:left w:type="dxa" w:w="100"/>
+              <w:bottom w:type="dxa" w:w="70"/>
+              <w:right w:type="dxa" w:w="100"/>
+            </w:tcMar>
+          </w:tcPr>
+          <w:p>
+            <w:pPr>
+              <w:jc w:val="right"/>
+            </w:pPr>
+            <w:r>
+              <w:rPr>
+                <w:rFonts w:ascii="Arial" w:cs="Arial" w:eastAsia="Arial" w:hAnsi="Arial"/>
+                <w:b/>
+                <w:bCs/>
+                <w:color w:val="0E3A4E"/>
+                <w:sz w:val="19"/>
+                <w:szCs w:val="19"/>
+              </w:rPr>
+              <w:t xml:space="preserve">Segundo año · 2028</w:t>
             </w:r>
           </w:p>
         </w:tc>
@@ -224,7 +253,7 @@
         </w:trPr>
         <w:tc>
           <w:tcPr>
-            <w:tcW w:type="dxa" w:w="6560"/>
+            <w:tcW w:type="dxa" w:w="5160"/>
             <w:shd w:fill="F6F9FA" w:color="auto" w:val="clear"/>
             <w:tcMar>
               <w:top w:type="dxa" w:w="70"/>
@@ -252,7 +281,35 @@
         </w:tc>
         <w:tc>
           <w:tcPr>
-            <w:tcW w:type="dxa" w:w="2800"/>
+            <w:tcW w:type="dxa" w:w="2100"/>
+            <w:shd w:fill="F6F9FA" w:color="auto" w:val="clear"/>
+            <w:tcMar>
+              <w:top w:type="dxa" w:w="70"/>
+              <w:left w:type="dxa" w:w="100"/>
+              <w:bottom w:type="dxa" w:w="70"/>
+              <w:right w:type="dxa" w:w="100"/>
+            </w:tcMar>
+          </w:tcPr>
+          <w:p>
+            <w:pPr>
+              <w:jc w:val="right"/>
+            </w:pPr>
+            <w:r>
+              <w:rPr>
+                <w:rFonts w:ascii="Arial" w:cs="Arial" w:eastAsia="Arial" w:hAnsi="Arial"/>
+                <w:b w:val="false"/>
+                <w:bCs w:val="false"/>
+                <w:color w:val="0E3A4E"/>
+                <w:sz w:val="19"/>
+                <w:szCs w:val="19"/>
+              </w:rPr>
+              <w:t xml:space="preserve">$15,176</w:t>
+            </w:r>
+          </w:p>
+        </w:tc>
+        <w:tc>
+          <w:tcPr>
+            <w:tcW w:type="dxa" w:w="2100"/>
             <w:shd w:fill="F6F9FA" w:color="auto" w:val="clear"/>
             <w:tcMar>
               <w:top w:type="dxa" w:w="70"/>
@@ -285,7 +342,7 @@
         </w:trPr>
         <w:tc>
           <w:tcPr>
-            <w:tcW w:type="dxa" w:w="6560"/>
+            <w:tcW w:type="dxa" w:w="5160"/>
             <w:shd w:fill="FFFFFF" w:color="auto" w:val="clear"/>
             <w:tcMar>
               <w:top w:type="dxa" w:w="70"/>
@@ -313,7 +370,7 @@
         </w:tc>
         <w:tc>
           <w:tcPr>
-            <w:tcW w:type="dxa" w:w="2800"/>
+            <w:tcW w:type="dxa" w:w="2100"/>
             <w:shd w:fill="FFFFFF" w:color="auto" w:val="clear"/>
             <w:tcMar>
               <w:top w:type="dxa" w:w="70"/>
@@ -336,6 +393,34 @@
                 <w:szCs w:val="19"/>
               </w:rPr>
               <w:t xml:space="preserve">$10,150</w:t>
+            </w:r>
+          </w:p>
+        </w:tc>
+        <w:tc>
+          <w:tcPr>
+            <w:tcW w:type="dxa" w:w="2100"/>
+            <w:shd w:fill="FFFFFF" w:color="auto" w:val="clear"/>
+            <w:tcMar>
+              <w:top w:type="dxa" w:w="70"/>
+              <w:left w:type="dxa" w:w="100"/>
+              <w:bottom w:type="dxa" w:w="70"/>
+              <w:right w:type="dxa" w:w="100"/>
+            </w:tcMar>
+          </w:tcPr>
+          <w:p>
+            <w:pPr>
+              <w:jc w:val="right"/>
+            </w:pPr>
+            <w:r>
+              <w:rPr>
+                <w:rFonts w:ascii="Arial" w:cs="Arial" w:eastAsia="Arial" w:hAnsi="Arial"/>
+                <w:b w:val="false"/>
+                <w:bCs w:val="false"/>
+                <w:color w:val="0E3A4E"/>
+                <w:sz w:val="19"/>
+                <w:szCs w:val="19"/>
+              </w:rPr>
+              <w:t xml:space="preserve">$5,835</w:t>
             </w:r>
           </w:p>
         </w:tc>
@@ -346,7 +431,7 @@
         </w:trPr>
         <w:tc>
           <w:tcPr>
-            <w:tcW w:type="dxa" w:w="6560"/>
+            <w:tcW w:type="dxa" w:w="5160"/>
             <w:shd w:fill="175772" w:color="auto" w:val="clear"/>
             <w:tcMar>
               <w:top w:type="dxa" w:w="70"/>
@@ -368,13 +453,13 @@
                 <w:sz w:val="19"/>
                 <w:szCs w:val="19"/>
               </w:rPr>
-              <w:t xml:space="preserve">Total 2027</w:t>
-            </w:r>
-          </w:p>
-        </w:tc>
-        <w:tc>
-          <w:tcPr>
-            <w:tcW w:type="dxa" w:w="2800"/>
+              <w:t xml:space="preserve">Total</w:t>
+            </w:r>
+          </w:p>
+        </w:tc>
+        <w:tc>
+          <w:tcPr>
+            <w:tcW w:type="dxa" w:w="2100"/>
             <w:shd w:fill="175772" w:color="auto" w:val="clear"/>
             <w:tcMar>
               <w:top w:type="dxa" w:w="70"/>
@@ -397,6 +482,34 @@
                 <w:szCs w:val="19"/>
               </w:rPr>
               <w:t xml:space="preserve">$25,326</w:t>
+            </w:r>
+          </w:p>
+        </w:tc>
+        <w:tc>
+          <w:tcPr>
+            <w:tcW w:type="dxa" w:w="2100"/>
+            <w:shd w:fill="175772" w:color="auto" w:val="clear"/>
+            <w:tcMar>
+              <w:top w:type="dxa" w:w="70"/>
+              <w:left w:type="dxa" w:w="100"/>
+              <w:bottom w:type="dxa" w:w="70"/>
+              <w:right w:type="dxa" w:w="100"/>
+            </w:tcMar>
+          </w:tcPr>
+          <w:p>
+            <w:pPr>
+              <w:jc w:val="right"/>
+            </w:pPr>
+            <w:r>
+              <w:rPr>
+                <w:rFonts w:ascii="Arial" w:cs="Arial" w:eastAsia="Arial" w:hAnsi="Arial"/>
+                <w:b/>
+                <w:bCs/>
+                <w:color w:val="A8C243"/>
+                <w:sz w:val="19"/>
+                <w:szCs w:val="19"/>
+              </w:rPr>
+              <w:t xml:space="preserve">$21,011</w:t>
             </w:r>
           </w:p>
         </w:tc>
@@ -415,7 +528,7 @@
           <w:sz w:val="19"/>
           <w:szCs w:val="19"/>
         </w:rPr>
-        <w:t xml:space="preserve">MXN con IVA. Todo se paga de forma anual.</w:t>
+        <w:t xml:space="preserve">MXN con IVA. El segundo año baja porque el servidor de Hostinger se paga una sola vez por 24 meses en 2027 y ya cubre 2028.</w:t>
       </w:r>
     </w:p>
     <w:p>
@@ -730,7 +843,7 @@
             </w:tcMar>
           </w:tcPr>
           <w:p>
-            <w:hyperlink w:history="1" r:id="rId_th0itpdiqbzg90kb-o01">
+            <w:hyperlink w:history="1" r:id="rIdn67sr7-k39hns7awviofd">
               <w:r>
                 <w:rPr>
                   <w:rFonts w:ascii="Arial" w:cs="Arial" w:eastAsia="Arial" w:hAnsi="Arial"/>
@@ -873,7 +986,7 @@
             </w:tcMar>
           </w:tcPr>
           <w:p>
-            <w:hyperlink w:history="1" r:id="rIdtgylhkzwux-dkxxvcihmi">
+            <w:hyperlink w:history="1" r:id="rId1czbp9_g3zyrjxadcpl9j">
               <w:r>
                 <w:rPr>
                   <w:rFonts w:ascii="Arial" w:cs="Arial" w:eastAsia="Arial" w:hAnsi="Arial"/>
@@ -1016,7 +1129,7 @@
             </w:tcMar>
           </w:tcPr>
           <w:p>
-            <w:hyperlink w:history="1" r:id="rIdxiz0dm-mvquv6nw2bm53y">
+            <w:hyperlink w:history="1" r:id="rIdvnqkzcfjtueqeckbusaie">
               <w:r>
                 <w:rPr>
                   <w:rFonts w:ascii="Arial" w:cs="Arial" w:eastAsia="Arial" w:hAnsi="Arial"/>
@@ -1159,7 +1272,7 @@
             </w:tcMar>
           </w:tcPr>
           <w:p>
-            <w:hyperlink w:history="1" r:id="rIdzcdtsshwuytw-6jooetno">
+            <w:hyperlink w:history="1" r:id="rIdy0fuhvueo75wyinxvyqob">
               <w:r>
                 <w:rPr>
                   <w:rFonts w:ascii="Arial" w:cs="Arial" w:eastAsia="Arial" w:hAnsi="Arial"/>
@@ -2012,9 +2125,10 @@
         </w:tblBorders>
       </w:tblPr>
       <w:tblGrid>
-        <w:gridCol w:w="3000"/>
-        <w:gridCol w:w="4360"/>
-        <w:gridCol w:w="2000"/>
+        <w:gridCol w:w="2900"/>
+        <w:gridCol w:w="3260"/>
+        <w:gridCol w:w="1600"/>
+        <w:gridCol w:w="1600"/>
       </w:tblGrid>
       <w:tr>
         <w:trPr>
@@ -2022,7 +2136,7 @@
         </w:trPr>
         <w:tc>
           <w:tcPr>
-            <w:tcW w:type="dxa" w:w="3000"/>
+            <w:tcW w:type="dxa" w:w="2900"/>
             <w:shd w:fill="DCE6EB" w:color="auto" w:val="clear"/>
             <w:tcMar>
               <w:top w:type="dxa" w:w="70"/>
@@ -2050,7 +2164,7 @@
         </w:tc>
         <w:tc>
           <w:tcPr>
-            <w:tcW w:type="dxa" w:w="4360"/>
+            <w:tcW w:type="dxa" w:w="3260"/>
             <w:shd w:fill="DCE6EB" w:color="auto" w:val="clear"/>
             <w:tcMar>
               <w:top w:type="dxa" w:w="70"/>
@@ -2078,7 +2192,7 @@
         </w:tc>
         <w:tc>
           <w:tcPr>
-            <w:tcW w:type="dxa" w:w="2000"/>
+            <w:tcW w:type="dxa" w:w="1600"/>
             <w:shd w:fill="DCE6EB" w:color="auto" w:val="clear"/>
             <w:tcMar>
               <w:top w:type="dxa" w:w="70"/>
@@ -2100,7 +2214,35 @@
                 <w:sz w:val="19"/>
                 <w:szCs w:val="19"/>
               </w:rPr>
-              <w:t xml:space="preserve">Al año</w:t>
+              <w:t xml:space="preserve">Primer año · 2027</w:t>
+            </w:r>
+          </w:p>
+        </w:tc>
+        <w:tc>
+          <w:tcPr>
+            <w:tcW w:type="dxa" w:w="1600"/>
+            <w:shd w:fill="DCE6EB" w:color="auto" w:val="clear"/>
+            <w:tcMar>
+              <w:top w:type="dxa" w:w="70"/>
+              <w:left w:type="dxa" w:w="100"/>
+              <w:bottom w:type="dxa" w:w="70"/>
+              <w:right w:type="dxa" w:w="100"/>
+            </w:tcMar>
+          </w:tcPr>
+          <w:p>
+            <w:pPr>
+              <w:jc w:val="right"/>
+            </w:pPr>
+            <w:r>
+              <w:rPr>
+                <w:rFonts w:ascii="Arial" w:cs="Arial" w:eastAsia="Arial" w:hAnsi="Arial"/>
+                <w:b/>
+                <w:bCs/>
+                <w:color w:val="0E3A4E"/>
+                <w:sz w:val="19"/>
+                <w:szCs w:val="19"/>
+              </w:rPr>
+              <w:t xml:space="preserve">Segundo año · 2028</w:t>
             </w:r>
           </w:p>
         </w:tc>
@@ -2111,7 +2253,7 @@
         </w:trPr>
         <w:tc>
           <w:tcPr>
-            <w:tcW w:type="dxa" w:w="3000"/>
+            <w:tcW w:type="dxa" w:w="2900"/>
             <w:shd w:fill="F6F9FA" w:color="auto" w:val="clear"/>
             <w:tcMar>
               <w:top w:type="dxa" w:w="70"/>
@@ -2133,13 +2275,13 @@
                 <w:sz w:val="19"/>
                 <w:szCs w:val="19"/>
               </w:rPr>
-              <w:t xml:space="preserve">Servidor VPS · Hostinger KVM 2 (pago de 24 meses)</w:t>
-            </w:r>
-          </w:p>
-        </w:tc>
-        <w:tc>
-          <w:tcPr>
-            <w:tcW w:type="dxa" w:w="4360"/>
+              <w:t xml:space="preserve">Servidor VPS · Hostinger KVM 2 (un pago por 24 meses)</w:t>
+            </w:r>
+          </w:p>
+        </w:tc>
+        <w:tc>
+          <w:tcPr>
+            <w:tcW w:type="dxa" w:w="3260"/>
             <w:shd w:fill="F6F9FA" w:color="auto" w:val="clear"/>
             <w:tcMar>
               <w:top w:type="dxa" w:w="70"/>
@@ -2161,13 +2303,13 @@
                 <w:sz w:val="19"/>
                 <w:szCs w:val="19"/>
               </w:rPr>
-              <w:t xml:space="preserve">Donde vive la web, 24 horas; cubre 2027 y 2028, con margen para crecer</w:t>
-            </w:r>
-          </w:p>
-        </w:tc>
-        <w:tc>
-          <w:tcPr>
-            <w:tcW w:type="dxa" w:w="2000"/>
+              <w:t xml:space="preserve">Donde vive la web, 24 horas, con margen para crecer</w:t>
+            </w:r>
+          </w:p>
+        </w:tc>
+        <w:tc>
+          <w:tcPr>
+            <w:tcW w:type="dxa" w:w="1600"/>
             <w:shd w:fill="F6F9FA" w:color="auto" w:val="clear"/>
             <w:tcMar>
               <w:top w:type="dxa" w:w="70"/>
@@ -2190,6 +2332,34 @@
                 <w:szCs w:val="19"/>
               </w:rPr>
               <w:t xml:space="preserve">$4,315</w:t>
+            </w:r>
+          </w:p>
+        </w:tc>
+        <w:tc>
+          <w:tcPr>
+            <w:tcW w:type="dxa" w:w="1600"/>
+            <w:shd w:fill="F6F9FA" w:color="auto" w:val="clear"/>
+            <w:tcMar>
+              <w:top w:type="dxa" w:w="70"/>
+              <w:left w:type="dxa" w:w="100"/>
+              <w:bottom w:type="dxa" w:w="70"/>
+              <w:right w:type="dxa" w:w="100"/>
+            </w:tcMar>
+          </w:tcPr>
+          <w:p>
+            <w:pPr>
+              <w:jc w:val="right"/>
+            </w:pPr>
+            <w:r>
+              <w:rPr>
+                <w:rFonts w:ascii="Arial" w:cs="Arial" w:eastAsia="Arial" w:hAnsi="Arial"/>
+                <w:b w:val="false"/>
+                <w:bCs w:val="false"/>
+                <w:color w:val="0E3A4E"/>
+                <w:sz w:val="19"/>
+                <w:szCs w:val="19"/>
+              </w:rPr>
+              <w:t xml:space="preserve">$0 (ya pagado)</w:t>
             </w:r>
           </w:p>
         </w:tc>
@@ -2200,7 +2370,7 @@
         </w:trPr>
         <w:tc>
           <w:tcPr>
-            <w:tcW w:type="dxa" w:w="3000"/>
+            <w:tcW w:type="dxa" w:w="2900"/>
             <w:shd w:fill="FFFFFF" w:color="auto" w:val="clear"/>
             <w:tcMar>
               <w:top w:type="dxa" w:w="70"/>
@@ -2228,7 +2398,7 @@
         </w:tc>
         <w:tc>
           <w:tcPr>
-            <w:tcW w:type="dxa" w:w="4360"/>
+            <w:tcW w:type="dxa" w:w="3260"/>
             <w:shd w:fill="FFFFFF" w:color="auto" w:val="clear"/>
             <w:tcMar>
               <w:top w:type="dxa" w:w="70"/>
@@ -2256,7 +2426,35 @@
         </w:tc>
         <w:tc>
           <w:tcPr>
-            <w:tcW w:type="dxa" w:w="2000"/>
+            <w:tcW w:type="dxa" w:w="1600"/>
+            <w:shd w:fill="FFFFFF" w:color="auto" w:val="clear"/>
+            <w:tcMar>
+              <w:top w:type="dxa" w:w="70"/>
+              <w:left w:type="dxa" w:w="100"/>
+              <w:bottom w:type="dxa" w:w="70"/>
+              <w:right w:type="dxa" w:w="100"/>
+            </w:tcMar>
+          </w:tcPr>
+          <w:p>
+            <w:pPr>
+              <w:jc w:val="right"/>
+            </w:pPr>
+            <w:r>
+              <w:rPr>
+                <w:rFonts w:ascii="Arial" w:cs="Arial" w:eastAsia="Arial" w:hAnsi="Arial"/>
+                <w:b w:val="false"/>
+                <w:bCs w:val="false"/>
+                <w:color w:val="0E3A4E"/>
+                <w:sz w:val="19"/>
+                <w:szCs w:val="19"/>
+              </w:rPr>
+              <w:t xml:space="preserve">$1,747</w:t>
+            </w:r>
+          </w:p>
+        </w:tc>
+        <w:tc>
+          <w:tcPr>
+            <w:tcW w:type="dxa" w:w="1600"/>
             <w:shd w:fill="FFFFFF" w:color="auto" w:val="clear"/>
             <w:tcMar>
               <w:top w:type="dxa" w:w="70"/>
@@ -2289,7 +2487,7 @@
         </w:trPr>
         <w:tc>
           <w:tcPr>
-            <w:tcW w:type="dxa" w:w="3000"/>
+            <w:tcW w:type="dxa" w:w="2900"/>
             <w:shd w:fill="F6F9FA" w:color="auto" w:val="clear"/>
             <w:tcMar>
               <w:top w:type="dxa" w:w="70"/>
@@ -2317,7 +2515,7 @@
         </w:tc>
         <w:tc>
           <w:tcPr>
-            <w:tcW w:type="dxa" w:w="4360"/>
+            <w:tcW w:type="dxa" w:w="3260"/>
             <w:shd w:fill="F6F9FA" w:color="auto" w:val="clear"/>
             <w:tcMar>
               <w:top w:type="dxa" w:w="70"/>
@@ -2345,7 +2543,35 @@
         </w:tc>
         <w:tc>
           <w:tcPr>
-            <w:tcW w:type="dxa" w:w="2000"/>
+            <w:tcW w:type="dxa" w:w="1600"/>
+            <w:shd w:fill="F6F9FA" w:color="auto" w:val="clear"/>
+            <w:tcMar>
+              <w:top w:type="dxa" w:w="70"/>
+              <w:left w:type="dxa" w:w="100"/>
+              <w:bottom w:type="dxa" w:w="70"/>
+              <w:right w:type="dxa" w:w="100"/>
+            </w:tcMar>
+          </w:tcPr>
+          <w:p>
+            <w:pPr>
+              <w:jc w:val="right"/>
+            </w:pPr>
+            <w:r>
+              <w:rPr>
+                <w:rFonts w:ascii="Arial" w:cs="Arial" w:eastAsia="Arial" w:hAnsi="Arial"/>
+                <w:b w:val="false"/>
+                <w:bCs w:val="false"/>
+                <w:color w:val="0E3A4E"/>
+                <w:sz w:val="19"/>
+                <w:szCs w:val="19"/>
+              </w:rPr>
+              <w:t xml:space="preserve">$0</w:t>
+            </w:r>
+          </w:p>
+        </w:tc>
+        <w:tc>
+          <w:tcPr>
+            <w:tcW w:type="dxa" w:w="1600"/>
             <w:shd w:fill="F6F9FA" w:color="auto" w:val="clear"/>
             <w:tcMar>
               <w:top w:type="dxa" w:w="70"/>
@@ -2378,7 +2604,7 @@
         </w:trPr>
         <w:tc>
           <w:tcPr>
-            <w:tcW w:type="dxa" w:w="3000"/>
+            <w:tcW w:type="dxa" w:w="2900"/>
             <w:shd w:fill="FFFFFF" w:color="auto" w:val="clear"/>
             <w:tcMar>
               <w:top w:type="dxa" w:w="70"/>
@@ -2406,7 +2632,7 @@
         </w:tc>
         <w:tc>
           <w:tcPr>
-            <w:tcW w:type="dxa" w:w="4360"/>
+            <w:tcW w:type="dxa" w:w="3260"/>
             <w:shd w:fill="FFFFFF" w:color="auto" w:val="clear"/>
             <w:tcMar>
               <w:top w:type="dxa" w:w="70"/>
@@ -2434,7 +2660,35 @@
         </w:tc>
         <w:tc>
           <w:tcPr>
-            <w:tcW w:type="dxa" w:w="2000"/>
+            <w:tcW w:type="dxa" w:w="1600"/>
+            <w:shd w:fill="FFFFFF" w:color="auto" w:val="clear"/>
+            <w:tcMar>
+              <w:top w:type="dxa" w:w="70"/>
+              <w:left w:type="dxa" w:w="100"/>
+              <w:bottom w:type="dxa" w:w="70"/>
+              <w:right w:type="dxa" w:w="100"/>
+            </w:tcMar>
+          </w:tcPr>
+          <w:p>
+            <w:pPr>
+              <w:jc w:val="right"/>
+            </w:pPr>
+            <w:r>
+              <w:rPr>
+                <w:rFonts w:ascii="Arial" w:cs="Arial" w:eastAsia="Arial" w:hAnsi="Arial"/>
+                <w:b w:val="false"/>
+                <w:bCs w:val="false"/>
+                <w:color w:val="0E3A4E"/>
+                <w:sz w:val="19"/>
+                <w:szCs w:val="19"/>
+              </w:rPr>
+              <w:t xml:space="preserve">$638</w:t>
+            </w:r>
+          </w:p>
+        </w:tc>
+        <w:tc>
+          <w:tcPr>
+            <w:tcW w:type="dxa" w:w="1600"/>
             <w:shd w:fill="FFFFFF" w:color="auto" w:val="clear"/>
             <w:tcMar>
               <w:top w:type="dxa" w:w="70"/>
@@ -2467,7 +2721,7 @@
         </w:trPr>
         <w:tc>
           <w:tcPr>
-            <w:tcW w:type="dxa" w:w="3000"/>
+            <w:tcW w:type="dxa" w:w="2900"/>
             <w:shd w:fill="F6F9FA" w:color="auto" w:val="clear"/>
             <w:tcMar>
               <w:top w:type="dxa" w:w="70"/>
@@ -2495,7 +2749,7 @@
         </w:tc>
         <w:tc>
           <w:tcPr>
-            <w:tcW w:type="dxa" w:w="4360"/>
+            <w:tcW w:type="dxa" w:w="3260"/>
             <w:shd w:fill="F6F9FA" w:color="auto" w:val="clear"/>
             <w:tcMar>
               <w:top w:type="dxa" w:w="70"/>
@@ -2523,7 +2777,35 @@
         </w:tc>
         <w:tc>
           <w:tcPr>
-            <w:tcW w:type="dxa" w:w="2000"/>
+            <w:tcW w:type="dxa" w:w="1600"/>
+            <w:shd w:fill="F6F9FA" w:color="auto" w:val="clear"/>
+            <w:tcMar>
+              <w:top w:type="dxa" w:w="70"/>
+              <w:left w:type="dxa" w:w="100"/>
+              <w:bottom w:type="dxa" w:w="70"/>
+              <w:right w:type="dxa" w:w="100"/>
+            </w:tcMar>
+          </w:tcPr>
+          <w:p>
+            <w:pPr>
+              <w:jc w:val="right"/>
+            </w:pPr>
+            <w:r>
+              <w:rPr>
+                <w:rFonts w:ascii="Arial" w:cs="Arial" w:eastAsia="Arial" w:hAnsi="Arial"/>
+                <w:b w:val="false"/>
+                <w:bCs w:val="false"/>
+                <w:color w:val="0E3A4E"/>
+                <w:sz w:val="19"/>
+                <w:szCs w:val="19"/>
+              </w:rPr>
+              <w:t xml:space="preserve">$0</w:t>
+            </w:r>
+          </w:p>
+        </w:tc>
+        <w:tc>
+          <w:tcPr>
+            <w:tcW w:type="dxa" w:w="1600"/>
             <w:shd w:fill="F6F9FA" w:color="auto" w:val="clear"/>
             <w:tcMar>
               <w:top w:type="dxa" w:w="70"/>
@@ -2556,7 +2838,7 @@
         </w:trPr>
         <w:tc>
           <w:tcPr>
-            <w:tcW w:type="dxa" w:w="3000"/>
+            <w:tcW w:type="dxa" w:w="2900"/>
             <w:shd w:fill="FFFFFF" w:color="auto" w:val="clear"/>
             <w:tcMar>
               <w:top w:type="dxa" w:w="70"/>
@@ -2584,7 +2866,7 @@
         </w:tc>
         <w:tc>
           <w:tcPr>
-            <w:tcW w:type="dxa" w:w="4360"/>
+            <w:tcW w:type="dxa" w:w="3260"/>
             <w:shd w:fill="FFFFFF" w:color="auto" w:val="clear"/>
             <w:tcMar>
               <w:top w:type="dxa" w:w="70"/>
@@ -2612,7 +2894,35 @@
         </w:tc>
         <w:tc>
           <w:tcPr>
-            <w:tcW w:type="dxa" w:w="2000"/>
+            <w:tcW w:type="dxa" w:w="1600"/>
+            <w:shd w:fill="FFFFFF" w:color="auto" w:val="clear"/>
+            <w:tcMar>
+              <w:top w:type="dxa" w:w="70"/>
+              <w:left w:type="dxa" w:w="100"/>
+              <w:bottom w:type="dxa" w:w="70"/>
+              <w:right w:type="dxa" w:w="100"/>
+            </w:tcMar>
+          </w:tcPr>
+          <w:p>
+            <w:pPr>
+              <w:jc w:val="right"/>
+            </w:pPr>
+            <w:r>
+              <w:rPr>
+                <w:rFonts w:ascii="Arial" w:cs="Arial" w:eastAsia="Arial" w:hAnsi="Arial"/>
+                <w:b w:val="false"/>
+                <w:bCs w:val="false"/>
+                <w:color w:val="0E3A4E"/>
+                <w:sz w:val="19"/>
+                <w:szCs w:val="19"/>
+              </w:rPr>
+              <w:t xml:space="preserve">$3,450</w:t>
+            </w:r>
+          </w:p>
+        </w:tc>
+        <w:tc>
+          <w:tcPr>
+            <w:tcW w:type="dxa" w:w="1600"/>
             <w:shd w:fill="FFFFFF" w:color="auto" w:val="clear"/>
             <w:tcMar>
               <w:top w:type="dxa" w:w="70"/>
@@ -2645,7 +2955,7 @@
         </w:trPr>
         <w:tc>
           <w:tcPr>
-            <w:tcW w:type="dxa" w:w="3000"/>
+            <w:tcW w:type="dxa" w:w="2900"/>
             <w:shd w:fill="175772" w:color="auto" w:val="clear"/>
             <w:tcMar>
               <w:top w:type="dxa" w:w="70"/>
@@ -2673,7 +2983,7 @@
         </w:tc>
         <w:tc>
           <w:tcPr>
-            <w:tcW w:type="dxa" w:w="4360"/>
+            <w:tcW w:type="dxa" w:w="3260"/>
             <w:shd w:fill="175772" w:color="auto" w:val="clear"/>
             <w:tcMar>
               <w:top w:type="dxa" w:w="70"/>
@@ -2701,7 +3011,7 @@
         </w:tc>
         <w:tc>
           <w:tcPr>
-            <w:tcW w:type="dxa" w:w="2000"/>
+            <w:tcW w:type="dxa" w:w="1600"/>
             <w:shd w:fill="175772" w:color="auto" w:val="clear"/>
             <w:tcMar>
               <w:top w:type="dxa" w:w="70"/>
@@ -2727,8 +3037,52 @@
             </w:r>
           </w:p>
         </w:tc>
+        <w:tc>
+          <w:tcPr>
+            <w:tcW w:type="dxa" w:w="1600"/>
+            <w:shd w:fill="175772" w:color="auto" w:val="clear"/>
+            <w:tcMar>
+              <w:top w:type="dxa" w:w="70"/>
+              <w:left w:type="dxa" w:w="100"/>
+              <w:bottom w:type="dxa" w:w="70"/>
+              <w:right w:type="dxa" w:w="100"/>
+            </w:tcMar>
+          </w:tcPr>
+          <w:p>
+            <w:pPr>
+              <w:jc w:val="right"/>
+            </w:pPr>
+            <w:r>
+              <w:rPr>
+                <w:rFonts w:ascii="Arial" w:cs="Arial" w:eastAsia="Arial" w:hAnsi="Arial"/>
+                <w:b/>
+                <w:bCs/>
+                <w:color w:val="A8C243"/>
+                <w:sz w:val="19"/>
+                <w:szCs w:val="19"/>
+              </w:rPr>
+              <w:t xml:space="preserve">$5,835</w:t>
+            </w:r>
+          </w:p>
+        </w:tc>
       </w:tr>
     </w:tbl>
+    <w:p>
+      <w:pPr>
+        <w:spacing w:after="120" w:before="80"/>
+      </w:pPr>
+      <w:r>
+        <w:rPr>
+          <w:rFonts w:ascii="Arial" w:cs="Arial" w:eastAsia="Arial" w:hAnsi="Arial"/>
+          <w:i/>
+          <w:iCs/>
+          <w:color w:val="3D5866"/>
+          <w:sz w:val="19"/>
+          <w:szCs w:val="19"/>
+        </w:rPr>
+        <w:t xml:space="preserve">En 2029 el servidor se renueva a MXN 273.99 al mes (24 meses), salvo que se cambie de plan.</w:t>
+      </w:r>
+    </w:p>
     <w:p>
       <w:pPr>
         <w:pStyle w:val="Heading2"/>
@@ -3472,7 +3826,7 @@
         </w:numPr>
         <w:spacing w:after="60"/>
       </w:pPr>
-      <w:hyperlink w:history="1" r:id="rIdhr4pcktzgvmdxlyacb70_">
+      <w:hyperlink w:history="1" r:id="rIdp-t2jmji6ylataaapvh3h">
         <w:r>
           <w:rPr>
             <w:rFonts w:ascii="Arial" w:cs="Arial" w:eastAsia="Arial" w:hAnsi="Arial"/>
@@ -3494,7 +3848,7 @@
         </w:numPr>
         <w:spacing w:after="60"/>
       </w:pPr>
-      <w:hyperlink w:history="1" r:id="rIdnii3g_4qi2_ybflgoe1n5">
+      <w:hyperlink w:history="1" r:id="rIdmk0jtsg4pdhppilmf91ud">
         <w:r>
           <w:rPr>
             <w:rFonts w:ascii="Arial" w:cs="Arial" w:eastAsia="Arial" w:hAnsi="Arial"/>
@@ -3516,7 +3870,7 @@
         </w:numPr>
         <w:spacing w:after="60"/>
       </w:pPr>
-      <w:hyperlink w:history="1" r:id="rIdoxlhvhmdawortbebbezip">
+      <w:hyperlink w:history="1" r:id="rIdjxy6m7ycv17er7ihx5xvg">
         <w:r>
           <w:rPr>
             <w:rFonts w:ascii="Arial" w:cs="Arial" w:eastAsia="Arial" w:hAnsi="Arial"/>
@@ -3538,7 +3892,7 @@
         </w:numPr>
         <w:spacing w:after="60"/>
       </w:pPr>
-      <w:hyperlink w:history="1" r:id="rIdb77px2li9j82krz_z_rbx">
+      <w:hyperlink w:history="1" r:id="rIdfqioat1w54jj38evejbkr">
         <w:r>
           <w:rPr>
             <w:rFonts w:ascii="Arial" w:cs="Arial" w:eastAsia="Arial" w:hAnsi="Arial"/>
@@ -3577,7 +3931,7 @@
         </w:numPr>
         <w:spacing w:after="60"/>
       </w:pPr>
-      <w:hyperlink w:history="1" r:id="rIdd8iax61ddbacv5jkw29w9">
+      <w:hyperlink w:history="1" r:id="rId2yqq7z3vl_5owtbgwgm86">
         <w:r>
           <w:rPr>
             <w:rFonts w:ascii="Arial" w:cs="Arial" w:eastAsia="Arial" w:hAnsi="Arial"/>
@@ -3599,7 +3953,7 @@
         </w:numPr>
         <w:spacing w:after="60"/>
       </w:pPr>
-      <w:hyperlink w:history="1" r:id="rIdgkusawrigsv0ph8vbqiyo">
+      <w:hyperlink w:history="1" r:id="rIdbwpt2rt9xxcj1_ed8mlqv">
         <w:r>
           <w:rPr>
             <w:rFonts w:ascii="Arial" w:cs="Arial" w:eastAsia="Arial" w:hAnsi="Arial"/>
@@ -3621,7 +3975,7 @@
         </w:numPr>
         <w:spacing w:after="60"/>
       </w:pPr>
-      <w:hyperlink w:history="1" r:id="rIdco3cbmmt-jblk1_2qjd-d">
+      <w:hyperlink w:history="1" r:id="rIdea_nwcqt6zmdzf4brqpvg">
         <w:r>
           <w:rPr>
             <w:rFonts w:ascii="Arial" w:cs="Arial" w:eastAsia="Arial" w:hAnsi="Arial"/>
@@ -3643,7 +3997,7 @@
         </w:numPr>
         <w:spacing w:after="60"/>
       </w:pPr>
-      <w:hyperlink w:history="1" r:id="rIdbpgm5wpcxqnfznoks6wrr">
+      <w:hyperlink w:history="1" r:id="rId3h0nxb4vwozuzcpmdqlgr">
         <w:r>
           <w:rPr>
             <w:rFonts w:ascii="Arial" w:cs="Arial" w:eastAsia="Arial" w:hAnsi="Arial"/>

</xml_diff>